<commit_message>
Add report model DOCX renderer
</commit_message>
<xml_diff>
--- a/backend/templates/assessment-operational-template.docx
+++ b/backend/templates/assessment-operational-template.docx
@@ -103,7 +103,15 @@
           <w:color w:val="2F5273"/>
           <w:sz w:val="30"/>
         </w:rPr>
-        <w:t>{cover.client_name} - Arquitetura de Processos e Sistemas</w:t>
+        <w:t>{cover_client_name}</w:t>
+      </w:r>
+      <w:r>
+        <w:rPr>
+          <w:b/>
+          <w:color w:val="2F5273"/>
+          <w:sz w:val="30"/>
+        </w:rPr>
+        <w:t xml:space="preserve"> - Arquitetura de Processos e Sistemas</w:t>
       </w:r>
     </w:p>
     <w:p>
@@ -144,7 +152,7 @@
         <w:rPr>
           <w:sz w:val="22"/>
         </w:rPr>
-        <w:t>{COVER.CLIENT_NAME}</w:t>
+        <w:t>{cover_client_name}</w:t>
       </w:r>
     </w:p>
     <w:p>
@@ -500,7 +508,7 @@
                 <w:rStyle w:val="Hyperlink"/>
                 <w:noProof/>
               </w:rPr>
-              <w:t>{COVER.CLIENT_NAME}</w:t>
+              <w:t>{cover_client_name}</w:t>
             </w:r>
             <w:r>
               <w:rPr>
@@ -2028,7 +2036,7 @@
         <w:t xml:space="preserve">Este assessment tem como objetivo analisar o processo atual de desenvolvimento de produtos da </w:t>
       </w:r>
       <w:r>
-        <w:t>{COVER.CLIENT_NAME}</w:t>
+        <w:t>{cover_client_name}</w:t>
       </w:r>
       <w:r>
         <w:t>, com foco na arquitetura de processos, fluxos de informação, sistemas utilizados, gargalos operacionais e oportunidades de evolução por meio da plataforma 3DEXPERIENCE, SKACONECTOR e integrações associadas.</w:t>
@@ -2093,7 +2101,7 @@
               <w:rPr>
                 <w:b/>
               </w:rPr>
-              <w:t>{executive.current_state}</w:t>
+              <w:t>{executive_current_state}</w:t>
             </w:r>
           </w:p>
           <w:p>
@@ -2106,7 +2114,13 @@
               <w:rPr>
                 <w:b/>
               </w:rPr>
-              <w:t>{#executive.main_pains}- {.}</w:t>
+              <w:t>{#executive_main_pains}</w:t>
+            </w:r>
+            <w:r>
+              <w:rPr>
+                <w:b/>
+              </w:rPr>
+              <w:t>- {.}</w:t>
             </w:r>
           </w:p>
           <w:p>
@@ -2119,7 +2133,7 @@
               <w:rPr>
                 <w:b/>
               </w:rPr>
-              <w:t>{/executive.main_pains}</w:t>
+              <w:t>{/executive_main_pains}</w:t>
             </w:r>
           </w:p>
           <w:p>
@@ -2127,7 +2141,13 @@
               <w:rPr>
                 <w:b/>
               </w:rPr>
-              <w:t>Maturidade: {executive.overall_maturity}</w:t>
+              <w:t xml:space="preserve">Maturidade: </w:t>
+            </w:r>
+            <w:r>
+              <w:rPr>
+                <w:b/>
+              </w:rPr>
+              <w:t>{executive_overall_maturity}</w:t>
             </w:r>
           </w:p>
         </w:tc>
@@ -2191,11 +2211,10 @@
       </w:pPr>
       <w:bookmarkStart w:id="3" w:name="_Toc231930566"/>
       <w:r>
-        <w:lastRenderedPageBreak/>
         <w:t xml:space="preserve">2. Visão Geral da Engenharia - </w:t>
       </w:r>
       <w:r>
-        <w:t>{COVER.CLIENT_NAME}</w:t>
+        <w:t>{cover_client_name}</w:t>
       </w:r>
       <w:bookmarkEnd w:id="3"/>
     </w:p>
@@ -2215,7 +2234,7 @@
         <w:t xml:space="preserve">A </w:t>
       </w:r>
       <w:r>
-        <w:t>{COVER.CLIENT_NAME}</w:t>
+        <w:t>{cover_client_name}</w:t>
       </w:r>
       <w:r>
         <w:t xml:space="preserve"> atua em um contexto de forte expansão e crescimento acelerado. A ampliação da estrutura torna mais crítica a governança da informação, principalmente em um ambiente multidisciplinar de engenharia.</w:t>
@@ -2416,7 +2435,6 @@
         <w:rPr>
           <w:noProof/>
         </w:rPr>
-        <w:lastRenderedPageBreak/>
         <mc:AlternateContent>
           <mc:Choice Requires="wps">
             <w:drawing>
@@ -5323,7 +5341,6 @@
       </w:pPr>
       <w:bookmarkStart w:id="7" w:name="_Toc231930570"/>
       <w:r>
-        <w:lastRenderedPageBreak/>
         <w:t>3. Análise de Situação Atual</w:t>
       </w:r>
       <w:bookmarkEnd w:id="7"/>
@@ -5714,7 +5731,6 @@
       </w:pPr>
       <w:bookmarkStart w:id="10" w:name="_Toc231930573"/>
       <w:r>
-        <w:lastRenderedPageBreak/>
         <w:t>3.3 Integração MCAD-ECAD e Mecânica de Precisão</w:t>
       </w:r>
       <w:bookmarkEnd w:id="10"/>
@@ -5888,7 +5904,6 @@
       </w:pPr>
       <w:bookmarkStart w:id="14" w:name="_Toc231930577"/>
       <w:r>
-        <w:lastRenderedPageBreak/>
         <w:t>3.7 Gargalos e Ineficiências Identificadas</w:t>
       </w:r>
       <w:bookmarkEnd w:id="14"/>
@@ -6096,7 +6111,7 @@
         <w:t xml:space="preserve">A </w:t>
       </w:r>
       <w:r>
-        <w:t>{COVER.CLIENT_NAME}</w:t>
+        <w:t>{cover_client_name}</w:t>
       </w:r>
       <w:r>
         <w:t xml:space="preserve"> possui uma engenharia de alto nível técnico, com forte capacidade de prototipagem e desenvolvimento multidisciplinar. O principal desafio não está na capacidade técnica da equipe, mas na sustentação do crescimento com governança de dados, rastreabilidade e integração entre sistemas.</w:t>
@@ -6125,7 +6140,6 @@
       </w:pPr>
       <w:bookmarkStart w:id="16" w:name="_Toc231930579"/>
       <w:r>
-        <w:lastRenderedPageBreak/>
         <w:t>4. Expectativas com as Soluções 3DEXPERIENCE e SKACONECTOR</w:t>
       </w:r>
       <w:bookmarkEnd w:id="16"/>
@@ -6267,7 +6281,6 @@
         <w:rPr>
           <w:noProof/>
         </w:rPr>
-        <w:lastRenderedPageBreak/>
         <mc:AlternateContent>
           <mc:Choice Requires="wps">
             <w:drawing>
@@ -8119,7 +8132,6 @@
       </w:pPr>
       <w:bookmarkStart w:id="19" w:name="_Toc231930582"/>
       <w:r>
-        <w:lastRenderedPageBreak/>
         <w:t>5. Direcionamentos e expectativas</w:t>
       </w:r>
       <w:bookmarkEnd w:id="19"/>
@@ -8288,7 +8300,6 @@
         <w:rPr>
           <w:noProof/>
         </w:rPr>
-        <w:lastRenderedPageBreak/>
         <mc:AlternateContent>
           <mc:Choice Requires="wps">
             <w:drawing>
@@ -10998,14 +11009,7 @@
                                 <w:b/>
                                 <w:sz w:val="15"/>
                               </w:rPr>
-                              <w:t>gimbals</w:t>
-                            </w:r>
-                            <w:r>
-                              <w:rPr>
-                                <w:b/>
-                                <w:sz w:val="15"/>
-                              </w:rPr>
-                              <w:t>, cases e integração física</w:t>
+                              <w:t>gimbals, cases e integração física</w:t>
                             </w:r>
                           </w:p>
                         </w:txbxContent>

</xml_diff>

<commit_message>
Enhance flow and gap radar DOCX sections
</commit_message>
<xml_diff>
--- a/backend/templates/assessment-operational-template.docx
+++ b/backend/templates/assessment-operational-template.docx
@@ -2941,6 +2941,99 @@
       <w:tblGrid>
         <w:gridCol w:w="100"/>
         <w:gridCol w:w="100"/>
+      </w:tblGrid>
+      <w:tr>
+        <w:tc>
+          <w:tcPr>
+            <w:tcBorders>
+              <w:top w:val="single" w:color="CBD5E1" w:sz="1"/>
+              <w:left w:val="single" w:color="CBD5E1" w:sz="1"/>
+              <w:bottom w:val="single" w:color="CBD5E1" w:sz="1"/>
+              <w:right w:val="single" w:color="CBD5E1" w:sz="1"/>
+            </w:tcBorders>
+            <w:shd w:fill="FEF3C7" w:color="auto" w:val="clear"/>
+            <w:tcMar>
+              <w:top w:type="dxa" w:w="100"/>
+              <w:left w:type="dxa" w:w="110"/>
+              <w:bottom w:type="dxa" w:w="100"/>
+              <w:right w:type="dxa" w:w="110"/>
+            </w:tcMar>
+            <w:vAlign w:val="center"/>
+          </w:tcPr>
+          <w:p>
+            <w:pPr>
+              <w:spacing w:after="0"/>
+            </w:pPr>
+            <w:r>
+              <w:rPr>
+                <w:b/>
+                <w:bCs/>
+                <w:i w:val="false"/>
+                <w:iCs w:val="false"/>
+                <w:color w:val="1E3A8A"/>
+                <w:sz w:val="18"/>
+                <w:szCs w:val="18"/>
+                <w:caps w:val="false"/>
+              </w:rPr>
+              <w:t xml:space="preserve">Leitura executiva do radar</w:t>
+            </w:r>
+          </w:p>
+        </w:tc>
+        <w:tc>
+          <w:tcPr>
+            <w:tcBorders>
+              <w:top w:val="single" w:color="CBD5E1" w:sz="1"/>
+              <w:left w:val="single" w:color="CBD5E1" w:sz="1"/>
+              <w:bottom w:val="single" w:color="CBD5E1" w:sz="1"/>
+              <w:right w:val="single" w:color="CBD5E1" w:sz="1"/>
+            </w:tcBorders>
+            <w:shd w:fill="FEF3C7" w:color="auto" w:val="clear"/>
+            <w:tcMar>
+              <w:top w:type="dxa" w:w="100"/>
+              <w:left w:type="dxa" w:w="110"/>
+              <w:bottom w:type="dxa" w:w="100"/>
+              <w:right w:type="dxa" w:w="110"/>
+            </w:tcMar>
+            <w:vAlign w:val="center"/>
+          </w:tcPr>
+          <w:p>
+            <w:pPr>
+              <w:spacing w:after="0"/>
+            </w:pPr>
+            <w:r>
+              <w:rPr>
+                <w:b w:val="false"/>
+                <w:bCs w:val="false"/>
+                <w:i w:val="false"/>
+                <w:iCs w:val="false"/>
+                <w:color w:val="111827"/>
+                <w:sz w:val="18"/>
+                <w:szCs w:val="18"/>
+                <w:caps w:val="false"/>
+              </w:rPr>
+              <w:t xml:space="preserve">{gap_radar_summary}</w:t>
+            </w:r>
+          </w:p>
+        </w:tc>
+      </w:tr>
+    </w:tbl>
+    <w:tbl>
+      <w:tblPr>
+        <w:tblW w:type="pct" w:w="100%"/>
+        <w:tblBorders>
+          <w:top w:val="single" w:color="auto" w:sz="4"/>
+          <w:left w:val="single" w:color="auto" w:sz="4"/>
+          <w:bottom w:val="single" w:color="auto" w:sz="4"/>
+          <w:right w:val="single" w:color="auto" w:sz="4"/>
+          <w:insideH w:val="single" w:color="auto" w:sz="4"/>
+          <w:insideV w:val="single" w:color="auto" w:sz="4"/>
+        </w:tblBorders>
+        <w:tblLayout w:type="fixed"/>
+      </w:tblPr>
+      <w:tblGrid>
+        <w:gridCol w:w="100"/>
+        <w:gridCol w:w="100"/>
+        <w:gridCol w:w="100"/>
         <w:gridCol w:w="100"/>
         <w:gridCol w:w="100"/>
         <w:gridCol w:w="100"/>
@@ -3282,6 +3375,43 @@
                 <w:szCs w:val="15"/>
                 <w:caps/>
               </w:rPr>
+              <w:t xml:space="preserve">Nivel</w:t>
+            </w:r>
+          </w:p>
+        </w:tc>
+        <w:tc>
+          <w:tcPr>
+            <w:tcBorders>
+              <w:top w:val="single" w:color="CBD5E1" w:sz="1"/>
+              <w:left w:val="single" w:color="CBD5E1" w:sz="1"/>
+              <w:bottom w:val="single" w:color="CBD5E1" w:sz="1"/>
+              <w:right w:val="single" w:color="CBD5E1" w:sz="1"/>
+            </w:tcBorders>
+            <w:shd w:fill="2555D9" w:color="auto" w:val="clear"/>
+            <w:tcMar>
+              <w:top w:type="dxa" w:w="100"/>
+              <w:left w:type="dxa" w:w="110"/>
+              <w:bottom w:type="dxa" w:w="100"/>
+              <w:right w:type="dxa" w:w="110"/>
+            </w:tcMar>
+            <w:vAlign w:val="center"/>
+          </w:tcPr>
+          <w:p>
+            <w:pPr>
+              <w:spacing w:after="0"/>
+              <w:jc w:val="center"/>
+            </w:pPr>
+            <w:r>
+              <w:rPr>
+                <w:b/>
+                <w:bCs/>
+                <w:i w:val="false"/>
+                <w:iCs w:val="false"/>
+                <w:color w:val="FFFFFF"/>
+                <w:sz w:val="15"/>
+                <w:szCs w:val="15"/>
+                <w:caps/>
+              </w:rPr>
               <w:t xml:space="preserve">Gaps fonte</w:t>
             </w:r>
           </w:p>
@@ -3572,7 +3702,7 @@
                 <w:szCs w:val="16"/>
                 <w:caps w:val="false"/>
               </w:rPr>
-              <w:t xml:space="preserve">{score}</w:t>
+              <w:t xml:space="preserve">{score_label}</w:t>
             </w:r>
           </w:p>
         </w:tc>
@@ -3585,6 +3715,42 @@
               <w:right w:val="single" w:color="CBD5E1" w:sz="1"/>
             </w:tcBorders>
             <w:shd w:fill="FFFFFF" w:color="auto" w:val="clear"/>
+            <w:tcMar>
+              <w:top w:type="dxa" w:w="100"/>
+              <w:left w:type="dxa" w:w="110"/>
+              <w:bottom w:type="dxa" w:w="100"/>
+              <w:right w:type="dxa" w:w="110"/>
+            </w:tcMar>
+            <w:vAlign w:val="center"/>
+          </w:tcPr>
+          <w:p>
+            <w:pPr>
+              <w:spacing w:after="0"/>
+            </w:pPr>
+            <w:r>
+              <w:rPr>
+                <w:b w:val="false"/>
+                <w:bCs w:val="false"/>
+                <w:i w:val="false"/>
+                <w:iCs w:val="false"/>
+                <w:color w:val="111827"/>
+                <w:sz w:val="16"/>
+                <w:szCs w:val="16"/>
+                <w:caps w:val="false"/>
+              </w:rPr>
+              <w:t xml:space="preserve">{risk_level}</w:t>
+            </w:r>
+          </w:p>
+        </w:tc>
+        <w:tc>
+          <w:tcPr>
+            <w:tcBorders>
+              <w:top w:val="single" w:color="CBD5E1" w:sz="1"/>
+              <w:left w:val="single" w:color="CBD5E1" w:sz="1"/>
+              <w:bottom w:val="single" w:color="CBD5E1" w:sz="1"/>
+              <w:right w:val="single" w:color="CBD5E1" w:sz="1"/>
+            </w:tcBorders>
+            <w:shd w:fill="F8FAFC" w:color="auto" w:val="clear"/>
             <w:tcMar>
               <w:top w:type="dxa" w:w="100"/>
               <w:left w:type="dxa" w:w="110"/>
@@ -4178,6 +4344,733 @@
           <w:szCs w:val="20"/>
           <w:caps w:val="false"/>
         </w:rPr>
+      </w:r>
+    </w:p>
+    <w:p>
+      <w:pPr>
+        <w:pStyle w:val="Heading2"/>
+        <w:spacing w:before="0" w:after="120" w:line="276"/>
+      </w:pPr>
+      <w:r>
+        <w:rPr>
+          <w:b/>
+          <w:bCs/>
+          <w:i w:val="false"/>
+          <w:iCs w:val="false"/>
+          <w:color w:val="111827"/>
+          <w:sz w:val="22"/>
+          <w:szCs w:val="22"/>
+          <w:caps w:val="false"/>
+        </w:rPr>
+        <w:t xml:space="preserve">Fluxo visual resumido</w:t>
+      </w:r>
+    </w:p>
+    <w:tbl>
+      <w:tblPr>
+        <w:tblW w:type="pct" w:w="100%"/>
+        <w:tblBorders>
+          <w:top w:val="single" w:color="auto" w:sz="4"/>
+          <w:left w:val="single" w:color="auto" w:sz="4"/>
+          <w:bottom w:val="single" w:color="auto" w:sz="4"/>
+          <w:right w:val="single" w:color="auto" w:sz="4"/>
+          <w:insideH w:val="single" w:color="auto" w:sz="4"/>
+          <w:insideV w:val="single" w:color="auto" w:sz="4"/>
+        </w:tblBorders>
+        <w:tblLayout w:type="fixed"/>
+      </w:tblPr>
+      <w:tblGrid>
+        <w:gridCol w:w="100"/>
+        <w:gridCol w:w="100"/>
+        <w:gridCol w:w="100"/>
+        <w:gridCol w:w="100"/>
+        <w:gridCol w:w="100"/>
+        <w:gridCol w:w="100"/>
+        <w:gridCol w:w="100"/>
+        <w:gridCol w:w="100"/>
+        <w:gridCol w:w="100"/>
+      </w:tblGrid>
+      <w:tr>
+        <w:trPr>
+          <w:tblHeader/>
+        </w:trPr>
+        <w:tc>
+          <w:tcPr>
+            <w:tcBorders>
+              <w:top w:val="single" w:color="CBD5E1" w:sz="1"/>
+              <w:left w:val="single" w:color="CBD5E1" w:sz="1"/>
+              <w:bottom w:val="single" w:color="CBD5E1" w:sz="1"/>
+              <w:right w:val="single" w:color="CBD5E1" w:sz="1"/>
+            </w:tcBorders>
+            <w:shd w:fill="2555D9" w:color="auto" w:val="clear"/>
+            <w:tcMar>
+              <w:top w:type="dxa" w:w="100"/>
+              <w:left w:type="dxa" w:w="110"/>
+              <w:bottom w:type="dxa" w:w="100"/>
+              <w:right w:type="dxa" w:w="110"/>
+            </w:tcMar>
+            <w:vAlign w:val="center"/>
+          </w:tcPr>
+          <w:p>
+            <w:pPr>
+              <w:spacing w:after="0"/>
+              <w:jc w:val="center"/>
+            </w:pPr>
+            <w:r>
+              <w:rPr>
+                <w:b/>
+                <w:bCs/>
+                <w:i w:val="false"/>
+                <w:iCs w:val="false"/>
+                <w:color w:val="FFFFFF"/>
+                <w:sz w:val="15"/>
+                <w:szCs w:val="15"/>
+                <w:caps/>
+              </w:rPr>
+              <w:t xml:space="preserve">Fluxo</w:t>
+            </w:r>
+          </w:p>
+        </w:tc>
+        <w:tc>
+          <w:tcPr>
+            <w:tcBorders>
+              <w:top w:val="single" w:color="CBD5E1" w:sz="1"/>
+              <w:left w:val="single" w:color="CBD5E1" w:sz="1"/>
+              <w:bottom w:val="single" w:color="CBD5E1" w:sz="1"/>
+              <w:right w:val="single" w:color="CBD5E1" w:sz="1"/>
+            </w:tcBorders>
+            <w:shd w:fill="2555D9" w:color="auto" w:val="clear"/>
+            <w:tcMar>
+              <w:top w:type="dxa" w:w="100"/>
+              <w:left w:type="dxa" w:w="110"/>
+              <w:bottom w:type="dxa" w:w="100"/>
+              <w:right w:type="dxa" w:w="110"/>
+            </w:tcMar>
+            <w:vAlign w:val="center"/>
+          </w:tcPr>
+          <w:p>
+            <w:pPr>
+              <w:spacing w:after="0"/>
+              <w:jc w:val="center"/>
+            </w:pPr>
+            <w:r>
+              <w:rPr>
+                <w:b/>
+                <w:bCs/>
+                <w:i w:val="false"/>
+                <w:iCs w:val="false"/>
+                <w:color w:val="FFFFFF"/>
+                <w:sz w:val="15"/>
+                <w:szCs w:val="15"/>
+                <w:caps/>
+              </w:rPr>
+              <w:t xml:space="preserve">Tipo</w:t>
+            </w:r>
+          </w:p>
+        </w:tc>
+        <w:tc>
+          <w:tcPr>
+            <w:tcBorders>
+              <w:top w:val="single" w:color="CBD5E1" w:sz="1"/>
+              <w:left w:val="single" w:color="CBD5E1" w:sz="1"/>
+              <w:bottom w:val="single" w:color="CBD5E1" w:sz="1"/>
+              <w:right w:val="single" w:color="CBD5E1" w:sz="1"/>
+            </w:tcBorders>
+            <w:shd w:fill="2555D9" w:color="auto" w:val="clear"/>
+            <w:tcMar>
+              <w:top w:type="dxa" w:w="100"/>
+              <w:left w:type="dxa" w:w="110"/>
+              <w:bottom w:type="dxa" w:w="100"/>
+              <w:right w:type="dxa" w:w="110"/>
+            </w:tcMar>
+            <w:vAlign w:val="center"/>
+          </w:tcPr>
+          <w:p>
+            <w:pPr>
+              <w:spacing w:after="0"/>
+              <w:jc w:val="center"/>
+            </w:pPr>
+            <w:r>
+              <w:rPr>
+                <w:b/>
+                <w:bCs/>
+                <w:i w:val="false"/>
+                <w:iCs w:val="false"/>
+                <w:color w:val="FFFFFF"/>
+                <w:sz w:val="15"/>
+                <w:szCs w:val="15"/>
+                <w:caps/>
+              </w:rPr>
+              <w:t xml:space="preserve">Etapa 1</w:t>
+            </w:r>
+          </w:p>
+        </w:tc>
+        <w:tc>
+          <w:tcPr>
+            <w:tcBorders>
+              <w:top w:val="single" w:color="CBD5E1" w:sz="1"/>
+              <w:left w:val="single" w:color="CBD5E1" w:sz="1"/>
+              <w:bottom w:val="single" w:color="CBD5E1" w:sz="1"/>
+              <w:right w:val="single" w:color="CBD5E1" w:sz="1"/>
+            </w:tcBorders>
+            <w:shd w:fill="2555D9" w:color="auto" w:val="clear"/>
+            <w:tcMar>
+              <w:top w:type="dxa" w:w="100"/>
+              <w:left w:type="dxa" w:w="110"/>
+              <w:bottom w:type="dxa" w:w="100"/>
+              <w:right w:type="dxa" w:w="110"/>
+            </w:tcMar>
+            <w:vAlign w:val="center"/>
+          </w:tcPr>
+          <w:p>
+            <w:pPr>
+              <w:spacing w:after="0"/>
+              <w:jc w:val="center"/>
+            </w:pPr>
+            <w:r>
+              <w:rPr>
+                <w:b/>
+                <w:bCs/>
+                <w:i w:val="false"/>
+                <w:iCs w:val="false"/>
+                <w:color w:val="FFFFFF"/>
+                <w:sz w:val="15"/>
+                <w:szCs w:val="15"/>
+                <w:caps/>
+              </w:rPr>
+              <w:t xml:space="preserve">Etapa 2</w:t>
+            </w:r>
+          </w:p>
+        </w:tc>
+        <w:tc>
+          <w:tcPr>
+            <w:tcBorders>
+              <w:top w:val="single" w:color="CBD5E1" w:sz="1"/>
+              <w:left w:val="single" w:color="CBD5E1" w:sz="1"/>
+              <w:bottom w:val="single" w:color="CBD5E1" w:sz="1"/>
+              <w:right w:val="single" w:color="CBD5E1" w:sz="1"/>
+            </w:tcBorders>
+            <w:shd w:fill="2555D9" w:color="auto" w:val="clear"/>
+            <w:tcMar>
+              <w:top w:type="dxa" w:w="100"/>
+              <w:left w:type="dxa" w:w="110"/>
+              <w:bottom w:type="dxa" w:w="100"/>
+              <w:right w:type="dxa" w:w="110"/>
+            </w:tcMar>
+            <w:vAlign w:val="center"/>
+          </w:tcPr>
+          <w:p>
+            <w:pPr>
+              <w:spacing w:after="0"/>
+              <w:jc w:val="center"/>
+            </w:pPr>
+            <w:r>
+              <w:rPr>
+                <w:b/>
+                <w:bCs/>
+                <w:i w:val="false"/>
+                <w:iCs w:val="false"/>
+                <w:color w:val="FFFFFF"/>
+                <w:sz w:val="15"/>
+                <w:szCs w:val="15"/>
+                <w:caps/>
+              </w:rPr>
+              <w:t xml:space="preserve">Etapa 3</w:t>
+            </w:r>
+          </w:p>
+        </w:tc>
+        <w:tc>
+          <w:tcPr>
+            <w:tcBorders>
+              <w:top w:val="single" w:color="CBD5E1" w:sz="1"/>
+              <w:left w:val="single" w:color="CBD5E1" w:sz="1"/>
+              <w:bottom w:val="single" w:color="CBD5E1" w:sz="1"/>
+              <w:right w:val="single" w:color="CBD5E1" w:sz="1"/>
+            </w:tcBorders>
+            <w:shd w:fill="2555D9" w:color="auto" w:val="clear"/>
+            <w:tcMar>
+              <w:top w:type="dxa" w:w="100"/>
+              <w:left w:type="dxa" w:w="110"/>
+              <w:bottom w:type="dxa" w:w="100"/>
+              <w:right w:type="dxa" w:w="110"/>
+            </w:tcMar>
+            <w:vAlign w:val="center"/>
+          </w:tcPr>
+          <w:p>
+            <w:pPr>
+              <w:spacing w:after="0"/>
+              <w:jc w:val="center"/>
+            </w:pPr>
+            <w:r>
+              <w:rPr>
+                <w:b/>
+                <w:bCs/>
+                <w:i w:val="false"/>
+                <w:iCs w:val="false"/>
+                <w:color w:val="FFFFFF"/>
+                <w:sz w:val="15"/>
+                <w:szCs w:val="15"/>
+                <w:caps/>
+              </w:rPr>
+              <w:t xml:space="preserve">Etapa 4</w:t>
+            </w:r>
+          </w:p>
+        </w:tc>
+        <w:tc>
+          <w:tcPr>
+            <w:tcBorders>
+              <w:top w:val="single" w:color="CBD5E1" w:sz="1"/>
+              <w:left w:val="single" w:color="CBD5E1" w:sz="1"/>
+              <w:bottom w:val="single" w:color="CBD5E1" w:sz="1"/>
+              <w:right w:val="single" w:color="CBD5E1" w:sz="1"/>
+            </w:tcBorders>
+            <w:shd w:fill="2555D9" w:color="auto" w:val="clear"/>
+            <w:tcMar>
+              <w:top w:type="dxa" w:w="100"/>
+              <w:left w:type="dxa" w:w="110"/>
+              <w:bottom w:type="dxa" w:w="100"/>
+              <w:right w:type="dxa" w:w="110"/>
+            </w:tcMar>
+            <w:vAlign w:val="center"/>
+          </w:tcPr>
+          <w:p>
+            <w:pPr>
+              <w:spacing w:after="0"/>
+              <w:jc w:val="center"/>
+            </w:pPr>
+            <w:r>
+              <w:rPr>
+                <w:b/>
+                <w:bCs/>
+                <w:i w:val="false"/>
+                <w:iCs w:val="false"/>
+                <w:color w:val="FFFFFF"/>
+                <w:sz w:val="15"/>
+                <w:szCs w:val="15"/>
+                <w:caps/>
+              </w:rPr>
+              <w:t xml:space="preserve">Etapa 5</w:t>
+            </w:r>
+          </w:p>
+        </w:tc>
+        <w:tc>
+          <w:tcPr>
+            <w:tcBorders>
+              <w:top w:val="single" w:color="CBD5E1" w:sz="1"/>
+              <w:left w:val="single" w:color="CBD5E1" w:sz="1"/>
+              <w:bottom w:val="single" w:color="CBD5E1" w:sz="1"/>
+              <w:right w:val="single" w:color="CBD5E1" w:sz="1"/>
+            </w:tcBorders>
+            <w:shd w:fill="2555D9" w:color="auto" w:val="clear"/>
+            <w:tcMar>
+              <w:top w:type="dxa" w:w="100"/>
+              <w:left w:type="dxa" w:w="110"/>
+              <w:bottom w:type="dxa" w:w="100"/>
+              <w:right w:type="dxa" w:w="110"/>
+            </w:tcMar>
+            <w:vAlign w:val="center"/>
+          </w:tcPr>
+          <w:p>
+            <w:pPr>
+              <w:spacing w:after="0"/>
+              <w:jc w:val="center"/>
+            </w:pPr>
+            <w:r>
+              <w:rPr>
+                <w:b/>
+                <w:bCs/>
+                <w:i w:val="false"/>
+                <w:iCs w:val="false"/>
+                <w:color w:val="FFFFFF"/>
+                <w:sz w:val="15"/>
+                <w:szCs w:val="15"/>
+                <w:caps/>
+              </w:rPr>
+              <w:t xml:space="preserve">Etapa 6</w:t>
+            </w:r>
+          </w:p>
+        </w:tc>
+        <w:tc>
+          <w:tcPr>
+            <w:tcBorders>
+              <w:top w:val="single" w:color="CBD5E1" w:sz="1"/>
+              <w:left w:val="single" w:color="CBD5E1" w:sz="1"/>
+              <w:bottom w:val="single" w:color="CBD5E1" w:sz="1"/>
+              <w:right w:val="single" w:color="CBD5E1" w:sz="1"/>
+            </w:tcBorders>
+            <w:shd w:fill="2555D9" w:color="auto" w:val="clear"/>
+            <w:tcMar>
+              <w:top w:type="dxa" w:w="100"/>
+              <w:left w:type="dxa" w:w="110"/>
+              <w:bottom w:type="dxa" w:w="100"/>
+              <w:right w:type="dxa" w:w="110"/>
+            </w:tcMar>
+            <w:vAlign w:val="center"/>
+          </w:tcPr>
+          <w:p>
+            <w:pPr>
+              <w:spacing w:after="0"/>
+              <w:jc w:val="center"/>
+            </w:pPr>
+            <w:r>
+              <w:rPr>
+                <w:b/>
+                <w:bCs/>
+                <w:i w:val="false"/>
+                <w:iCs w:val="false"/>
+                <w:color w:val="FFFFFF"/>
+                <w:sz w:val="15"/>
+                <w:szCs w:val="15"/>
+                <w:caps/>
+              </w:rPr>
+              <w:t xml:space="preserve">Observacao</w:t>
+            </w:r>
+          </w:p>
+        </w:tc>
+      </w:tr>
+      <w:tr>
+        <w:tc>
+          <w:tcPr>
+            <w:tcBorders>
+              <w:top w:val="single" w:color="CBD5E1" w:sz="1"/>
+              <w:left w:val="single" w:color="CBD5E1" w:sz="1"/>
+              <w:bottom w:val="single" w:color="CBD5E1" w:sz="1"/>
+              <w:right w:val="single" w:color="CBD5E1" w:sz="1"/>
+            </w:tcBorders>
+            <w:shd w:fill="FFFFFF" w:color="auto" w:val="clear"/>
+            <w:tcMar>
+              <w:top w:type="dxa" w:w="100"/>
+              <w:left w:type="dxa" w:w="110"/>
+              <w:bottom w:type="dxa" w:w="100"/>
+              <w:right w:type="dxa" w:w="110"/>
+            </w:tcMar>
+            <w:vAlign w:val="center"/>
+          </w:tcPr>
+          <w:p>
+            <w:pPr>
+              <w:spacing w:after="0"/>
+            </w:pPr>
+            <w:r>
+              <w:rPr>
+                <w:b w:val="false"/>
+                <w:bCs w:val="false"/>
+                <w:i w:val="false"/>
+                <w:iCs w:val="false"/>
+                <w:color w:val="111827"/>
+                <w:sz w:val="14"/>
+                <w:szCs w:val="14"/>
+                <w:caps w:val="false"/>
+              </w:rPr>
+              <w:t xml:space="preserve">{#flow_visuals}{flow_name}</w:t>
+            </w:r>
+          </w:p>
+        </w:tc>
+        <w:tc>
+          <w:tcPr>
+            <w:tcBorders>
+              <w:top w:val="single" w:color="CBD5E1" w:sz="1"/>
+              <w:left w:val="single" w:color="CBD5E1" w:sz="1"/>
+              <w:bottom w:val="single" w:color="CBD5E1" w:sz="1"/>
+              <w:right w:val="single" w:color="CBD5E1" w:sz="1"/>
+            </w:tcBorders>
+            <w:shd w:fill="F8FAFC" w:color="auto" w:val="clear"/>
+            <w:tcMar>
+              <w:top w:type="dxa" w:w="100"/>
+              <w:left w:type="dxa" w:w="110"/>
+              <w:bottom w:type="dxa" w:w="100"/>
+              <w:right w:type="dxa" w:w="110"/>
+            </w:tcMar>
+            <w:vAlign w:val="center"/>
+          </w:tcPr>
+          <w:p>
+            <w:pPr>
+              <w:spacing w:after="0"/>
+            </w:pPr>
+            <w:r>
+              <w:rPr>
+                <w:b w:val="false"/>
+                <w:bCs w:val="false"/>
+                <w:i w:val="false"/>
+                <w:iCs w:val="false"/>
+                <w:color w:val="111827"/>
+                <w:sz w:val="14"/>
+                <w:szCs w:val="14"/>
+                <w:caps w:val="false"/>
+              </w:rPr>
+              <w:t xml:space="preserve">{flow_type}</w:t>
+            </w:r>
+          </w:p>
+        </w:tc>
+        <w:tc>
+          <w:tcPr>
+            <w:tcBorders>
+              <w:top w:val="single" w:color="CBD5E1" w:sz="1"/>
+              <w:left w:val="single" w:color="CBD5E1" w:sz="1"/>
+              <w:bottom w:val="single" w:color="CBD5E1" w:sz="1"/>
+              <w:right w:val="single" w:color="CBD5E1" w:sz="1"/>
+            </w:tcBorders>
+            <w:shd w:fill="FFFFFF" w:color="auto" w:val="clear"/>
+            <w:tcMar>
+              <w:top w:type="dxa" w:w="100"/>
+              <w:left w:type="dxa" w:w="110"/>
+              <w:bottom w:type="dxa" w:w="100"/>
+              <w:right w:type="dxa" w:w="110"/>
+            </w:tcMar>
+            <w:vAlign w:val="center"/>
+          </w:tcPr>
+          <w:p>
+            <w:pPr>
+              <w:spacing w:after="0"/>
+            </w:pPr>
+            <w:r>
+              <w:rPr>
+                <w:b w:val="false"/>
+                <w:bCs w:val="false"/>
+                <w:i w:val="false"/>
+                <w:iCs w:val="false"/>
+                <w:color w:val="111827"/>
+                <w:sz w:val="14"/>
+                <w:szCs w:val="14"/>
+                <w:caps w:val="false"/>
+              </w:rPr>
+              <w:t xml:space="preserve">{step_1}</w:t>
+            </w:r>
+          </w:p>
+        </w:tc>
+        <w:tc>
+          <w:tcPr>
+            <w:tcBorders>
+              <w:top w:val="single" w:color="CBD5E1" w:sz="1"/>
+              <w:left w:val="single" w:color="CBD5E1" w:sz="1"/>
+              <w:bottom w:val="single" w:color="CBD5E1" w:sz="1"/>
+              <w:right w:val="single" w:color="CBD5E1" w:sz="1"/>
+            </w:tcBorders>
+            <w:shd w:fill="F8FAFC" w:color="auto" w:val="clear"/>
+            <w:tcMar>
+              <w:top w:type="dxa" w:w="100"/>
+              <w:left w:type="dxa" w:w="110"/>
+              <w:bottom w:type="dxa" w:w="100"/>
+              <w:right w:type="dxa" w:w="110"/>
+            </w:tcMar>
+            <w:vAlign w:val="center"/>
+          </w:tcPr>
+          <w:p>
+            <w:pPr>
+              <w:spacing w:after="0"/>
+            </w:pPr>
+            <w:r>
+              <w:rPr>
+                <w:b w:val="false"/>
+                <w:bCs w:val="false"/>
+                <w:i w:val="false"/>
+                <w:iCs w:val="false"/>
+                <w:color w:val="111827"/>
+                <w:sz w:val="14"/>
+                <w:szCs w:val="14"/>
+                <w:caps w:val="false"/>
+              </w:rPr>
+              <w:t xml:space="preserve">{step_2}</w:t>
+            </w:r>
+          </w:p>
+        </w:tc>
+        <w:tc>
+          <w:tcPr>
+            <w:tcBorders>
+              <w:top w:val="single" w:color="CBD5E1" w:sz="1"/>
+              <w:left w:val="single" w:color="CBD5E1" w:sz="1"/>
+              <w:bottom w:val="single" w:color="CBD5E1" w:sz="1"/>
+              <w:right w:val="single" w:color="CBD5E1" w:sz="1"/>
+            </w:tcBorders>
+            <w:shd w:fill="FFFFFF" w:color="auto" w:val="clear"/>
+            <w:tcMar>
+              <w:top w:type="dxa" w:w="100"/>
+              <w:left w:type="dxa" w:w="110"/>
+              <w:bottom w:type="dxa" w:w="100"/>
+              <w:right w:type="dxa" w:w="110"/>
+            </w:tcMar>
+            <w:vAlign w:val="center"/>
+          </w:tcPr>
+          <w:p>
+            <w:pPr>
+              <w:spacing w:after="0"/>
+            </w:pPr>
+            <w:r>
+              <w:rPr>
+                <w:b w:val="false"/>
+                <w:bCs w:val="false"/>
+                <w:i w:val="false"/>
+                <w:iCs w:val="false"/>
+                <w:color w:val="111827"/>
+                <w:sz w:val="14"/>
+                <w:szCs w:val="14"/>
+                <w:caps w:val="false"/>
+              </w:rPr>
+              <w:t xml:space="preserve">{step_3}</w:t>
+            </w:r>
+          </w:p>
+        </w:tc>
+        <w:tc>
+          <w:tcPr>
+            <w:tcBorders>
+              <w:top w:val="single" w:color="CBD5E1" w:sz="1"/>
+              <w:left w:val="single" w:color="CBD5E1" w:sz="1"/>
+              <w:bottom w:val="single" w:color="CBD5E1" w:sz="1"/>
+              <w:right w:val="single" w:color="CBD5E1" w:sz="1"/>
+            </w:tcBorders>
+            <w:shd w:fill="F8FAFC" w:color="auto" w:val="clear"/>
+            <w:tcMar>
+              <w:top w:type="dxa" w:w="100"/>
+              <w:left w:type="dxa" w:w="110"/>
+              <w:bottom w:type="dxa" w:w="100"/>
+              <w:right w:type="dxa" w:w="110"/>
+            </w:tcMar>
+            <w:vAlign w:val="center"/>
+          </w:tcPr>
+          <w:p>
+            <w:pPr>
+              <w:spacing w:after="0"/>
+            </w:pPr>
+            <w:r>
+              <w:rPr>
+                <w:b w:val="false"/>
+                <w:bCs w:val="false"/>
+                <w:i w:val="false"/>
+                <w:iCs w:val="false"/>
+                <w:color w:val="111827"/>
+                <w:sz w:val="14"/>
+                <w:szCs w:val="14"/>
+                <w:caps w:val="false"/>
+              </w:rPr>
+              <w:t xml:space="preserve">{step_4}</w:t>
+            </w:r>
+          </w:p>
+        </w:tc>
+        <w:tc>
+          <w:tcPr>
+            <w:tcBorders>
+              <w:top w:val="single" w:color="CBD5E1" w:sz="1"/>
+              <w:left w:val="single" w:color="CBD5E1" w:sz="1"/>
+              <w:bottom w:val="single" w:color="CBD5E1" w:sz="1"/>
+              <w:right w:val="single" w:color="CBD5E1" w:sz="1"/>
+            </w:tcBorders>
+            <w:shd w:fill="FFFFFF" w:color="auto" w:val="clear"/>
+            <w:tcMar>
+              <w:top w:type="dxa" w:w="100"/>
+              <w:left w:type="dxa" w:w="110"/>
+              <w:bottom w:type="dxa" w:w="100"/>
+              <w:right w:type="dxa" w:w="110"/>
+            </w:tcMar>
+            <w:vAlign w:val="center"/>
+          </w:tcPr>
+          <w:p>
+            <w:pPr>
+              <w:spacing w:after="0"/>
+            </w:pPr>
+            <w:r>
+              <w:rPr>
+                <w:b w:val="false"/>
+                <w:bCs w:val="false"/>
+                <w:i w:val="false"/>
+                <w:iCs w:val="false"/>
+                <w:color w:val="111827"/>
+                <w:sz w:val="14"/>
+                <w:szCs w:val="14"/>
+                <w:caps w:val="false"/>
+              </w:rPr>
+              <w:t xml:space="preserve">{step_5}</w:t>
+            </w:r>
+          </w:p>
+        </w:tc>
+        <w:tc>
+          <w:tcPr>
+            <w:tcBorders>
+              <w:top w:val="single" w:color="CBD5E1" w:sz="1"/>
+              <w:left w:val="single" w:color="CBD5E1" w:sz="1"/>
+              <w:bottom w:val="single" w:color="CBD5E1" w:sz="1"/>
+              <w:right w:val="single" w:color="CBD5E1" w:sz="1"/>
+            </w:tcBorders>
+            <w:shd w:fill="F8FAFC" w:color="auto" w:val="clear"/>
+            <w:tcMar>
+              <w:top w:type="dxa" w:w="100"/>
+              <w:left w:type="dxa" w:w="110"/>
+              <w:bottom w:type="dxa" w:w="100"/>
+              <w:right w:type="dxa" w:w="110"/>
+            </w:tcMar>
+            <w:vAlign w:val="center"/>
+          </w:tcPr>
+          <w:p>
+            <w:pPr>
+              <w:spacing w:after="0"/>
+            </w:pPr>
+            <w:r>
+              <w:rPr>
+                <w:b w:val="false"/>
+                <w:bCs w:val="false"/>
+                <w:i w:val="false"/>
+                <w:iCs w:val="false"/>
+                <w:color w:val="111827"/>
+                <w:sz w:val="14"/>
+                <w:szCs w:val="14"/>
+                <w:caps w:val="false"/>
+              </w:rPr>
+              <w:t xml:space="preserve">{step_6}</w:t>
+            </w:r>
+          </w:p>
+        </w:tc>
+        <w:tc>
+          <w:tcPr>
+            <w:tcBorders>
+              <w:top w:val="single" w:color="CBD5E1" w:sz="1"/>
+              <w:left w:val="single" w:color="CBD5E1" w:sz="1"/>
+              <w:bottom w:val="single" w:color="CBD5E1" w:sz="1"/>
+              <w:right w:val="single" w:color="CBD5E1" w:sz="1"/>
+            </w:tcBorders>
+            <w:shd w:fill="FFFFFF" w:color="auto" w:val="clear"/>
+            <w:tcMar>
+              <w:top w:type="dxa" w:w="100"/>
+              <w:left w:type="dxa" w:w="110"/>
+              <w:bottom w:type="dxa" w:w="100"/>
+              <w:right w:type="dxa" w:w="110"/>
+            </w:tcMar>
+            <w:vAlign w:val="center"/>
+          </w:tcPr>
+          <w:p>
+            <w:pPr>
+              <w:spacing w:after="0"/>
+            </w:pPr>
+            <w:r>
+              <w:rPr>
+                <w:b w:val="false"/>
+                <w:bCs w:val="false"/>
+                <w:i w:val="false"/>
+                <w:iCs w:val="false"/>
+                <w:color w:val="111827"/>
+                <w:sz w:val="14"/>
+                <w:szCs w:val="14"/>
+                <w:caps w:val="false"/>
+              </w:rPr>
+              <w:t xml:space="preserve">{overflow_note}{/flow_visuals}</w:t>
+            </w:r>
+          </w:p>
+        </w:tc>
+      </w:tr>
+    </w:tbl>
+    <w:p>
+      <w:pPr>
+        <w:pStyle w:val="Heading2"/>
+        <w:spacing w:before="220" w:after="120" w:line="276"/>
+      </w:pPr>
+      <w:r>
+        <w:rPr>
+          <w:b/>
+          <w:bCs/>
+          <w:i w:val="false"/>
+          <w:iCs w:val="false"/>
+          <w:color w:val="111827"/>
+          <w:sz w:val="22"/>
+          <w:szCs w:val="22"/>
+          <w:caps w:val="false"/>
+        </w:rPr>
+        <w:t xml:space="preserve">Detalhamento do fluxo</w:t>
       </w:r>
     </w:p>
     <w:tbl>

</xml_diff>

<commit_message>
Document backup and enhance flow radar DOCX output
Document backup and enhance flow radar DOCX output

- document backup branch/tag, current premises, completed work, gaps, and next steps
- add flow_visuals and radar summary data to the report model
- improve the clean DOCX template with horizontal editable flow output
- enhance the gap radar with summary, score labels, and risk levels
- keep the template generated from the official script and guardrail-compatible
</commit_message>
<xml_diff>
--- a/backend/templates/assessment-operational-template.docx
+++ b/backend/templates/assessment-operational-template.docx
@@ -2941,6 +2941,99 @@
       <w:tblGrid>
         <w:gridCol w:w="100"/>
         <w:gridCol w:w="100"/>
+      </w:tblGrid>
+      <w:tr>
+        <w:tc>
+          <w:tcPr>
+            <w:tcBorders>
+              <w:top w:val="single" w:color="CBD5E1" w:sz="1"/>
+              <w:left w:val="single" w:color="CBD5E1" w:sz="1"/>
+              <w:bottom w:val="single" w:color="CBD5E1" w:sz="1"/>
+              <w:right w:val="single" w:color="CBD5E1" w:sz="1"/>
+            </w:tcBorders>
+            <w:shd w:fill="FEF3C7" w:color="auto" w:val="clear"/>
+            <w:tcMar>
+              <w:top w:type="dxa" w:w="100"/>
+              <w:left w:type="dxa" w:w="110"/>
+              <w:bottom w:type="dxa" w:w="100"/>
+              <w:right w:type="dxa" w:w="110"/>
+            </w:tcMar>
+            <w:vAlign w:val="center"/>
+          </w:tcPr>
+          <w:p>
+            <w:pPr>
+              <w:spacing w:after="0"/>
+            </w:pPr>
+            <w:r>
+              <w:rPr>
+                <w:b/>
+                <w:bCs/>
+                <w:i w:val="false"/>
+                <w:iCs w:val="false"/>
+                <w:color w:val="1E3A8A"/>
+                <w:sz w:val="18"/>
+                <w:szCs w:val="18"/>
+                <w:caps w:val="false"/>
+              </w:rPr>
+              <w:t xml:space="preserve">Leitura executiva do radar</w:t>
+            </w:r>
+          </w:p>
+        </w:tc>
+        <w:tc>
+          <w:tcPr>
+            <w:tcBorders>
+              <w:top w:val="single" w:color="CBD5E1" w:sz="1"/>
+              <w:left w:val="single" w:color="CBD5E1" w:sz="1"/>
+              <w:bottom w:val="single" w:color="CBD5E1" w:sz="1"/>
+              <w:right w:val="single" w:color="CBD5E1" w:sz="1"/>
+            </w:tcBorders>
+            <w:shd w:fill="FEF3C7" w:color="auto" w:val="clear"/>
+            <w:tcMar>
+              <w:top w:type="dxa" w:w="100"/>
+              <w:left w:type="dxa" w:w="110"/>
+              <w:bottom w:type="dxa" w:w="100"/>
+              <w:right w:type="dxa" w:w="110"/>
+            </w:tcMar>
+            <w:vAlign w:val="center"/>
+          </w:tcPr>
+          <w:p>
+            <w:pPr>
+              <w:spacing w:after="0"/>
+            </w:pPr>
+            <w:r>
+              <w:rPr>
+                <w:b w:val="false"/>
+                <w:bCs w:val="false"/>
+                <w:i w:val="false"/>
+                <w:iCs w:val="false"/>
+                <w:color w:val="111827"/>
+                <w:sz w:val="18"/>
+                <w:szCs w:val="18"/>
+                <w:caps w:val="false"/>
+              </w:rPr>
+              <w:t xml:space="preserve">{gap_radar_summary}</w:t>
+            </w:r>
+          </w:p>
+        </w:tc>
+      </w:tr>
+    </w:tbl>
+    <w:tbl>
+      <w:tblPr>
+        <w:tblW w:type="pct" w:w="100%"/>
+        <w:tblBorders>
+          <w:top w:val="single" w:color="auto" w:sz="4"/>
+          <w:left w:val="single" w:color="auto" w:sz="4"/>
+          <w:bottom w:val="single" w:color="auto" w:sz="4"/>
+          <w:right w:val="single" w:color="auto" w:sz="4"/>
+          <w:insideH w:val="single" w:color="auto" w:sz="4"/>
+          <w:insideV w:val="single" w:color="auto" w:sz="4"/>
+        </w:tblBorders>
+        <w:tblLayout w:type="fixed"/>
+      </w:tblPr>
+      <w:tblGrid>
+        <w:gridCol w:w="100"/>
+        <w:gridCol w:w="100"/>
+        <w:gridCol w:w="100"/>
         <w:gridCol w:w="100"/>
         <w:gridCol w:w="100"/>
         <w:gridCol w:w="100"/>
@@ -3282,6 +3375,43 @@
                 <w:szCs w:val="15"/>
                 <w:caps/>
               </w:rPr>
+              <w:t xml:space="preserve">Nivel</w:t>
+            </w:r>
+          </w:p>
+        </w:tc>
+        <w:tc>
+          <w:tcPr>
+            <w:tcBorders>
+              <w:top w:val="single" w:color="CBD5E1" w:sz="1"/>
+              <w:left w:val="single" w:color="CBD5E1" w:sz="1"/>
+              <w:bottom w:val="single" w:color="CBD5E1" w:sz="1"/>
+              <w:right w:val="single" w:color="CBD5E1" w:sz="1"/>
+            </w:tcBorders>
+            <w:shd w:fill="2555D9" w:color="auto" w:val="clear"/>
+            <w:tcMar>
+              <w:top w:type="dxa" w:w="100"/>
+              <w:left w:type="dxa" w:w="110"/>
+              <w:bottom w:type="dxa" w:w="100"/>
+              <w:right w:type="dxa" w:w="110"/>
+            </w:tcMar>
+            <w:vAlign w:val="center"/>
+          </w:tcPr>
+          <w:p>
+            <w:pPr>
+              <w:spacing w:after="0"/>
+              <w:jc w:val="center"/>
+            </w:pPr>
+            <w:r>
+              <w:rPr>
+                <w:b/>
+                <w:bCs/>
+                <w:i w:val="false"/>
+                <w:iCs w:val="false"/>
+                <w:color w:val="FFFFFF"/>
+                <w:sz w:val="15"/>
+                <w:szCs w:val="15"/>
+                <w:caps/>
+              </w:rPr>
               <w:t xml:space="preserve">Gaps fonte</w:t>
             </w:r>
           </w:p>
@@ -3572,7 +3702,7 @@
                 <w:szCs w:val="16"/>
                 <w:caps w:val="false"/>
               </w:rPr>
-              <w:t xml:space="preserve">{score}</w:t>
+              <w:t xml:space="preserve">{score_label}</w:t>
             </w:r>
           </w:p>
         </w:tc>
@@ -3585,6 +3715,42 @@
               <w:right w:val="single" w:color="CBD5E1" w:sz="1"/>
             </w:tcBorders>
             <w:shd w:fill="FFFFFF" w:color="auto" w:val="clear"/>
+            <w:tcMar>
+              <w:top w:type="dxa" w:w="100"/>
+              <w:left w:type="dxa" w:w="110"/>
+              <w:bottom w:type="dxa" w:w="100"/>
+              <w:right w:type="dxa" w:w="110"/>
+            </w:tcMar>
+            <w:vAlign w:val="center"/>
+          </w:tcPr>
+          <w:p>
+            <w:pPr>
+              <w:spacing w:after="0"/>
+            </w:pPr>
+            <w:r>
+              <w:rPr>
+                <w:b w:val="false"/>
+                <w:bCs w:val="false"/>
+                <w:i w:val="false"/>
+                <w:iCs w:val="false"/>
+                <w:color w:val="111827"/>
+                <w:sz w:val="16"/>
+                <w:szCs w:val="16"/>
+                <w:caps w:val="false"/>
+              </w:rPr>
+              <w:t xml:space="preserve">{risk_level}</w:t>
+            </w:r>
+          </w:p>
+        </w:tc>
+        <w:tc>
+          <w:tcPr>
+            <w:tcBorders>
+              <w:top w:val="single" w:color="CBD5E1" w:sz="1"/>
+              <w:left w:val="single" w:color="CBD5E1" w:sz="1"/>
+              <w:bottom w:val="single" w:color="CBD5E1" w:sz="1"/>
+              <w:right w:val="single" w:color="CBD5E1" w:sz="1"/>
+            </w:tcBorders>
+            <w:shd w:fill="F8FAFC" w:color="auto" w:val="clear"/>
             <w:tcMar>
               <w:top w:type="dxa" w:w="100"/>
               <w:left w:type="dxa" w:w="110"/>
@@ -4178,6 +4344,733 @@
           <w:szCs w:val="20"/>
           <w:caps w:val="false"/>
         </w:rPr>
+      </w:r>
+    </w:p>
+    <w:p>
+      <w:pPr>
+        <w:pStyle w:val="Heading2"/>
+        <w:spacing w:before="0" w:after="120" w:line="276"/>
+      </w:pPr>
+      <w:r>
+        <w:rPr>
+          <w:b/>
+          <w:bCs/>
+          <w:i w:val="false"/>
+          <w:iCs w:val="false"/>
+          <w:color w:val="111827"/>
+          <w:sz w:val="22"/>
+          <w:szCs w:val="22"/>
+          <w:caps w:val="false"/>
+        </w:rPr>
+        <w:t xml:space="preserve">Fluxo visual resumido</w:t>
+      </w:r>
+    </w:p>
+    <w:tbl>
+      <w:tblPr>
+        <w:tblW w:type="pct" w:w="100%"/>
+        <w:tblBorders>
+          <w:top w:val="single" w:color="auto" w:sz="4"/>
+          <w:left w:val="single" w:color="auto" w:sz="4"/>
+          <w:bottom w:val="single" w:color="auto" w:sz="4"/>
+          <w:right w:val="single" w:color="auto" w:sz="4"/>
+          <w:insideH w:val="single" w:color="auto" w:sz="4"/>
+          <w:insideV w:val="single" w:color="auto" w:sz="4"/>
+        </w:tblBorders>
+        <w:tblLayout w:type="fixed"/>
+      </w:tblPr>
+      <w:tblGrid>
+        <w:gridCol w:w="100"/>
+        <w:gridCol w:w="100"/>
+        <w:gridCol w:w="100"/>
+        <w:gridCol w:w="100"/>
+        <w:gridCol w:w="100"/>
+        <w:gridCol w:w="100"/>
+        <w:gridCol w:w="100"/>
+        <w:gridCol w:w="100"/>
+        <w:gridCol w:w="100"/>
+      </w:tblGrid>
+      <w:tr>
+        <w:trPr>
+          <w:tblHeader/>
+        </w:trPr>
+        <w:tc>
+          <w:tcPr>
+            <w:tcBorders>
+              <w:top w:val="single" w:color="CBD5E1" w:sz="1"/>
+              <w:left w:val="single" w:color="CBD5E1" w:sz="1"/>
+              <w:bottom w:val="single" w:color="CBD5E1" w:sz="1"/>
+              <w:right w:val="single" w:color="CBD5E1" w:sz="1"/>
+            </w:tcBorders>
+            <w:shd w:fill="2555D9" w:color="auto" w:val="clear"/>
+            <w:tcMar>
+              <w:top w:type="dxa" w:w="100"/>
+              <w:left w:type="dxa" w:w="110"/>
+              <w:bottom w:type="dxa" w:w="100"/>
+              <w:right w:type="dxa" w:w="110"/>
+            </w:tcMar>
+            <w:vAlign w:val="center"/>
+          </w:tcPr>
+          <w:p>
+            <w:pPr>
+              <w:spacing w:after="0"/>
+              <w:jc w:val="center"/>
+            </w:pPr>
+            <w:r>
+              <w:rPr>
+                <w:b/>
+                <w:bCs/>
+                <w:i w:val="false"/>
+                <w:iCs w:val="false"/>
+                <w:color w:val="FFFFFF"/>
+                <w:sz w:val="15"/>
+                <w:szCs w:val="15"/>
+                <w:caps/>
+              </w:rPr>
+              <w:t xml:space="preserve">Fluxo</w:t>
+            </w:r>
+          </w:p>
+        </w:tc>
+        <w:tc>
+          <w:tcPr>
+            <w:tcBorders>
+              <w:top w:val="single" w:color="CBD5E1" w:sz="1"/>
+              <w:left w:val="single" w:color="CBD5E1" w:sz="1"/>
+              <w:bottom w:val="single" w:color="CBD5E1" w:sz="1"/>
+              <w:right w:val="single" w:color="CBD5E1" w:sz="1"/>
+            </w:tcBorders>
+            <w:shd w:fill="2555D9" w:color="auto" w:val="clear"/>
+            <w:tcMar>
+              <w:top w:type="dxa" w:w="100"/>
+              <w:left w:type="dxa" w:w="110"/>
+              <w:bottom w:type="dxa" w:w="100"/>
+              <w:right w:type="dxa" w:w="110"/>
+            </w:tcMar>
+            <w:vAlign w:val="center"/>
+          </w:tcPr>
+          <w:p>
+            <w:pPr>
+              <w:spacing w:after="0"/>
+              <w:jc w:val="center"/>
+            </w:pPr>
+            <w:r>
+              <w:rPr>
+                <w:b/>
+                <w:bCs/>
+                <w:i w:val="false"/>
+                <w:iCs w:val="false"/>
+                <w:color w:val="FFFFFF"/>
+                <w:sz w:val="15"/>
+                <w:szCs w:val="15"/>
+                <w:caps/>
+              </w:rPr>
+              <w:t xml:space="preserve">Tipo</w:t>
+            </w:r>
+          </w:p>
+        </w:tc>
+        <w:tc>
+          <w:tcPr>
+            <w:tcBorders>
+              <w:top w:val="single" w:color="CBD5E1" w:sz="1"/>
+              <w:left w:val="single" w:color="CBD5E1" w:sz="1"/>
+              <w:bottom w:val="single" w:color="CBD5E1" w:sz="1"/>
+              <w:right w:val="single" w:color="CBD5E1" w:sz="1"/>
+            </w:tcBorders>
+            <w:shd w:fill="2555D9" w:color="auto" w:val="clear"/>
+            <w:tcMar>
+              <w:top w:type="dxa" w:w="100"/>
+              <w:left w:type="dxa" w:w="110"/>
+              <w:bottom w:type="dxa" w:w="100"/>
+              <w:right w:type="dxa" w:w="110"/>
+            </w:tcMar>
+            <w:vAlign w:val="center"/>
+          </w:tcPr>
+          <w:p>
+            <w:pPr>
+              <w:spacing w:after="0"/>
+              <w:jc w:val="center"/>
+            </w:pPr>
+            <w:r>
+              <w:rPr>
+                <w:b/>
+                <w:bCs/>
+                <w:i w:val="false"/>
+                <w:iCs w:val="false"/>
+                <w:color w:val="FFFFFF"/>
+                <w:sz w:val="15"/>
+                <w:szCs w:val="15"/>
+                <w:caps/>
+              </w:rPr>
+              <w:t xml:space="preserve">Etapa 1</w:t>
+            </w:r>
+          </w:p>
+        </w:tc>
+        <w:tc>
+          <w:tcPr>
+            <w:tcBorders>
+              <w:top w:val="single" w:color="CBD5E1" w:sz="1"/>
+              <w:left w:val="single" w:color="CBD5E1" w:sz="1"/>
+              <w:bottom w:val="single" w:color="CBD5E1" w:sz="1"/>
+              <w:right w:val="single" w:color="CBD5E1" w:sz="1"/>
+            </w:tcBorders>
+            <w:shd w:fill="2555D9" w:color="auto" w:val="clear"/>
+            <w:tcMar>
+              <w:top w:type="dxa" w:w="100"/>
+              <w:left w:type="dxa" w:w="110"/>
+              <w:bottom w:type="dxa" w:w="100"/>
+              <w:right w:type="dxa" w:w="110"/>
+            </w:tcMar>
+            <w:vAlign w:val="center"/>
+          </w:tcPr>
+          <w:p>
+            <w:pPr>
+              <w:spacing w:after="0"/>
+              <w:jc w:val="center"/>
+            </w:pPr>
+            <w:r>
+              <w:rPr>
+                <w:b/>
+                <w:bCs/>
+                <w:i w:val="false"/>
+                <w:iCs w:val="false"/>
+                <w:color w:val="FFFFFF"/>
+                <w:sz w:val="15"/>
+                <w:szCs w:val="15"/>
+                <w:caps/>
+              </w:rPr>
+              <w:t xml:space="preserve">Etapa 2</w:t>
+            </w:r>
+          </w:p>
+        </w:tc>
+        <w:tc>
+          <w:tcPr>
+            <w:tcBorders>
+              <w:top w:val="single" w:color="CBD5E1" w:sz="1"/>
+              <w:left w:val="single" w:color="CBD5E1" w:sz="1"/>
+              <w:bottom w:val="single" w:color="CBD5E1" w:sz="1"/>
+              <w:right w:val="single" w:color="CBD5E1" w:sz="1"/>
+            </w:tcBorders>
+            <w:shd w:fill="2555D9" w:color="auto" w:val="clear"/>
+            <w:tcMar>
+              <w:top w:type="dxa" w:w="100"/>
+              <w:left w:type="dxa" w:w="110"/>
+              <w:bottom w:type="dxa" w:w="100"/>
+              <w:right w:type="dxa" w:w="110"/>
+            </w:tcMar>
+            <w:vAlign w:val="center"/>
+          </w:tcPr>
+          <w:p>
+            <w:pPr>
+              <w:spacing w:after="0"/>
+              <w:jc w:val="center"/>
+            </w:pPr>
+            <w:r>
+              <w:rPr>
+                <w:b/>
+                <w:bCs/>
+                <w:i w:val="false"/>
+                <w:iCs w:val="false"/>
+                <w:color w:val="FFFFFF"/>
+                <w:sz w:val="15"/>
+                <w:szCs w:val="15"/>
+                <w:caps/>
+              </w:rPr>
+              <w:t xml:space="preserve">Etapa 3</w:t>
+            </w:r>
+          </w:p>
+        </w:tc>
+        <w:tc>
+          <w:tcPr>
+            <w:tcBorders>
+              <w:top w:val="single" w:color="CBD5E1" w:sz="1"/>
+              <w:left w:val="single" w:color="CBD5E1" w:sz="1"/>
+              <w:bottom w:val="single" w:color="CBD5E1" w:sz="1"/>
+              <w:right w:val="single" w:color="CBD5E1" w:sz="1"/>
+            </w:tcBorders>
+            <w:shd w:fill="2555D9" w:color="auto" w:val="clear"/>
+            <w:tcMar>
+              <w:top w:type="dxa" w:w="100"/>
+              <w:left w:type="dxa" w:w="110"/>
+              <w:bottom w:type="dxa" w:w="100"/>
+              <w:right w:type="dxa" w:w="110"/>
+            </w:tcMar>
+            <w:vAlign w:val="center"/>
+          </w:tcPr>
+          <w:p>
+            <w:pPr>
+              <w:spacing w:after="0"/>
+              <w:jc w:val="center"/>
+            </w:pPr>
+            <w:r>
+              <w:rPr>
+                <w:b/>
+                <w:bCs/>
+                <w:i w:val="false"/>
+                <w:iCs w:val="false"/>
+                <w:color w:val="FFFFFF"/>
+                <w:sz w:val="15"/>
+                <w:szCs w:val="15"/>
+                <w:caps/>
+              </w:rPr>
+              <w:t xml:space="preserve">Etapa 4</w:t>
+            </w:r>
+          </w:p>
+        </w:tc>
+        <w:tc>
+          <w:tcPr>
+            <w:tcBorders>
+              <w:top w:val="single" w:color="CBD5E1" w:sz="1"/>
+              <w:left w:val="single" w:color="CBD5E1" w:sz="1"/>
+              <w:bottom w:val="single" w:color="CBD5E1" w:sz="1"/>
+              <w:right w:val="single" w:color="CBD5E1" w:sz="1"/>
+            </w:tcBorders>
+            <w:shd w:fill="2555D9" w:color="auto" w:val="clear"/>
+            <w:tcMar>
+              <w:top w:type="dxa" w:w="100"/>
+              <w:left w:type="dxa" w:w="110"/>
+              <w:bottom w:type="dxa" w:w="100"/>
+              <w:right w:type="dxa" w:w="110"/>
+            </w:tcMar>
+            <w:vAlign w:val="center"/>
+          </w:tcPr>
+          <w:p>
+            <w:pPr>
+              <w:spacing w:after="0"/>
+              <w:jc w:val="center"/>
+            </w:pPr>
+            <w:r>
+              <w:rPr>
+                <w:b/>
+                <w:bCs/>
+                <w:i w:val="false"/>
+                <w:iCs w:val="false"/>
+                <w:color w:val="FFFFFF"/>
+                <w:sz w:val="15"/>
+                <w:szCs w:val="15"/>
+                <w:caps/>
+              </w:rPr>
+              <w:t xml:space="preserve">Etapa 5</w:t>
+            </w:r>
+          </w:p>
+        </w:tc>
+        <w:tc>
+          <w:tcPr>
+            <w:tcBorders>
+              <w:top w:val="single" w:color="CBD5E1" w:sz="1"/>
+              <w:left w:val="single" w:color="CBD5E1" w:sz="1"/>
+              <w:bottom w:val="single" w:color="CBD5E1" w:sz="1"/>
+              <w:right w:val="single" w:color="CBD5E1" w:sz="1"/>
+            </w:tcBorders>
+            <w:shd w:fill="2555D9" w:color="auto" w:val="clear"/>
+            <w:tcMar>
+              <w:top w:type="dxa" w:w="100"/>
+              <w:left w:type="dxa" w:w="110"/>
+              <w:bottom w:type="dxa" w:w="100"/>
+              <w:right w:type="dxa" w:w="110"/>
+            </w:tcMar>
+            <w:vAlign w:val="center"/>
+          </w:tcPr>
+          <w:p>
+            <w:pPr>
+              <w:spacing w:after="0"/>
+              <w:jc w:val="center"/>
+            </w:pPr>
+            <w:r>
+              <w:rPr>
+                <w:b/>
+                <w:bCs/>
+                <w:i w:val="false"/>
+                <w:iCs w:val="false"/>
+                <w:color w:val="FFFFFF"/>
+                <w:sz w:val="15"/>
+                <w:szCs w:val="15"/>
+                <w:caps/>
+              </w:rPr>
+              <w:t xml:space="preserve">Etapa 6</w:t>
+            </w:r>
+          </w:p>
+        </w:tc>
+        <w:tc>
+          <w:tcPr>
+            <w:tcBorders>
+              <w:top w:val="single" w:color="CBD5E1" w:sz="1"/>
+              <w:left w:val="single" w:color="CBD5E1" w:sz="1"/>
+              <w:bottom w:val="single" w:color="CBD5E1" w:sz="1"/>
+              <w:right w:val="single" w:color="CBD5E1" w:sz="1"/>
+            </w:tcBorders>
+            <w:shd w:fill="2555D9" w:color="auto" w:val="clear"/>
+            <w:tcMar>
+              <w:top w:type="dxa" w:w="100"/>
+              <w:left w:type="dxa" w:w="110"/>
+              <w:bottom w:type="dxa" w:w="100"/>
+              <w:right w:type="dxa" w:w="110"/>
+            </w:tcMar>
+            <w:vAlign w:val="center"/>
+          </w:tcPr>
+          <w:p>
+            <w:pPr>
+              <w:spacing w:after="0"/>
+              <w:jc w:val="center"/>
+            </w:pPr>
+            <w:r>
+              <w:rPr>
+                <w:b/>
+                <w:bCs/>
+                <w:i w:val="false"/>
+                <w:iCs w:val="false"/>
+                <w:color w:val="FFFFFF"/>
+                <w:sz w:val="15"/>
+                <w:szCs w:val="15"/>
+                <w:caps/>
+              </w:rPr>
+              <w:t xml:space="preserve">Observacao</w:t>
+            </w:r>
+          </w:p>
+        </w:tc>
+      </w:tr>
+      <w:tr>
+        <w:tc>
+          <w:tcPr>
+            <w:tcBorders>
+              <w:top w:val="single" w:color="CBD5E1" w:sz="1"/>
+              <w:left w:val="single" w:color="CBD5E1" w:sz="1"/>
+              <w:bottom w:val="single" w:color="CBD5E1" w:sz="1"/>
+              <w:right w:val="single" w:color="CBD5E1" w:sz="1"/>
+            </w:tcBorders>
+            <w:shd w:fill="FFFFFF" w:color="auto" w:val="clear"/>
+            <w:tcMar>
+              <w:top w:type="dxa" w:w="100"/>
+              <w:left w:type="dxa" w:w="110"/>
+              <w:bottom w:type="dxa" w:w="100"/>
+              <w:right w:type="dxa" w:w="110"/>
+            </w:tcMar>
+            <w:vAlign w:val="center"/>
+          </w:tcPr>
+          <w:p>
+            <w:pPr>
+              <w:spacing w:after="0"/>
+            </w:pPr>
+            <w:r>
+              <w:rPr>
+                <w:b w:val="false"/>
+                <w:bCs w:val="false"/>
+                <w:i w:val="false"/>
+                <w:iCs w:val="false"/>
+                <w:color w:val="111827"/>
+                <w:sz w:val="14"/>
+                <w:szCs w:val="14"/>
+                <w:caps w:val="false"/>
+              </w:rPr>
+              <w:t xml:space="preserve">{#flow_visuals}{flow_name}</w:t>
+            </w:r>
+          </w:p>
+        </w:tc>
+        <w:tc>
+          <w:tcPr>
+            <w:tcBorders>
+              <w:top w:val="single" w:color="CBD5E1" w:sz="1"/>
+              <w:left w:val="single" w:color="CBD5E1" w:sz="1"/>
+              <w:bottom w:val="single" w:color="CBD5E1" w:sz="1"/>
+              <w:right w:val="single" w:color="CBD5E1" w:sz="1"/>
+            </w:tcBorders>
+            <w:shd w:fill="F8FAFC" w:color="auto" w:val="clear"/>
+            <w:tcMar>
+              <w:top w:type="dxa" w:w="100"/>
+              <w:left w:type="dxa" w:w="110"/>
+              <w:bottom w:type="dxa" w:w="100"/>
+              <w:right w:type="dxa" w:w="110"/>
+            </w:tcMar>
+            <w:vAlign w:val="center"/>
+          </w:tcPr>
+          <w:p>
+            <w:pPr>
+              <w:spacing w:after="0"/>
+            </w:pPr>
+            <w:r>
+              <w:rPr>
+                <w:b w:val="false"/>
+                <w:bCs w:val="false"/>
+                <w:i w:val="false"/>
+                <w:iCs w:val="false"/>
+                <w:color w:val="111827"/>
+                <w:sz w:val="14"/>
+                <w:szCs w:val="14"/>
+                <w:caps w:val="false"/>
+              </w:rPr>
+              <w:t xml:space="preserve">{flow_type}</w:t>
+            </w:r>
+          </w:p>
+        </w:tc>
+        <w:tc>
+          <w:tcPr>
+            <w:tcBorders>
+              <w:top w:val="single" w:color="CBD5E1" w:sz="1"/>
+              <w:left w:val="single" w:color="CBD5E1" w:sz="1"/>
+              <w:bottom w:val="single" w:color="CBD5E1" w:sz="1"/>
+              <w:right w:val="single" w:color="CBD5E1" w:sz="1"/>
+            </w:tcBorders>
+            <w:shd w:fill="FFFFFF" w:color="auto" w:val="clear"/>
+            <w:tcMar>
+              <w:top w:type="dxa" w:w="100"/>
+              <w:left w:type="dxa" w:w="110"/>
+              <w:bottom w:type="dxa" w:w="100"/>
+              <w:right w:type="dxa" w:w="110"/>
+            </w:tcMar>
+            <w:vAlign w:val="center"/>
+          </w:tcPr>
+          <w:p>
+            <w:pPr>
+              <w:spacing w:after="0"/>
+            </w:pPr>
+            <w:r>
+              <w:rPr>
+                <w:b w:val="false"/>
+                <w:bCs w:val="false"/>
+                <w:i w:val="false"/>
+                <w:iCs w:val="false"/>
+                <w:color w:val="111827"/>
+                <w:sz w:val="14"/>
+                <w:szCs w:val="14"/>
+                <w:caps w:val="false"/>
+              </w:rPr>
+              <w:t xml:space="preserve">{step_1}</w:t>
+            </w:r>
+          </w:p>
+        </w:tc>
+        <w:tc>
+          <w:tcPr>
+            <w:tcBorders>
+              <w:top w:val="single" w:color="CBD5E1" w:sz="1"/>
+              <w:left w:val="single" w:color="CBD5E1" w:sz="1"/>
+              <w:bottom w:val="single" w:color="CBD5E1" w:sz="1"/>
+              <w:right w:val="single" w:color="CBD5E1" w:sz="1"/>
+            </w:tcBorders>
+            <w:shd w:fill="F8FAFC" w:color="auto" w:val="clear"/>
+            <w:tcMar>
+              <w:top w:type="dxa" w:w="100"/>
+              <w:left w:type="dxa" w:w="110"/>
+              <w:bottom w:type="dxa" w:w="100"/>
+              <w:right w:type="dxa" w:w="110"/>
+            </w:tcMar>
+            <w:vAlign w:val="center"/>
+          </w:tcPr>
+          <w:p>
+            <w:pPr>
+              <w:spacing w:after="0"/>
+            </w:pPr>
+            <w:r>
+              <w:rPr>
+                <w:b w:val="false"/>
+                <w:bCs w:val="false"/>
+                <w:i w:val="false"/>
+                <w:iCs w:val="false"/>
+                <w:color w:val="111827"/>
+                <w:sz w:val="14"/>
+                <w:szCs w:val="14"/>
+                <w:caps w:val="false"/>
+              </w:rPr>
+              <w:t xml:space="preserve">{step_2}</w:t>
+            </w:r>
+          </w:p>
+        </w:tc>
+        <w:tc>
+          <w:tcPr>
+            <w:tcBorders>
+              <w:top w:val="single" w:color="CBD5E1" w:sz="1"/>
+              <w:left w:val="single" w:color="CBD5E1" w:sz="1"/>
+              <w:bottom w:val="single" w:color="CBD5E1" w:sz="1"/>
+              <w:right w:val="single" w:color="CBD5E1" w:sz="1"/>
+            </w:tcBorders>
+            <w:shd w:fill="FFFFFF" w:color="auto" w:val="clear"/>
+            <w:tcMar>
+              <w:top w:type="dxa" w:w="100"/>
+              <w:left w:type="dxa" w:w="110"/>
+              <w:bottom w:type="dxa" w:w="100"/>
+              <w:right w:type="dxa" w:w="110"/>
+            </w:tcMar>
+            <w:vAlign w:val="center"/>
+          </w:tcPr>
+          <w:p>
+            <w:pPr>
+              <w:spacing w:after="0"/>
+            </w:pPr>
+            <w:r>
+              <w:rPr>
+                <w:b w:val="false"/>
+                <w:bCs w:val="false"/>
+                <w:i w:val="false"/>
+                <w:iCs w:val="false"/>
+                <w:color w:val="111827"/>
+                <w:sz w:val="14"/>
+                <w:szCs w:val="14"/>
+                <w:caps w:val="false"/>
+              </w:rPr>
+              <w:t xml:space="preserve">{step_3}</w:t>
+            </w:r>
+          </w:p>
+        </w:tc>
+        <w:tc>
+          <w:tcPr>
+            <w:tcBorders>
+              <w:top w:val="single" w:color="CBD5E1" w:sz="1"/>
+              <w:left w:val="single" w:color="CBD5E1" w:sz="1"/>
+              <w:bottom w:val="single" w:color="CBD5E1" w:sz="1"/>
+              <w:right w:val="single" w:color="CBD5E1" w:sz="1"/>
+            </w:tcBorders>
+            <w:shd w:fill="F8FAFC" w:color="auto" w:val="clear"/>
+            <w:tcMar>
+              <w:top w:type="dxa" w:w="100"/>
+              <w:left w:type="dxa" w:w="110"/>
+              <w:bottom w:type="dxa" w:w="100"/>
+              <w:right w:type="dxa" w:w="110"/>
+            </w:tcMar>
+            <w:vAlign w:val="center"/>
+          </w:tcPr>
+          <w:p>
+            <w:pPr>
+              <w:spacing w:after="0"/>
+            </w:pPr>
+            <w:r>
+              <w:rPr>
+                <w:b w:val="false"/>
+                <w:bCs w:val="false"/>
+                <w:i w:val="false"/>
+                <w:iCs w:val="false"/>
+                <w:color w:val="111827"/>
+                <w:sz w:val="14"/>
+                <w:szCs w:val="14"/>
+                <w:caps w:val="false"/>
+              </w:rPr>
+              <w:t xml:space="preserve">{step_4}</w:t>
+            </w:r>
+          </w:p>
+        </w:tc>
+        <w:tc>
+          <w:tcPr>
+            <w:tcBorders>
+              <w:top w:val="single" w:color="CBD5E1" w:sz="1"/>
+              <w:left w:val="single" w:color="CBD5E1" w:sz="1"/>
+              <w:bottom w:val="single" w:color="CBD5E1" w:sz="1"/>
+              <w:right w:val="single" w:color="CBD5E1" w:sz="1"/>
+            </w:tcBorders>
+            <w:shd w:fill="FFFFFF" w:color="auto" w:val="clear"/>
+            <w:tcMar>
+              <w:top w:type="dxa" w:w="100"/>
+              <w:left w:type="dxa" w:w="110"/>
+              <w:bottom w:type="dxa" w:w="100"/>
+              <w:right w:type="dxa" w:w="110"/>
+            </w:tcMar>
+            <w:vAlign w:val="center"/>
+          </w:tcPr>
+          <w:p>
+            <w:pPr>
+              <w:spacing w:after="0"/>
+            </w:pPr>
+            <w:r>
+              <w:rPr>
+                <w:b w:val="false"/>
+                <w:bCs w:val="false"/>
+                <w:i w:val="false"/>
+                <w:iCs w:val="false"/>
+                <w:color w:val="111827"/>
+                <w:sz w:val="14"/>
+                <w:szCs w:val="14"/>
+                <w:caps w:val="false"/>
+              </w:rPr>
+              <w:t xml:space="preserve">{step_5}</w:t>
+            </w:r>
+          </w:p>
+        </w:tc>
+        <w:tc>
+          <w:tcPr>
+            <w:tcBorders>
+              <w:top w:val="single" w:color="CBD5E1" w:sz="1"/>
+              <w:left w:val="single" w:color="CBD5E1" w:sz="1"/>
+              <w:bottom w:val="single" w:color="CBD5E1" w:sz="1"/>
+              <w:right w:val="single" w:color="CBD5E1" w:sz="1"/>
+            </w:tcBorders>
+            <w:shd w:fill="F8FAFC" w:color="auto" w:val="clear"/>
+            <w:tcMar>
+              <w:top w:type="dxa" w:w="100"/>
+              <w:left w:type="dxa" w:w="110"/>
+              <w:bottom w:type="dxa" w:w="100"/>
+              <w:right w:type="dxa" w:w="110"/>
+            </w:tcMar>
+            <w:vAlign w:val="center"/>
+          </w:tcPr>
+          <w:p>
+            <w:pPr>
+              <w:spacing w:after="0"/>
+            </w:pPr>
+            <w:r>
+              <w:rPr>
+                <w:b w:val="false"/>
+                <w:bCs w:val="false"/>
+                <w:i w:val="false"/>
+                <w:iCs w:val="false"/>
+                <w:color w:val="111827"/>
+                <w:sz w:val="14"/>
+                <w:szCs w:val="14"/>
+                <w:caps w:val="false"/>
+              </w:rPr>
+              <w:t xml:space="preserve">{step_6}</w:t>
+            </w:r>
+          </w:p>
+        </w:tc>
+        <w:tc>
+          <w:tcPr>
+            <w:tcBorders>
+              <w:top w:val="single" w:color="CBD5E1" w:sz="1"/>
+              <w:left w:val="single" w:color="CBD5E1" w:sz="1"/>
+              <w:bottom w:val="single" w:color="CBD5E1" w:sz="1"/>
+              <w:right w:val="single" w:color="CBD5E1" w:sz="1"/>
+            </w:tcBorders>
+            <w:shd w:fill="FFFFFF" w:color="auto" w:val="clear"/>
+            <w:tcMar>
+              <w:top w:type="dxa" w:w="100"/>
+              <w:left w:type="dxa" w:w="110"/>
+              <w:bottom w:type="dxa" w:w="100"/>
+              <w:right w:type="dxa" w:w="110"/>
+            </w:tcMar>
+            <w:vAlign w:val="center"/>
+          </w:tcPr>
+          <w:p>
+            <w:pPr>
+              <w:spacing w:after="0"/>
+            </w:pPr>
+            <w:r>
+              <w:rPr>
+                <w:b w:val="false"/>
+                <w:bCs w:val="false"/>
+                <w:i w:val="false"/>
+                <w:iCs w:val="false"/>
+                <w:color w:val="111827"/>
+                <w:sz w:val="14"/>
+                <w:szCs w:val="14"/>
+                <w:caps w:val="false"/>
+              </w:rPr>
+              <w:t xml:space="preserve">{overflow_note}{/flow_visuals}</w:t>
+            </w:r>
+          </w:p>
+        </w:tc>
+      </w:tr>
+    </w:tbl>
+    <w:p>
+      <w:pPr>
+        <w:pStyle w:val="Heading2"/>
+        <w:spacing w:before="220" w:after="120" w:line="276"/>
+      </w:pPr>
+      <w:r>
+        <w:rPr>
+          <w:b/>
+          <w:bCs/>
+          <w:i w:val="false"/>
+          <w:iCs w:val="false"/>
+          <w:color w:val="111827"/>
+          <w:sz w:val="22"/>
+          <w:szCs w:val="22"/>
+          <w:caps w:val="false"/>
+        </w:rPr>
+        <w:t xml:space="preserve">Detalhamento do fluxo</w:t>
       </w:r>
     </w:p>
     <w:tbl>

</xml_diff>

<commit_message>
Add native Word flow shapes to DOCX export
</commit_message>
<xml_diff>
--- a/backend/templates/assessment-operational-template.docx
+++ b/backend/templates/assessment-operational-template.docx
@@ -24,12 +24,6 @@
         <w:gridCol w:w="10664"/>
       </w:tblGrid>
       <w:tr>
-        <w:tblPrEx>
-          <w:tblCellMar>
-            <w:top w:w="0" w:type="dxa"/>
-            <w:bottom w:w="0" w:type="dxa"/>
-          </w:tblCellMar>
-        </w:tblPrEx>
         <w:tc>
           <w:tcPr>
             <w:tcW w:w="100" w:type="dxa"/>
@@ -53,6 +47,750 @@
               <w:spacing w:after="0"/>
               <w:jc w:val="center"/>
             </w:pPr>
+            <w:r>
+              <w:rPr>
+                <w:b/>
+                <w:bCs/>
+                <w:noProof/>
+                <w:color w:val="FFFFFF"/>
+                <w:sz w:val="34"/>
+                <w:szCs w:val="34"/>
+              </w:rPr>
+              <mc:AlternateContent>
+                <mc:Choice Requires="wps">
+                  <w:drawing>
+                    <wp:anchor distT="0" distB="0" distL="114300" distR="114300" simplePos="0" relativeHeight="251681792" behindDoc="0" locked="0" layoutInCell="1" allowOverlap="1" wp14:anchorId="59E6D73F" wp14:editId="58BA4102">
+                      <wp:simplePos x="0" y="0"/>
+                      <wp:positionH relativeFrom="column">
+                        <wp:posOffset>6369685</wp:posOffset>
+                      </wp:positionH>
+                      <wp:positionV relativeFrom="paragraph">
+                        <wp:posOffset>4775200</wp:posOffset>
+                      </wp:positionV>
+                      <wp:extent cx="177800" cy="0"/>
+                      <wp:effectExtent l="0" t="76200" r="12700" b="114300"/>
+                      <wp:wrapNone/>
+                      <wp:docPr id="1879620596" name="Conector de Seta Reta 23"/>
+                      <wp:cNvGraphicFramePr/>
+                      <a:graphic xmlns:a="http://schemas.openxmlformats.org/drawingml/2006/main">
+                        <a:graphicData uri="http://schemas.microsoft.com/office/word/2010/wordprocessingShape">
+                          <wps:wsp>
+                            <wps:cNvCnPr/>
+                            <wps:spPr>
+                              <a:xfrm>
+                                <a:off x="0" y="0"/>
+                                <a:ext cx="177800" cy="0"/>
+                              </a:xfrm>
+                              <a:prstGeom prst="straightConnector1">
+                                <a:avLst/>
+                              </a:prstGeom>
+                              <a:ln w="15875">
+                                <a:solidFill>
+                                  <a:srgbClr val="808080"/>
+                                </a:solidFill>
+                                <a:tailEnd type="arrow"/>
+                              </a:ln>
+                            </wps:spPr>
+                            <wps:style>
+                              <a:lnRef idx="2">
+                                <a:schemeClr val="accent1"/>
+                              </a:lnRef>
+                              <a:fillRef idx="0">
+                                <a:schemeClr val="accent1"/>
+                              </a:fillRef>
+                              <a:effectRef idx="1">
+                                <a:schemeClr val="accent1"/>
+                              </a:effectRef>
+                              <a:fontRef idx="minor">
+                                <a:schemeClr val="tx1"/>
+                              </a:fontRef>
+                            </wps:style>
+                            <wps:bodyPr/>
+                          </wps:wsp>
+                        </a:graphicData>
+                      </a:graphic>
+                    </wp:anchor>
+                  </w:drawing>
+                </mc:Choice>
+                <mc:Fallback>
+                  <w:pict>
+                    <v:shapetype w14:anchorId="6A5B2209" id="_x0000_t32" coordsize="21600,21600" o:spt="32" o:oned="t" path="m,l21600,21600e" filled="f">
+                      <v:path arrowok="t" fillok="f" o:connecttype="none"/>
+                      <o:lock v:ext="edit" shapetype="t"/>
+                    </v:shapetype>
+                    <v:shape id="Conector de Seta Reta 23" o:spid="_x0000_s1026" type="#_x0000_t32" style="position:absolute;margin-left:501.55pt;margin-top:376pt;width:14pt;height:0;z-index:251681792;visibility:visible;mso-wrap-style:square;mso-wrap-distance-left:9pt;mso-wrap-distance-top:0;mso-wrap-distance-right:9pt;mso-wrap-distance-bottom:0;mso-position-horizontal:absolute;mso-position-horizontal-relative:text;mso-position-vertical:absolute;mso-position-vertical-relative:text" o:gfxdata="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" strokecolor="gray" strokeweight="1.25pt">
+                      <v:stroke endarrow="open" joinstyle="miter"/>
+                    </v:shape>
+                  </w:pict>
+                </mc:Fallback>
+              </mc:AlternateContent>
+            </w:r>
+            <w:r>
+              <w:rPr>
+                <w:b/>
+                <w:bCs/>
+                <w:noProof/>
+                <w:color w:val="FFFFFF"/>
+                <w:sz w:val="34"/>
+                <w:szCs w:val="34"/>
+              </w:rPr>
+              <mc:AlternateContent>
+                <mc:Choice Requires="wps">
+                  <w:drawing>
+                    <wp:anchor distT="0" distB="0" distL="114300" distR="114300" simplePos="0" relativeHeight="251679744" behindDoc="0" locked="0" layoutInCell="1" allowOverlap="1" wp14:anchorId="5E60C81F" wp14:editId="5262B39B">
+                      <wp:simplePos x="0" y="0"/>
+                      <wp:positionH relativeFrom="column">
+                        <wp:posOffset>5150485</wp:posOffset>
+                      </wp:positionH>
+                      <wp:positionV relativeFrom="paragraph">
+                        <wp:posOffset>4775200</wp:posOffset>
+                      </wp:positionV>
+                      <wp:extent cx="177800" cy="0"/>
+                      <wp:effectExtent l="0" t="76200" r="12700" b="114300"/>
+                      <wp:wrapNone/>
+                      <wp:docPr id="1959928664" name="Conector de Seta Reta 21"/>
+                      <wp:cNvGraphicFramePr/>
+                      <a:graphic xmlns:a="http://schemas.openxmlformats.org/drawingml/2006/main">
+                        <a:graphicData uri="http://schemas.microsoft.com/office/word/2010/wordprocessingShape">
+                          <wps:wsp>
+                            <wps:cNvCnPr/>
+                            <wps:spPr>
+                              <a:xfrm>
+                                <a:off x="0" y="0"/>
+                                <a:ext cx="177800" cy="0"/>
+                              </a:xfrm>
+                              <a:prstGeom prst="straightConnector1">
+                                <a:avLst/>
+                              </a:prstGeom>
+                              <a:ln w="15875">
+                                <a:solidFill>
+                                  <a:srgbClr val="808080"/>
+                                </a:solidFill>
+                                <a:tailEnd type="arrow"/>
+                              </a:ln>
+                            </wps:spPr>
+                            <wps:style>
+                              <a:lnRef idx="2">
+                                <a:schemeClr val="accent1"/>
+                              </a:lnRef>
+                              <a:fillRef idx="0">
+                                <a:schemeClr val="accent1"/>
+                              </a:fillRef>
+                              <a:effectRef idx="1">
+                                <a:schemeClr val="accent1"/>
+                              </a:effectRef>
+                              <a:fontRef idx="minor">
+                                <a:schemeClr val="tx1"/>
+                              </a:fontRef>
+                            </wps:style>
+                            <wps:bodyPr/>
+                          </wps:wsp>
+                        </a:graphicData>
+                      </a:graphic>
+                    </wp:anchor>
+                  </w:drawing>
+                </mc:Choice>
+                <mc:Fallback>
+                  <w:pict>
+                    <v:shape w14:anchorId="29485270" id="Conector de Seta Reta 21" o:spid="_x0000_s1026" type="#_x0000_t32" style="position:absolute;margin-left:405.55pt;margin-top:376pt;width:14pt;height:0;z-index:251679744;visibility:visible;mso-wrap-style:square;mso-wrap-distance-left:9pt;mso-wrap-distance-top:0;mso-wrap-distance-right:9pt;mso-wrap-distance-bottom:0;mso-position-horizontal:absolute;mso-position-horizontal-relative:text;mso-position-vertical:absolute;mso-position-vertical-relative:text" o:gfxdata="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" strokecolor="gray" strokeweight="1.25pt">
+                      <v:stroke endarrow="open" joinstyle="miter"/>
+                    </v:shape>
+                  </w:pict>
+                </mc:Fallback>
+              </mc:AlternateContent>
+            </w:r>
+            <w:r>
+              <w:rPr>
+                <w:b/>
+                <w:bCs/>
+                <w:noProof/>
+                <w:color w:val="FFFFFF"/>
+                <w:sz w:val="34"/>
+                <w:szCs w:val="34"/>
+              </w:rPr>
+              <mc:AlternateContent>
+                <mc:Choice Requires="wps">
+                  <w:drawing>
+                    <wp:anchor distT="0" distB="0" distL="114300" distR="114300" simplePos="0" relativeHeight="251677696" behindDoc="0" locked="0" layoutInCell="1" allowOverlap="1" wp14:anchorId="5E778B2E" wp14:editId="7A75ED49">
+                      <wp:simplePos x="0" y="0"/>
+                      <wp:positionH relativeFrom="column">
+                        <wp:posOffset>3931285</wp:posOffset>
+                      </wp:positionH>
+                      <wp:positionV relativeFrom="paragraph">
+                        <wp:posOffset>4775200</wp:posOffset>
+                      </wp:positionV>
+                      <wp:extent cx="177800" cy="0"/>
+                      <wp:effectExtent l="0" t="76200" r="12700" b="114300"/>
+                      <wp:wrapNone/>
+                      <wp:docPr id="316415229" name="Conector de Seta Reta 19"/>
+                      <wp:cNvGraphicFramePr/>
+                      <a:graphic xmlns:a="http://schemas.openxmlformats.org/drawingml/2006/main">
+                        <a:graphicData uri="http://schemas.microsoft.com/office/word/2010/wordprocessingShape">
+                          <wps:wsp>
+                            <wps:cNvCnPr/>
+                            <wps:spPr>
+                              <a:xfrm>
+                                <a:off x="0" y="0"/>
+                                <a:ext cx="177800" cy="0"/>
+                              </a:xfrm>
+                              <a:prstGeom prst="straightConnector1">
+                                <a:avLst/>
+                              </a:prstGeom>
+                              <a:ln w="15875">
+                                <a:solidFill>
+                                  <a:srgbClr val="808080"/>
+                                </a:solidFill>
+                                <a:tailEnd type="arrow"/>
+                              </a:ln>
+                            </wps:spPr>
+                            <wps:style>
+                              <a:lnRef idx="2">
+                                <a:schemeClr val="accent1"/>
+                              </a:lnRef>
+                              <a:fillRef idx="0">
+                                <a:schemeClr val="accent1"/>
+                              </a:fillRef>
+                              <a:effectRef idx="1">
+                                <a:schemeClr val="accent1"/>
+                              </a:effectRef>
+                              <a:fontRef idx="minor">
+                                <a:schemeClr val="tx1"/>
+                              </a:fontRef>
+                            </wps:style>
+                            <wps:bodyPr/>
+                          </wps:wsp>
+                        </a:graphicData>
+                      </a:graphic>
+                    </wp:anchor>
+                  </w:drawing>
+                </mc:Choice>
+                <mc:Fallback>
+                  <w:pict>
+                    <v:shape w14:anchorId="5E4CE2C7" id="Conector de Seta Reta 19" o:spid="_x0000_s1026" type="#_x0000_t32" style="position:absolute;margin-left:309.55pt;margin-top:376pt;width:14pt;height:0;z-index:251677696;visibility:visible;mso-wrap-style:square;mso-wrap-distance-left:9pt;mso-wrap-distance-top:0;mso-wrap-distance-right:9pt;mso-wrap-distance-bottom:0;mso-position-horizontal:absolute;mso-position-horizontal-relative:text;mso-position-vertical:absolute;mso-position-vertical-relative:text" o:gfxdata="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" strokecolor="gray" strokeweight="1.25pt">
+                      <v:stroke endarrow="open" joinstyle="miter"/>
+                    </v:shape>
+                  </w:pict>
+                </mc:Fallback>
+              </mc:AlternateContent>
+            </w:r>
+            <w:r>
+              <w:rPr>
+                <w:b/>
+                <w:bCs/>
+                <w:noProof/>
+                <w:color w:val="FFFFFF"/>
+                <w:sz w:val="34"/>
+                <w:szCs w:val="34"/>
+              </w:rPr>
+              <mc:AlternateContent>
+                <mc:Choice Requires="wps">
+                  <w:drawing>
+                    <wp:anchor distT="0" distB="0" distL="114300" distR="114300" simplePos="0" relativeHeight="251675648" behindDoc="0" locked="0" layoutInCell="1" allowOverlap="1" wp14:anchorId="7F1348C4" wp14:editId="7E2F39D4">
+                      <wp:simplePos x="0" y="0"/>
+                      <wp:positionH relativeFrom="column">
+                        <wp:posOffset>2712085</wp:posOffset>
+                      </wp:positionH>
+                      <wp:positionV relativeFrom="paragraph">
+                        <wp:posOffset>4775200</wp:posOffset>
+                      </wp:positionV>
+                      <wp:extent cx="177800" cy="0"/>
+                      <wp:effectExtent l="0" t="76200" r="12700" b="114300"/>
+                      <wp:wrapNone/>
+                      <wp:docPr id="1036000563" name="Conector de Seta Reta 17"/>
+                      <wp:cNvGraphicFramePr/>
+                      <a:graphic xmlns:a="http://schemas.openxmlformats.org/drawingml/2006/main">
+                        <a:graphicData uri="http://schemas.microsoft.com/office/word/2010/wordprocessingShape">
+                          <wps:wsp>
+                            <wps:cNvCnPr/>
+                            <wps:spPr>
+                              <a:xfrm>
+                                <a:off x="0" y="0"/>
+                                <a:ext cx="177800" cy="0"/>
+                              </a:xfrm>
+                              <a:prstGeom prst="straightConnector1">
+                                <a:avLst/>
+                              </a:prstGeom>
+                              <a:ln w="15875">
+                                <a:solidFill>
+                                  <a:srgbClr val="808080"/>
+                                </a:solidFill>
+                                <a:tailEnd type="arrow"/>
+                              </a:ln>
+                            </wps:spPr>
+                            <wps:style>
+                              <a:lnRef idx="2">
+                                <a:schemeClr val="accent1"/>
+                              </a:lnRef>
+                              <a:fillRef idx="0">
+                                <a:schemeClr val="accent1"/>
+                              </a:fillRef>
+                              <a:effectRef idx="1">
+                                <a:schemeClr val="accent1"/>
+                              </a:effectRef>
+                              <a:fontRef idx="minor">
+                                <a:schemeClr val="tx1"/>
+                              </a:fontRef>
+                            </wps:style>
+                            <wps:bodyPr/>
+                          </wps:wsp>
+                        </a:graphicData>
+                      </a:graphic>
+                    </wp:anchor>
+                  </w:drawing>
+                </mc:Choice>
+                <mc:Fallback>
+                  <w:pict>
+                    <v:shape w14:anchorId="16228D61" id="Conector de Seta Reta 17" o:spid="_x0000_s1026" type="#_x0000_t32" style="position:absolute;margin-left:213.55pt;margin-top:376pt;width:14pt;height:0;z-index:251675648;visibility:visible;mso-wrap-style:square;mso-wrap-distance-left:9pt;mso-wrap-distance-top:0;mso-wrap-distance-right:9pt;mso-wrap-distance-bottom:0;mso-position-horizontal:absolute;mso-position-horizontal-relative:text;mso-position-vertical:absolute;mso-position-vertical-relative:text" o:gfxdata="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" strokecolor="gray" strokeweight="1.25pt">
+                      <v:stroke endarrow="open" joinstyle="miter"/>
+                    </v:shape>
+                  </w:pict>
+                </mc:Fallback>
+              </mc:AlternateContent>
+            </w:r>
+            <w:r>
+              <w:rPr>
+                <w:b/>
+                <w:bCs/>
+                <w:noProof/>
+                <w:color w:val="FFFFFF"/>
+                <w:sz w:val="34"/>
+                <w:szCs w:val="34"/>
+              </w:rPr>
+              <mc:AlternateContent>
+                <mc:Choice Requires="wps">
+                  <w:drawing>
+                    <wp:anchor distT="0" distB="0" distL="114300" distR="114300" simplePos="0" relativeHeight="251673600" behindDoc="0" locked="0" layoutInCell="1" allowOverlap="1" wp14:anchorId="2EEC8E0E" wp14:editId="337B4268">
+                      <wp:simplePos x="0" y="0"/>
+                      <wp:positionH relativeFrom="column">
+                        <wp:posOffset>1492885</wp:posOffset>
+                      </wp:positionH>
+                      <wp:positionV relativeFrom="paragraph">
+                        <wp:posOffset>4775200</wp:posOffset>
+                      </wp:positionV>
+                      <wp:extent cx="177800" cy="0"/>
+                      <wp:effectExtent l="0" t="76200" r="12700" b="114300"/>
+                      <wp:wrapNone/>
+                      <wp:docPr id="692063523" name="Conector de Seta Reta 15"/>
+                      <wp:cNvGraphicFramePr/>
+                      <a:graphic xmlns:a="http://schemas.openxmlformats.org/drawingml/2006/main">
+                        <a:graphicData uri="http://schemas.microsoft.com/office/word/2010/wordprocessingShape">
+                          <wps:wsp>
+                            <wps:cNvCnPr/>
+                            <wps:spPr>
+                              <a:xfrm>
+                                <a:off x="0" y="0"/>
+                                <a:ext cx="177800" cy="0"/>
+                              </a:xfrm>
+                              <a:prstGeom prst="straightConnector1">
+                                <a:avLst/>
+                              </a:prstGeom>
+                              <a:ln w="15875">
+                                <a:solidFill>
+                                  <a:srgbClr val="808080"/>
+                                </a:solidFill>
+                                <a:tailEnd type="arrow"/>
+                              </a:ln>
+                            </wps:spPr>
+                            <wps:style>
+                              <a:lnRef idx="2">
+                                <a:schemeClr val="accent1"/>
+                              </a:lnRef>
+                              <a:fillRef idx="0">
+                                <a:schemeClr val="accent1"/>
+                              </a:fillRef>
+                              <a:effectRef idx="1">
+                                <a:schemeClr val="accent1"/>
+                              </a:effectRef>
+                              <a:fontRef idx="minor">
+                                <a:schemeClr val="tx1"/>
+                              </a:fontRef>
+                            </wps:style>
+                            <wps:bodyPr/>
+                          </wps:wsp>
+                        </a:graphicData>
+                      </a:graphic>
+                    </wp:anchor>
+                  </w:drawing>
+                </mc:Choice>
+                <mc:Fallback>
+                  <w:pict>
+                    <v:shape w14:anchorId="513E11D1" id="Conector de Seta Reta 15" o:spid="_x0000_s1026" type="#_x0000_t32" style="position:absolute;margin-left:117.55pt;margin-top:376pt;width:14pt;height:0;z-index:251673600;visibility:visible;mso-wrap-style:square;mso-wrap-distance-left:9pt;mso-wrap-distance-top:0;mso-wrap-distance-right:9pt;mso-wrap-distance-bottom:0;mso-position-horizontal:absolute;mso-position-horizontal-relative:text;mso-position-vertical:absolute;mso-position-vertical-relative:text" o:gfxdata="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" strokecolor="gray" strokeweight="1.25pt">
+                      <v:stroke endarrow="open" joinstyle="miter"/>
+                    </v:shape>
+                  </w:pict>
+                </mc:Fallback>
+              </mc:AlternateContent>
+            </w:r>
+            <w:r>
+              <w:rPr>
+                <w:b/>
+                <w:bCs/>
+                <w:noProof/>
+                <w:color w:val="FFFFFF"/>
+                <w:sz w:val="34"/>
+                <w:szCs w:val="34"/>
+              </w:rPr>
+              <mc:AlternateContent>
+                <mc:Choice Requires="wps">
+                  <w:drawing>
+                    <wp:anchor distT="0" distB="0" distL="114300" distR="114300" simplePos="0" relativeHeight="251669504" behindDoc="0" locked="0" layoutInCell="1" allowOverlap="1" wp14:anchorId="6BB8499B" wp14:editId="77606D9A">
+                      <wp:simplePos x="0" y="0"/>
+                      <wp:positionH relativeFrom="column">
+                        <wp:posOffset>6369685</wp:posOffset>
+                      </wp:positionH>
+                      <wp:positionV relativeFrom="paragraph">
+                        <wp:posOffset>3441700</wp:posOffset>
+                      </wp:positionV>
+                      <wp:extent cx="177800" cy="0"/>
+                      <wp:effectExtent l="0" t="76200" r="12700" b="114300"/>
+                      <wp:wrapNone/>
+                      <wp:docPr id="1614094450" name="Conector de Seta Reta 11"/>
+                      <wp:cNvGraphicFramePr/>
+                      <a:graphic xmlns:a="http://schemas.openxmlformats.org/drawingml/2006/main">
+                        <a:graphicData uri="http://schemas.microsoft.com/office/word/2010/wordprocessingShape">
+                          <wps:wsp>
+                            <wps:cNvCnPr/>
+                            <wps:spPr>
+                              <a:xfrm>
+                                <a:off x="0" y="0"/>
+                                <a:ext cx="177800" cy="0"/>
+                              </a:xfrm>
+                              <a:prstGeom prst="straightConnector1">
+                                <a:avLst/>
+                              </a:prstGeom>
+                              <a:ln w="15875">
+                                <a:solidFill>
+                                  <a:srgbClr val="808080"/>
+                                </a:solidFill>
+                                <a:tailEnd type="arrow"/>
+                              </a:ln>
+                            </wps:spPr>
+                            <wps:style>
+                              <a:lnRef idx="2">
+                                <a:schemeClr val="accent1"/>
+                              </a:lnRef>
+                              <a:fillRef idx="0">
+                                <a:schemeClr val="accent1"/>
+                              </a:fillRef>
+                              <a:effectRef idx="1">
+                                <a:schemeClr val="accent1"/>
+                              </a:effectRef>
+                              <a:fontRef idx="minor">
+                                <a:schemeClr val="tx1"/>
+                              </a:fontRef>
+                            </wps:style>
+                            <wps:bodyPr/>
+                          </wps:wsp>
+                        </a:graphicData>
+                      </a:graphic>
+                    </wp:anchor>
+                  </w:drawing>
+                </mc:Choice>
+                <mc:Fallback>
+                  <w:pict>
+                    <v:shape w14:anchorId="769D8C3F" id="Conector de Seta Reta 11" o:spid="_x0000_s1026" type="#_x0000_t32" style="position:absolute;margin-left:501.55pt;margin-top:271pt;width:14pt;height:0;z-index:251669504;visibility:visible;mso-wrap-style:square;mso-wrap-distance-left:9pt;mso-wrap-distance-top:0;mso-wrap-distance-right:9pt;mso-wrap-distance-bottom:0;mso-position-horizontal:absolute;mso-position-horizontal-relative:text;mso-position-vertical:absolute;mso-position-vertical-relative:text" o:gfxdata="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" strokecolor="gray" strokeweight="1.25pt">
+                      <v:stroke endarrow="open" joinstyle="miter"/>
+                    </v:shape>
+                  </w:pict>
+                </mc:Fallback>
+              </mc:AlternateContent>
+            </w:r>
+            <w:r>
+              <w:rPr>
+                <w:b/>
+                <w:bCs/>
+                <w:noProof/>
+                <w:color w:val="FFFFFF"/>
+                <w:sz w:val="34"/>
+                <w:szCs w:val="34"/>
+              </w:rPr>
+              <mc:AlternateContent>
+                <mc:Choice Requires="wps">
+                  <w:drawing>
+                    <wp:anchor distT="0" distB="0" distL="114300" distR="114300" simplePos="0" relativeHeight="251667456" behindDoc="0" locked="0" layoutInCell="1" allowOverlap="1" wp14:anchorId="67DA573B" wp14:editId="02E79DA3">
+                      <wp:simplePos x="0" y="0"/>
+                      <wp:positionH relativeFrom="column">
+                        <wp:posOffset>5150485</wp:posOffset>
+                      </wp:positionH>
+                      <wp:positionV relativeFrom="paragraph">
+                        <wp:posOffset>3441700</wp:posOffset>
+                      </wp:positionV>
+                      <wp:extent cx="177800" cy="0"/>
+                      <wp:effectExtent l="0" t="76200" r="12700" b="114300"/>
+                      <wp:wrapNone/>
+                      <wp:docPr id="585365557" name="Conector de Seta Reta 9"/>
+                      <wp:cNvGraphicFramePr/>
+                      <a:graphic xmlns:a="http://schemas.openxmlformats.org/drawingml/2006/main">
+                        <a:graphicData uri="http://schemas.microsoft.com/office/word/2010/wordprocessingShape">
+                          <wps:wsp>
+                            <wps:cNvCnPr/>
+                            <wps:spPr>
+                              <a:xfrm>
+                                <a:off x="0" y="0"/>
+                                <a:ext cx="177800" cy="0"/>
+                              </a:xfrm>
+                              <a:prstGeom prst="straightConnector1">
+                                <a:avLst/>
+                              </a:prstGeom>
+                              <a:ln w="15875">
+                                <a:solidFill>
+                                  <a:srgbClr val="808080"/>
+                                </a:solidFill>
+                                <a:tailEnd type="arrow"/>
+                              </a:ln>
+                            </wps:spPr>
+                            <wps:style>
+                              <a:lnRef idx="2">
+                                <a:schemeClr val="accent1"/>
+                              </a:lnRef>
+                              <a:fillRef idx="0">
+                                <a:schemeClr val="accent1"/>
+                              </a:fillRef>
+                              <a:effectRef idx="1">
+                                <a:schemeClr val="accent1"/>
+                              </a:effectRef>
+                              <a:fontRef idx="minor">
+                                <a:schemeClr val="tx1"/>
+                              </a:fontRef>
+                            </wps:style>
+                            <wps:bodyPr/>
+                          </wps:wsp>
+                        </a:graphicData>
+                      </a:graphic>
+                    </wp:anchor>
+                  </w:drawing>
+                </mc:Choice>
+                <mc:Fallback>
+                  <w:pict>
+                    <v:shape w14:anchorId="564397CB" id="Conector de Seta Reta 9" o:spid="_x0000_s1026" type="#_x0000_t32" style="position:absolute;margin-left:405.55pt;margin-top:271pt;width:14pt;height:0;z-index:251667456;visibility:visible;mso-wrap-style:square;mso-wrap-distance-left:9pt;mso-wrap-distance-top:0;mso-wrap-distance-right:9pt;mso-wrap-distance-bottom:0;mso-position-horizontal:absolute;mso-position-horizontal-relative:text;mso-position-vertical:absolute;mso-position-vertical-relative:text" o:gfxdata="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" strokecolor="gray" strokeweight="1.25pt">
+                      <v:stroke endarrow="open" joinstyle="miter"/>
+                    </v:shape>
+                  </w:pict>
+                </mc:Fallback>
+              </mc:AlternateContent>
+            </w:r>
+            <w:r>
+              <w:rPr>
+                <w:b/>
+                <w:bCs/>
+                <w:noProof/>
+                <w:color w:val="FFFFFF"/>
+                <w:sz w:val="34"/>
+                <w:szCs w:val="34"/>
+              </w:rPr>
+              <mc:AlternateContent>
+                <mc:Choice Requires="wps">
+                  <w:drawing>
+                    <wp:anchor distT="0" distB="0" distL="114300" distR="114300" simplePos="0" relativeHeight="251665408" behindDoc="0" locked="0" layoutInCell="1" allowOverlap="1" wp14:anchorId="616D8FE3" wp14:editId="01F0EC45">
+                      <wp:simplePos x="0" y="0"/>
+                      <wp:positionH relativeFrom="column">
+                        <wp:posOffset>3931285</wp:posOffset>
+                      </wp:positionH>
+                      <wp:positionV relativeFrom="paragraph">
+                        <wp:posOffset>3441700</wp:posOffset>
+                      </wp:positionV>
+                      <wp:extent cx="177800" cy="0"/>
+                      <wp:effectExtent l="0" t="76200" r="12700" b="114300"/>
+                      <wp:wrapNone/>
+                      <wp:docPr id="1494451442" name="Conector de Seta Reta 7"/>
+                      <wp:cNvGraphicFramePr/>
+                      <a:graphic xmlns:a="http://schemas.openxmlformats.org/drawingml/2006/main">
+                        <a:graphicData uri="http://schemas.microsoft.com/office/word/2010/wordprocessingShape">
+                          <wps:wsp>
+                            <wps:cNvCnPr/>
+                            <wps:spPr>
+                              <a:xfrm>
+                                <a:off x="0" y="0"/>
+                                <a:ext cx="177800" cy="0"/>
+                              </a:xfrm>
+                              <a:prstGeom prst="straightConnector1">
+                                <a:avLst/>
+                              </a:prstGeom>
+                              <a:ln w="15875">
+                                <a:solidFill>
+                                  <a:srgbClr val="808080"/>
+                                </a:solidFill>
+                                <a:tailEnd type="arrow"/>
+                              </a:ln>
+                            </wps:spPr>
+                            <wps:style>
+                              <a:lnRef idx="2">
+                                <a:schemeClr val="accent1"/>
+                              </a:lnRef>
+                              <a:fillRef idx="0">
+                                <a:schemeClr val="accent1"/>
+                              </a:fillRef>
+                              <a:effectRef idx="1">
+                                <a:schemeClr val="accent1"/>
+                              </a:effectRef>
+                              <a:fontRef idx="minor">
+                                <a:schemeClr val="tx1"/>
+                              </a:fontRef>
+                            </wps:style>
+                            <wps:bodyPr/>
+                          </wps:wsp>
+                        </a:graphicData>
+                      </a:graphic>
+                    </wp:anchor>
+                  </w:drawing>
+                </mc:Choice>
+                <mc:Fallback>
+                  <w:pict>
+                    <v:shape w14:anchorId="0B946574" id="Conector de Seta Reta 7" o:spid="_x0000_s1026" type="#_x0000_t32" style="position:absolute;margin-left:309.55pt;margin-top:271pt;width:14pt;height:0;z-index:251665408;visibility:visible;mso-wrap-style:square;mso-wrap-distance-left:9pt;mso-wrap-distance-top:0;mso-wrap-distance-right:9pt;mso-wrap-distance-bottom:0;mso-position-horizontal:absolute;mso-position-horizontal-relative:text;mso-position-vertical:absolute;mso-position-vertical-relative:text" o:gfxdata="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" strokecolor="gray" strokeweight="1.25pt">
+                      <v:stroke endarrow="open" joinstyle="miter"/>
+                    </v:shape>
+                  </w:pict>
+                </mc:Fallback>
+              </mc:AlternateContent>
+            </w:r>
+            <w:r>
+              <w:rPr>
+                <w:b/>
+                <w:bCs/>
+                <w:noProof/>
+                <w:color w:val="FFFFFF"/>
+                <w:sz w:val="34"/>
+                <w:szCs w:val="34"/>
+              </w:rPr>
+              <mc:AlternateContent>
+                <mc:Choice Requires="wps">
+                  <w:drawing>
+                    <wp:anchor distT="0" distB="0" distL="114300" distR="114300" simplePos="0" relativeHeight="251663360" behindDoc="0" locked="0" layoutInCell="1" allowOverlap="1" wp14:anchorId="7421FFA6" wp14:editId="406B21FD">
+                      <wp:simplePos x="0" y="0"/>
+                      <wp:positionH relativeFrom="column">
+                        <wp:posOffset>2712085</wp:posOffset>
+                      </wp:positionH>
+                      <wp:positionV relativeFrom="paragraph">
+                        <wp:posOffset>3441700</wp:posOffset>
+                      </wp:positionV>
+                      <wp:extent cx="177800" cy="0"/>
+                      <wp:effectExtent l="0" t="76200" r="12700" b="114300"/>
+                      <wp:wrapNone/>
+                      <wp:docPr id="609322883" name="Conector de Seta Reta 5"/>
+                      <wp:cNvGraphicFramePr/>
+                      <a:graphic xmlns:a="http://schemas.openxmlformats.org/drawingml/2006/main">
+                        <a:graphicData uri="http://schemas.microsoft.com/office/word/2010/wordprocessingShape">
+                          <wps:wsp>
+                            <wps:cNvCnPr/>
+                            <wps:spPr>
+                              <a:xfrm>
+                                <a:off x="0" y="0"/>
+                                <a:ext cx="177800" cy="0"/>
+                              </a:xfrm>
+                              <a:prstGeom prst="straightConnector1">
+                                <a:avLst/>
+                              </a:prstGeom>
+                              <a:ln w="15875">
+                                <a:solidFill>
+                                  <a:srgbClr val="808080"/>
+                                </a:solidFill>
+                                <a:tailEnd type="arrow"/>
+                              </a:ln>
+                            </wps:spPr>
+                            <wps:style>
+                              <a:lnRef idx="2">
+                                <a:schemeClr val="accent1"/>
+                              </a:lnRef>
+                              <a:fillRef idx="0">
+                                <a:schemeClr val="accent1"/>
+                              </a:fillRef>
+                              <a:effectRef idx="1">
+                                <a:schemeClr val="accent1"/>
+                              </a:effectRef>
+                              <a:fontRef idx="minor">
+                                <a:schemeClr val="tx1"/>
+                              </a:fontRef>
+                            </wps:style>
+                            <wps:bodyPr/>
+                          </wps:wsp>
+                        </a:graphicData>
+                      </a:graphic>
+                    </wp:anchor>
+                  </w:drawing>
+                </mc:Choice>
+                <mc:Fallback>
+                  <w:pict>
+                    <v:shape w14:anchorId="2AE3D204" id="Conector de Seta Reta 5" o:spid="_x0000_s1026" type="#_x0000_t32" style="position:absolute;margin-left:213.55pt;margin-top:271pt;width:14pt;height:0;z-index:251663360;visibility:visible;mso-wrap-style:square;mso-wrap-distance-left:9pt;mso-wrap-distance-top:0;mso-wrap-distance-right:9pt;mso-wrap-distance-bottom:0;mso-position-horizontal:absolute;mso-position-horizontal-relative:text;mso-position-vertical:absolute;mso-position-vertical-relative:text" o:gfxdata="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" strokecolor="gray" strokeweight="1.25pt">
+                      <v:stroke endarrow="open" joinstyle="miter"/>
+                    </v:shape>
+                  </w:pict>
+                </mc:Fallback>
+              </mc:AlternateContent>
+            </w:r>
+            <w:r>
+              <w:rPr>
+                <w:b/>
+                <w:bCs/>
+                <w:noProof/>
+                <w:color w:val="FFFFFF"/>
+                <w:sz w:val="34"/>
+                <w:szCs w:val="34"/>
+              </w:rPr>
+              <mc:AlternateContent>
+                <mc:Choice Requires="wps">
+                  <w:drawing>
+                    <wp:anchor distT="0" distB="0" distL="114300" distR="114300" simplePos="0" relativeHeight="251661312" behindDoc="0" locked="0" layoutInCell="1" allowOverlap="1" wp14:anchorId="4CC650AF" wp14:editId="20A080C4">
+                      <wp:simplePos x="0" y="0"/>
+                      <wp:positionH relativeFrom="column">
+                        <wp:posOffset>1492885</wp:posOffset>
+                      </wp:positionH>
+                      <wp:positionV relativeFrom="paragraph">
+                        <wp:posOffset>3441700</wp:posOffset>
+                      </wp:positionV>
+                      <wp:extent cx="177800" cy="0"/>
+                      <wp:effectExtent l="0" t="76200" r="12700" b="114300"/>
+                      <wp:wrapNone/>
+                      <wp:docPr id="2017450541" name="Conector de Seta Reta 3"/>
+                      <wp:cNvGraphicFramePr/>
+                      <a:graphic xmlns:a="http://schemas.openxmlformats.org/drawingml/2006/main">
+                        <a:graphicData uri="http://schemas.microsoft.com/office/word/2010/wordprocessingShape">
+                          <wps:wsp>
+                            <wps:cNvCnPr/>
+                            <wps:spPr>
+                              <a:xfrm>
+                                <a:off x="0" y="0"/>
+                                <a:ext cx="177800" cy="0"/>
+                              </a:xfrm>
+                              <a:prstGeom prst="straightConnector1">
+                                <a:avLst/>
+                              </a:prstGeom>
+                              <a:ln w="15875">
+                                <a:solidFill>
+                                  <a:srgbClr val="808080"/>
+                                </a:solidFill>
+                                <a:tailEnd type="arrow"/>
+                              </a:ln>
+                            </wps:spPr>
+                            <wps:style>
+                              <a:lnRef idx="2">
+                                <a:schemeClr val="accent1"/>
+                              </a:lnRef>
+                              <a:fillRef idx="0">
+                                <a:schemeClr val="accent1"/>
+                              </a:fillRef>
+                              <a:effectRef idx="1">
+                                <a:schemeClr val="accent1"/>
+                              </a:effectRef>
+                              <a:fontRef idx="minor">
+                                <a:schemeClr val="tx1"/>
+                              </a:fontRef>
+                            </wps:style>
+                            <wps:bodyPr/>
+                          </wps:wsp>
+                        </a:graphicData>
+                      </a:graphic>
+                    </wp:anchor>
+                  </w:drawing>
+                </mc:Choice>
+                <mc:Fallback>
+                  <w:pict>
+                    <v:shape w14:anchorId="51F122CE" id="Conector de Seta Reta 3" o:spid="_x0000_s1026" type="#_x0000_t32" style="position:absolute;margin-left:117.55pt;margin-top:271pt;width:14pt;height:0;z-index:251661312;visibility:visible;mso-wrap-style:square;mso-wrap-distance-left:9pt;mso-wrap-distance-top:0;mso-wrap-distance-right:9pt;mso-wrap-distance-bottom:0;mso-position-horizontal:absolute;mso-position-horizontal-relative:text;mso-position-vertical:absolute;mso-position-vertical-relative:text" o:gfxdata="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" strokecolor="gray" strokeweight="1.25pt">
+                      <v:stroke endarrow="open" joinstyle="miter"/>
+                    </v:shape>
+                  </w:pict>
+                </mc:Fallback>
+              </mc:AlternateContent>
+            </w:r>
             <w:r>
               <w:rPr>
                 <w:b/>
@@ -67,12 +805,6 @@
         </w:tc>
       </w:tr>
       <w:tr>
-        <w:tblPrEx>
-          <w:tblCellMar>
-            <w:top w:w="0" w:type="dxa"/>
-            <w:bottom w:w="0" w:type="dxa"/>
-          </w:tblCellMar>
-        </w:tblPrEx>
         <w:tc>
           <w:tcPr>
             <w:tcW w:w="100" w:type="dxa"/>
@@ -110,12 +842,6 @@
         </w:tc>
       </w:tr>
       <w:tr>
-        <w:tblPrEx>
-          <w:tblCellMar>
-            <w:top w:w="0" w:type="dxa"/>
-            <w:bottom w:w="0" w:type="dxa"/>
-          </w:tblCellMar>
-        </w:tblPrEx>
         <w:tc>
           <w:tcPr>
             <w:tcW w:w="100" w:type="dxa"/>
@@ -180,12 +906,6 @@
         <w:gridCol w:w="4692"/>
       </w:tblGrid>
       <w:tr>
-        <w:tblPrEx>
-          <w:tblCellMar>
-            <w:top w:w="0" w:type="dxa"/>
-            <w:bottom w:w="0" w:type="dxa"/>
-          </w:tblCellMar>
-        </w:tblPrEx>
         <w:trPr>
           <w:jc w:val="center"/>
         </w:trPr>
@@ -254,12 +974,6 @@
         </w:tc>
       </w:tr>
       <w:tr>
-        <w:tblPrEx>
-          <w:tblCellMar>
-            <w:top w:w="0" w:type="dxa"/>
-            <w:bottom w:w="0" w:type="dxa"/>
-          </w:tblCellMar>
-        </w:tblPrEx>
         <w:trPr>
           <w:jc w:val="center"/>
         </w:trPr>
@@ -328,12 +1042,6 @@
         </w:tc>
       </w:tr>
       <w:tr>
-        <w:tblPrEx>
-          <w:tblCellMar>
-            <w:top w:w="0" w:type="dxa"/>
-            <w:bottom w:w="0" w:type="dxa"/>
-          </w:tblCellMar>
-        </w:tblPrEx>
         <w:trPr>
           <w:jc w:val="center"/>
         </w:trPr>
@@ -402,12 +1110,6 @@
         </w:tc>
       </w:tr>
       <w:tr>
-        <w:tblPrEx>
-          <w:tblCellMar>
-            <w:top w:w="0" w:type="dxa"/>
-            <w:bottom w:w="0" w:type="dxa"/>
-          </w:tblCellMar>
-        </w:tblPrEx>
         <w:trPr>
           <w:jc w:val="center"/>
         </w:trPr>
@@ -504,12 +1206,6 @@
         <w:gridCol w:w="5332"/>
       </w:tblGrid>
       <w:tr>
-        <w:tblPrEx>
-          <w:tblCellMar>
-            <w:top w:w="0" w:type="dxa"/>
-            <w:bottom w:w="0" w:type="dxa"/>
-          </w:tblCellMar>
-        </w:tblPrEx>
         <w:tc>
           <w:tcPr>
             <w:tcW w:w="100" w:type="dxa"/>
@@ -605,12 +1301,6 @@
         <w:gridCol w:w="5332"/>
       </w:tblGrid>
       <w:tr>
-        <w:tblPrEx>
-          <w:tblCellMar>
-            <w:top w:w="0" w:type="dxa"/>
-            <w:bottom w:w="0" w:type="dxa"/>
-          </w:tblCellMar>
-        </w:tblPrEx>
         <w:tc>
           <w:tcPr>
             <w:tcW w:w="100" w:type="dxa"/>
@@ -681,12 +1371,6 @@
         </w:tc>
       </w:tr>
       <w:tr>
-        <w:tblPrEx>
-          <w:tblCellMar>
-            <w:top w:w="0" w:type="dxa"/>
-            <w:bottom w:w="0" w:type="dxa"/>
-          </w:tblCellMar>
-        </w:tblPrEx>
         <w:tc>
           <w:tcPr>
             <w:tcW w:w="200" w:type="dxa"/>
@@ -750,12 +1434,6 @@
         <w:gridCol w:w="5332"/>
       </w:tblGrid>
       <w:tr>
-        <w:tblPrEx>
-          <w:tblCellMar>
-            <w:top w:w="0" w:type="dxa"/>
-            <w:bottom w:w="0" w:type="dxa"/>
-          </w:tblCellMar>
-        </w:tblPrEx>
         <w:tc>
           <w:tcPr>
             <w:tcW w:w="100" w:type="dxa"/>
@@ -864,12 +1542,6 @@
         <w:gridCol w:w="5332"/>
       </w:tblGrid>
       <w:tr>
-        <w:tblPrEx>
-          <w:tblCellMar>
-            <w:top w:w="0" w:type="dxa"/>
-            <w:bottom w:w="0" w:type="dxa"/>
-          </w:tblCellMar>
-        </w:tblPrEx>
         <w:tc>
           <w:tcPr>
             <w:tcW w:w="100" w:type="dxa"/>
@@ -937,12 +1609,6 @@
         </w:tc>
       </w:tr>
       <w:tr>
-        <w:tblPrEx>
-          <w:tblCellMar>
-            <w:top w:w="0" w:type="dxa"/>
-            <w:bottom w:w="0" w:type="dxa"/>
-          </w:tblCellMar>
-        </w:tblPrEx>
         <w:tc>
           <w:tcPr>
             <w:tcW w:w="100" w:type="dxa"/>
@@ -1038,12 +1704,6 @@
         <w:gridCol w:w="5332"/>
       </w:tblGrid>
       <w:tr>
-        <w:tblPrEx>
-          <w:tblCellMar>
-            <w:top w:w="0" w:type="dxa"/>
-            <w:bottom w:w="0" w:type="dxa"/>
-          </w:tblCellMar>
-        </w:tblPrEx>
         <w:tc>
           <w:tcPr>
             <w:tcW w:w="100" w:type="dxa"/>
@@ -1114,12 +1774,6 @@
         </w:tc>
       </w:tr>
       <w:tr>
-        <w:tblPrEx>
-          <w:tblCellMar>
-            <w:top w:w="0" w:type="dxa"/>
-            <w:bottom w:w="0" w:type="dxa"/>
-          </w:tblCellMar>
-        </w:tblPrEx>
         <w:tc>
           <w:tcPr>
             <w:tcW w:w="200" w:type="dxa"/>
@@ -1197,12 +1851,6 @@
         <w:gridCol w:w="1523"/>
       </w:tblGrid>
       <w:tr>
-        <w:tblPrEx>
-          <w:tblCellMar>
-            <w:top w:w="0" w:type="dxa"/>
-            <w:bottom w:w="0" w:type="dxa"/>
-          </w:tblCellMar>
-        </w:tblPrEx>
         <w:trPr>
           <w:tblHeader/>
         </w:trPr>
@@ -1460,12 +2108,6 @@
         </w:tc>
       </w:tr>
       <w:tr>
-        <w:tblPrEx>
-          <w:tblCellMar>
-            <w:top w:w="0" w:type="dxa"/>
-            <w:bottom w:w="0" w:type="dxa"/>
-          </w:tblCellMar>
-        </w:tblPrEx>
         <w:tc>
           <w:tcPr>
             <w:tcW w:w="100" w:type="dxa"/>
@@ -1721,12 +2363,6 @@
         <w:gridCol w:w="1777"/>
       </w:tblGrid>
       <w:tr>
-        <w:tblPrEx>
-          <w:tblCellMar>
-            <w:top w:w="0" w:type="dxa"/>
-            <w:bottom w:w="0" w:type="dxa"/>
-          </w:tblCellMar>
-        </w:tblPrEx>
         <w:trPr>
           <w:tblHeader/>
         </w:trPr>
@@ -1948,12 +2584,6 @@
         </w:tc>
       </w:tr>
       <w:tr>
-        <w:tblPrEx>
-          <w:tblCellMar>
-            <w:top w:w="0" w:type="dxa"/>
-            <w:bottom w:w="0" w:type="dxa"/>
-          </w:tblCellMar>
-        </w:tblPrEx>
         <w:tc>
           <w:tcPr>
             <w:tcW w:w="100" w:type="dxa"/>
@@ -2170,12 +2800,6 @@
         <w:gridCol w:w="5332"/>
       </w:tblGrid>
       <w:tr>
-        <w:tblPrEx>
-          <w:tblCellMar>
-            <w:top w:w="0" w:type="dxa"/>
-            <w:bottom w:w="0" w:type="dxa"/>
-          </w:tblCellMar>
-        </w:tblPrEx>
         <w:tc>
           <w:tcPr>
             <w:tcW w:w="100" w:type="dxa"/>
@@ -2246,12 +2870,6 @@
         </w:tc>
       </w:tr>
       <w:tr>
-        <w:tblPrEx>
-          <w:tblCellMar>
-            <w:top w:w="0" w:type="dxa"/>
-            <w:bottom w:w="0" w:type="dxa"/>
-          </w:tblCellMar>
-        </w:tblPrEx>
         <w:tc>
           <w:tcPr>
             <w:tcW w:w="200" w:type="dxa"/>
@@ -2328,12 +2946,6 @@
         <w:gridCol w:w="1777"/>
       </w:tblGrid>
       <w:tr>
-        <w:tblPrEx>
-          <w:tblCellMar>
-            <w:top w:w="0" w:type="dxa"/>
-            <w:bottom w:w="0" w:type="dxa"/>
-          </w:tblCellMar>
-        </w:tblPrEx>
         <w:trPr>
           <w:tblHeader/>
         </w:trPr>
@@ -2555,12 +3167,6 @@
         </w:tc>
       </w:tr>
       <w:tr>
-        <w:tblPrEx>
-          <w:tblCellMar>
-            <w:top w:w="0" w:type="dxa"/>
-            <w:bottom w:w="0" w:type="dxa"/>
-          </w:tblCellMar>
-        </w:tblPrEx>
         <w:tc>
           <w:tcPr>
             <w:tcW w:w="100" w:type="dxa"/>
@@ -2781,12 +3387,6 @@
         <w:gridCol w:w="5332"/>
       </w:tblGrid>
       <w:tr>
-        <w:tblPrEx>
-          <w:tblCellMar>
-            <w:top w:w="0" w:type="dxa"/>
-            <w:bottom w:w="0" w:type="dxa"/>
-          </w:tblCellMar>
-        </w:tblPrEx>
         <w:tc>
           <w:tcPr>
             <w:tcW w:w="100" w:type="dxa"/>
@@ -2909,12 +3509,6 @@
         <w:gridCol w:w="1066"/>
       </w:tblGrid>
       <w:tr>
-        <w:tblPrEx>
-          <w:tblCellMar>
-            <w:top w:w="0" w:type="dxa"/>
-            <w:bottom w:w="0" w:type="dxa"/>
-          </w:tblCellMar>
-        </w:tblPrEx>
         <w:trPr>
           <w:tblHeader/>
         </w:trPr>
@@ -3280,12 +3874,6 @@
         </w:tc>
       </w:tr>
       <w:tr>
-        <w:tblPrEx>
-          <w:tblCellMar>
-            <w:top w:w="0" w:type="dxa"/>
-            <w:bottom w:w="0" w:type="dxa"/>
-          </w:tblCellMar>
-        </w:tblPrEx>
         <w:tc>
           <w:tcPr>
             <w:tcW w:w="100" w:type="dxa"/>
@@ -3633,12 +4221,6 @@
         <w:gridCol w:w="2133"/>
       </w:tblGrid>
       <w:tr>
-        <w:tblPrEx>
-          <w:tblCellMar>
-            <w:top w:w="0" w:type="dxa"/>
-            <w:bottom w:w="0" w:type="dxa"/>
-          </w:tblCellMar>
-        </w:tblPrEx>
         <w:trPr>
           <w:tblHeader/>
         </w:trPr>
@@ -3824,12 +4406,6 @@
         </w:tc>
       </w:tr>
       <w:tr>
-        <w:tblPrEx>
-          <w:tblCellMar>
-            <w:top w:w="0" w:type="dxa"/>
-            <w:bottom w:w="0" w:type="dxa"/>
-          </w:tblCellMar>
-        </w:tblPrEx>
         <w:tc>
           <w:tcPr>
             <w:tcW w:w="100" w:type="dxa"/>
@@ -4015,12 +4591,6 @@
         <w:gridCol w:w="5332"/>
       </w:tblGrid>
       <w:tr>
-        <w:tblPrEx>
-          <w:tblCellMar>
-            <w:top w:w="0" w:type="dxa"/>
-            <w:bottom w:w="0" w:type="dxa"/>
-          </w:tblCellMar>
-        </w:tblPrEx>
         <w:tc>
           <w:tcPr>
             <w:tcW w:w="100" w:type="dxa"/>
@@ -4091,12 +4661,6 @@
         </w:tc>
       </w:tr>
       <w:tr>
-        <w:tblPrEx>
-          <w:tblCellMar>
-            <w:top w:w="0" w:type="dxa"/>
-            <w:bottom w:w="0" w:type="dxa"/>
-          </w:tblCellMar>
-        </w:tblPrEx>
         <w:tc>
           <w:tcPr>
             <w:tcW w:w="200" w:type="dxa"/>
@@ -4145,6 +4709,1706 @@
       <w:r>
         <w:t>Fluxo visual resumido</w:t>
       </w:r>
+    </w:p>
+    <w:p>
+      <w:pPr>
+        <w:pStyle w:val="Ttulo2"/>
+        <w:spacing w:before="0" w:after="120"/>
+      </w:pPr>
+      <w:r>
+        <w:rPr>
+          <w:noProof/>
+        </w:rPr>
+        <mc:AlternateContent>
+          <mc:Choice Requires="wps">
+            <w:drawing>
+              <wp:anchor distT="0" distB="0" distL="114300" distR="114300" simplePos="0" relativeHeight="251682816" behindDoc="0" locked="0" layoutInCell="1" allowOverlap="1" wp14:anchorId="335442CF" wp14:editId="63B98335">
+                <wp:simplePos x="0" y="0"/>
+                <wp:positionH relativeFrom="column">
+                  <wp:posOffset>6273800</wp:posOffset>
+                </wp:positionH>
+                <wp:positionV relativeFrom="paragraph">
+                  <wp:posOffset>2961005</wp:posOffset>
+                </wp:positionV>
+                <wp:extent cx="990600" cy="533400"/>
+                <wp:effectExtent l="0" t="0" r="19050" b="19050"/>
+                <wp:wrapNone/>
+                <wp:docPr id="1752512017" name="Retângulo: Cantos Arredondados 24"/>
+                <wp:cNvGraphicFramePr/>
+                <a:graphic xmlns:a="http://schemas.openxmlformats.org/drawingml/2006/main">
+                  <a:graphicData uri="http://schemas.microsoft.com/office/word/2010/wordprocessingShape">
+                    <wps:wsp>
+                      <wps:cNvSpPr/>
+                      <wps:spPr>
+                        <a:xfrm>
+                          <a:off x="0" y="0"/>
+                          <a:ext cx="990600" cy="533400"/>
+                        </a:xfrm>
+                        <a:prstGeom prst="roundRect">
+                          <a:avLst/>
+                        </a:prstGeom>
+                        <a:solidFill>
+                          <a:srgbClr val="FFFFFF"/>
+                        </a:solidFill>
+                        <a:ln w="12700">
+                          <a:solidFill>
+                            <a:srgbClr val="53DA3D"/>
+                          </a:solidFill>
+                        </a:ln>
+                      </wps:spPr>
+                      <wps:style>
+                        <a:lnRef idx="2">
+                          <a:schemeClr val="accent1">
+                            <a:shade val="15000"/>
+                          </a:schemeClr>
+                        </a:lnRef>
+                        <a:fillRef idx="1">
+                          <a:schemeClr val="accent1"/>
+                        </a:fillRef>
+                        <a:effectRef idx="0">
+                          <a:schemeClr val="accent1"/>
+                        </a:effectRef>
+                        <a:fontRef idx="minor">
+                          <a:schemeClr val="lt1"/>
+                        </a:fontRef>
+                      </wps:style>
+                      <wps:txbx>
+                        <w:txbxContent>
+                          <w:p>
+                            <w:pPr>
+                              <w:jc w:val="center"/>
+                              <w:rPr>
+                                <w:sz w:val="14"/>
+                              </w:rPr>
+                            </w:pPr>
+                            <w:r>
+                              <w:rPr>
+                                <w:sz w:val="14"/>
+                              </w:rPr>
+                              <w:t>{flow_shape_2_step_6}</w:t>
+                            </w:r>
+                          </w:p>
+                        </w:txbxContent>
+                      </wps:txbx>
+                      <wps:bodyPr rot="0" spcFirstLastPara="0" vertOverflow="overflow" horzOverflow="overflow" vert="horz" wrap="square" lIns="50800" tIns="38100" rIns="50800" bIns="38100" numCol="1" spcCol="0" rtlCol="0" fromWordArt="0" anchor="ctr" anchorCtr="0" forceAA="0" compatLnSpc="1">
+                        <a:prstTxWarp prst="textNoShape">
+                          <a:avLst/>
+                        </a:prstTxWarp>
+                        <a:noAutofit/>
+                      </wps:bodyPr>
+                    </wps:wsp>
+                  </a:graphicData>
+                </a:graphic>
+              </wp:anchor>
+            </w:drawing>
+          </mc:Choice>
+          <mc:Fallback>
+            <w:pict>
+              <v:roundrect w14:anchorId="335442CF" id="Retângulo: Cantos Arredondados 24" o:spid="_x0000_s1026" style="position:absolute;margin-left:494pt;margin-top:233.15pt;width:78pt;height:42pt;z-index:251682816;visibility:visible;mso-wrap-style:square;mso-wrap-distance-left:9pt;mso-wrap-distance-top:0;mso-wrap-distance-right:9pt;mso-wrap-distance-bottom:0;mso-position-horizontal:absolute;mso-position-horizontal-relative:text;mso-position-vertical:absolute;mso-position-vertical-relative:text;v-text-anchor:middle" arcsize="10923f" o:gfxdata="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" strokecolor="#53da3d" strokeweight="1pt">
+                <v:stroke joinstyle="miter"/>
+                <v:textbox inset="4pt,3pt,4pt,3pt">
+                  <w:txbxContent>
+                    <w:p>
+                      <w:pPr>
+                        <w:jc w:val="center"/>
+                        <w:rPr>
+                          <w:sz w:val="14"/>
+                        </w:rPr>
+                      </w:pPr>
+                      <w:r>
+                        <w:rPr>
+                          <w:sz w:val="14"/>
+                        </w:rPr>
+                        <w:t>{flow_shape_2_step_6}</w:t>
+                      </w:r>
+                    </w:p>
+                  </w:txbxContent>
+                </v:textbox>
+              </v:roundrect>
+            </w:pict>
+          </mc:Fallback>
+        </mc:AlternateContent>
+      </w:r>
+      <w:r>
+        <w:rPr>
+          <w:noProof/>
+        </w:rPr>
+        <mc:AlternateContent>
+          <mc:Choice Requires="wps">
+            <w:drawing>
+              <wp:anchor distT="0" distB="0" distL="114300" distR="114300" simplePos="0" relativeHeight="251680768" behindDoc="0" locked="0" layoutInCell="1" allowOverlap="1" wp14:anchorId="6E8F1596" wp14:editId="1D4FF209">
+                <wp:simplePos x="0" y="0"/>
+                <wp:positionH relativeFrom="column">
+                  <wp:posOffset>5054600</wp:posOffset>
+                </wp:positionH>
+                <wp:positionV relativeFrom="paragraph">
+                  <wp:posOffset>2961005</wp:posOffset>
+                </wp:positionV>
+                <wp:extent cx="990600" cy="533400"/>
+                <wp:effectExtent l="0" t="0" r="19050" b="19050"/>
+                <wp:wrapNone/>
+                <wp:docPr id="1021467803" name="Retângulo: Cantos Arredondados 22"/>
+                <wp:cNvGraphicFramePr/>
+                <a:graphic xmlns:a="http://schemas.openxmlformats.org/drawingml/2006/main">
+                  <a:graphicData uri="http://schemas.microsoft.com/office/word/2010/wordprocessingShape">
+                    <wps:wsp>
+                      <wps:cNvSpPr/>
+                      <wps:spPr>
+                        <a:xfrm>
+                          <a:off x="0" y="0"/>
+                          <a:ext cx="990600" cy="533400"/>
+                        </a:xfrm>
+                        <a:prstGeom prst="roundRect">
+                          <a:avLst/>
+                        </a:prstGeom>
+                        <a:solidFill>
+                          <a:srgbClr val="FFFFFF"/>
+                        </a:solidFill>
+                        <a:ln w="12700">
+                          <a:solidFill>
+                            <a:srgbClr val="53DA3D"/>
+                          </a:solidFill>
+                        </a:ln>
+                      </wps:spPr>
+                      <wps:style>
+                        <a:lnRef idx="2">
+                          <a:schemeClr val="accent1">
+                            <a:shade val="15000"/>
+                          </a:schemeClr>
+                        </a:lnRef>
+                        <a:fillRef idx="1">
+                          <a:schemeClr val="accent1"/>
+                        </a:fillRef>
+                        <a:effectRef idx="0">
+                          <a:schemeClr val="accent1"/>
+                        </a:effectRef>
+                        <a:fontRef idx="minor">
+                          <a:schemeClr val="lt1"/>
+                        </a:fontRef>
+                      </wps:style>
+                      <wps:txbx>
+                        <w:txbxContent>
+                          <w:p>
+                            <w:pPr>
+                              <w:jc w:val="center"/>
+                              <w:rPr>
+                                <w:sz w:val="14"/>
+                              </w:rPr>
+                            </w:pPr>
+                            <w:r>
+                              <w:rPr>
+                                <w:sz w:val="14"/>
+                              </w:rPr>
+                              <w:t>{flow_shape_2_step_5}</w:t>
+                            </w:r>
+                          </w:p>
+                        </w:txbxContent>
+                      </wps:txbx>
+                      <wps:bodyPr rot="0" spcFirstLastPara="0" vertOverflow="overflow" horzOverflow="overflow" vert="horz" wrap="square" lIns="50800" tIns="38100" rIns="50800" bIns="38100" numCol="1" spcCol="0" rtlCol="0" fromWordArt="0" anchor="ctr" anchorCtr="0" forceAA="0" compatLnSpc="1">
+                        <a:prstTxWarp prst="textNoShape">
+                          <a:avLst/>
+                        </a:prstTxWarp>
+                        <a:noAutofit/>
+                      </wps:bodyPr>
+                    </wps:wsp>
+                  </a:graphicData>
+                </a:graphic>
+              </wp:anchor>
+            </w:drawing>
+          </mc:Choice>
+          <mc:Fallback>
+            <w:pict>
+              <v:roundrect w14:anchorId="6E8F1596" id="Retângulo: Cantos Arredondados 22" o:spid="_x0000_s1027" style="position:absolute;margin-left:398pt;margin-top:233.15pt;width:78pt;height:42pt;z-index:251680768;visibility:visible;mso-wrap-style:square;mso-wrap-distance-left:9pt;mso-wrap-distance-top:0;mso-wrap-distance-right:9pt;mso-wrap-distance-bottom:0;mso-position-horizontal:absolute;mso-position-horizontal-relative:text;mso-position-vertical:absolute;mso-position-vertical-relative:text;v-text-anchor:middle" arcsize="10923f" o:gfxdata="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" strokecolor="#53da3d" strokeweight="1pt">
+                <v:stroke joinstyle="miter"/>
+                <v:textbox inset="4pt,3pt,4pt,3pt">
+                  <w:txbxContent>
+                    <w:p>
+                      <w:pPr>
+                        <w:jc w:val="center"/>
+                        <w:rPr>
+                          <w:sz w:val="14"/>
+                        </w:rPr>
+                      </w:pPr>
+                      <w:r>
+                        <w:rPr>
+                          <w:sz w:val="14"/>
+                        </w:rPr>
+                        <w:t>{flow_shape_2_step_5}</w:t>
+                      </w:r>
+                    </w:p>
+                  </w:txbxContent>
+                </v:textbox>
+              </v:roundrect>
+            </w:pict>
+          </mc:Fallback>
+        </mc:AlternateContent>
+      </w:r>
+      <w:r>
+        <w:rPr>
+          <w:noProof/>
+        </w:rPr>
+        <mc:AlternateContent>
+          <mc:Choice Requires="wps">
+            <w:drawing>
+              <wp:anchor distT="0" distB="0" distL="114300" distR="114300" simplePos="0" relativeHeight="251678720" behindDoc="0" locked="0" layoutInCell="1" allowOverlap="1" wp14:anchorId="1AA6F7C1" wp14:editId="5E4B470D">
+                <wp:simplePos x="0" y="0"/>
+                <wp:positionH relativeFrom="column">
+                  <wp:posOffset>3835400</wp:posOffset>
+                </wp:positionH>
+                <wp:positionV relativeFrom="paragraph">
+                  <wp:posOffset>2961005</wp:posOffset>
+                </wp:positionV>
+                <wp:extent cx="990600" cy="533400"/>
+                <wp:effectExtent l="0" t="0" r="19050" b="19050"/>
+                <wp:wrapNone/>
+                <wp:docPr id="1449079873" name="Retângulo: Cantos Arredondados 20"/>
+                <wp:cNvGraphicFramePr/>
+                <a:graphic xmlns:a="http://schemas.openxmlformats.org/drawingml/2006/main">
+                  <a:graphicData uri="http://schemas.microsoft.com/office/word/2010/wordprocessingShape">
+                    <wps:wsp>
+                      <wps:cNvSpPr/>
+                      <wps:spPr>
+                        <a:xfrm>
+                          <a:off x="0" y="0"/>
+                          <a:ext cx="990600" cy="533400"/>
+                        </a:xfrm>
+                        <a:prstGeom prst="roundRect">
+                          <a:avLst/>
+                        </a:prstGeom>
+                        <a:solidFill>
+                          <a:srgbClr val="FFFFFF"/>
+                        </a:solidFill>
+                        <a:ln w="12700">
+                          <a:solidFill>
+                            <a:srgbClr val="53DA3D"/>
+                          </a:solidFill>
+                        </a:ln>
+                      </wps:spPr>
+                      <wps:style>
+                        <a:lnRef idx="2">
+                          <a:schemeClr val="accent1">
+                            <a:shade val="15000"/>
+                          </a:schemeClr>
+                        </a:lnRef>
+                        <a:fillRef idx="1">
+                          <a:schemeClr val="accent1"/>
+                        </a:fillRef>
+                        <a:effectRef idx="0">
+                          <a:schemeClr val="accent1"/>
+                        </a:effectRef>
+                        <a:fontRef idx="minor">
+                          <a:schemeClr val="lt1"/>
+                        </a:fontRef>
+                      </wps:style>
+                      <wps:txbx>
+                        <w:txbxContent>
+                          <w:p>
+                            <w:pPr>
+                              <w:jc w:val="center"/>
+                              <w:rPr>
+                                <w:sz w:val="14"/>
+                              </w:rPr>
+                            </w:pPr>
+                            <w:r>
+                              <w:rPr>
+                                <w:sz w:val="14"/>
+                              </w:rPr>
+                              <w:t>{flow_shape_2_step_4}</w:t>
+                            </w:r>
+                          </w:p>
+                        </w:txbxContent>
+                      </wps:txbx>
+                      <wps:bodyPr rot="0" spcFirstLastPara="0" vertOverflow="overflow" horzOverflow="overflow" vert="horz" wrap="square" lIns="50800" tIns="38100" rIns="50800" bIns="38100" numCol="1" spcCol="0" rtlCol="0" fromWordArt="0" anchor="ctr" anchorCtr="0" forceAA="0" compatLnSpc="1">
+                        <a:prstTxWarp prst="textNoShape">
+                          <a:avLst/>
+                        </a:prstTxWarp>
+                        <a:noAutofit/>
+                      </wps:bodyPr>
+                    </wps:wsp>
+                  </a:graphicData>
+                </a:graphic>
+              </wp:anchor>
+            </w:drawing>
+          </mc:Choice>
+          <mc:Fallback>
+            <w:pict>
+              <v:roundrect w14:anchorId="1AA6F7C1" id="Retângulo: Cantos Arredondados 20" o:spid="_x0000_s1028" style="position:absolute;margin-left:302pt;margin-top:233.15pt;width:78pt;height:42pt;z-index:251678720;visibility:visible;mso-wrap-style:square;mso-wrap-distance-left:9pt;mso-wrap-distance-top:0;mso-wrap-distance-right:9pt;mso-wrap-distance-bottom:0;mso-position-horizontal:absolute;mso-position-horizontal-relative:text;mso-position-vertical:absolute;mso-position-vertical-relative:text;v-text-anchor:middle" arcsize="10923f" o:gfxdata="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" strokecolor="#53da3d" strokeweight="1pt">
+                <v:stroke joinstyle="miter"/>
+                <v:textbox inset="4pt,3pt,4pt,3pt">
+                  <w:txbxContent>
+                    <w:p>
+                      <w:pPr>
+                        <w:jc w:val="center"/>
+                        <w:rPr>
+                          <w:sz w:val="14"/>
+                        </w:rPr>
+                      </w:pPr>
+                      <w:r>
+                        <w:rPr>
+                          <w:sz w:val="14"/>
+                        </w:rPr>
+                        <w:t>{flow_shape_2_step_4}</w:t>
+                      </w:r>
+                    </w:p>
+                  </w:txbxContent>
+                </v:textbox>
+              </v:roundrect>
+            </w:pict>
+          </mc:Fallback>
+        </mc:AlternateContent>
+      </w:r>
+      <w:r>
+        <w:rPr>
+          <w:noProof/>
+        </w:rPr>
+        <mc:AlternateContent>
+          <mc:Choice Requires="wps">
+            <w:drawing>
+              <wp:anchor distT="0" distB="0" distL="114300" distR="114300" simplePos="0" relativeHeight="251676672" behindDoc="0" locked="0" layoutInCell="1" allowOverlap="1" wp14:anchorId="4CF6B7C4" wp14:editId="30EFCFA3">
+                <wp:simplePos x="0" y="0"/>
+                <wp:positionH relativeFrom="column">
+                  <wp:posOffset>2616200</wp:posOffset>
+                </wp:positionH>
+                <wp:positionV relativeFrom="paragraph">
+                  <wp:posOffset>2961005</wp:posOffset>
+                </wp:positionV>
+                <wp:extent cx="990600" cy="533400"/>
+                <wp:effectExtent l="0" t="0" r="19050" b="19050"/>
+                <wp:wrapNone/>
+                <wp:docPr id="249713771" name="Retângulo: Cantos Arredondados 18"/>
+                <wp:cNvGraphicFramePr/>
+                <a:graphic xmlns:a="http://schemas.openxmlformats.org/drawingml/2006/main">
+                  <a:graphicData uri="http://schemas.microsoft.com/office/word/2010/wordprocessingShape">
+                    <wps:wsp>
+                      <wps:cNvSpPr/>
+                      <wps:spPr>
+                        <a:xfrm>
+                          <a:off x="0" y="0"/>
+                          <a:ext cx="990600" cy="533400"/>
+                        </a:xfrm>
+                        <a:prstGeom prst="roundRect">
+                          <a:avLst/>
+                        </a:prstGeom>
+                        <a:solidFill>
+                          <a:srgbClr val="FFFFFF"/>
+                        </a:solidFill>
+                        <a:ln w="12700">
+                          <a:solidFill>
+                            <a:srgbClr val="53DA3D"/>
+                          </a:solidFill>
+                        </a:ln>
+                      </wps:spPr>
+                      <wps:style>
+                        <a:lnRef idx="2">
+                          <a:schemeClr val="accent1">
+                            <a:shade val="15000"/>
+                          </a:schemeClr>
+                        </a:lnRef>
+                        <a:fillRef idx="1">
+                          <a:schemeClr val="accent1"/>
+                        </a:fillRef>
+                        <a:effectRef idx="0">
+                          <a:schemeClr val="accent1"/>
+                        </a:effectRef>
+                        <a:fontRef idx="minor">
+                          <a:schemeClr val="lt1"/>
+                        </a:fontRef>
+                      </wps:style>
+                      <wps:txbx>
+                        <w:txbxContent>
+                          <w:p>
+                            <w:pPr>
+                              <w:jc w:val="center"/>
+                              <w:rPr>
+                                <w:sz w:val="14"/>
+                              </w:rPr>
+                            </w:pPr>
+                            <w:r>
+                              <w:rPr>
+                                <w:sz w:val="14"/>
+                              </w:rPr>
+                              <w:t>{flow_shape_2_step_3}</w:t>
+                            </w:r>
+                          </w:p>
+                        </w:txbxContent>
+                      </wps:txbx>
+                      <wps:bodyPr rot="0" spcFirstLastPara="0" vertOverflow="overflow" horzOverflow="overflow" vert="horz" wrap="square" lIns="50800" tIns="38100" rIns="50800" bIns="38100" numCol="1" spcCol="0" rtlCol="0" fromWordArt="0" anchor="ctr" anchorCtr="0" forceAA="0" compatLnSpc="1">
+                        <a:prstTxWarp prst="textNoShape">
+                          <a:avLst/>
+                        </a:prstTxWarp>
+                        <a:noAutofit/>
+                      </wps:bodyPr>
+                    </wps:wsp>
+                  </a:graphicData>
+                </a:graphic>
+              </wp:anchor>
+            </w:drawing>
+          </mc:Choice>
+          <mc:Fallback>
+            <w:pict>
+              <v:roundrect w14:anchorId="4CF6B7C4" id="Retângulo: Cantos Arredondados 18" o:spid="_x0000_s1029" style="position:absolute;margin-left:206pt;margin-top:233.15pt;width:78pt;height:42pt;z-index:251676672;visibility:visible;mso-wrap-style:square;mso-wrap-distance-left:9pt;mso-wrap-distance-top:0;mso-wrap-distance-right:9pt;mso-wrap-distance-bottom:0;mso-position-horizontal:absolute;mso-position-horizontal-relative:text;mso-position-vertical:absolute;mso-position-vertical-relative:text;v-text-anchor:middle" arcsize="10923f" o:gfxdata="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" strokecolor="#53da3d" strokeweight="1pt">
+                <v:stroke joinstyle="miter"/>
+                <v:textbox inset="4pt,3pt,4pt,3pt">
+                  <w:txbxContent>
+                    <w:p>
+                      <w:pPr>
+                        <w:jc w:val="center"/>
+                        <w:rPr>
+                          <w:sz w:val="14"/>
+                        </w:rPr>
+                      </w:pPr>
+                      <w:r>
+                        <w:rPr>
+                          <w:sz w:val="14"/>
+                        </w:rPr>
+                        <w:t>{flow_shape_2_step_3}</w:t>
+                      </w:r>
+                    </w:p>
+                  </w:txbxContent>
+                </v:textbox>
+              </v:roundrect>
+            </w:pict>
+          </mc:Fallback>
+        </mc:AlternateContent>
+      </w:r>
+      <w:r>
+        <w:rPr>
+          <w:noProof/>
+        </w:rPr>
+        <mc:AlternateContent>
+          <mc:Choice Requires="wps">
+            <w:drawing>
+              <wp:anchor distT="0" distB="0" distL="114300" distR="114300" simplePos="0" relativeHeight="251674624" behindDoc="0" locked="0" layoutInCell="1" allowOverlap="1" wp14:anchorId="37B2547C" wp14:editId="798E0FDF">
+                <wp:simplePos x="0" y="0"/>
+                <wp:positionH relativeFrom="column">
+                  <wp:posOffset>1397000</wp:posOffset>
+                </wp:positionH>
+                <wp:positionV relativeFrom="paragraph">
+                  <wp:posOffset>2961005</wp:posOffset>
+                </wp:positionV>
+                <wp:extent cx="990600" cy="533400"/>
+                <wp:effectExtent l="0" t="0" r="19050" b="19050"/>
+                <wp:wrapNone/>
+                <wp:docPr id="1783755079" name="Retângulo: Cantos Arredondados 16"/>
+                <wp:cNvGraphicFramePr/>
+                <a:graphic xmlns:a="http://schemas.openxmlformats.org/drawingml/2006/main">
+                  <a:graphicData uri="http://schemas.microsoft.com/office/word/2010/wordprocessingShape">
+                    <wps:wsp>
+                      <wps:cNvSpPr/>
+                      <wps:spPr>
+                        <a:xfrm>
+                          <a:off x="0" y="0"/>
+                          <a:ext cx="990600" cy="533400"/>
+                        </a:xfrm>
+                        <a:prstGeom prst="roundRect">
+                          <a:avLst/>
+                        </a:prstGeom>
+                        <a:solidFill>
+                          <a:srgbClr val="FFFFFF"/>
+                        </a:solidFill>
+                        <a:ln w="12700">
+                          <a:solidFill>
+                            <a:srgbClr val="53DA3D"/>
+                          </a:solidFill>
+                        </a:ln>
+                      </wps:spPr>
+                      <wps:style>
+                        <a:lnRef idx="2">
+                          <a:schemeClr val="accent1">
+                            <a:shade val="15000"/>
+                          </a:schemeClr>
+                        </a:lnRef>
+                        <a:fillRef idx="1">
+                          <a:schemeClr val="accent1"/>
+                        </a:fillRef>
+                        <a:effectRef idx="0">
+                          <a:schemeClr val="accent1"/>
+                        </a:effectRef>
+                        <a:fontRef idx="minor">
+                          <a:schemeClr val="lt1"/>
+                        </a:fontRef>
+                      </wps:style>
+                      <wps:txbx>
+                        <w:txbxContent>
+                          <w:p>
+                            <w:pPr>
+                              <w:jc w:val="center"/>
+                              <w:rPr>
+                                <w:sz w:val="14"/>
+                              </w:rPr>
+                            </w:pPr>
+                            <w:r>
+                              <w:rPr>
+                                <w:sz w:val="14"/>
+                              </w:rPr>
+                              <w:t>{flow_shape_2_step_2}</w:t>
+                            </w:r>
+                          </w:p>
+                        </w:txbxContent>
+                      </wps:txbx>
+                      <wps:bodyPr rot="0" spcFirstLastPara="0" vertOverflow="overflow" horzOverflow="overflow" vert="horz" wrap="square" lIns="50800" tIns="38100" rIns="50800" bIns="38100" numCol="1" spcCol="0" rtlCol="0" fromWordArt="0" anchor="ctr" anchorCtr="0" forceAA="0" compatLnSpc="1">
+                        <a:prstTxWarp prst="textNoShape">
+                          <a:avLst/>
+                        </a:prstTxWarp>
+                        <a:noAutofit/>
+                      </wps:bodyPr>
+                    </wps:wsp>
+                  </a:graphicData>
+                </a:graphic>
+              </wp:anchor>
+            </w:drawing>
+          </mc:Choice>
+          <mc:Fallback>
+            <w:pict>
+              <v:roundrect w14:anchorId="37B2547C" id="Retângulo: Cantos Arredondados 16" o:spid="_x0000_s1030" style="position:absolute;margin-left:110pt;margin-top:233.15pt;width:78pt;height:42pt;z-index:251674624;visibility:visible;mso-wrap-style:square;mso-wrap-distance-left:9pt;mso-wrap-distance-top:0;mso-wrap-distance-right:9pt;mso-wrap-distance-bottom:0;mso-position-horizontal:absolute;mso-position-horizontal-relative:text;mso-position-vertical:absolute;mso-position-vertical-relative:text;v-text-anchor:middle" arcsize="10923f" o:gfxdata="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" strokecolor="#53da3d" strokeweight="1pt">
+                <v:stroke joinstyle="miter"/>
+                <v:textbox inset="4pt,3pt,4pt,3pt">
+                  <w:txbxContent>
+                    <w:p>
+                      <w:pPr>
+                        <w:jc w:val="center"/>
+                        <w:rPr>
+                          <w:sz w:val="14"/>
+                        </w:rPr>
+                      </w:pPr>
+                      <w:r>
+                        <w:rPr>
+                          <w:sz w:val="14"/>
+                        </w:rPr>
+                        <w:t>{flow_shape_2_step_2}</w:t>
+                      </w:r>
+                    </w:p>
+                  </w:txbxContent>
+                </v:textbox>
+              </v:roundrect>
+            </w:pict>
+          </mc:Fallback>
+        </mc:AlternateContent>
+      </w:r>
+      <w:r>
+        <w:rPr>
+          <w:noProof/>
+        </w:rPr>
+        <mc:AlternateContent>
+          <mc:Choice Requires="wps">
+            <w:drawing>
+              <wp:anchor distT="0" distB="0" distL="114300" distR="114300" simplePos="0" relativeHeight="251672576" behindDoc="0" locked="0" layoutInCell="1" allowOverlap="1" wp14:anchorId="4EC0C154" wp14:editId="2FAC276B">
+                <wp:simplePos x="0" y="0"/>
+                <wp:positionH relativeFrom="column">
+                  <wp:posOffset>177800</wp:posOffset>
+                </wp:positionH>
+                <wp:positionV relativeFrom="paragraph">
+                  <wp:posOffset>2961005</wp:posOffset>
+                </wp:positionV>
+                <wp:extent cx="990600" cy="533400"/>
+                <wp:effectExtent l="0" t="0" r="19050" b="19050"/>
+                <wp:wrapNone/>
+                <wp:docPr id="1829180862" name="Retângulo: Cantos Arredondados 14"/>
+                <wp:cNvGraphicFramePr/>
+                <a:graphic xmlns:a="http://schemas.openxmlformats.org/drawingml/2006/main">
+                  <a:graphicData uri="http://schemas.microsoft.com/office/word/2010/wordprocessingShape">
+                    <wps:wsp>
+                      <wps:cNvSpPr/>
+                      <wps:spPr>
+                        <a:xfrm>
+                          <a:off x="0" y="0"/>
+                          <a:ext cx="990600" cy="533400"/>
+                        </a:xfrm>
+                        <a:prstGeom prst="roundRect">
+                          <a:avLst/>
+                        </a:prstGeom>
+                        <a:solidFill>
+                          <a:srgbClr val="FFFFFF"/>
+                        </a:solidFill>
+                        <a:ln w="12700">
+                          <a:solidFill>
+                            <a:srgbClr val="53DA3D"/>
+                          </a:solidFill>
+                        </a:ln>
+                      </wps:spPr>
+                      <wps:style>
+                        <a:lnRef idx="2">
+                          <a:schemeClr val="accent1">
+                            <a:shade val="15000"/>
+                          </a:schemeClr>
+                        </a:lnRef>
+                        <a:fillRef idx="1">
+                          <a:schemeClr val="accent1"/>
+                        </a:fillRef>
+                        <a:effectRef idx="0">
+                          <a:schemeClr val="accent1"/>
+                        </a:effectRef>
+                        <a:fontRef idx="minor">
+                          <a:schemeClr val="lt1"/>
+                        </a:fontRef>
+                      </wps:style>
+                      <wps:txbx>
+                        <w:txbxContent>
+                          <w:p>
+                            <w:pPr>
+                              <w:jc w:val="center"/>
+                              <w:rPr>
+                                <w:sz w:val="14"/>
+                              </w:rPr>
+                            </w:pPr>
+                            <w:r>
+                              <w:rPr>
+                                <w:sz w:val="14"/>
+                              </w:rPr>
+                              <w:t>{flow_shape_2_step_1}</w:t>
+                            </w:r>
+                          </w:p>
+                        </w:txbxContent>
+                      </wps:txbx>
+                      <wps:bodyPr rot="0" spcFirstLastPara="0" vertOverflow="overflow" horzOverflow="overflow" vert="horz" wrap="square" lIns="50800" tIns="38100" rIns="50800" bIns="38100" numCol="1" spcCol="0" rtlCol="0" fromWordArt="0" anchor="ctr" anchorCtr="0" forceAA="0" compatLnSpc="1">
+                        <a:prstTxWarp prst="textNoShape">
+                          <a:avLst/>
+                        </a:prstTxWarp>
+                        <a:noAutofit/>
+                      </wps:bodyPr>
+                    </wps:wsp>
+                  </a:graphicData>
+                </a:graphic>
+              </wp:anchor>
+            </w:drawing>
+          </mc:Choice>
+          <mc:Fallback>
+            <w:pict>
+              <v:roundrect w14:anchorId="4EC0C154" id="Retângulo: Cantos Arredondados 14" o:spid="_x0000_s1031" style="position:absolute;margin-left:14pt;margin-top:233.15pt;width:78pt;height:42pt;z-index:251672576;visibility:visible;mso-wrap-style:square;mso-wrap-distance-left:9pt;mso-wrap-distance-top:0;mso-wrap-distance-right:9pt;mso-wrap-distance-bottom:0;mso-position-horizontal:absolute;mso-position-horizontal-relative:text;mso-position-vertical:absolute;mso-position-vertical-relative:text;v-text-anchor:middle" arcsize="10923f" o:gfxdata="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" strokecolor="#53da3d" strokeweight="1pt">
+                <v:stroke joinstyle="miter"/>
+                <v:textbox inset="4pt,3pt,4pt,3pt">
+                  <w:txbxContent>
+                    <w:p>
+                      <w:pPr>
+                        <w:jc w:val="center"/>
+                        <w:rPr>
+                          <w:sz w:val="14"/>
+                        </w:rPr>
+                      </w:pPr>
+                      <w:r>
+                        <w:rPr>
+                          <w:sz w:val="14"/>
+                        </w:rPr>
+                        <w:t>{flow_shape_2_step_1}</w:t>
+                      </w:r>
+                    </w:p>
+                  </w:txbxContent>
+                </v:textbox>
+              </v:roundrect>
+            </w:pict>
+          </mc:Fallback>
+        </mc:AlternateContent>
+      </w:r>
+      <w:r>
+        <w:rPr>
+          <w:noProof/>
+        </w:rPr>
+        <mc:AlternateContent>
+          <mc:Choice Requires="wps">
+            <w:drawing>
+              <wp:anchor distT="0" distB="0" distL="114300" distR="114300" simplePos="0" relativeHeight="251671552" behindDoc="0" locked="0" layoutInCell="1" allowOverlap="1" wp14:anchorId="6DEA1BC8" wp14:editId="34B4793F">
+                <wp:simplePos x="0" y="0"/>
+                <wp:positionH relativeFrom="column">
+                  <wp:posOffset>177800</wp:posOffset>
+                </wp:positionH>
+                <wp:positionV relativeFrom="paragraph">
+                  <wp:posOffset>2478405</wp:posOffset>
+                </wp:positionV>
+                <wp:extent cx="7112000" cy="304800"/>
+                <wp:effectExtent l="0" t="0" r="12700" b="19050"/>
+                <wp:wrapNone/>
+                <wp:docPr id="1639732649" name="Retângulo: Cantos Arredondados 13"/>
+                <wp:cNvGraphicFramePr/>
+                <a:graphic xmlns:a="http://schemas.openxmlformats.org/drawingml/2006/main">
+                  <a:graphicData uri="http://schemas.microsoft.com/office/word/2010/wordprocessingShape">
+                    <wps:wsp>
+                      <wps:cNvSpPr/>
+                      <wps:spPr>
+                        <a:xfrm>
+                          <a:off x="0" y="0"/>
+                          <a:ext cx="7112000" cy="304800"/>
+                        </a:xfrm>
+                        <a:prstGeom prst="roundRect">
+                          <a:avLst/>
+                        </a:prstGeom>
+                        <a:solidFill>
+                          <a:srgbClr val="DBFFE8"/>
+                        </a:solidFill>
+                        <a:ln w="12700">
+                          <a:solidFill>
+                            <a:srgbClr val="53DA3D"/>
+                          </a:solidFill>
+                        </a:ln>
+                      </wps:spPr>
+                      <wps:style>
+                        <a:lnRef idx="2">
+                          <a:schemeClr val="accent1">
+                            <a:shade val="15000"/>
+                          </a:schemeClr>
+                        </a:lnRef>
+                        <a:fillRef idx="1">
+                          <a:schemeClr val="accent1"/>
+                        </a:fillRef>
+                        <a:effectRef idx="0">
+                          <a:schemeClr val="accent1"/>
+                        </a:effectRef>
+                        <a:fontRef idx="minor">
+                          <a:schemeClr val="lt1"/>
+                        </a:fontRef>
+                      </wps:style>
+                      <wps:txbx>
+                        <w:txbxContent>
+                          <w:p>
+                            <w:pPr>
+                              <w:jc w:val="center"/>
+                              <w:rPr>
+                                <w:b/>
+                                <w:sz w:val="14"/>
+                              </w:rPr>
+                            </w:pPr>
+                            <w:r>
+                              <w:rPr>
+                                <w:b/>
+                                <w:sz w:val="14"/>
+                              </w:rPr>
+                              <w:t>{flow_shape_2_title}</w:t>
+                            </w:r>
+                          </w:p>
+                        </w:txbxContent>
+                      </wps:txbx>
+                      <wps:bodyPr rot="0" spcFirstLastPara="0" vertOverflow="overflow" horzOverflow="overflow" vert="horz" wrap="square" lIns="50800" tIns="38100" rIns="50800" bIns="38100" numCol="1" spcCol="0" rtlCol="0" fromWordArt="0" anchor="ctr" anchorCtr="0" forceAA="0" compatLnSpc="1">
+                        <a:prstTxWarp prst="textNoShape">
+                          <a:avLst/>
+                        </a:prstTxWarp>
+                        <a:noAutofit/>
+                      </wps:bodyPr>
+                    </wps:wsp>
+                  </a:graphicData>
+                </a:graphic>
+              </wp:anchor>
+            </w:drawing>
+          </mc:Choice>
+          <mc:Fallback>
+            <w:pict>
+              <v:roundrect w14:anchorId="6DEA1BC8" id="Retângulo: Cantos Arredondados 13" o:spid="_x0000_s1032" style="position:absolute;margin-left:14pt;margin-top:195.15pt;width:560pt;height:24pt;z-index:251671552;visibility:visible;mso-wrap-style:square;mso-wrap-distance-left:9pt;mso-wrap-distance-top:0;mso-wrap-distance-right:9pt;mso-wrap-distance-bottom:0;mso-position-horizontal:absolute;mso-position-horizontal-relative:text;mso-position-vertical:absolute;mso-position-vertical-relative:text;v-text-anchor:middle" arcsize="10923f" o:gfxdata="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" fillcolor="#dbffe8" strokecolor="#53da3d" strokeweight="1pt">
+                <v:stroke joinstyle="miter"/>
+                <v:textbox inset="4pt,3pt,4pt,3pt">
+                  <w:txbxContent>
+                    <w:p>
+                      <w:pPr>
+                        <w:jc w:val="center"/>
+                        <w:rPr>
+                          <w:b/>
+                          <w:sz w:val="14"/>
+                        </w:rPr>
+                      </w:pPr>
+                      <w:r>
+                        <w:rPr>
+                          <w:b/>
+                          <w:sz w:val="14"/>
+                        </w:rPr>
+                        <w:t>{flow_shape_2_title}</w:t>
+                      </w:r>
+                    </w:p>
+                  </w:txbxContent>
+                </v:textbox>
+              </v:roundrect>
+            </w:pict>
+          </mc:Fallback>
+        </mc:AlternateContent>
+      </w:r>
+      <w:r>
+        <w:rPr>
+          <w:noProof/>
+        </w:rPr>
+        <mc:AlternateContent>
+          <mc:Choice Requires="wps">
+            <w:drawing>
+              <wp:anchor distT="0" distB="0" distL="114300" distR="114300" simplePos="0" relativeHeight="251670528" behindDoc="0" locked="0" layoutInCell="1" allowOverlap="1" wp14:anchorId="30FDBD3A" wp14:editId="1B0A9D2B">
+                <wp:simplePos x="0" y="0"/>
+                <wp:positionH relativeFrom="column">
+                  <wp:posOffset>6273800</wp:posOffset>
+                </wp:positionH>
+                <wp:positionV relativeFrom="paragraph">
+                  <wp:posOffset>1627505</wp:posOffset>
+                </wp:positionV>
+                <wp:extent cx="990600" cy="533400"/>
+                <wp:effectExtent l="0" t="0" r="19050" b="19050"/>
+                <wp:wrapNone/>
+                <wp:docPr id="1048145225" name="Retângulo: Cantos Arredondados 12"/>
+                <wp:cNvGraphicFramePr/>
+                <a:graphic xmlns:a="http://schemas.openxmlformats.org/drawingml/2006/main">
+                  <a:graphicData uri="http://schemas.microsoft.com/office/word/2010/wordprocessingShape">
+                    <wps:wsp>
+                      <wps:cNvSpPr/>
+                      <wps:spPr>
+                        <a:xfrm>
+                          <a:off x="0" y="0"/>
+                          <a:ext cx="990600" cy="533400"/>
+                        </a:xfrm>
+                        <a:prstGeom prst="roundRect">
+                          <a:avLst/>
+                        </a:prstGeom>
+                        <a:solidFill>
+                          <a:srgbClr val="FFFFFF"/>
+                        </a:solidFill>
+                        <a:ln w="12700">
+                          <a:solidFill>
+                            <a:srgbClr val="2555D9"/>
+                          </a:solidFill>
+                        </a:ln>
+                      </wps:spPr>
+                      <wps:style>
+                        <a:lnRef idx="2">
+                          <a:schemeClr val="accent1">
+                            <a:shade val="15000"/>
+                          </a:schemeClr>
+                        </a:lnRef>
+                        <a:fillRef idx="1">
+                          <a:schemeClr val="accent1"/>
+                        </a:fillRef>
+                        <a:effectRef idx="0">
+                          <a:schemeClr val="accent1"/>
+                        </a:effectRef>
+                        <a:fontRef idx="minor">
+                          <a:schemeClr val="lt1"/>
+                        </a:fontRef>
+                      </wps:style>
+                      <wps:txbx>
+                        <w:txbxContent>
+                          <w:p>
+                            <w:pPr>
+                              <w:jc w:val="center"/>
+                              <w:rPr>
+                                <w:sz w:val="14"/>
+                              </w:rPr>
+                            </w:pPr>
+                            <w:r>
+                              <w:rPr>
+                                <w:sz w:val="14"/>
+                              </w:rPr>
+                              <w:t>{flow_shape_1_step_6}</w:t>
+                            </w:r>
+                          </w:p>
+                        </w:txbxContent>
+                      </wps:txbx>
+                      <wps:bodyPr rot="0" spcFirstLastPara="0" vertOverflow="overflow" horzOverflow="overflow" vert="horz" wrap="square" lIns="50800" tIns="38100" rIns="50800" bIns="38100" numCol="1" spcCol="0" rtlCol="0" fromWordArt="0" anchor="ctr" anchorCtr="0" forceAA="0" compatLnSpc="1">
+                        <a:prstTxWarp prst="textNoShape">
+                          <a:avLst/>
+                        </a:prstTxWarp>
+                        <a:noAutofit/>
+                      </wps:bodyPr>
+                    </wps:wsp>
+                  </a:graphicData>
+                </a:graphic>
+              </wp:anchor>
+            </w:drawing>
+          </mc:Choice>
+          <mc:Fallback>
+            <w:pict>
+              <v:roundrect w14:anchorId="30FDBD3A" id="Retângulo: Cantos Arredondados 12" o:spid="_x0000_s1033" style="position:absolute;margin-left:494pt;margin-top:128.15pt;width:78pt;height:42pt;z-index:251670528;visibility:visible;mso-wrap-style:square;mso-wrap-distance-left:9pt;mso-wrap-distance-top:0;mso-wrap-distance-right:9pt;mso-wrap-distance-bottom:0;mso-position-horizontal:absolute;mso-position-horizontal-relative:text;mso-position-vertical:absolute;mso-position-vertical-relative:text;v-text-anchor:middle" arcsize="10923f" o:gfxdata="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" strokecolor="#2555d9" strokeweight="1pt">
+                <v:stroke joinstyle="miter"/>
+                <v:textbox inset="4pt,3pt,4pt,3pt">
+                  <w:txbxContent>
+                    <w:p>
+                      <w:pPr>
+                        <w:jc w:val="center"/>
+                        <w:rPr>
+                          <w:sz w:val="14"/>
+                        </w:rPr>
+                      </w:pPr>
+                      <w:r>
+                        <w:rPr>
+                          <w:sz w:val="14"/>
+                        </w:rPr>
+                        <w:t>{flow_shape_1_step_6}</w:t>
+                      </w:r>
+                    </w:p>
+                  </w:txbxContent>
+                </v:textbox>
+              </v:roundrect>
+            </w:pict>
+          </mc:Fallback>
+        </mc:AlternateContent>
+      </w:r>
+      <w:r>
+        <w:rPr>
+          <w:noProof/>
+        </w:rPr>
+        <mc:AlternateContent>
+          <mc:Choice Requires="wps">
+            <w:drawing>
+              <wp:anchor distT="0" distB="0" distL="114300" distR="114300" simplePos="0" relativeHeight="251668480" behindDoc="0" locked="0" layoutInCell="1" allowOverlap="1" wp14:anchorId="353E1F85" wp14:editId="01CD85D3">
+                <wp:simplePos x="0" y="0"/>
+                <wp:positionH relativeFrom="column">
+                  <wp:posOffset>5054600</wp:posOffset>
+                </wp:positionH>
+                <wp:positionV relativeFrom="paragraph">
+                  <wp:posOffset>1627505</wp:posOffset>
+                </wp:positionV>
+                <wp:extent cx="990600" cy="533400"/>
+                <wp:effectExtent l="0" t="0" r="19050" b="19050"/>
+                <wp:wrapNone/>
+                <wp:docPr id="1830682808" name="Retângulo: Cantos Arredondados 10"/>
+                <wp:cNvGraphicFramePr/>
+                <a:graphic xmlns:a="http://schemas.openxmlformats.org/drawingml/2006/main">
+                  <a:graphicData uri="http://schemas.microsoft.com/office/word/2010/wordprocessingShape">
+                    <wps:wsp>
+                      <wps:cNvSpPr/>
+                      <wps:spPr>
+                        <a:xfrm>
+                          <a:off x="0" y="0"/>
+                          <a:ext cx="990600" cy="533400"/>
+                        </a:xfrm>
+                        <a:prstGeom prst="roundRect">
+                          <a:avLst/>
+                        </a:prstGeom>
+                        <a:solidFill>
+                          <a:srgbClr val="FFFFFF"/>
+                        </a:solidFill>
+                        <a:ln w="12700">
+                          <a:solidFill>
+                            <a:srgbClr val="2555D9"/>
+                          </a:solidFill>
+                        </a:ln>
+                      </wps:spPr>
+                      <wps:style>
+                        <a:lnRef idx="2">
+                          <a:schemeClr val="accent1">
+                            <a:shade val="15000"/>
+                          </a:schemeClr>
+                        </a:lnRef>
+                        <a:fillRef idx="1">
+                          <a:schemeClr val="accent1"/>
+                        </a:fillRef>
+                        <a:effectRef idx="0">
+                          <a:schemeClr val="accent1"/>
+                        </a:effectRef>
+                        <a:fontRef idx="minor">
+                          <a:schemeClr val="lt1"/>
+                        </a:fontRef>
+                      </wps:style>
+                      <wps:txbx>
+                        <w:txbxContent>
+                          <w:p>
+                            <w:pPr>
+                              <w:jc w:val="center"/>
+                              <w:rPr>
+                                <w:sz w:val="14"/>
+                              </w:rPr>
+                            </w:pPr>
+                            <w:r>
+                              <w:rPr>
+                                <w:sz w:val="14"/>
+                              </w:rPr>
+                              <w:t>{flow_shape_1_step_5}</w:t>
+                            </w:r>
+                          </w:p>
+                        </w:txbxContent>
+                      </wps:txbx>
+                      <wps:bodyPr rot="0" spcFirstLastPara="0" vertOverflow="overflow" horzOverflow="overflow" vert="horz" wrap="square" lIns="50800" tIns="38100" rIns="50800" bIns="38100" numCol="1" spcCol="0" rtlCol="0" fromWordArt="0" anchor="ctr" anchorCtr="0" forceAA="0" compatLnSpc="1">
+                        <a:prstTxWarp prst="textNoShape">
+                          <a:avLst/>
+                        </a:prstTxWarp>
+                        <a:noAutofit/>
+                      </wps:bodyPr>
+                    </wps:wsp>
+                  </a:graphicData>
+                </a:graphic>
+              </wp:anchor>
+            </w:drawing>
+          </mc:Choice>
+          <mc:Fallback>
+            <w:pict>
+              <v:roundrect w14:anchorId="353E1F85" id="Retângulo: Cantos Arredondados 10" o:spid="_x0000_s1034" style="position:absolute;margin-left:398pt;margin-top:128.15pt;width:78pt;height:42pt;z-index:251668480;visibility:visible;mso-wrap-style:square;mso-wrap-distance-left:9pt;mso-wrap-distance-top:0;mso-wrap-distance-right:9pt;mso-wrap-distance-bottom:0;mso-position-horizontal:absolute;mso-position-horizontal-relative:text;mso-position-vertical:absolute;mso-position-vertical-relative:text;v-text-anchor:middle" arcsize="10923f" o:gfxdata="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" strokecolor="#2555d9" strokeweight="1pt">
+                <v:stroke joinstyle="miter"/>
+                <v:textbox inset="4pt,3pt,4pt,3pt">
+                  <w:txbxContent>
+                    <w:p>
+                      <w:pPr>
+                        <w:jc w:val="center"/>
+                        <w:rPr>
+                          <w:sz w:val="14"/>
+                        </w:rPr>
+                      </w:pPr>
+                      <w:r>
+                        <w:rPr>
+                          <w:sz w:val="14"/>
+                        </w:rPr>
+                        <w:t>{flow_shape_1_step_5}</w:t>
+                      </w:r>
+                    </w:p>
+                  </w:txbxContent>
+                </v:textbox>
+              </v:roundrect>
+            </w:pict>
+          </mc:Fallback>
+        </mc:AlternateContent>
+      </w:r>
+      <w:r>
+        <w:rPr>
+          <w:noProof/>
+        </w:rPr>
+        <mc:AlternateContent>
+          <mc:Choice Requires="wps">
+            <w:drawing>
+              <wp:anchor distT="0" distB="0" distL="114300" distR="114300" simplePos="0" relativeHeight="251666432" behindDoc="0" locked="0" layoutInCell="1" allowOverlap="1" wp14:anchorId="24287406" wp14:editId="635C0303">
+                <wp:simplePos x="0" y="0"/>
+                <wp:positionH relativeFrom="column">
+                  <wp:posOffset>3835400</wp:posOffset>
+                </wp:positionH>
+                <wp:positionV relativeFrom="paragraph">
+                  <wp:posOffset>1627505</wp:posOffset>
+                </wp:positionV>
+                <wp:extent cx="990600" cy="533400"/>
+                <wp:effectExtent l="0" t="0" r="19050" b="19050"/>
+                <wp:wrapNone/>
+                <wp:docPr id="58233908" name="Retângulo: Cantos Arredondados 8"/>
+                <wp:cNvGraphicFramePr/>
+                <a:graphic xmlns:a="http://schemas.openxmlformats.org/drawingml/2006/main">
+                  <a:graphicData uri="http://schemas.microsoft.com/office/word/2010/wordprocessingShape">
+                    <wps:wsp>
+                      <wps:cNvSpPr/>
+                      <wps:spPr>
+                        <a:xfrm>
+                          <a:off x="0" y="0"/>
+                          <a:ext cx="990600" cy="533400"/>
+                        </a:xfrm>
+                        <a:prstGeom prst="roundRect">
+                          <a:avLst/>
+                        </a:prstGeom>
+                        <a:solidFill>
+                          <a:srgbClr val="FFFFFF"/>
+                        </a:solidFill>
+                        <a:ln w="12700">
+                          <a:solidFill>
+                            <a:srgbClr val="2555D9"/>
+                          </a:solidFill>
+                        </a:ln>
+                      </wps:spPr>
+                      <wps:style>
+                        <a:lnRef idx="2">
+                          <a:schemeClr val="accent1">
+                            <a:shade val="15000"/>
+                          </a:schemeClr>
+                        </a:lnRef>
+                        <a:fillRef idx="1">
+                          <a:schemeClr val="accent1"/>
+                        </a:fillRef>
+                        <a:effectRef idx="0">
+                          <a:schemeClr val="accent1"/>
+                        </a:effectRef>
+                        <a:fontRef idx="minor">
+                          <a:schemeClr val="lt1"/>
+                        </a:fontRef>
+                      </wps:style>
+                      <wps:txbx>
+                        <w:txbxContent>
+                          <w:p>
+                            <w:pPr>
+                              <w:jc w:val="center"/>
+                              <w:rPr>
+                                <w:sz w:val="14"/>
+                              </w:rPr>
+                            </w:pPr>
+                            <w:r>
+                              <w:rPr>
+                                <w:sz w:val="14"/>
+                              </w:rPr>
+                              <w:t>{flow_shape_1_step_4}</w:t>
+                            </w:r>
+                          </w:p>
+                        </w:txbxContent>
+                      </wps:txbx>
+                      <wps:bodyPr rot="0" spcFirstLastPara="0" vertOverflow="overflow" horzOverflow="overflow" vert="horz" wrap="square" lIns="50800" tIns="38100" rIns="50800" bIns="38100" numCol="1" spcCol="0" rtlCol="0" fromWordArt="0" anchor="ctr" anchorCtr="0" forceAA="0" compatLnSpc="1">
+                        <a:prstTxWarp prst="textNoShape">
+                          <a:avLst/>
+                        </a:prstTxWarp>
+                        <a:noAutofit/>
+                      </wps:bodyPr>
+                    </wps:wsp>
+                  </a:graphicData>
+                </a:graphic>
+              </wp:anchor>
+            </w:drawing>
+          </mc:Choice>
+          <mc:Fallback>
+            <w:pict>
+              <v:roundrect w14:anchorId="24287406" id="Retângulo: Cantos Arredondados 8" o:spid="_x0000_s1035" style="position:absolute;margin-left:302pt;margin-top:128.15pt;width:78pt;height:42pt;z-index:251666432;visibility:visible;mso-wrap-style:square;mso-wrap-distance-left:9pt;mso-wrap-distance-top:0;mso-wrap-distance-right:9pt;mso-wrap-distance-bottom:0;mso-position-horizontal:absolute;mso-position-horizontal-relative:text;mso-position-vertical:absolute;mso-position-vertical-relative:text;v-text-anchor:middle" arcsize="10923f" o:gfxdata="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" strokecolor="#2555d9" strokeweight="1pt">
+                <v:stroke joinstyle="miter"/>
+                <v:textbox inset="4pt,3pt,4pt,3pt">
+                  <w:txbxContent>
+                    <w:p>
+                      <w:pPr>
+                        <w:jc w:val="center"/>
+                        <w:rPr>
+                          <w:sz w:val="14"/>
+                        </w:rPr>
+                      </w:pPr>
+                      <w:r>
+                        <w:rPr>
+                          <w:sz w:val="14"/>
+                        </w:rPr>
+                        <w:t>{flow_shape_1_step_4}</w:t>
+                      </w:r>
+                    </w:p>
+                  </w:txbxContent>
+                </v:textbox>
+              </v:roundrect>
+            </w:pict>
+          </mc:Fallback>
+        </mc:AlternateContent>
+      </w:r>
+      <w:r>
+        <w:rPr>
+          <w:noProof/>
+        </w:rPr>
+        <mc:AlternateContent>
+          <mc:Choice Requires="wps">
+            <w:drawing>
+              <wp:anchor distT="0" distB="0" distL="114300" distR="114300" simplePos="0" relativeHeight="251664384" behindDoc="0" locked="0" layoutInCell="1" allowOverlap="1" wp14:anchorId="55C5A156" wp14:editId="168E0D6A">
+                <wp:simplePos x="0" y="0"/>
+                <wp:positionH relativeFrom="column">
+                  <wp:posOffset>2616200</wp:posOffset>
+                </wp:positionH>
+                <wp:positionV relativeFrom="paragraph">
+                  <wp:posOffset>1627505</wp:posOffset>
+                </wp:positionV>
+                <wp:extent cx="990600" cy="533400"/>
+                <wp:effectExtent l="0" t="0" r="19050" b="19050"/>
+                <wp:wrapNone/>
+                <wp:docPr id="2095813878" name="Retângulo: Cantos Arredondados 6"/>
+                <wp:cNvGraphicFramePr/>
+                <a:graphic xmlns:a="http://schemas.openxmlformats.org/drawingml/2006/main">
+                  <a:graphicData uri="http://schemas.microsoft.com/office/word/2010/wordprocessingShape">
+                    <wps:wsp>
+                      <wps:cNvSpPr/>
+                      <wps:spPr>
+                        <a:xfrm>
+                          <a:off x="0" y="0"/>
+                          <a:ext cx="990600" cy="533400"/>
+                        </a:xfrm>
+                        <a:prstGeom prst="roundRect">
+                          <a:avLst/>
+                        </a:prstGeom>
+                        <a:solidFill>
+                          <a:srgbClr val="FFFFFF"/>
+                        </a:solidFill>
+                        <a:ln w="12700">
+                          <a:solidFill>
+                            <a:srgbClr val="2555D9"/>
+                          </a:solidFill>
+                        </a:ln>
+                      </wps:spPr>
+                      <wps:style>
+                        <a:lnRef idx="2">
+                          <a:schemeClr val="accent1">
+                            <a:shade val="15000"/>
+                          </a:schemeClr>
+                        </a:lnRef>
+                        <a:fillRef idx="1">
+                          <a:schemeClr val="accent1"/>
+                        </a:fillRef>
+                        <a:effectRef idx="0">
+                          <a:schemeClr val="accent1"/>
+                        </a:effectRef>
+                        <a:fontRef idx="minor">
+                          <a:schemeClr val="lt1"/>
+                        </a:fontRef>
+                      </wps:style>
+                      <wps:txbx>
+                        <w:txbxContent>
+                          <w:p>
+                            <w:pPr>
+                              <w:jc w:val="center"/>
+                              <w:rPr>
+                                <w:sz w:val="14"/>
+                              </w:rPr>
+                            </w:pPr>
+                            <w:r>
+                              <w:rPr>
+                                <w:sz w:val="14"/>
+                              </w:rPr>
+                              <w:t>{flow_shape_1_step_3}</w:t>
+                            </w:r>
+                          </w:p>
+                        </w:txbxContent>
+                      </wps:txbx>
+                      <wps:bodyPr rot="0" spcFirstLastPara="0" vertOverflow="overflow" horzOverflow="overflow" vert="horz" wrap="square" lIns="50800" tIns="38100" rIns="50800" bIns="38100" numCol="1" spcCol="0" rtlCol="0" fromWordArt="0" anchor="ctr" anchorCtr="0" forceAA="0" compatLnSpc="1">
+                        <a:prstTxWarp prst="textNoShape">
+                          <a:avLst/>
+                        </a:prstTxWarp>
+                        <a:noAutofit/>
+                      </wps:bodyPr>
+                    </wps:wsp>
+                  </a:graphicData>
+                </a:graphic>
+              </wp:anchor>
+            </w:drawing>
+          </mc:Choice>
+          <mc:Fallback>
+            <w:pict>
+              <v:roundrect w14:anchorId="55C5A156" id="Retângulo: Cantos Arredondados 6" o:spid="_x0000_s1036" style="position:absolute;margin-left:206pt;margin-top:128.15pt;width:78pt;height:42pt;z-index:251664384;visibility:visible;mso-wrap-style:square;mso-wrap-distance-left:9pt;mso-wrap-distance-top:0;mso-wrap-distance-right:9pt;mso-wrap-distance-bottom:0;mso-position-horizontal:absolute;mso-position-horizontal-relative:text;mso-position-vertical:absolute;mso-position-vertical-relative:text;v-text-anchor:middle" arcsize="10923f" o:gfxdata="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" strokecolor="#2555d9" strokeweight="1pt">
+                <v:stroke joinstyle="miter"/>
+                <v:textbox inset="4pt,3pt,4pt,3pt">
+                  <w:txbxContent>
+                    <w:p>
+                      <w:pPr>
+                        <w:jc w:val="center"/>
+                        <w:rPr>
+                          <w:sz w:val="14"/>
+                        </w:rPr>
+                      </w:pPr>
+                      <w:r>
+                        <w:rPr>
+                          <w:sz w:val="14"/>
+                        </w:rPr>
+                        <w:t>{flow_shape_1_step_3}</w:t>
+                      </w:r>
+                    </w:p>
+                  </w:txbxContent>
+                </v:textbox>
+              </v:roundrect>
+            </w:pict>
+          </mc:Fallback>
+        </mc:AlternateContent>
+      </w:r>
+      <w:r>
+        <w:rPr>
+          <w:noProof/>
+        </w:rPr>
+        <mc:AlternateContent>
+          <mc:Choice Requires="wps">
+            <w:drawing>
+              <wp:anchor distT="0" distB="0" distL="114300" distR="114300" simplePos="0" relativeHeight="251662336" behindDoc="0" locked="0" layoutInCell="1" allowOverlap="1" wp14:anchorId="33DE3917" wp14:editId="3F79EA51">
+                <wp:simplePos x="0" y="0"/>
+                <wp:positionH relativeFrom="column">
+                  <wp:posOffset>1397000</wp:posOffset>
+                </wp:positionH>
+                <wp:positionV relativeFrom="paragraph">
+                  <wp:posOffset>1627505</wp:posOffset>
+                </wp:positionV>
+                <wp:extent cx="990600" cy="533400"/>
+                <wp:effectExtent l="0" t="0" r="19050" b="19050"/>
+                <wp:wrapNone/>
+                <wp:docPr id="869931937" name="Retângulo: Cantos Arredondados 4"/>
+                <wp:cNvGraphicFramePr/>
+                <a:graphic xmlns:a="http://schemas.openxmlformats.org/drawingml/2006/main">
+                  <a:graphicData uri="http://schemas.microsoft.com/office/word/2010/wordprocessingShape">
+                    <wps:wsp>
+                      <wps:cNvSpPr/>
+                      <wps:spPr>
+                        <a:xfrm>
+                          <a:off x="0" y="0"/>
+                          <a:ext cx="990600" cy="533400"/>
+                        </a:xfrm>
+                        <a:prstGeom prst="roundRect">
+                          <a:avLst/>
+                        </a:prstGeom>
+                        <a:solidFill>
+                          <a:srgbClr val="FFFFFF"/>
+                        </a:solidFill>
+                        <a:ln w="12700">
+                          <a:solidFill>
+                            <a:srgbClr val="2555D9"/>
+                          </a:solidFill>
+                        </a:ln>
+                      </wps:spPr>
+                      <wps:style>
+                        <a:lnRef idx="2">
+                          <a:schemeClr val="accent1">
+                            <a:shade val="15000"/>
+                          </a:schemeClr>
+                        </a:lnRef>
+                        <a:fillRef idx="1">
+                          <a:schemeClr val="accent1"/>
+                        </a:fillRef>
+                        <a:effectRef idx="0">
+                          <a:schemeClr val="accent1"/>
+                        </a:effectRef>
+                        <a:fontRef idx="minor">
+                          <a:schemeClr val="lt1"/>
+                        </a:fontRef>
+                      </wps:style>
+                      <wps:txbx>
+                        <w:txbxContent>
+                          <w:p>
+                            <w:pPr>
+                              <w:jc w:val="center"/>
+                              <w:rPr>
+                                <w:sz w:val="14"/>
+                              </w:rPr>
+                            </w:pPr>
+                            <w:r>
+                              <w:rPr>
+                                <w:sz w:val="14"/>
+                              </w:rPr>
+                              <w:t>{flow_shape_1_step_2}</w:t>
+                            </w:r>
+                          </w:p>
+                        </w:txbxContent>
+                      </wps:txbx>
+                      <wps:bodyPr rot="0" spcFirstLastPara="0" vertOverflow="overflow" horzOverflow="overflow" vert="horz" wrap="square" lIns="50800" tIns="38100" rIns="50800" bIns="38100" numCol="1" spcCol="0" rtlCol="0" fromWordArt="0" anchor="ctr" anchorCtr="0" forceAA="0" compatLnSpc="1">
+                        <a:prstTxWarp prst="textNoShape">
+                          <a:avLst/>
+                        </a:prstTxWarp>
+                        <a:noAutofit/>
+                      </wps:bodyPr>
+                    </wps:wsp>
+                  </a:graphicData>
+                </a:graphic>
+              </wp:anchor>
+            </w:drawing>
+          </mc:Choice>
+          <mc:Fallback>
+            <w:pict>
+              <v:roundrect w14:anchorId="33DE3917" id="Retângulo: Cantos Arredondados 4" o:spid="_x0000_s1037" style="position:absolute;margin-left:110pt;margin-top:128.15pt;width:78pt;height:42pt;z-index:251662336;visibility:visible;mso-wrap-style:square;mso-wrap-distance-left:9pt;mso-wrap-distance-top:0;mso-wrap-distance-right:9pt;mso-wrap-distance-bottom:0;mso-position-horizontal:absolute;mso-position-horizontal-relative:text;mso-position-vertical:absolute;mso-position-vertical-relative:text;v-text-anchor:middle" arcsize="10923f" o:gfxdata="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" strokecolor="#2555d9" strokeweight="1pt">
+                <v:stroke joinstyle="miter"/>
+                <v:textbox inset="4pt,3pt,4pt,3pt">
+                  <w:txbxContent>
+                    <w:p>
+                      <w:pPr>
+                        <w:jc w:val="center"/>
+                        <w:rPr>
+                          <w:sz w:val="14"/>
+                        </w:rPr>
+                      </w:pPr>
+                      <w:r>
+                        <w:rPr>
+                          <w:sz w:val="14"/>
+                        </w:rPr>
+                        <w:t>{flow_shape_1_step_2}</w:t>
+                      </w:r>
+                    </w:p>
+                  </w:txbxContent>
+                </v:textbox>
+              </v:roundrect>
+            </w:pict>
+          </mc:Fallback>
+        </mc:AlternateContent>
+      </w:r>
+      <w:r>
+        <w:rPr>
+          <w:noProof/>
+        </w:rPr>
+        <mc:AlternateContent>
+          <mc:Choice Requires="wps">
+            <w:drawing>
+              <wp:anchor distT="0" distB="0" distL="114300" distR="114300" simplePos="0" relativeHeight="251660288" behindDoc="0" locked="0" layoutInCell="1" allowOverlap="1" wp14:anchorId="5A880CC3" wp14:editId="041E75A4">
+                <wp:simplePos x="0" y="0"/>
+                <wp:positionH relativeFrom="column">
+                  <wp:posOffset>177800</wp:posOffset>
+                </wp:positionH>
+                <wp:positionV relativeFrom="paragraph">
+                  <wp:posOffset>1627505</wp:posOffset>
+                </wp:positionV>
+                <wp:extent cx="990600" cy="533400"/>
+                <wp:effectExtent l="0" t="0" r="19050" b="19050"/>
+                <wp:wrapNone/>
+                <wp:docPr id="1026272423" name="Retângulo: Cantos Arredondados 2"/>
+                <wp:cNvGraphicFramePr/>
+                <a:graphic xmlns:a="http://schemas.openxmlformats.org/drawingml/2006/main">
+                  <a:graphicData uri="http://schemas.microsoft.com/office/word/2010/wordprocessingShape">
+                    <wps:wsp>
+                      <wps:cNvSpPr/>
+                      <wps:spPr>
+                        <a:xfrm>
+                          <a:off x="0" y="0"/>
+                          <a:ext cx="990600" cy="533400"/>
+                        </a:xfrm>
+                        <a:prstGeom prst="roundRect">
+                          <a:avLst/>
+                        </a:prstGeom>
+                        <a:solidFill>
+                          <a:srgbClr val="FFFFFF"/>
+                        </a:solidFill>
+                        <a:ln w="12700">
+                          <a:solidFill>
+                            <a:srgbClr val="2555D9"/>
+                          </a:solidFill>
+                        </a:ln>
+                      </wps:spPr>
+                      <wps:style>
+                        <a:lnRef idx="2">
+                          <a:schemeClr val="accent1">
+                            <a:shade val="15000"/>
+                          </a:schemeClr>
+                        </a:lnRef>
+                        <a:fillRef idx="1">
+                          <a:schemeClr val="accent1"/>
+                        </a:fillRef>
+                        <a:effectRef idx="0">
+                          <a:schemeClr val="accent1"/>
+                        </a:effectRef>
+                        <a:fontRef idx="minor">
+                          <a:schemeClr val="lt1"/>
+                        </a:fontRef>
+                      </wps:style>
+                      <wps:txbx>
+                        <w:txbxContent>
+                          <w:p>
+                            <w:pPr>
+                              <w:jc w:val="center"/>
+                              <w:rPr>
+                                <w:sz w:val="14"/>
+                              </w:rPr>
+                            </w:pPr>
+                            <w:r>
+                              <w:rPr>
+                                <w:sz w:val="14"/>
+                              </w:rPr>
+                              <w:t>{flow_shape_1_step_1}</w:t>
+                            </w:r>
+                          </w:p>
+                        </w:txbxContent>
+                      </wps:txbx>
+                      <wps:bodyPr rot="0" spcFirstLastPara="0" vertOverflow="overflow" horzOverflow="overflow" vert="horz" wrap="square" lIns="50800" tIns="38100" rIns="50800" bIns="38100" numCol="1" spcCol="0" rtlCol="0" fromWordArt="0" anchor="ctr" anchorCtr="0" forceAA="0" compatLnSpc="1">
+                        <a:prstTxWarp prst="textNoShape">
+                          <a:avLst/>
+                        </a:prstTxWarp>
+                        <a:noAutofit/>
+                      </wps:bodyPr>
+                    </wps:wsp>
+                  </a:graphicData>
+                </a:graphic>
+              </wp:anchor>
+            </w:drawing>
+          </mc:Choice>
+          <mc:Fallback>
+            <w:pict>
+              <v:roundrect w14:anchorId="5A880CC3" id="Retângulo: Cantos Arredondados 2" o:spid="_x0000_s1038" style="position:absolute;margin-left:14pt;margin-top:128.15pt;width:78pt;height:42pt;z-index:251660288;visibility:visible;mso-wrap-style:square;mso-wrap-distance-left:9pt;mso-wrap-distance-top:0;mso-wrap-distance-right:9pt;mso-wrap-distance-bottom:0;mso-position-horizontal:absolute;mso-position-horizontal-relative:text;mso-position-vertical:absolute;mso-position-vertical-relative:text;v-text-anchor:middle" arcsize="10923f" o:gfxdata="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" strokecolor="#2555d9" strokeweight="1pt">
+                <v:stroke joinstyle="miter"/>
+                <v:textbox inset="4pt,3pt,4pt,3pt">
+                  <w:txbxContent>
+                    <w:p>
+                      <w:pPr>
+                        <w:jc w:val="center"/>
+                        <w:rPr>
+                          <w:sz w:val="14"/>
+                        </w:rPr>
+                      </w:pPr>
+                      <w:r>
+                        <w:rPr>
+                          <w:sz w:val="14"/>
+                        </w:rPr>
+                        <w:t>{flow_shape_1_step_1}</w:t>
+                      </w:r>
+                    </w:p>
+                  </w:txbxContent>
+                </v:textbox>
+              </v:roundrect>
+            </w:pict>
+          </mc:Fallback>
+        </mc:AlternateContent>
+      </w:r>
+      <w:r>
+        <w:rPr>
+          <w:noProof/>
+        </w:rPr>
+        <mc:AlternateContent>
+          <mc:Choice Requires="wps">
+            <w:drawing>
+              <wp:anchor distT="0" distB="0" distL="114300" distR="114300" simplePos="0" relativeHeight="251659264" behindDoc="0" locked="0" layoutInCell="1" allowOverlap="1" wp14:anchorId="354AA6F5" wp14:editId="58813480">
+                <wp:simplePos x="0" y="0"/>
+                <wp:positionH relativeFrom="column">
+                  <wp:posOffset>177800</wp:posOffset>
+                </wp:positionH>
+                <wp:positionV relativeFrom="paragraph">
+                  <wp:posOffset>1144905</wp:posOffset>
+                </wp:positionV>
+                <wp:extent cx="7112000" cy="304800"/>
+                <wp:effectExtent l="0" t="0" r="12700" b="19050"/>
+                <wp:wrapNone/>
+                <wp:docPr id="548449543" name="Retângulo: Cantos Arredondados 1"/>
+                <wp:cNvGraphicFramePr/>
+                <a:graphic xmlns:a="http://schemas.openxmlformats.org/drawingml/2006/main">
+                  <a:graphicData uri="http://schemas.microsoft.com/office/word/2010/wordprocessingShape">
+                    <wps:wsp>
+                      <wps:cNvSpPr/>
+                      <wps:spPr>
+                        <a:xfrm>
+                          <a:off x="0" y="0"/>
+                          <a:ext cx="7112000" cy="304800"/>
+                        </a:xfrm>
+                        <a:prstGeom prst="roundRect">
+                          <a:avLst/>
+                        </a:prstGeom>
+                        <a:solidFill>
+                          <a:srgbClr val="EAF2FF"/>
+                        </a:solidFill>
+                        <a:ln w="12700">
+                          <a:solidFill>
+                            <a:srgbClr val="2555D9"/>
+                          </a:solidFill>
+                        </a:ln>
+                      </wps:spPr>
+                      <wps:style>
+                        <a:lnRef idx="2">
+                          <a:schemeClr val="accent1">
+                            <a:shade val="15000"/>
+                          </a:schemeClr>
+                        </a:lnRef>
+                        <a:fillRef idx="1">
+                          <a:schemeClr val="accent1"/>
+                        </a:fillRef>
+                        <a:effectRef idx="0">
+                          <a:schemeClr val="accent1"/>
+                        </a:effectRef>
+                        <a:fontRef idx="minor">
+                          <a:schemeClr val="lt1"/>
+                        </a:fontRef>
+                      </wps:style>
+                      <wps:txbx>
+                        <w:txbxContent>
+                          <w:p>
+                            <w:pPr>
+                              <w:jc w:val="center"/>
+                              <w:rPr>
+                                <w:b/>
+                                <w:sz w:val="14"/>
+                              </w:rPr>
+                            </w:pPr>
+                            <w:r>
+                              <w:rPr>
+                                <w:b/>
+                                <w:sz w:val="14"/>
+                              </w:rPr>
+                              <w:t>{flow_shape_1_title}</w:t>
+                            </w:r>
+                          </w:p>
+                        </w:txbxContent>
+                      </wps:txbx>
+                      <wps:bodyPr rot="0" spcFirstLastPara="0" vertOverflow="overflow" horzOverflow="overflow" vert="horz" wrap="square" lIns="50800" tIns="38100" rIns="50800" bIns="38100" numCol="1" spcCol="0" rtlCol="0" fromWordArt="0" anchor="ctr" anchorCtr="0" forceAA="0" compatLnSpc="1">
+                        <a:prstTxWarp prst="textNoShape">
+                          <a:avLst/>
+                        </a:prstTxWarp>
+                        <a:noAutofit/>
+                      </wps:bodyPr>
+                    </wps:wsp>
+                  </a:graphicData>
+                </a:graphic>
+              </wp:anchor>
+            </w:drawing>
+          </mc:Choice>
+          <mc:Fallback>
+            <w:pict>
+              <v:roundrect w14:anchorId="354AA6F5" id="Retângulo: Cantos Arredondados 1" o:spid="_x0000_s1039" style="position:absolute;margin-left:14pt;margin-top:90.15pt;width:560pt;height:24pt;z-index:251659264;visibility:visible;mso-wrap-style:square;mso-wrap-distance-left:9pt;mso-wrap-distance-top:0;mso-wrap-distance-right:9pt;mso-wrap-distance-bottom:0;mso-position-horizontal:absolute;mso-position-horizontal-relative:text;mso-position-vertical:absolute;mso-position-vertical-relative:text;v-text-anchor:middle" arcsize="10923f" o:gfxdata="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" fillcolor="#eaf2ff" strokecolor="#2555d9" strokeweight="1pt">
+                <v:stroke joinstyle="miter"/>
+                <v:textbox inset="4pt,3pt,4pt,3pt">
+                  <w:txbxContent>
+                    <w:p>
+                      <w:pPr>
+                        <w:jc w:val="center"/>
+                        <w:rPr>
+                          <w:b/>
+                          <w:sz w:val="14"/>
+                        </w:rPr>
+                      </w:pPr>
+                      <w:r>
+                        <w:rPr>
+                          <w:b/>
+                          <w:sz w:val="14"/>
+                        </w:rPr>
+                        <w:t>{flow_shape_1_title}</w:t>
+                      </w:r>
+                    </w:p>
+                  </w:txbxContent>
+                </v:textbox>
+              </v:roundrect>
+            </w:pict>
+          </mc:Fallback>
+        </mc:AlternateContent>
+      </w:r>
+    </w:p>
+    <w:p>
+      <w:pPr>
+        <w:pStyle w:val="Ttulo2"/>
+        <w:spacing w:before="0" w:after="120"/>
+      </w:pPr>
+    </w:p>
+    <w:p>
+      <w:pPr>
+        <w:pStyle w:val="Ttulo2"/>
+        <w:spacing w:before="0" w:after="120"/>
+      </w:pPr>
+    </w:p>
+    <w:p>
+      <w:pPr>
+        <w:pStyle w:val="Ttulo2"/>
+        <w:spacing w:before="0" w:after="120"/>
+      </w:pPr>
+    </w:p>
+    <w:p>
+      <w:pPr>
+        <w:pStyle w:val="Ttulo2"/>
+        <w:spacing w:before="0" w:after="120"/>
+      </w:pPr>
+    </w:p>
+    <w:p>
+      <w:pPr>
+        <w:pStyle w:val="Ttulo2"/>
+        <w:spacing w:before="0" w:after="120"/>
+      </w:pPr>
+    </w:p>
+    <w:p>
+      <w:pPr>
+        <w:pStyle w:val="Ttulo2"/>
+        <w:spacing w:before="0" w:after="120"/>
+      </w:pPr>
+    </w:p>
+    <w:p>
+      <w:pPr>
+        <w:pStyle w:val="Ttulo2"/>
+        <w:spacing w:before="0" w:after="120"/>
+      </w:pPr>
+    </w:p>
+    <w:p>
+      <w:pPr>
+        <w:pStyle w:val="Ttulo2"/>
+        <w:spacing w:before="0" w:after="120"/>
+      </w:pPr>
+    </w:p>
+    <w:p>
+      <w:pPr>
+        <w:pStyle w:val="Ttulo2"/>
+        <w:spacing w:before="0" w:after="120"/>
+      </w:pPr>
+    </w:p>
+    <w:p>
+      <w:pPr>
+        <w:pStyle w:val="Ttulo2"/>
+        <w:spacing w:before="0" w:after="120"/>
+      </w:pPr>
+    </w:p>
+    <w:p>
+      <w:pPr>
+        <w:pStyle w:val="Ttulo2"/>
+        <w:spacing w:before="0" w:after="120"/>
+      </w:pPr>
+    </w:p>
+    <w:p>
+      <w:pPr>
+        <w:pStyle w:val="Ttulo2"/>
+        <w:spacing w:before="0" w:after="120"/>
+      </w:pPr>
+    </w:p>
+    <w:p>
+      <w:pPr>
+        <w:pStyle w:val="Ttulo2"/>
+        <w:spacing w:before="0" w:after="120"/>
+      </w:pPr>
+    </w:p>
+    <w:p>
+      <w:pPr>
+        <w:pStyle w:val="Ttulo2"/>
+        <w:spacing w:before="0" w:after="120"/>
+      </w:pPr>
+    </w:p>
+    <w:p>
+      <w:pPr>
+        <w:pStyle w:val="Ttulo2"/>
+        <w:spacing w:before="0" w:after="120"/>
+      </w:pPr>
     </w:p>
     <w:tbl>
       <w:tblPr>
@@ -4176,12 +6440,6 @@
         <w:gridCol w:w="1185"/>
       </w:tblGrid>
       <w:tr>
-        <w:tblPrEx>
-          <w:tblCellMar>
-            <w:top w:w="0" w:type="dxa"/>
-            <w:bottom w:w="0" w:type="dxa"/>
-          </w:tblCellMar>
-        </w:tblPrEx>
         <w:trPr>
           <w:tblHeader/>
         </w:trPr>
@@ -4511,12 +6769,6 @@
         </w:tc>
       </w:tr>
       <w:tr>
-        <w:tblPrEx>
-          <w:tblCellMar>
-            <w:top w:w="0" w:type="dxa"/>
-            <w:bottom w:w="0" w:type="dxa"/>
-          </w:tblCellMar>
-        </w:tblPrEx>
         <w:tc>
           <w:tcPr>
             <w:tcW w:w="100" w:type="dxa"/>
@@ -4838,12 +7090,6 @@
         <w:gridCol w:w="1066"/>
       </w:tblGrid>
       <w:tr>
-        <w:tblPrEx>
-          <w:tblCellMar>
-            <w:top w:w="0" w:type="dxa"/>
-            <w:bottom w:w="0" w:type="dxa"/>
-          </w:tblCellMar>
-        </w:tblPrEx>
         <w:trPr>
           <w:tblHeader/>
         </w:trPr>
@@ -5209,12 +7455,6 @@
         </w:tc>
       </w:tr>
       <w:tr>
-        <w:tblPrEx>
-          <w:tblCellMar>
-            <w:top w:w="0" w:type="dxa"/>
-            <w:bottom w:w="0" w:type="dxa"/>
-          </w:tblCellMar>
-        </w:tblPrEx>
         <w:tc>
           <w:tcPr>
             <w:tcW w:w="100" w:type="dxa"/>
@@ -5555,12 +7795,6 @@
         <w:gridCol w:w="5332"/>
       </w:tblGrid>
       <w:tr>
-        <w:tblPrEx>
-          <w:tblCellMar>
-            <w:top w:w="0" w:type="dxa"/>
-            <w:bottom w:w="0" w:type="dxa"/>
-          </w:tblCellMar>
-        </w:tblPrEx>
         <w:tc>
           <w:tcPr>
             <w:tcW w:w="100" w:type="dxa"/>
@@ -5590,6 +7824,7 @@
                 <w:bCs/>
                 <w:color w:val="FFFFFF"/>
               </w:rPr>
+              <w:lastRenderedPageBreak/>
               <w:t>05</w:t>
             </w:r>
           </w:p>
@@ -5630,12 +7865,6 @@
         </w:tc>
       </w:tr>
       <w:tr>
-        <w:tblPrEx>
-          <w:tblCellMar>
-            <w:top w:w="0" w:type="dxa"/>
-            <w:bottom w:w="0" w:type="dxa"/>
-          </w:tblCellMar>
-        </w:tblPrEx>
         <w:tc>
           <w:tcPr>
             <w:tcW w:w="200" w:type="dxa"/>
@@ -5712,12 +7941,6 @@
         <w:gridCol w:w="2133"/>
       </w:tblGrid>
       <w:tr>
-        <w:tblPrEx>
-          <w:tblCellMar>
-            <w:top w:w="0" w:type="dxa"/>
-            <w:bottom w:w="0" w:type="dxa"/>
-          </w:tblCellMar>
-        </w:tblPrEx>
         <w:trPr>
           <w:tblHeader/>
         </w:trPr>
@@ -5903,12 +8126,6 @@
         </w:tc>
       </w:tr>
       <w:tr>
-        <w:tblPrEx>
-          <w:tblCellMar>
-            <w:top w:w="0" w:type="dxa"/>
-            <w:bottom w:w="0" w:type="dxa"/>
-          </w:tblCellMar>
-        </w:tblPrEx>
         <w:tc>
           <w:tcPr>
             <w:tcW w:w="100" w:type="dxa"/>
@@ -6101,12 +8318,6 @@
         <w:gridCol w:w="2666"/>
       </w:tblGrid>
       <w:tr>
-        <w:tblPrEx>
-          <w:tblCellMar>
-            <w:top w:w="0" w:type="dxa"/>
-            <w:bottom w:w="0" w:type="dxa"/>
-          </w:tblCellMar>
-        </w:tblPrEx>
         <w:trPr>
           <w:tblHeader/>
         </w:trPr>
@@ -6256,12 +8467,6 @@
         </w:tc>
       </w:tr>
       <w:tr>
-        <w:tblPrEx>
-          <w:tblCellMar>
-            <w:top w:w="0" w:type="dxa"/>
-            <w:bottom w:w="0" w:type="dxa"/>
-          </w:tblCellMar>
-        </w:tblPrEx>
         <w:tc>
           <w:tcPr>
             <w:tcW w:w="100" w:type="dxa"/>
@@ -6423,12 +8628,6 @@
         <w:gridCol w:w="2666"/>
       </w:tblGrid>
       <w:tr>
-        <w:tblPrEx>
-          <w:tblCellMar>
-            <w:top w:w="0" w:type="dxa"/>
-            <w:bottom w:w="0" w:type="dxa"/>
-          </w:tblCellMar>
-        </w:tblPrEx>
         <w:trPr>
           <w:tblHeader/>
         </w:trPr>
@@ -6578,12 +8777,6 @@
         </w:tc>
       </w:tr>
       <w:tr>
-        <w:tblPrEx>
-          <w:tblCellMar>
-            <w:top w:w="0" w:type="dxa"/>
-            <w:bottom w:w="0" w:type="dxa"/>
-          </w:tblCellMar>
-        </w:tblPrEx>
         <w:tc>
           <w:tcPr>
             <w:tcW w:w="100" w:type="dxa"/>

</xml_diff>

<commit_message>
Add native Word software and process maps
</commit_message>
<xml_diff>
--- a/backend/templates/assessment-operational-template.docx
+++ b/backend/templates/assessment-operational-template.docx
@@ -47,6 +47,824 @@
               <w:spacing w:after="0"/>
               <w:jc w:val="center"/>
             </w:pPr>
+            <w:r>
+              <w:rPr>
+                <w:b/>
+                <w:bCs/>
+                <w:noProof/>
+                <w:color w:val="FFFFFF"/>
+                <w:sz w:val="34"/>
+                <w:szCs w:val="34"/>
+              </w:rPr>
+              <mc:AlternateContent>
+                <mc:Choice Requires="wps">
+                  <w:drawing>
+                    <wp:anchor distT="0" distB="0" distL="114300" distR="114300" simplePos="0" relativeHeight="251707392" behindDoc="0" locked="0" layoutInCell="1" allowOverlap="1" wp14:anchorId="2C4C5F31" wp14:editId="2CE3BE70">
+                      <wp:simplePos x="0" y="0"/>
+                      <wp:positionH relativeFrom="column">
+                        <wp:posOffset>11995785</wp:posOffset>
+                      </wp:positionH>
+                      <wp:positionV relativeFrom="paragraph">
+                        <wp:posOffset>6731000</wp:posOffset>
+                      </wp:positionV>
+                      <wp:extent cx="596900" cy="0"/>
+                      <wp:effectExtent l="0" t="76200" r="12700" b="114300"/>
+                      <wp:wrapNone/>
+                      <wp:docPr id="1615338367" name="Conector de Seta Reta 48"/>
+                      <wp:cNvGraphicFramePr/>
+                      <a:graphic xmlns:a="http://schemas.openxmlformats.org/drawingml/2006/main">
+                        <a:graphicData uri="http://schemas.microsoft.com/office/word/2010/wordprocessingShape">
+                          <wps:wsp>
+                            <wps:cNvCnPr/>
+                            <wps:spPr>
+                              <a:xfrm>
+                                <a:off x="0" y="0"/>
+                                <a:ext cx="596900" cy="0"/>
+                              </a:xfrm>
+                              <a:prstGeom prst="straightConnector1">
+                                <a:avLst/>
+                              </a:prstGeom>
+                              <a:ln w="15875">
+                                <a:solidFill>
+                                  <a:srgbClr val="808080"/>
+                                </a:solidFill>
+                                <a:tailEnd type="arrow"/>
+                              </a:ln>
+                            </wps:spPr>
+                            <wps:style>
+                              <a:lnRef idx="2">
+                                <a:schemeClr val="accent1"/>
+                              </a:lnRef>
+                              <a:fillRef idx="0">
+                                <a:schemeClr val="accent1"/>
+                              </a:fillRef>
+                              <a:effectRef idx="1">
+                                <a:schemeClr val="accent1"/>
+                              </a:effectRef>
+                              <a:fontRef idx="minor">
+                                <a:schemeClr val="tx1"/>
+                              </a:fontRef>
+                            </wps:style>
+                            <wps:bodyPr/>
+                          </wps:wsp>
+                        </a:graphicData>
+                      </a:graphic>
+                    </wp:anchor>
+                  </w:drawing>
+                </mc:Choice>
+                <mc:Fallback>
+                  <w:pict>
+                    <v:shapetype w14:anchorId="1209A8D9" id="_x0000_t32" coordsize="21600,21600" o:spt="32" o:oned="t" path="m,l21600,21600e" filled="f">
+                      <v:path arrowok="t" fillok="f" o:connecttype="none"/>
+                      <o:lock v:ext="edit" shapetype="t"/>
+                    </v:shapetype>
+                    <v:shape id="Conector de Seta Reta 48" o:spid="_x0000_s1026" type="#_x0000_t32" style="position:absolute;margin-left:944.55pt;margin-top:530pt;width:47pt;height:0;z-index:251707392;visibility:visible;mso-wrap-style:square;mso-wrap-distance-left:9pt;mso-wrap-distance-top:0;mso-wrap-distance-right:9pt;mso-wrap-distance-bottom:0;mso-position-horizontal:absolute;mso-position-horizontal-relative:text;mso-position-vertical:absolute;mso-position-vertical-relative:text" o:gfxdata="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" strokecolor="gray" strokeweight="1.25pt">
+                      <v:stroke endarrow="open" joinstyle="miter"/>
+                    </v:shape>
+                  </w:pict>
+                </mc:Fallback>
+              </mc:AlternateContent>
+            </w:r>
+            <w:r>
+              <w:rPr>
+                <w:b/>
+                <w:bCs/>
+                <w:noProof/>
+                <w:color w:val="FFFFFF"/>
+                <w:sz w:val="34"/>
+                <w:szCs w:val="34"/>
+              </w:rPr>
+              <mc:AlternateContent>
+                <mc:Choice Requires="wps">
+                  <w:drawing>
+                    <wp:anchor distT="0" distB="0" distL="114300" distR="114300" simplePos="0" relativeHeight="251705344" behindDoc="0" locked="0" layoutInCell="1" allowOverlap="1" wp14:anchorId="069F7788" wp14:editId="1FE56E68">
+                      <wp:simplePos x="0" y="0"/>
+                      <wp:positionH relativeFrom="column">
+                        <wp:posOffset>9582785</wp:posOffset>
+                      </wp:positionH>
+                      <wp:positionV relativeFrom="paragraph">
+                        <wp:posOffset>6731000</wp:posOffset>
+                      </wp:positionV>
+                      <wp:extent cx="596900" cy="0"/>
+                      <wp:effectExtent l="0" t="76200" r="12700" b="114300"/>
+                      <wp:wrapNone/>
+                      <wp:docPr id="108825420" name="Conector de Seta Reta 46"/>
+                      <wp:cNvGraphicFramePr/>
+                      <a:graphic xmlns:a="http://schemas.openxmlformats.org/drawingml/2006/main">
+                        <a:graphicData uri="http://schemas.microsoft.com/office/word/2010/wordprocessingShape">
+                          <wps:wsp>
+                            <wps:cNvCnPr/>
+                            <wps:spPr>
+                              <a:xfrm>
+                                <a:off x="0" y="0"/>
+                                <a:ext cx="596900" cy="0"/>
+                              </a:xfrm>
+                              <a:prstGeom prst="straightConnector1">
+                                <a:avLst/>
+                              </a:prstGeom>
+                              <a:ln w="15875">
+                                <a:solidFill>
+                                  <a:srgbClr val="808080"/>
+                                </a:solidFill>
+                                <a:tailEnd type="arrow"/>
+                              </a:ln>
+                            </wps:spPr>
+                            <wps:style>
+                              <a:lnRef idx="2">
+                                <a:schemeClr val="accent1"/>
+                              </a:lnRef>
+                              <a:fillRef idx="0">
+                                <a:schemeClr val="accent1"/>
+                              </a:fillRef>
+                              <a:effectRef idx="1">
+                                <a:schemeClr val="accent1"/>
+                              </a:effectRef>
+                              <a:fontRef idx="minor">
+                                <a:schemeClr val="tx1"/>
+                              </a:fontRef>
+                            </wps:style>
+                            <wps:bodyPr/>
+                          </wps:wsp>
+                        </a:graphicData>
+                      </a:graphic>
+                    </wp:anchor>
+                  </w:drawing>
+                </mc:Choice>
+                <mc:Fallback>
+                  <w:pict>
+                    <v:shape w14:anchorId="2D277741" id="Conector de Seta Reta 46" o:spid="_x0000_s1026" type="#_x0000_t32" style="position:absolute;margin-left:754.55pt;margin-top:530pt;width:47pt;height:0;z-index:251705344;visibility:visible;mso-wrap-style:square;mso-wrap-distance-left:9pt;mso-wrap-distance-top:0;mso-wrap-distance-right:9pt;mso-wrap-distance-bottom:0;mso-position-horizontal:absolute;mso-position-horizontal-relative:text;mso-position-vertical:absolute;mso-position-vertical-relative:text" o:gfxdata="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" strokecolor="gray" strokeweight="1.25pt">
+                      <v:stroke endarrow="open" joinstyle="miter"/>
+                    </v:shape>
+                  </w:pict>
+                </mc:Fallback>
+              </mc:AlternateContent>
+            </w:r>
+            <w:r>
+              <w:rPr>
+                <w:b/>
+                <w:bCs/>
+                <w:noProof/>
+                <w:color w:val="FFFFFF"/>
+                <w:sz w:val="34"/>
+                <w:szCs w:val="34"/>
+              </w:rPr>
+              <mc:AlternateContent>
+                <mc:Choice Requires="wps">
+                  <w:drawing>
+                    <wp:anchor distT="0" distB="0" distL="114300" distR="114300" simplePos="0" relativeHeight="251703296" behindDoc="0" locked="0" layoutInCell="1" allowOverlap="1" wp14:anchorId="07E07BB2" wp14:editId="62003ACE">
+                      <wp:simplePos x="0" y="0"/>
+                      <wp:positionH relativeFrom="column">
+                        <wp:posOffset>7169785</wp:posOffset>
+                      </wp:positionH>
+                      <wp:positionV relativeFrom="paragraph">
+                        <wp:posOffset>6731000</wp:posOffset>
+                      </wp:positionV>
+                      <wp:extent cx="596900" cy="0"/>
+                      <wp:effectExtent l="0" t="76200" r="12700" b="114300"/>
+                      <wp:wrapNone/>
+                      <wp:docPr id="1338144101" name="Conector de Seta Reta 44"/>
+                      <wp:cNvGraphicFramePr/>
+                      <a:graphic xmlns:a="http://schemas.openxmlformats.org/drawingml/2006/main">
+                        <a:graphicData uri="http://schemas.microsoft.com/office/word/2010/wordprocessingShape">
+                          <wps:wsp>
+                            <wps:cNvCnPr/>
+                            <wps:spPr>
+                              <a:xfrm>
+                                <a:off x="0" y="0"/>
+                                <a:ext cx="596900" cy="0"/>
+                              </a:xfrm>
+                              <a:prstGeom prst="straightConnector1">
+                                <a:avLst/>
+                              </a:prstGeom>
+                              <a:ln w="15875">
+                                <a:solidFill>
+                                  <a:srgbClr val="808080"/>
+                                </a:solidFill>
+                                <a:tailEnd type="arrow"/>
+                              </a:ln>
+                            </wps:spPr>
+                            <wps:style>
+                              <a:lnRef idx="2">
+                                <a:schemeClr val="accent1"/>
+                              </a:lnRef>
+                              <a:fillRef idx="0">
+                                <a:schemeClr val="accent1"/>
+                              </a:fillRef>
+                              <a:effectRef idx="1">
+                                <a:schemeClr val="accent1"/>
+                              </a:effectRef>
+                              <a:fontRef idx="minor">
+                                <a:schemeClr val="tx1"/>
+                              </a:fontRef>
+                            </wps:style>
+                            <wps:bodyPr/>
+                          </wps:wsp>
+                        </a:graphicData>
+                      </a:graphic>
+                    </wp:anchor>
+                  </w:drawing>
+                </mc:Choice>
+                <mc:Fallback>
+                  <w:pict>
+                    <v:shape w14:anchorId="3D6011EA" id="Conector de Seta Reta 44" o:spid="_x0000_s1026" type="#_x0000_t32" style="position:absolute;margin-left:564.55pt;margin-top:530pt;width:47pt;height:0;z-index:251703296;visibility:visible;mso-wrap-style:square;mso-wrap-distance-left:9pt;mso-wrap-distance-top:0;mso-wrap-distance-right:9pt;mso-wrap-distance-bottom:0;mso-position-horizontal:absolute;mso-position-horizontal-relative:text;mso-position-vertical:absolute;mso-position-vertical-relative:text" o:gfxdata="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" strokecolor="gray" strokeweight="1.25pt">
+                      <v:stroke endarrow="open" joinstyle="miter"/>
+                    </v:shape>
+                  </w:pict>
+                </mc:Fallback>
+              </mc:AlternateContent>
+            </w:r>
+            <w:r>
+              <w:rPr>
+                <w:b/>
+                <w:bCs/>
+                <w:noProof/>
+                <w:color w:val="FFFFFF"/>
+                <w:sz w:val="34"/>
+                <w:szCs w:val="34"/>
+              </w:rPr>
+              <mc:AlternateContent>
+                <mc:Choice Requires="wps">
+                  <w:drawing>
+                    <wp:anchor distT="0" distB="0" distL="114300" distR="114300" simplePos="0" relativeHeight="251701248" behindDoc="0" locked="0" layoutInCell="1" allowOverlap="1" wp14:anchorId="13D24C37" wp14:editId="0AE4CF63">
+                      <wp:simplePos x="0" y="0"/>
+                      <wp:positionH relativeFrom="column">
+                        <wp:posOffset>4756785</wp:posOffset>
+                      </wp:positionH>
+                      <wp:positionV relativeFrom="paragraph">
+                        <wp:posOffset>6731000</wp:posOffset>
+                      </wp:positionV>
+                      <wp:extent cx="596900" cy="0"/>
+                      <wp:effectExtent l="0" t="76200" r="12700" b="114300"/>
+                      <wp:wrapNone/>
+                      <wp:docPr id="877391716" name="Conector de Seta Reta 42"/>
+                      <wp:cNvGraphicFramePr/>
+                      <a:graphic xmlns:a="http://schemas.openxmlformats.org/drawingml/2006/main">
+                        <a:graphicData uri="http://schemas.microsoft.com/office/word/2010/wordprocessingShape">
+                          <wps:wsp>
+                            <wps:cNvCnPr/>
+                            <wps:spPr>
+                              <a:xfrm>
+                                <a:off x="0" y="0"/>
+                                <a:ext cx="596900" cy="0"/>
+                              </a:xfrm>
+                              <a:prstGeom prst="straightConnector1">
+                                <a:avLst/>
+                              </a:prstGeom>
+                              <a:ln w="15875">
+                                <a:solidFill>
+                                  <a:srgbClr val="808080"/>
+                                </a:solidFill>
+                                <a:tailEnd type="arrow"/>
+                              </a:ln>
+                            </wps:spPr>
+                            <wps:style>
+                              <a:lnRef idx="2">
+                                <a:schemeClr val="accent1"/>
+                              </a:lnRef>
+                              <a:fillRef idx="0">
+                                <a:schemeClr val="accent1"/>
+                              </a:fillRef>
+                              <a:effectRef idx="1">
+                                <a:schemeClr val="accent1"/>
+                              </a:effectRef>
+                              <a:fontRef idx="minor">
+                                <a:schemeClr val="tx1"/>
+                              </a:fontRef>
+                            </wps:style>
+                            <wps:bodyPr/>
+                          </wps:wsp>
+                        </a:graphicData>
+                      </a:graphic>
+                    </wp:anchor>
+                  </w:drawing>
+                </mc:Choice>
+                <mc:Fallback>
+                  <w:pict>
+                    <v:shape w14:anchorId="28144222" id="Conector de Seta Reta 42" o:spid="_x0000_s1026" type="#_x0000_t32" style="position:absolute;margin-left:374.55pt;margin-top:530pt;width:47pt;height:0;z-index:251701248;visibility:visible;mso-wrap-style:square;mso-wrap-distance-left:9pt;mso-wrap-distance-top:0;mso-wrap-distance-right:9pt;mso-wrap-distance-bottom:0;mso-position-horizontal:absolute;mso-position-horizontal-relative:text;mso-position-vertical:absolute;mso-position-vertical-relative:text" o:gfxdata="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" strokecolor="gray" strokeweight="1.25pt">
+                      <v:stroke endarrow="open" joinstyle="miter"/>
+                    </v:shape>
+                  </w:pict>
+                </mc:Fallback>
+              </mc:AlternateContent>
+            </w:r>
+            <w:r>
+              <w:rPr>
+                <w:b/>
+                <w:bCs/>
+                <w:noProof/>
+                <w:color w:val="FFFFFF"/>
+                <w:sz w:val="34"/>
+                <w:szCs w:val="34"/>
+              </w:rPr>
+              <mc:AlternateContent>
+                <mc:Choice Requires="wps">
+                  <w:drawing>
+                    <wp:anchor distT="0" distB="0" distL="114300" distR="114300" simplePos="0" relativeHeight="251699200" behindDoc="0" locked="0" layoutInCell="1" allowOverlap="1" wp14:anchorId="1D2C50B3" wp14:editId="3D6C2E3C">
+                      <wp:simplePos x="0" y="0"/>
+                      <wp:positionH relativeFrom="column">
+                        <wp:posOffset>2343785</wp:posOffset>
+                      </wp:positionH>
+                      <wp:positionV relativeFrom="paragraph">
+                        <wp:posOffset>6731000</wp:posOffset>
+                      </wp:positionV>
+                      <wp:extent cx="596900" cy="0"/>
+                      <wp:effectExtent l="0" t="76200" r="12700" b="114300"/>
+                      <wp:wrapNone/>
+                      <wp:docPr id="1365580393" name="Conector de Seta Reta 40"/>
+                      <wp:cNvGraphicFramePr/>
+                      <a:graphic xmlns:a="http://schemas.openxmlformats.org/drawingml/2006/main">
+                        <a:graphicData uri="http://schemas.microsoft.com/office/word/2010/wordprocessingShape">
+                          <wps:wsp>
+                            <wps:cNvCnPr/>
+                            <wps:spPr>
+                              <a:xfrm>
+                                <a:off x="0" y="0"/>
+                                <a:ext cx="596900" cy="0"/>
+                              </a:xfrm>
+                              <a:prstGeom prst="straightConnector1">
+                                <a:avLst/>
+                              </a:prstGeom>
+                              <a:ln w="15875">
+                                <a:solidFill>
+                                  <a:srgbClr val="808080"/>
+                                </a:solidFill>
+                                <a:tailEnd type="arrow"/>
+                              </a:ln>
+                            </wps:spPr>
+                            <wps:style>
+                              <a:lnRef idx="2">
+                                <a:schemeClr val="accent1"/>
+                              </a:lnRef>
+                              <a:fillRef idx="0">
+                                <a:schemeClr val="accent1"/>
+                              </a:fillRef>
+                              <a:effectRef idx="1">
+                                <a:schemeClr val="accent1"/>
+                              </a:effectRef>
+                              <a:fontRef idx="minor">
+                                <a:schemeClr val="tx1"/>
+                              </a:fontRef>
+                            </wps:style>
+                            <wps:bodyPr/>
+                          </wps:wsp>
+                        </a:graphicData>
+                      </a:graphic>
+                    </wp:anchor>
+                  </w:drawing>
+                </mc:Choice>
+                <mc:Fallback>
+                  <w:pict>
+                    <v:shape w14:anchorId="1372E1BA" id="Conector de Seta Reta 40" o:spid="_x0000_s1026" type="#_x0000_t32" style="position:absolute;margin-left:184.55pt;margin-top:530pt;width:47pt;height:0;z-index:251699200;visibility:visible;mso-wrap-style:square;mso-wrap-distance-left:9pt;mso-wrap-distance-top:0;mso-wrap-distance-right:9pt;mso-wrap-distance-bottom:0;mso-position-horizontal:absolute;mso-position-horizontal-relative:text;mso-position-vertical:absolute;mso-position-vertical-relative:text" o:gfxdata="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" strokecolor="gray" strokeweight="1.25pt">
+                      <v:stroke endarrow="open" joinstyle="miter"/>
+                    </v:shape>
+                  </w:pict>
+                </mc:Fallback>
+              </mc:AlternateContent>
+            </w:r>
+            <w:r>
+              <w:rPr>
+                <w:b/>
+                <w:bCs/>
+                <w:noProof/>
+                <w:color w:val="FFFFFF"/>
+                <w:sz w:val="34"/>
+                <w:szCs w:val="34"/>
+              </w:rPr>
+              <mc:AlternateContent>
+                <mc:Choice Requires="wps">
+                  <w:drawing>
+                    <wp:anchor distT="0" distB="0" distL="114300" distR="114300" simplePos="0" relativeHeight="251696128" behindDoc="0" locked="0" layoutInCell="1" allowOverlap="1" wp14:anchorId="6129942C" wp14:editId="25D6D56D">
+                      <wp:simplePos x="0" y="0"/>
+                      <wp:positionH relativeFrom="column">
+                        <wp:posOffset>5988685</wp:posOffset>
+                      </wp:positionH>
+                      <wp:positionV relativeFrom="paragraph">
+                        <wp:posOffset>4229100</wp:posOffset>
+                      </wp:positionV>
+                      <wp:extent cx="508000" cy="0"/>
+                      <wp:effectExtent l="0" t="76200" r="25400" b="114300"/>
+                      <wp:wrapNone/>
+                      <wp:docPr id="1732683791" name="Conector de Seta Reta 37"/>
+                      <wp:cNvGraphicFramePr/>
+                      <a:graphic xmlns:a="http://schemas.openxmlformats.org/drawingml/2006/main">
+                        <a:graphicData uri="http://schemas.microsoft.com/office/word/2010/wordprocessingShape">
+                          <wps:wsp>
+                            <wps:cNvCnPr/>
+                            <wps:spPr>
+                              <a:xfrm>
+                                <a:off x="0" y="0"/>
+                                <a:ext cx="508000" cy="0"/>
+                              </a:xfrm>
+                              <a:prstGeom prst="straightConnector1">
+                                <a:avLst/>
+                              </a:prstGeom>
+                              <a:ln w="15875">
+                                <a:solidFill>
+                                  <a:srgbClr val="808080"/>
+                                </a:solidFill>
+                                <a:tailEnd type="arrow"/>
+                              </a:ln>
+                            </wps:spPr>
+                            <wps:style>
+                              <a:lnRef idx="2">
+                                <a:schemeClr val="accent1"/>
+                              </a:lnRef>
+                              <a:fillRef idx="0">
+                                <a:schemeClr val="accent1"/>
+                              </a:fillRef>
+                              <a:effectRef idx="1">
+                                <a:schemeClr val="accent1"/>
+                              </a:effectRef>
+                              <a:fontRef idx="minor">
+                                <a:schemeClr val="tx1"/>
+                              </a:fontRef>
+                            </wps:style>
+                            <wps:bodyPr/>
+                          </wps:wsp>
+                        </a:graphicData>
+                      </a:graphic>
+                    </wp:anchor>
+                  </w:drawing>
+                </mc:Choice>
+                <mc:Fallback>
+                  <w:pict>
+                    <v:shape w14:anchorId="126A2C76" id="Conector de Seta Reta 37" o:spid="_x0000_s1026" type="#_x0000_t32" style="position:absolute;margin-left:471.55pt;margin-top:333pt;width:40pt;height:0;z-index:251696128;visibility:visible;mso-wrap-style:square;mso-wrap-distance-left:9pt;mso-wrap-distance-top:0;mso-wrap-distance-right:9pt;mso-wrap-distance-bottom:0;mso-position-horizontal:absolute;mso-position-horizontal-relative:text;mso-position-vertical:absolute;mso-position-vertical-relative:text" o:gfxdata="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" strokecolor="gray" strokeweight="1.25pt">
+                      <v:stroke endarrow="open" joinstyle="miter"/>
+                    </v:shape>
+                  </w:pict>
+                </mc:Fallback>
+              </mc:AlternateContent>
+            </w:r>
+            <w:r>
+              <w:rPr>
+                <w:b/>
+                <w:bCs/>
+                <w:noProof/>
+                <w:color w:val="FFFFFF"/>
+                <w:sz w:val="34"/>
+                <w:szCs w:val="34"/>
+              </w:rPr>
+              <mc:AlternateContent>
+                <mc:Choice Requires="wps">
+                  <w:drawing>
+                    <wp:anchor distT="0" distB="0" distL="114300" distR="114300" simplePos="0" relativeHeight="251694080" behindDoc="0" locked="0" layoutInCell="1" allowOverlap="1" wp14:anchorId="0E81621B" wp14:editId="7C881651">
+                      <wp:simplePos x="0" y="0"/>
+                      <wp:positionH relativeFrom="column">
+                        <wp:posOffset>3956685</wp:posOffset>
+                      </wp:positionH>
+                      <wp:positionV relativeFrom="paragraph">
+                        <wp:posOffset>4229100</wp:posOffset>
+                      </wp:positionV>
+                      <wp:extent cx="508000" cy="0"/>
+                      <wp:effectExtent l="0" t="76200" r="25400" b="114300"/>
+                      <wp:wrapNone/>
+                      <wp:docPr id="1686903040" name="Conector de Seta Reta 35"/>
+                      <wp:cNvGraphicFramePr/>
+                      <a:graphic xmlns:a="http://schemas.openxmlformats.org/drawingml/2006/main">
+                        <a:graphicData uri="http://schemas.microsoft.com/office/word/2010/wordprocessingShape">
+                          <wps:wsp>
+                            <wps:cNvCnPr/>
+                            <wps:spPr>
+                              <a:xfrm>
+                                <a:off x="0" y="0"/>
+                                <a:ext cx="508000" cy="0"/>
+                              </a:xfrm>
+                              <a:prstGeom prst="straightConnector1">
+                                <a:avLst/>
+                              </a:prstGeom>
+                              <a:ln w="15875">
+                                <a:solidFill>
+                                  <a:srgbClr val="808080"/>
+                                </a:solidFill>
+                                <a:tailEnd type="arrow"/>
+                              </a:ln>
+                            </wps:spPr>
+                            <wps:style>
+                              <a:lnRef idx="2">
+                                <a:schemeClr val="accent1"/>
+                              </a:lnRef>
+                              <a:fillRef idx="0">
+                                <a:schemeClr val="accent1"/>
+                              </a:fillRef>
+                              <a:effectRef idx="1">
+                                <a:schemeClr val="accent1"/>
+                              </a:effectRef>
+                              <a:fontRef idx="minor">
+                                <a:schemeClr val="tx1"/>
+                              </a:fontRef>
+                            </wps:style>
+                            <wps:bodyPr/>
+                          </wps:wsp>
+                        </a:graphicData>
+                      </a:graphic>
+                    </wp:anchor>
+                  </w:drawing>
+                </mc:Choice>
+                <mc:Fallback>
+                  <w:pict>
+                    <v:shape w14:anchorId="3E99987A" id="Conector de Seta Reta 35" o:spid="_x0000_s1026" type="#_x0000_t32" style="position:absolute;margin-left:311.55pt;margin-top:333pt;width:40pt;height:0;z-index:251694080;visibility:visible;mso-wrap-style:square;mso-wrap-distance-left:9pt;mso-wrap-distance-top:0;mso-wrap-distance-right:9pt;mso-wrap-distance-bottom:0;mso-position-horizontal:absolute;mso-position-horizontal-relative:text;mso-position-vertical:absolute;mso-position-vertical-relative:text" o:gfxdata="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" strokecolor="gray" strokeweight="1.25pt">
+                      <v:stroke endarrow="open" joinstyle="miter"/>
+                    </v:shape>
+                  </w:pict>
+                </mc:Fallback>
+              </mc:AlternateContent>
+            </w:r>
+            <w:r>
+              <w:rPr>
+                <w:b/>
+                <w:bCs/>
+                <w:noProof/>
+                <w:color w:val="FFFFFF"/>
+                <w:sz w:val="34"/>
+                <w:szCs w:val="34"/>
+              </w:rPr>
+              <mc:AlternateContent>
+                <mc:Choice Requires="wps">
+                  <w:drawing>
+                    <wp:anchor distT="0" distB="0" distL="114300" distR="114300" simplePos="0" relativeHeight="251692032" behindDoc="0" locked="0" layoutInCell="1" allowOverlap="1" wp14:anchorId="68CCF35F" wp14:editId="7DBBB44A">
+                      <wp:simplePos x="0" y="0"/>
+                      <wp:positionH relativeFrom="column">
+                        <wp:posOffset>1924685</wp:posOffset>
+                      </wp:positionH>
+                      <wp:positionV relativeFrom="paragraph">
+                        <wp:posOffset>4229100</wp:posOffset>
+                      </wp:positionV>
+                      <wp:extent cx="508000" cy="0"/>
+                      <wp:effectExtent l="0" t="76200" r="25400" b="114300"/>
+                      <wp:wrapNone/>
+                      <wp:docPr id="788320031" name="Conector de Seta Reta 33"/>
+                      <wp:cNvGraphicFramePr/>
+                      <a:graphic xmlns:a="http://schemas.openxmlformats.org/drawingml/2006/main">
+                        <a:graphicData uri="http://schemas.microsoft.com/office/word/2010/wordprocessingShape">
+                          <wps:wsp>
+                            <wps:cNvCnPr/>
+                            <wps:spPr>
+                              <a:xfrm>
+                                <a:off x="0" y="0"/>
+                                <a:ext cx="508000" cy="0"/>
+                              </a:xfrm>
+                              <a:prstGeom prst="straightConnector1">
+                                <a:avLst/>
+                              </a:prstGeom>
+                              <a:ln w="15875">
+                                <a:solidFill>
+                                  <a:srgbClr val="808080"/>
+                                </a:solidFill>
+                                <a:tailEnd type="arrow"/>
+                              </a:ln>
+                            </wps:spPr>
+                            <wps:style>
+                              <a:lnRef idx="2">
+                                <a:schemeClr val="accent1"/>
+                              </a:lnRef>
+                              <a:fillRef idx="0">
+                                <a:schemeClr val="accent1"/>
+                              </a:fillRef>
+                              <a:effectRef idx="1">
+                                <a:schemeClr val="accent1"/>
+                              </a:effectRef>
+                              <a:fontRef idx="minor">
+                                <a:schemeClr val="tx1"/>
+                              </a:fontRef>
+                            </wps:style>
+                            <wps:bodyPr/>
+                          </wps:wsp>
+                        </a:graphicData>
+                      </a:graphic>
+                    </wp:anchor>
+                  </w:drawing>
+                </mc:Choice>
+                <mc:Fallback>
+                  <w:pict>
+                    <v:shape w14:anchorId="48B6C578" id="Conector de Seta Reta 33" o:spid="_x0000_s1026" type="#_x0000_t32" style="position:absolute;margin-left:151.55pt;margin-top:333pt;width:40pt;height:0;z-index:251692032;visibility:visible;mso-wrap-style:square;mso-wrap-distance-left:9pt;mso-wrap-distance-top:0;mso-wrap-distance-right:9pt;mso-wrap-distance-bottom:0;mso-position-horizontal:absolute;mso-position-horizontal-relative:text;mso-position-vertical:absolute;mso-position-vertical-relative:text" o:gfxdata="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" strokecolor="gray" strokeweight="1.25pt">
+                      <v:stroke endarrow="open" joinstyle="miter"/>
+                    </v:shape>
+                  </w:pict>
+                </mc:Fallback>
+              </mc:AlternateContent>
+            </w:r>
+            <w:r>
+              <w:rPr>
+                <w:b/>
+                <w:bCs/>
+                <w:noProof/>
+                <w:color w:val="FFFFFF"/>
+                <w:sz w:val="34"/>
+                <w:szCs w:val="34"/>
+              </w:rPr>
+              <mc:AlternateContent>
+                <mc:Choice Requires="wps">
+                  <w:drawing>
+                    <wp:anchor distT="0" distB="0" distL="114300" distR="114300" simplePos="0" relativeHeight="251688960" behindDoc="0" locked="0" layoutInCell="1" allowOverlap="1" wp14:anchorId="604FBED7" wp14:editId="57F8B5E8">
+                      <wp:simplePos x="0" y="0"/>
+                      <wp:positionH relativeFrom="column">
+                        <wp:posOffset>5988685</wp:posOffset>
+                      </wp:positionH>
+                      <wp:positionV relativeFrom="paragraph">
+                        <wp:posOffset>3060700</wp:posOffset>
+                      </wp:positionV>
+                      <wp:extent cx="508000" cy="0"/>
+                      <wp:effectExtent l="0" t="76200" r="25400" b="114300"/>
+                      <wp:wrapNone/>
+                      <wp:docPr id="963730997" name="Conector de Seta Reta 30"/>
+                      <wp:cNvGraphicFramePr/>
+                      <a:graphic xmlns:a="http://schemas.openxmlformats.org/drawingml/2006/main">
+                        <a:graphicData uri="http://schemas.microsoft.com/office/word/2010/wordprocessingShape">
+                          <wps:wsp>
+                            <wps:cNvCnPr/>
+                            <wps:spPr>
+                              <a:xfrm>
+                                <a:off x="0" y="0"/>
+                                <a:ext cx="508000" cy="0"/>
+                              </a:xfrm>
+                              <a:prstGeom prst="straightConnector1">
+                                <a:avLst/>
+                              </a:prstGeom>
+                              <a:ln w="15875">
+                                <a:solidFill>
+                                  <a:srgbClr val="808080"/>
+                                </a:solidFill>
+                                <a:tailEnd type="arrow"/>
+                              </a:ln>
+                            </wps:spPr>
+                            <wps:style>
+                              <a:lnRef idx="2">
+                                <a:schemeClr val="accent1"/>
+                              </a:lnRef>
+                              <a:fillRef idx="0">
+                                <a:schemeClr val="accent1"/>
+                              </a:fillRef>
+                              <a:effectRef idx="1">
+                                <a:schemeClr val="accent1"/>
+                              </a:effectRef>
+                              <a:fontRef idx="minor">
+                                <a:schemeClr val="tx1"/>
+                              </a:fontRef>
+                            </wps:style>
+                            <wps:bodyPr/>
+                          </wps:wsp>
+                        </a:graphicData>
+                      </a:graphic>
+                    </wp:anchor>
+                  </w:drawing>
+                </mc:Choice>
+                <mc:Fallback>
+                  <w:pict>
+                    <v:shape w14:anchorId="0A2800F6" id="Conector de Seta Reta 30" o:spid="_x0000_s1026" type="#_x0000_t32" style="position:absolute;margin-left:471.55pt;margin-top:241pt;width:40pt;height:0;z-index:251688960;visibility:visible;mso-wrap-style:square;mso-wrap-distance-left:9pt;mso-wrap-distance-top:0;mso-wrap-distance-right:9pt;mso-wrap-distance-bottom:0;mso-position-horizontal:absolute;mso-position-horizontal-relative:text;mso-position-vertical:absolute;mso-position-vertical-relative:text" o:gfxdata="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" strokecolor="gray" strokeweight="1.25pt">
+                      <v:stroke endarrow="open" joinstyle="miter"/>
+                    </v:shape>
+                  </w:pict>
+                </mc:Fallback>
+              </mc:AlternateContent>
+            </w:r>
+            <w:r>
+              <w:rPr>
+                <w:b/>
+                <w:bCs/>
+                <w:noProof/>
+                <w:color w:val="FFFFFF"/>
+                <w:sz w:val="34"/>
+                <w:szCs w:val="34"/>
+              </w:rPr>
+              <mc:AlternateContent>
+                <mc:Choice Requires="wps">
+                  <w:drawing>
+                    <wp:anchor distT="0" distB="0" distL="114300" distR="114300" simplePos="0" relativeHeight="251686912" behindDoc="0" locked="0" layoutInCell="1" allowOverlap="1" wp14:anchorId="70F24443" wp14:editId="47C002EB">
+                      <wp:simplePos x="0" y="0"/>
+                      <wp:positionH relativeFrom="column">
+                        <wp:posOffset>3956685</wp:posOffset>
+                      </wp:positionH>
+                      <wp:positionV relativeFrom="paragraph">
+                        <wp:posOffset>3060700</wp:posOffset>
+                      </wp:positionV>
+                      <wp:extent cx="508000" cy="0"/>
+                      <wp:effectExtent l="0" t="76200" r="25400" b="114300"/>
+                      <wp:wrapNone/>
+                      <wp:docPr id="123912850" name="Conector de Seta Reta 28"/>
+                      <wp:cNvGraphicFramePr/>
+                      <a:graphic xmlns:a="http://schemas.openxmlformats.org/drawingml/2006/main">
+                        <a:graphicData uri="http://schemas.microsoft.com/office/word/2010/wordprocessingShape">
+                          <wps:wsp>
+                            <wps:cNvCnPr/>
+                            <wps:spPr>
+                              <a:xfrm>
+                                <a:off x="0" y="0"/>
+                                <a:ext cx="508000" cy="0"/>
+                              </a:xfrm>
+                              <a:prstGeom prst="straightConnector1">
+                                <a:avLst/>
+                              </a:prstGeom>
+                              <a:ln w="15875">
+                                <a:solidFill>
+                                  <a:srgbClr val="808080"/>
+                                </a:solidFill>
+                                <a:tailEnd type="arrow"/>
+                              </a:ln>
+                            </wps:spPr>
+                            <wps:style>
+                              <a:lnRef idx="2">
+                                <a:schemeClr val="accent1"/>
+                              </a:lnRef>
+                              <a:fillRef idx="0">
+                                <a:schemeClr val="accent1"/>
+                              </a:fillRef>
+                              <a:effectRef idx="1">
+                                <a:schemeClr val="accent1"/>
+                              </a:effectRef>
+                              <a:fontRef idx="minor">
+                                <a:schemeClr val="tx1"/>
+                              </a:fontRef>
+                            </wps:style>
+                            <wps:bodyPr/>
+                          </wps:wsp>
+                        </a:graphicData>
+                      </a:graphic>
+                    </wp:anchor>
+                  </w:drawing>
+                </mc:Choice>
+                <mc:Fallback>
+                  <w:pict>
+                    <v:shape w14:anchorId="4FFD8BF1" id="Conector de Seta Reta 28" o:spid="_x0000_s1026" type="#_x0000_t32" style="position:absolute;margin-left:311.55pt;margin-top:241pt;width:40pt;height:0;z-index:251686912;visibility:visible;mso-wrap-style:square;mso-wrap-distance-left:9pt;mso-wrap-distance-top:0;mso-wrap-distance-right:9pt;mso-wrap-distance-bottom:0;mso-position-horizontal:absolute;mso-position-horizontal-relative:text;mso-position-vertical:absolute;mso-position-vertical-relative:text" o:gfxdata="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" strokecolor="gray" strokeweight="1.25pt">
+                      <v:stroke endarrow="open" joinstyle="miter"/>
+                    </v:shape>
+                  </w:pict>
+                </mc:Fallback>
+              </mc:AlternateContent>
+            </w:r>
+            <w:r>
+              <w:rPr>
+                <w:b/>
+                <w:bCs/>
+                <w:noProof/>
+                <w:color w:val="FFFFFF"/>
+                <w:sz w:val="34"/>
+                <w:szCs w:val="34"/>
+              </w:rPr>
+              <mc:AlternateContent>
+                <mc:Choice Requires="wps">
+                  <w:drawing>
+                    <wp:anchor distT="0" distB="0" distL="114300" distR="114300" simplePos="0" relativeHeight="251684864" behindDoc="0" locked="0" layoutInCell="1" allowOverlap="1" wp14:anchorId="0F51DF11" wp14:editId="696AC01F">
+                      <wp:simplePos x="0" y="0"/>
+                      <wp:positionH relativeFrom="column">
+                        <wp:posOffset>1924685</wp:posOffset>
+                      </wp:positionH>
+                      <wp:positionV relativeFrom="paragraph">
+                        <wp:posOffset>3060700</wp:posOffset>
+                      </wp:positionV>
+                      <wp:extent cx="508000" cy="0"/>
+                      <wp:effectExtent l="0" t="76200" r="25400" b="114300"/>
+                      <wp:wrapNone/>
+                      <wp:docPr id="681854106" name="Conector de Seta Reta 26"/>
+                      <wp:cNvGraphicFramePr/>
+                      <a:graphic xmlns:a="http://schemas.openxmlformats.org/drawingml/2006/main">
+                        <a:graphicData uri="http://schemas.microsoft.com/office/word/2010/wordprocessingShape">
+                          <wps:wsp>
+                            <wps:cNvCnPr/>
+                            <wps:spPr>
+                              <a:xfrm>
+                                <a:off x="0" y="0"/>
+                                <a:ext cx="508000" cy="0"/>
+                              </a:xfrm>
+                              <a:prstGeom prst="straightConnector1">
+                                <a:avLst/>
+                              </a:prstGeom>
+                              <a:ln w="15875">
+                                <a:solidFill>
+                                  <a:srgbClr val="808080"/>
+                                </a:solidFill>
+                                <a:tailEnd type="arrow"/>
+                              </a:ln>
+                            </wps:spPr>
+                            <wps:style>
+                              <a:lnRef idx="2">
+                                <a:schemeClr val="accent1"/>
+                              </a:lnRef>
+                              <a:fillRef idx="0">
+                                <a:schemeClr val="accent1"/>
+                              </a:fillRef>
+                              <a:effectRef idx="1">
+                                <a:schemeClr val="accent1"/>
+                              </a:effectRef>
+                              <a:fontRef idx="minor">
+                                <a:schemeClr val="tx1"/>
+                              </a:fontRef>
+                            </wps:style>
+                            <wps:bodyPr/>
+                          </wps:wsp>
+                        </a:graphicData>
+                      </a:graphic>
+                    </wp:anchor>
+                  </w:drawing>
+                </mc:Choice>
+                <mc:Fallback>
+                  <w:pict>
+                    <v:shape w14:anchorId="7BBD53A7" id="Conector de Seta Reta 26" o:spid="_x0000_s1026" type="#_x0000_t32" style="position:absolute;margin-left:151.55pt;margin-top:241pt;width:40pt;height:0;z-index:251684864;visibility:visible;mso-wrap-style:square;mso-wrap-distance-left:9pt;mso-wrap-distance-top:0;mso-wrap-distance-right:9pt;mso-wrap-distance-bottom:0;mso-position-horizontal:absolute;mso-position-horizontal-relative:text;mso-position-vertical:absolute;mso-position-vertical-relative:text" o:gfxdata="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" strokecolor="gray" strokeweight="1.25pt">
+                      <v:stroke endarrow="open" joinstyle="miter"/>
+                    </v:shape>
+                  </w:pict>
+                </mc:Fallback>
+              </mc:AlternateContent>
+            </w:r>
             <w:r>
               <w:rPr>
                 <w:b/>
@@ -1822,6 +2640,1258 @@
       <w:r>
         <w:t>Sistemas identificados</w:t>
       </w:r>
+      <w:r>
+        <w:rPr>
+          <w:noProof/>
+        </w:rPr>
+        <mc:AlternateContent>
+          <mc:Choice Requires="wps">
+            <w:drawing>
+              <wp:anchor distT="0" distB="0" distL="114300" distR="114300" simplePos="0" relativeHeight="251697152" behindDoc="0" locked="0" layoutInCell="1" allowOverlap="1" wp14:anchorId="369495CF" wp14:editId="4531C747">
+                <wp:simplePos x="0" y="0"/>
+                <wp:positionH relativeFrom="column">
+                  <wp:posOffset>6273800</wp:posOffset>
+                </wp:positionH>
+                <wp:positionV relativeFrom="paragraph">
+                  <wp:posOffset>2548890</wp:posOffset>
+                </wp:positionV>
+                <wp:extent cx="1422400" cy="787400"/>
+                <wp:effectExtent l="0" t="0" r="25400" b="12700"/>
+                <wp:wrapNone/>
+                <wp:docPr id="933692027" name="Retângulo: Cantos Arredondados 38"/>
+                <wp:cNvGraphicFramePr/>
+                <a:graphic xmlns:a="http://schemas.openxmlformats.org/drawingml/2006/main">
+                  <a:graphicData uri="http://schemas.microsoft.com/office/word/2010/wordprocessingShape">
+                    <wps:wsp>
+                      <wps:cNvSpPr/>
+                      <wps:spPr>
+                        <a:xfrm>
+                          <a:off x="0" y="0"/>
+                          <a:ext cx="1422400" cy="787400"/>
+                        </a:xfrm>
+                        <a:prstGeom prst="roundRect">
+                          <a:avLst/>
+                        </a:prstGeom>
+                        <a:solidFill>
+                          <a:srgbClr val="FFFFFF"/>
+                        </a:solidFill>
+                        <a:ln w="12700">
+                          <a:solidFill>
+                            <a:srgbClr val="2555D9"/>
+                          </a:solidFill>
+                        </a:ln>
+                      </wps:spPr>
+                      <wps:style>
+                        <a:lnRef idx="2">
+                          <a:schemeClr val="accent1">
+                            <a:shade val="15000"/>
+                          </a:schemeClr>
+                        </a:lnRef>
+                        <a:fillRef idx="1">
+                          <a:schemeClr val="accent1"/>
+                        </a:fillRef>
+                        <a:effectRef idx="0">
+                          <a:schemeClr val="accent1"/>
+                        </a:effectRef>
+                        <a:fontRef idx="minor">
+                          <a:schemeClr val="lt1"/>
+                        </a:fontRef>
+                      </wps:style>
+                      <wps:txbx>
+                        <w:txbxContent>
+                          <w:p>
+                            <w:pPr>
+                              <w:jc w:val="center"/>
+                              <w:rPr>
+                                <w:b/>
+                                <w:sz w:val="14"/>
+                              </w:rPr>
+                            </w:pPr>
+                            <w:r>
+                              <w:rPr>
+                                <w:b/>
+                                <w:sz w:val="14"/>
+                              </w:rPr>
+                              <w:t>{software_shape_8_title}</w:t>
+                            </w:r>
+                          </w:p>
+                          <w:p>
+                            <w:pPr>
+                              <w:jc w:val="center"/>
+                              <w:rPr>
+                                <w:sz w:val="14"/>
+                              </w:rPr>
+                            </w:pPr>
+                            <w:r>
+                              <w:rPr>
+                                <w:sz w:val="14"/>
+                              </w:rPr>
+                              <w:t>{software_shape_8_body}</w:t>
+                            </w:r>
+                          </w:p>
+                        </w:txbxContent>
+                      </wps:txbx>
+                      <wps:bodyPr rot="0" spcFirstLastPara="0" vertOverflow="overflow" horzOverflow="overflow" vert="horz" wrap="square" lIns="50800" tIns="38100" rIns="50800" bIns="38100" numCol="1" spcCol="0" rtlCol="0" fromWordArt="0" anchor="ctr" anchorCtr="0" forceAA="0" compatLnSpc="1">
+                        <a:prstTxWarp prst="textNoShape">
+                          <a:avLst/>
+                        </a:prstTxWarp>
+                        <a:noAutofit/>
+                      </wps:bodyPr>
+                    </wps:wsp>
+                  </a:graphicData>
+                </a:graphic>
+              </wp:anchor>
+            </w:drawing>
+          </mc:Choice>
+          <mc:Fallback>
+            <w:pict>
+              <v:roundrect w14:anchorId="369495CF" id="Retângulo: Cantos Arredondados 38" o:spid="_x0000_s1026" style="position:absolute;margin-left:494pt;margin-top:200.7pt;width:112pt;height:62pt;z-index:251697152;visibility:visible;mso-wrap-style:square;mso-wrap-distance-left:9pt;mso-wrap-distance-top:0;mso-wrap-distance-right:9pt;mso-wrap-distance-bottom:0;mso-position-horizontal:absolute;mso-position-horizontal-relative:text;mso-position-vertical:absolute;mso-position-vertical-relative:text;v-text-anchor:middle" arcsize="10923f" o:gfxdata="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" strokecolor="#2555d9" strokeweight="1pt">
+                <v:stroke joinstyle="miter"/>
+                <v:textbox inset="4pt,3pt,4pt,3pt">
+                  <w:txbxContent>
+                    <w:p>
+                      <w:pPr>
+                        <w:jc w:val="center"/>
+                        <w:rPr>
+                          <w:b/>
+                          <w:sz w:val="14"/>
+                        </w:rPr>
+                      </w:pPr>
+                      <w:r>
+                        <w:rPr>
+                          <w:b/>
+                          <w:sz w:val="14"/>
+                        </w:rPr>
+                        <w:t>{software_shape_8_title}</w:t>
+                      </w:r>
+                    </w:p>
+                    <w:p>
+                      <w:pPr>
+                        <w:jc w:val="center"/>
+                        <w:rPr>
+                          <w:sz w:val="14"/>
+                        </w:rPr>
+                      </w:pPr>
+                      <w:r>
+                        <w:rPr>
+                          <w:sz w:val="14"/>
+                        </w:rPr>
+                        <w:t>{software_shape_8_body}</w:t>
+                      </w:r>
+                    </w:p>
+                  </w:txbxContent>
+                </v:textbox>
+              </v:roundrect>
+            </w:pict>
+          </mc:Fallback>
+        </mc:AlternateContent>
+      </w:r>
+      <w:r>
+        <w:rPr>
+          <w:noProof/>
+        </w:rPr>
+        <mc:AlternateContent>
+          <mc:Choice Requires="wps">
+            <w:drawing>
+              <wp:anchor distT="0" distB="0" distL="114300" distR="114300" simplePos="0" relativeHeight="251695104" behindDoc="0" locked="0" layoutInCell="1" allowOverlap="1" wp14:anchorId="26312BC4" wp14:editId="5F1368DA">
+                <wp:simplePos x="0" y="0"/>
+                <wp:positionH relativeFrom="column">
+                  <wp:posOffset>4241800</wp:posOffset>
+                </wp:positionH>
+                <wp:positionV relativeFrom="paragraph">
+                  <wp:posOffset>2548890</wp:posOffset>
+                </wp:positionV>
+                <wp:extent cx="1422400" cy="787400"/>
+                <wp:effectExtent l="0" t="0" r="25400" b="12700"/>
+                <wp:wrapNone/>
+                <wp:docPr id="671888723" name="Retângulo: Cantos Arredondados 36"/>
+                <wp:cNvGraphicFramePr/>
+                <a:graphic xmlns:a="http://schemas.openxmlformats.org/drawingml/2006/main">
+                  <a:graphicData uri="http://schemas.microsoft.com/office/word/2010/wordprocessingShape">
+                    <wps:wsp>
+                      <wps:cNvSpPr/>
+                      <wps:spPr>
+                        <a:xfrm>
+                          <a:off x="0" y="0"/>
+                          <a:ext cx="1422400" cy="787400"/>
+                        </a:xfrm>
+                        <a:prstGeom prst="roundRect">
+                          <a:avLst/>
+                        </a:prstGeom>
+                        <a:solidFill>
+                          <a:srgbClr val="FFFFFF"/>
+                        </a:solidFill>
+                        <a:ln w="12700">
+                          <a:solidFill>
+                            <a:srgbClr val="2555D9"/>
+                          </a:solidFill>
+                        </a:ln>
+                      </wps:spPr>
+                      <wps:style>
+                        <a:lnRef idx="2">
+                          <a:schemeClr val="accent1">
+                            <a:shade val="15000"/>
+                          </a:schemeClr>
+                        </a:lnRef>
+                        <a:fillRef idx="1">
+                          <a:schemeClr val="accent1"/>
+                        </a:fillRef>
+                        <a:effectRef idx="0">
+                          <a:schemeClr val="accent1"/>
+                        </a:effectRef>
+                        <a:fontRef idx="minor">
+                          <a:schemeClr val="lt1"/>
+                        </a:fontRef>
+                      </wps:style>
+                      <wps:txbx>
+                        <w:txbxContent>
+                          <w:p>
+                            <w:pPr>
+                              <w:jc w:val="center"/>
+                              <w:rPr>
+                                <w:b/>
+                                <w:sz w:val="14"/>
+                              </w:rPr>
+                            </w:pPr>
+                            <w:r>
+                              <w:rPr>
+                                <w:b/>
+                                <w:sz w:val="14"/>
+                              </w:rPr>
+                              <w:t>{software_shape_7_title}</w:t>
+                            </w:r>
+                          </w:p>
+                          <w:p>
+                            <w:pPr>
+                              <w:jc w:val="center"/>
+                              <w:rPr>
+                                <w:sz w:val="14"/>
+                              </w:rPr>
+                            </w:pPr>
+                            <w:r>
+                              <w:rPr>
+                                <w:sz w:val="14"/>
+                              </w:rPr>
+                              <w:t>{software_shape_7_body}</w:t>
+                            </w:r>
+                          </w:p>
+                        </w:txbxContent>
+                      </wps:txbx>
+                      <wps:bodyPr rot="0" spcFirstLastPara="0" vertOverflow="overflow" horzOverflow="overflow" vert="horz" wrap="square" lIns="50800" tIns="38100" rIns="50800" bIns="38100" numCol="1" spcCol="0" rtlCol="0" fromWordArt="0" anchor="ctr" anchorCtr="0" forceAA="0" compatLnSpc="1">
+                        <a:prstTxWarp prst="textNoShape">
+                          <a:avLst/>
+                        </a:prstTxWarp>
+                        <a:noAutofit/>
+                      </wps:bodyPr>
+                    </wps:wsp>
+                  </a:graphicData>
+                </a:graphic>
+              </wp:anchor>
+            </w:drawing>
+          </mc:Choice>
+          <mc:Fallback>
+            <w:pict>
+              <v:roundrect w14:anchorId="26312BC4" id="Retângulo: Cantos Arredondados 36" o:spid="_x0000_s1027" style="position:absolute;margin-left:334pt;margin-top:200.7pt;width:112pt;height:62pt;z-index:251695104;visibility:visible;mso-wrap-style:square;mso-wrap-distance-left:9pt;mso-wrap-distance-top:0;mso-wrap-distance-right:9pt;mso-wrap-distance-bottom:0;mso-position-horizontal:absolute;mso-position-horizontal-relative:text;mso-position-vertical:absolute;mso-position-vertical-relative:text;v-text-anchor:middle" arcsize="10923f" o:gfxdata="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" strokecolor="#2555d9" strokeweight="1pt">
+                <v:stroke joinstyle="miter"/>
+                <v:textbox inset="4pt,3pt,4pt,3pt">
+                  <w:txbxContent>
+                    <w:p>
+                      <w:pPr>
+                        <w:jc w:val="center"/>
+                        <w:rPr>
+                          <w:b/>
+                          <w:sz w:val="14"/>
+                        </w:rPr>
+                      </w:pPr>
+                      <w:r>
+                        <w:rPr>
+                          <w:b/>
+                          <w:sz w:val="14"/>
+                        </w:rPr>
+                        <w:t>{software_shape_7_title}</w:t>
+                      </w:r>
+                    </w:p>
+                    <w:p>
+                      <w:pPr>
+                        <w:jc w:val="center"/>
+                        <w:rPr>
+                          <w:sz w:val="14"/>
+                        </w:rPr>
+                      </w:pPr>
+                      <w:r>
+                        <w:rPr>
+                          <w:sz w:val="14"/>
+                        </w:rPr>
+                        <w:t>{software_shape_7_body}</w:t>
+                      </w:r>
+                    </w:p>
+                  </w:txbxContent>
+                </v:textbox>
+              </v:roundrect>
+            </w:pict>
+          </mc:Fallback>
+        </mc:AlternateContent>
+      </w:r>
+      <w:r>
+        <w:rPr>
+          <w:noProof/>
+        </w:rPr>
+        <mc:AlternateContent>
+          <mc:Choice Requires="wps">
+            <w:drawing>
+              <wp:anchor distT="0" distB="0" distL="114300" distR="114300" simplePos="0" relativeHeight="251693056" behindDoc="0" locked="0" layoutInCell="1" allowOverlap="1" wp14:anchorId="63C2CEFD" wp14:editId="09B04084">
+                <wp:simplePos x="0" y="0"/>
+                <wp:positionH relativeFrom="column">
+                  <wp:posOffset>2209800</wp:posOffset>
+                </wp:positionH>
+                <wp:positionV relativeFrom="paragraph">
+                  <wp:posOffset>2548890</wp:posOffset>
+                </wp:positionV>
+                <wp:extent cx="1422400" cy="787400"/>
+                <wp:effectExtent l="0" t="0" r="25400" b="12700"/>
+                <wp:wrapNone/>
+                <wp:docPr id="96720033" name="Retângulo: Cantos Arredondados 34"/>
+                <wp:cNvGraphicFramePr/>
+                <a:graphic xmlns:a="http://schemas.openxmlformats.org/drawingml/2006/main">
+                  <a:graphicData uri="http://schemas.microsoft.com/office/word/2010/wordprocessingShape">
+                    <wps:wsp>
+                      <wps:cNvSpPr/>
+                      <wps:spPr>
+                        <a:xfrm>
+                          <a:off x="0" y="0"/>
+                          <a:ext cx="1422400" cy="787400"/>
+                        </a:xfrm>
+                        <a:prstGeom prst="roundRect">
+                          <a:avLst/>
+                        </a:prstGeom>
+                        <a:solidFill>
+                          <a:srgbClr val="FFFFFF"/>
+                        </a:solidFill>
+                        <a:ln w="12700">
+                          <a:solidFill>
+                            <a:srgbClr val="2555D9"/>
+                          </a:solidFill>
+                        </a:ln>
+                      </wps:spPr>
+                      <wps:style>
+                        <a:lnRef idx="2">
+                          <a:schemeClr val="accent1">
+                            <a:shade val="15000"/>
+                          </a:schemeClr>
+                        </a:lnRef>
+                        <a:fillRef idx="1">
+                          <a:schemeClr val="accent1"/>
+                        </a:fillRef>
+                        <a:effectRef idx="0">
+                          <a:schemeClr val="accent1"/>
+                        </a:effectRef>
+                        <a:fontRef idx="minor">
+                          <a:schemeClr val="lt1"/>
+                        </a:fontRef>
+                      </wps:style>
+                      <wps:txbx>
+                        <w:txbxContent>
+                          <w:p>
+                            <w:pPr>
+                              <w:jc w:val="center"/>
+                              <w:rPr>
+                                <w:b/>
+                                <w:sz w:val="14"/>
+                              </w:rPr>
+                            </w:pPr>
+                            <w:r>
+                              <w:rPr>
+                                <w:b/>
+                                <w:sz w:val="14"/>
+                              </w:rPr>
+                              <w:t>{software_shape_6_title}</w:t>
+                            </w:r>
+                          </w:p>
+                          <w:p>
+                            <w:pPr>
+                              <w:jc w:val="center"/>
+                              <w:rPr>
+                                <w:sz w:val="14"/>
+                              </w:rPr>
+                            </w:pPr>
+                            <w:r>
+                              <w:rPr>
+                                <w:sz w:val="14"/>
+                              </w:rPr>
+                              <w:t>{software_shape_6_body}</w:t>
+                            </w:r>
+                          </w:p>
+                        </w:txbxContent>
+                      </wps:txbx>
+                      <wps:bodyPr rot="0" spcFirstLastPara="0" vertOverflow="overflow" horzOverflow="overflow" vert="horz" wrap="square" lIns="50800" tIns="38100" rIns="50800" bIns="38100" numCol="1" spcCol="0" rtlCol="0" fromWordArt="0" anchor="ctr" anchorCtr="0" forceAA="0" compatLnSpc="1">
+                        <a:prstTxWarp prst="textNoShape">
+                          <a:avLst/>
+                        </a:prstTxWarp>
+                        <a:noAutofit/>
+                      </wps:bodyPr>
+                    </wps:wsp>
+                  </a:graphicData>
+                </a:graphic>
+              </wp:anchor>
+            </w:drawing>
+          </mc:Choice>
+          <mc:Fallback>
+            <w:pict>
+              <v:roundrect w14:anchorId="63C2CEFD" id="Retângulo: Cantos Arredondados 34" o:spid="_x0000_s1028" style="position:absolute;margin-left:174pt;margin-top:200.7pt;width:112pt;height:62pt;z-index:251693056;visibility:visible;mso-wrap-style:square;mso-wrap-distance-left:9pt;mso-wrap-distance-top:0;mso-wrap-distance-right:9pt;mso-wrap-distance-bottom:0;mso-position-horizontal:absolute;mso-position-horizontal-relative:text;mso-position-vertical:absolute;mso-position-vertical-relative:text;v-text-anchor:middle" arcsize="10923f" o:gfxdata="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" strokecolor="#2555d9" strokeweight="1pt">
+                <v:stroke joinstyle="miter"/>
+                <v:textbox inset="4pt,3pt,4pt,3pt">
+                  <w:txbxContent>
+                    <w:p>
+                      <w:pPr>
+                        <w:jc w:val="center"/>
+                        <w:rPr>
+                          <w:b/>
+                          <w:sz w:val="14"/>
+                        </w:rPr>
+                      </w:pPr>
+                      <w:r>
+                        <w:rPr>
+                          <w:b/>
+                          <w:sz w:val="14"/>
+                        </w:rPr>
+                        <w:t>{software_shape_6_title}</w:t>
+                      </w:r>
+                    </w:p>
+                    <w:p>
+                      <w:pPr>
+                        <w:jc w:val="center"/>
+                        <w:rPr>
+                          <w:sz w:val="14"/>
+                        </w:rPr>
+                      </w:pPr>
+                      <w:r>
+                        <w:rPr>
+                          <w:sz w:val="14"/>
+                        </w:rPr>
+                        <w:t>{software_shape_6_body}</w:t>
+                      </w:r>
+                    </w:p>
+                  </w:txbxContent>
+                </v:textbox>
+              </v:roundrect>
+            </w:pict>
+          </mc:Fallback>
+        </mc:AlternateContent>
+      </w:r>
+      <w:r>
+        <w:rPr>
+          <w:noProof/>
+        </w:rPr>
+        <mc:AlternateContent>
+          <mc:Choice Requires="wps">
+            <w:drawing>
+              <wp:anchor distT="0" distB="0" distL="114300" distR="114300" simplePos="0" relativeHeight="251691008" behindDoc="0" locked="0" layoutInCell="1" allowOverlap="1" wp14:anchorId="64741E19" wp14:editId="45A5D661">
+                <wp:simplePos x="0" y="0"/>
+                <wp:positionH relativeFrom="column">
+                  <wp:posOffset>177800</wp:posOffset>
+                </wp:positionH>
+                <wp:positionV relativeFrom="paragraph">
+                  <wp:posOffset>2548890</wp:posOffset>
+                </wp:positionV>
+                <wp:extent cx="1422400" cy="787400"/>
+                <wp:effectExtent l="0" t="0" r="25400" b="12700"/>
+                <wp:wrapNone/>
+                <wp:docPr id="31391282" name="Retângulo: Cantos Arredondados 32"/>
+                <wp:cNvGraphicFramePr/>
+                <a:graphic xmlns:a="http://schemas.openxmlformats.org/drawingml/2006/main">
+                  <a:graphicData uri="http://schemas.microsoft.com/office/word/2010/wordprocessingShape">
+                    <wps:wsp>
+                      <wps:cNvSpPr/>
+                      <wps:spPr>
+                        <a:xfrm>
+                          <a:off x="0" y="0"/>
+                          <a:ext cx="1422400" cy="787400"/>
+                        </a:xfrm>
+                        <a:prstGeom prst="roundRect">
+                          <a:avLst/>
+                        </a:prstGeom>
+                        <a:solidFill>
+                          <a:srgbClr val="FFFFFF"/>
+                        </a:solidFill>
+                        <a:ln w="12700">
+                          <a:solidFill>
+                            <a:srgbClr val="2555D9"/>
+                          </a:solidFill>
+                        </a:ln>
+                      </wps:spPr>
+                      <wps:style>
+                        <a:lnRef idx="2">
+                          <a:schemeClr val="accent1">
+                            <a:shade val="15000"/>
+                          </a:schemeClr>
+                        </a:lnRef>
+                        <a:fillRef idx="1">
+                          <a:schemeClr val="accent1"/>
+                        </a:fillRef>
+                        <a:effectRef idx="0">
+                          <a:schemeClr val="accent1"/>
+                        </a:effectRef>
+                        <a:fontRef idx="minor">
+                          <a:schemeClr val="lt1"/>
+                        </a:fontRef>
+                      </wps:style>
+                      <wps:txbx>
+                        <w:txbxContent>
+                          <w:p>
+                            <w:pPr>
+                              <w:jc w:val="center"/>
+                              <w:rPr>
+                                <w:b/>
+                                <w:sz w:val="14"/>
+                              </w:rPr>
+                            </w:pPr>
+                            <w:r>
+                              <w:rPr>
+                                <w:b/>
+                                <w:sz w:val="14"/>
+                              </w:rPr>
+                              <w:t>{software_shape_5_title}</w:t>
+                            </w:r>
+                          </w:p>
+                          <w:p>
+                            <w:pPr>
+                              <w:jc w:val="center"/>
+                              <w:rPr>
+                                <w:sz w:val="14"/>
+                              </w:rPr>
+                            </w:pPr>
+                            <w:r>
+                              <w:rPr>
+                                <w:sz w:val="14"/>
+                              </w:rPr>
+                              <w:t>{software_shape_5_body}</w:t>
+                            </w:r>
+                          </w:p>
+                        </w:txbxContent>
+                      </wps:txbx>
+                      <wps:bodyPr rot="0" spcFirstLastPara="0" vertOverflow="overflow" horzOverflow="overflow" vert="horz" wrap="square" lIns="50800" tIns="38100" rIns="50800" bIns="38100" numCol="1" spcCol="0" rtlCol="0" fromWordArt="0" anchor="ctr" anchorCtr="0" forceAA="0" compatLnSpc="1">
+                        <a:prstTxWarp prst="textNoShape">
+                          <a:avLst/>
+                        </a:prstTxWarp>
+                        <a:noAutofit/>
+                      </wps:bodyPr>
+                    </wps:wsp>
+                  </a:graphicData>
+                </a:graphic>
+              </wp:anchor>
+            </w:drawing>
+          </mc:Choice>
+          <mc:Fallback>
+            <w:pict>
+              <v:roundrect w14:anchorId="64741E19" id="Retângulo: Cantos Arredondados 32" o:spid="_x0000_s1029" style="position:absolute;margin-left:14pt;margin-top:200.7pt;width:112pt;height:62pt;z-index:251691008;visibility:visible;mso-wrap-style:square;mso-wrap-distance-left:9pt;mso-wrap-distance-top:0;mso-wrap-distance-right:9pt;mso-wrap-distance-bottom:0;mso-position-horizontal:absolute;mso-position-horizontal-relative:text;mso-position-vertical:absolute;mso-position-vertical-relative:text;v-text-anchor:middle" arcsize="10923f" o:gfxdata="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" strokecolor="#2555d9" strokeweight="1pt">
+                <v:stroke joinstyle="miter"/>
+                <v:textbox inset="4pt,3pt,4pt,3pt">
+                  <w:txbxContent>
+                    <w:p>
+                      <w:pPr>
+                        <w:jc w:val="center"/>
+                        <w:rPr>
+                          <w:b/>
+                          <w:sz w:val="14"/>
+                        </w:rPr>
+                      </w:pPr>
+                      <w:r>
+                        <w:rPr>
+                          <w:b/>
+                          <w:sz w:val="14"/>
+                        </w:rPr>
+                        <w:t>{software_shape_5_title}</w:t>
+                      </w:r>
+                    </w:p>
+                    <w:p>
+                      <w:pPr>
+                        <w:jc w:val="center"/>
+                        <w:rPr>
+                          <w:sz w:val="14"/>
+                        </w:rPr>
+                      </w:pPr>
+                      <w:r>
+                        <w:rPr>
+                          <w:sz w:val="14"/>
+                        </w:rPr>
+                        <w:t>{software_shape_5_body}</w:t>
+                      </w:r>
+                    </w:p>
+                  </w:txbxContent>
+                </v:textbox>
+              </v:roundrect>
+            </w:pict>
+          </mc:Fallback>
+        </mc:AlternateContent>
+      </w:r>
+      <w:r>
+        <w:rPr>
+          <w:noProof/>
+        </w:rPr>
+        <mc:AlternateContent>
+          <mc:Choice Requires="wps">
+            <w:drawing>
+              <wp:anchor distT="0" distB="0" distL="114300" distR="114300" simplePos="0" relativeHeight="251689984" behindDoc="0" locked="0" layoutInCell="1" allowOverlap="1" wp14:anchorId="56F6527F" wp14:editId="3571662B">
+                <wp:simplePos x="0" y="0"/>
+                <wp:positionH relativeFrom="column">
+                  <wp:posOffset>6273800</wp:posOffset>
+                </wp:positionH>
+                <wp:positionV relativeFrom="paragraph">
+                  <wp:posOffset>1380490</wp:posOffset>
+                </wp:positionV>
+                <wp:extent cx="1422400" cy="787400"/>
+                <wp:effectExtent l="0" t="0" r="25400" b="12700"/>
+                <wp:wrapNone/>
+                <wp:docPr id="61787357" name="Retângulo: Cantos Arredondados 31"/>
+                <wp:cNvGraphicFramePr/>
+                <a:graphic xmlns:a="http://schemas.openxmlformats.org/drawingml/2006/main">
+                  <a:graphicData uri="http://schemas.microsoft.com/office/word/2010/wordprocessingShape">
+                    <wps:wsp>
+                      <wps:cNvSpPr/>
+                      <wps:spPr>
+                        <a:xfrm>
+                          <a:off x="0" y="0"/>
+                          <a:ext cx="1422400" cy="787400"/>
+                        </a:xfrm>
+                        <a:prstGeom prst="roundRect">
+                          <a:avLst/>
+                        </a:prstGeom>
+                        <a:solidFill>
+                          <a:srgbClr val="FFFFFF"/>
+                        </a:solidFill>
+                        <a:ln w="12700">
+                          <a:solidFill>
+                            <a:srgbClr val="2555D9"/>
+                          </a:solidFill>
+                        </a:ln>
+                      </wps:spPr>
+                      <wps:style>
+                        <a:lnRef idx="2">
+                          <a:schemeClr val="accent1">
+                            <a:shade val="15000"/>
+                          </a:schemeClr>
+                        </a:lnRef>
+                        <a:fillRef idx="1">
+                          <a:schemeClr val="accent1"/>
+                        </a:fillRef>
+                        <a:effectRef idx="0">
+                          <a:schemeClr val="accent1"/>
+                        </a:effectRef>
+                        <a:fontRef idx="minor">
+                          <a:schemeClr val="lt1"/>
+                        </a:fontRef>
+                      </wps:style>
+                      <wps:txbx>
+                        <w:txbxContent>
+                          <w:p>
+                            <w:pPr>
+                              <w:jc w:val="center"/>
+                              <w:rPr>
+                                <w:b/>
+                                <w:sz w:val="14"/>
+                              </w:rPr>
+                            </w:pPr>
+                            <w:r>
+                              <w:rPr>
+                                <w:b/>
+                                <w:sz w:val="14"/>
+                              </w:rPr>
+                              <w:t>{software_shape_4_title}</w:t>
+                            </w:r>
+                          </w:p>
+                          <w:p>
+                            <w:pPr>
+                              <w:jc w:val="center"/>
+                              <w:rPr>
+                                <w:sz w:val="14"/>
+                              </w:rPr>
+                            </w:pPr>
+                            <w:r>
+                              <w:rPr>
+                                <w:sz w:val="14"/>
+                              </w:rPr>
+                              <w:t>{software_shape_4_body}</w:t>
+                            </w:r>
+                          </w:p>
+                        </w:txbxContent>
+                      </wps:txbx>
+                      <wps:bodyPr rot="0" spcFirstLastPara="0" vertOverflow="overflow" horzOverflow="overflow" vert="horz" wrap="square" lIns="50800" tIns="38100" rIns="50800" bIns="38100" numCol="1" spcCol="0" rtlCol="0" fromWordArt="0" anchor="ctr" anchorCtr="0" forceAA="0" compatLnSpc="1">
+                        <a:prstTxWarp prst="textNoShape">
+                          <a:avLst/>
+                        </a:prstTxWarp>
+                        <a:noAutofit/>
+                      </wps:bodyPr>
+                    </wps:wsp>
+                  </a:graphicData>
+                </a:graphic>
+              </wp:anchor>
+            </w:drawing>
+          </mc:Choice>
+          <mc:Fallback>
+            <w:pict>
+              <v:roundrect w14:anchorId="56F6527F" id="Retângulo: Cantos Arredondados 31" o:spid="_x0000_s1030" style="position:absolute;margin-left:494pt;margin-top:108.7pt;width:112pt;height:62pt;z-index:251689984;visibility:visible;mso-wrap-style:square;mso-wrap-distance-left:9pt;mso-wrap-distance-top:0;mso-wrap-distance-right:9pt;mso-wrap-distance-bottom:0;mso-position-horizontal:absolute;mso-position-horizontal-relative:text;mso-position-vertical:absolute;mso-position-vertical-relative:text;v-text-anchor:middle" arcsize="10923f" o:gfxdata="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" strokecolor="#2555d9" strokeweight="1pt">
+                <v:stroke joinstyle="miter"/>
+                <v:textbox inset="4pt,3pt,4pt,3pt">
+                  <w:txbxContent>
+                    <w:p>
+                      <w:pPr>
+                        <w:jc w:val="center"/>
+                        <w:rPr>
+                          <w:b/>
+                          <w:sz w:val="14"/>
+                        </w:rPr>
+                      </w:pPr>
+                      <w:r>
+                        <w:rPr>
+                          <w:b/>
+                          <w:sz w:val="14"/>
+                        </w:rPr>
+                        <w:t>{software_shape_4_title}</w:t>
+                      </w:r>
+                    </w:p>
+                    <w:p>
+                      <w:pPr>
+                        <w:jc w:val="center"/>
+                        <w:rPr>
+                          <w:sz w:val="14"/>
+                        </w:rPr>
+                      </w:pPr>
+                      <w:r>
+                        <w:rPr>
+                          <w:sz w:val="14"/>
+                        </w:rPr>
+                        <w:t>{software_shape_4_body}</w:t>
+                      </w:r>
+                    </w:p>
+                  </w:txbxContent>
+                </v:textbox>
+              </v:roundrect>
+            </w:pict>
+          </mc:Fallback>
+        </mc:AlternateContent>
+      </w:r>
+      <w:r>
+        <w:rPr>
+          <w:noProof/>
+        </w:rPr>
+        <mc:AlternateContent>
+          <mc:Choice Requires="wps">
+            <w:drawing>
+              <wp:anchor distT="0" distB="0" distL="114300" distR="114300" simplePos="0" relativeHeight="251687936" behindDoc="0" locked="0" layoutInCell="1" allowOverlap="1" wp14:anchorId="1F3E4F98" wp14:editId="39DADD57">
+                <wp:simplePos x="0" y="0"/>
+                <wp:positionH relativeFrom="column">
+                  <wp:posOffset>4241800</wp:posOffset>
+                </wp:positionH>
+                <wp:positionV relativeFrom="paragraph">
+                  <wp:posOffset>1380490</wp:posOffset>
+                </wp:positionV>
+                <wp:extent cx="1422400" cy="787400"/>
+                <wp:effectExtent l="0" t="0" r="25400" b="12700"/>
+                <wp:wrapNone/>
+                <wp:docPr id="155436752" name="Retângulo: Cantos Arredondados 29"/>
+                <wp:cNvGraphicFramePr/>
+                <a:graphic xmlns:a="http://schemas.openxmlformats.org/drawingml/2006/main">
+                  <a:graphicData uri="http://schemas.microsoft.com/office/word/2010/wordprocessingShape">
+                    <wps:wsp>
+                      <wps:cNvSpPr/>
+                      <wps:spPr>
+                        <a:xfrm>
+                          <a:off x="0" y="0"/>
+                          <a:ext cx="1422400" cy="787400"/>
+                        </a:xfrm>
+                        <a:prstGeom prst="roundRect">
+                          <a:avLst/>
+                        </a:prstGeom>
+                        <a:solidFill>
+                          <a:srgbClr val="FFFFFF"/>
+                        </a:solidFill>
+                        <a:ln w="12700">
+                          <a:solidFill>
+                            <a:srgbClr val="2555D9"/>
+                          </a:solidFill>
+                        </a:ln>
+                      </wps:spPr>
+                      <wps:style>
+                        <a:lnRef idx="2">
+                          <a:schemeClr val="accent1">
+                            <a:shade val="15000"/>
+                          </a:schemeClr>
+                        </a:lnRef>
+                        <a:fillRef idx="1">
+                          <a:schemeClr val="accent1"/>
+                        </a:fillRef>
+                        <a:effectRef idx="0">
+                          <a:schemeClr val="accent1"/>
+                        </a:effectRef>
+                        <a:fontRef idx="minor">
+                          <a:schemeClr val="lt1"/>
+                        </a:fontRef>
+                      </wps:style>
+                      <wps:txbx>
+                        <w:txbxContent>
+                          <w:p>
+                            <w:pPr>
+                              <w:jc w:val="center"/>
+                              <w:rPr>
+                                <w:b/>
+                                <w:sz w:val="14"/>
+                              </w:rPr>
+                            </w:pPr>
+                            <w:r>
+                              <w:rPr>
+                                <w:b/>
+                                <w:sz w:val="14"/>
+                              </w:rPr>
+                              <w:t>{software_shape_3_title}</w:t>
+                            </w:r>
+                          </w:p>
+                          <w:p>
+                            <w:pPr>
+                              <w:jc w:val="center"/>
+                              <w:rPr>
+                                <w:sz w:val="14"/>
+                              </w:rPr>
+                            </w:pPr>
+                            <w:r>
+                              <w:rPr>
+                                <w:sz w:val="14"/>
+                              </w:rPr>
+                              <w:t>{software_shape_3_body}</w:t>
+                            </w:r>
+                          </w:p>
+                        </w:txbxContent>
+                      </wps:txbx>
+                      <wps:bodyPr rot="0" spcFirstLastPara="0" vertOverflow="overflow" horzOverflow="overflow" vert="horz" wrap="square" lIns="50800" tIns="38100" rIns="50800" bIns="38100" numCol="1" spcCol="0" rtlCol="0" fromWordArt="0" anchor="ctr" anchorCtr="0" forceAA="0" compatLnSpc="1">
+                        <a:prstTxWarp prst="textNoShape">
+                          <a:avLst/>
+                        </a:prstTxWarp>
+                        <a:noAutofit/>
+                      </wps:bodyPr>
+                    </wps:wsp>
+                  </a:graphicData>
+                </a:graphic>
+              </wp:anchor>
+            </w:drawing>
+          </mc:Choice>
+          <mc:Fallback>
+            <w:pict>
+              <v:roundrect w14:anchorId="1F3E4F98" id="Retângulo: Cantos Arredondados 29" o:spid="_x0000_s1031" style="position:absolute;margin-left:334pt;margin-top:108.7pt;width:112pt;height:62pt;z-index:251687936;visibility:visible;mso-wrap-style:square;mso-wrap-distance-left:9pt;mso-wrap-distance-top:0;mso-wrap-distance-right:9pt;mso-wrap-distance-bottom:0;mso-position-horizontal:absolute;mso-position-horizontal-relative:text;mso-position-vertical:absolute;mso-position-vertical-relative:text;v-text-anchor:middle" arcsize="10923f" o:gfxdata="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" strokecolor="#2555d9" strokeweight="1pt">
+                <v:stroke joinstyle="miter"/>
+                <v:textbox inset="4pt,3pt,4pt,3pt">
+                  <w:txbxContent>
+                    <w:p>
+                      <w:pPr>
+                        <w:jc w:val="center"/>
+                        <w:rPr>
+                          <w:b/>
+                          <w:sz w:val="14"/>
+                        </w:rPr>
+                      </w:pPr>
+                      <w:r>
+                        <w:rPr>
+                          <w:b/>
+                          <w:sz w:val="14"/>
+                        </w:rPr>
+                        <w:t>{software_shape_3_title}</w:t>
+                      </w:r>
+                    </w:p>
+                    <w:p>
+                      <w:pPr>
+                        <w:jc w:val="center"/>
+                        <w:rPr>
+                          <w:sz w:val="14"/>
+                        </w:rPr>
+                      </w:pPr>
+                      <w:r>
+                        <w:rPr>
+                          <w:sz w:val="14"/>
+                        </w:rPr>
+                        <w:t>{software_shape_3_body}</w:t>
+                      </w:r>
+                    </w:p>
+                  </w:txbxContent>
+                </v:textbox>
+              </v:roundrect>
+            </w:pict>
+          </mc:Fallback>
+        </mc:AlternateContent>
+      </w:r>
+      <w:r>
+        <w:rPr>
+          <w:noProof/>
+        </w:rPr>
+        <mc:AlternateContent>
+          <mc:Choice Requires="wps">
+            <w:drawing>
+              <wp:anchor distT="0" distB="0" distL="114300" distR="114300" simplePos="0" relativeHeight="251685888" behindDoc="0" locked="0" layoutInCell="1" allowOverlap="1" wp14:anchorId="609D6ABE" wp14:editId="15F155E2">
+                <wp:simplePos x="0" y="0"/>
+                <wp:positionH relativeFrom="column">
+                  <wp:posOffset>2209800</wp:posOffset>
+                </wp:positionH>
+                <wp:positionV relativeFrom="paragraph">
+                  <wp:posOffset>1380490</wp:posOffset>
+                </wp:positionV>
+                <wp:extent cx="1422400" cy="787400"/>
+                <wp:effectExtent l="0" t="0" r="25400" b="12700"/>
+                <wp:wrapNone/>
+                <wp:docPr id="531375563" name="Retângulo: Cantos Arredondados 27"/>
+                <wp:cNvGraphicFramePr/>
+                <a:graphic xmlns:a="http://schemas.openxmlformats.org/drawingml/2006/main">
+                  <a:graphicData uri="http://schemas.microsoft.com/office/word/2010/wordprocessingShape">
+                    <wps:wsp>
+                      <wps:cNvSpPr/>
+                      <wps:spPr>
+                        <a:xfrm>
+                          <a:off x="0" y="0"/>
+                          <a:ext cx="1422400" cy="787400"/>
+                        </a:xfrm>
+                        <a:prstGeom prst="roundRect">
+                          <a:avLst/>
+                        </a:prstGeom>
+                        <a:solidFill>
+                          <a:srgbClr val="FFFFFF"/>
+                        </a:solidFill>
+                        <a:ln w="12700">
+                          <a:solidFill>
+                            <a:srgbClr val="2555D9"/>
+                          </a:solidFill>
+                        </a:ln>
+                      </wps:spPr>
+                      <wps:style>
+                        <a:lnRef idx="2">
+                          <a:schemeClr val="accent1">
+                            <a:shade val="15000"/>
+                          </a:schemeClr>
+                        </a:lnRef>
+                        <a:fillRef idx="1">
+                          <a:schemeClr val="accent1"/>
+                        </a:fillRef>
+                        <a:effectRef idx="0">
+                          <a:schemeClr val="accent1"/>
+                        </a:effectRef>
+                        <a:fontRef idx="minor">
+                          <a:schemeClr val="lt1"/>
+                        </a:fontRef>
+                      </wps:style>
+                      <wps:txbx>
+                        <w:txbxContent>
+                          <w:p>
+                            <w:pPr>
+                              <w:jc w:val="center"/>
+                              <w:rPr>
+                                <w:b/>
+                                <w:sz w:val="14"/>
+                              </w:rPr>
+                            </w:pPr>
+                            <w:r>
+                              <w:rPr>
+                                <w:b/>
+                                <w:sz w:val="14"/>
+                              </w:rPr>
+                              <w:t>{software_shape_2_title}</w:t>
+                            </w:r>
+                          </w:p>
+                          <w:p>
+                            <w:pPr>
+                              <w:jc w:val="center"/>
+                              <w:rPr>
+                                <w:sz w:val="14"/>
+                              </w:rPr>
+                            </w:pPr>
+                            <w:r>
+                              <w:rPr>
+                                <w:sz w:val="14"/>
+                              </w:rPr>
+                              <w:t>{software_shape_2_body}</w:t>
+                            </w:r>
+                          </w:p>
+                        </w:txbxContent>
+                      </wps:txbx>
+                      <wps:bodyPr rot="0" spcFirstLastPara="0" vertOverflow="overflow" horzOverflow="overflow" vert="horz" wrap="square" lIns="50800" tIns="38100" rIns="50800" bIns="38100" numCol="1" spcCol="0" rtlCol="0" fromWordArt="0" anchor="ctr" anchorCtr="0" forceAA="0" compatLnSpc="1">
+                        <a:prstTxWarp prst="textNoShape">
+                          <a:avLst/>
+                        </a:prstTxWarp>
+                        <a:noAutofit/>
+                      </wps:bodyPr>
+                    </wps:wsp>
+                  </a:graphicData>
+                </a:graphic>
+              </wp:anchor>
+            </w:drawing>
+          </mc:Choice>
+          <mc:Fallback>
+            <w:pict>
+              <v:roundrect w14:anchorId="609D6ABE" id="Retângulo: Cantos Arredondados 27" o:spid="_x0000_s1032" style="position:absolute;margin-left:174pt;margin-top:108.7pt;width:112pt;height:62pt;z-index:251685888;visibility:visible;mso-wrap-style:square;mso-wrap-distance-left:9pt;mso-wrap-distance-top:0;mso-wrap-distance-right:9pt;mso-wrap-distance-bottom:0;mso-position-horizontal:absolute;mso-position-horizontal-relative:text;mso-position-vertical:absolute;mso-position-vertical-relative:text;v-text-anchor:middle" arcsize="10923f" o:gfxdata="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" strokecolor="#2555d9" strokeweight="1pt">
+                <v:stroke joinstyle="miter"/>
+                <v:textbox inset="4pt,3pt,4pt,3pt">
+                  <w:txbxContent>
+                    <w:p>
+                      <w:pPr>
+                        <w:jc w:val="center"/>
+                        <w:rPr>
+                          <w:b/>
+                          <w:sz w:val="14"/>
+                        </w:rPr>
+                      </w:pPr>
+                      <w:r>
+                        <w:rPr>
+                          <w:b/>
+                          <w:sz w:val="14"/>
+                        </w:rPr>
+                        <w:t>{software_shape_2_title}</w:t>
+                      </w:r>
+                    </w:p>
+                    <w:p>
+                      <w:pPr>
+                        <w:jc w:val="center"/>
+                        <w:rPr>
+                          <w:sz w:val="14"/>
+                        </w:rPr>
+                      </w:pPr>
+                      <w:r>
+                        <w:rPr>
+                          <w:sz w:val="14"/>
+                        </w:rPr>
+                        <w:t>{software_shape_2_body}</w:t>
+                      </w:r>
+                    </w:p>
+                  </w:txbxContent>
+                </v:textbox>
+              </v:roundrect>
+            </w:pict>
+          </mc:Fallback>
+        </mc:AlternateContent>
+      </w:r>
+      <w:r>
+        <w:rPr>
+          <w:noProof/>
+        </w:rPr>
+        <mc:AlternateContent>
+          <mc:Choice Requires="wps">
+            <w:drawing>
+              <wp:anchor distT="0" distB="0" distL="114300" distR="114300" simplePos="0" relativeHeight="251683840" behindDoc="0" locked="0" layoutInCell="1" allowOverlap="1" wp14:anchorId="2F8A95FF" wp14:editId="1B0A6A52">
+                <wp:simplePos x="0" y="0"/>
+                <wp:positionH relativeFrom="column">
+                  <wp:posOffset>177800</wp:posOffset>
+                </wp:positionH>
+                <wp:positionV relativeFrom="paragraph">
+                  <wp:posOffset>1380490</wp:posOffset>
+                </wp:positionV>
+                <wp:extent cx="1422400" cy="787400"/>
+                <wp:effectExtent l="0" t="0" r="25400" b="12700"/>
+                <wp:wrapNone/>
+                <wp:docPr id="590992721" name="Retângulo: Cantos Arredondados 25"/>
+                <wp:cNvGraphicFramePr/>
+                <a:graphic xmlns:a="http://schemas.openxmlformats.org/drawingml/2006/main">
+                  <a:graphicData uri="http://schemas.microsoft.com/office/word/2010/wordprocessingShape">
+                    <wps:wsp>
+                      <wps:cNvSpPr/>
+                      <wps:spPr>
+                        <a:xfrm>
+                          <a:off x="0" y="0"/>
+                          <a:ext cx="1422400" cy="787400"/>
+                        </a:xfrm>
+                        <a:prstGeom prst="roundRect">
+                          <a:avLst/>
+                        </a:prstGeom>
+                        <a:solidFill>
+                          <a:srgbClr val="FFFFFF"/>
+                        </a:solidFill>
+                        <a:ln w="12700">
+                          <a:solidFill>
+                            <a:srgbClr val="2555D9"/>
+                          </a:solidFill>
+                        </a:ln>
+                      </wps:spPr>
+                      <wps:style>
+                        <a:lnRef idx="2">
+                          <a:schemeClr val="accent1">
+                            <a:shade val="15000"/>
+                          </a:schemeClr>
+                        </a:lnRef>
+                        <a:fillRef idx="1">
+                          <a:schemeClr val="accent1"/>
+                        </a:fillRef>
+                        <a:effectRef idx="0">
+                          <a:schemeClr val="accent1"/>
+                        </a:effectRef>
+                        <a:fontRef idx="minor">
+                          <a:schemeClr val="lt1"/>
+                        </a:fontRef>
+                      </wps:style>
+                      <wps:txbx>
+                        <w:txbxContent>
+                          <w:p>
+                            <w:pPr>
+                              <w:jc w:val="center"/>
+                              <w:rPr>
+                                <w:b/>
+                                <w:sz w:val="14"/>
+                              </w:rPr>
+                            </w:pPr>
+                            <w:r>
+                              <w:rPr>
+                                <w:b/>
+                                <w:sz w:val="14"/>
+                              </w:rPr>
+                              <w:t>{software_shape_1_title}</w:t>
+                            </w:r>
+                          </w:p>
+                          <w:p>
+                            <w:pPr>
+                              <w:jc w:val="center"/>
+                              <w:rPr>
+                                <w:sz w:val="14"/>
+                              </w:rPr>
+                            </w:pPr>
+                            <w:r>
+                              <w:rPr>
+                                <w:sz w:val="14"/>
+                              </w:rPr>
+                              <w:t>{software_shape_1_body}</w:t>
+                            </w:r>
+                          </w:p>
+                        </w:txbxContent>
+                      </wps:txbx>
+                      <wps:bodyPr rot="0" spcFirstLastPara="0" vertOverflow="overflow" horzOverflow="overflow" vert="horz" wrap="square" lIns="50800" tIns="38100" rIns="50800" bIns="38100" numCol="1" spcCol="0" rtlCol="0" fromWordArt="0" anchor="ctr" anchorCtr="0" forceAA="0" compatLnSpc="1">
+                        <a:prstTxWarp prst="textNoShape">
+                          <a:avLst/>
+                        </a:prstTxWarp>
+                        <a:noAutofit/>
+                      </wps:bodyPr>
+                    </wps:wsp>
+                  </a:graphicData>
+                </a:graphic>
+              </wp:anchor>
+            </w:drawing>
+          </mc:Choice>
+          <mc:Fallback>
+            <w:pict>
+              <v:roundrect w14:anchorId="2F8A95FF" id="Retângulo: Cantos Arredondados 25" o:spid="_x0000_s1033" style="position:absolute;margin-left:14pt;margin-top:108.7pt;width:112pt;height:62pt;z-index:251683840;visibility:visible;mso-wrap-style:square;mso-wrap-distance-left:9pt;mso-wrap-distance-top:0;mso-wrap-distance-right:9pt;mso-wrap-distance-bottom:0;mso-position-horizontal:absolute;mso-position-horizontal-relative:text;mso-position-vertical:absolute;mso-position-vertical-relative:text;v-text-anchor:middle" arcsize="10923f" o:gfxdata="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" strokecolor="#2555d9" strokeweight="1pt">
+                <v:stroke joinstyle="miter"/>
+                <v:textbox inset="4pt,3pt,4pt,3pt">
+                  <w:txbxContent>
+                    <w:p>
+                      <w:pPr>
+                        <w:jc w:val="center"/>
+                        <w:rPr>
+                          <w:b/>
+                          <w:sz w:val="14"/>
+                        </w:rPr>
+                      </w:pPr>
+                      <w:r>
+                        <w:rPr>
+                          <w:b/>
+                          <w:sz w:val="14"/>
+                        </w:rPr>
+                        <w:t>{software_shape_1_title}</w:t>
+                      </w:r>
+                    </w:p>
+                    <w:p>
+                      <w:pPr>
+                        <w:jc w:val="center"/>
+                        <w:rPr>
+                          <w:sz w:val="14"/>
+                        </w:rPr>
+                      </w:pPr>
+                      <w:r>
+                        <w:rPr>
+                          <w:sz w:val="14"/>
+                        </w:rPr>
+                        <w:t>{software_shape_1_body}</w:t>
+                      </w:r>
+                    </w:p>
+                  </w:txbxContent>
+                </v:textbox>
+              </v:roundrect>
+            </w:pict>
+          </mc:Fallback>
+        </mc:AlternateContent>
+      </w:r>
+    </w:p>
+    <w:p>
+      <w:pPr>
+        <w:pStyle w:val="Ttulo2"/>
+        <w:spacing w:before="0" w:after="120"/>
+      </w:pPr>
+    </w:p>
+    <w:p>
+      <w:pPr>
+        <w:pStyle w:val="Ttulo2"/>
+        <w:spacing w:before="0" w:after="120"/>
+      </w:pPr>
+    </w:p>
+    <w:p>
+      <w:pPr>
+        <w:pStyle w:val="Ttulo2"/>
+        <w:spacing w:before="0" w:after="120"/>
+      </w:pPr>
+    </w:p>
+    <w:p>
+      <w:pPr>
+        <w:pStyle w:val="Ttulo2"/>
+        <w:spacing w:before="0" w:after="120"/>
+      </w:pPr>
+    </w:p>
+    <w:p>
+      <w:pPr>
+        <w:pStyle w:val="Ttulo2"/>
+        <w:spacing w:before="0" w:after="120"/>
+      </w:pPr>
+    </w:p>
+    <w:p>
+      <w:pPr>
+        <w:pStyle w:val="Ttulo2"/>
+        <w:spacing w:before="0" w:after="120"/>
+      </w:pPr>
+    </w:p>
+    <w:p>
+      <w:pPr>
+        <w:pStyle w:val="Ttulo2"/>
+        <w:spacing w:before="0" w:after="120"/>
+      </w:pPr>
+    </w:p>
+    <w:p>
+      <w:pPr>
+        <w:pStyle w:val="Ttulo2"/>
+        <w:spacing w:before="0" w:after="120"/>
+      </w:pPr>
+    </w:p>
+    <w:p>
+      <w:pPr>
+        <w:pStyle w:val="Ttulo2"/>
+        <w:spacing w:before="0" w:after="120"/>
+      </w:pPr>
+    </w:p>
+    <w:p>
+      <w:pPr>
+        <w:pStyle w:val="Ttulo2"/>
+        <w:spacing w:before="0" w:after="120"/>
+      </w:pPr>
+    </w:p>
+    <w:p>
+      <w:pPr>
+        <w:pStyle w:val="Ttulo2"/>
+        <w:spacing w:before="0" w:after="120"/>
+      </w:pPr>
+    </w:p>
+    <w:p>
+      <w:pPr>
+        <w:pStyle w:val="Ttulo2"/>
+        <w:spacing w:before="0" w:after="120"/>
+      </w:pPr>
+    </w:p>
+    <w:p>
+      <w:pPr>
+        <w:pStyle w:val="Ttulo2"/>
+        <w:spacing w:before="0" w:after="120"/>
+      </w:pPr>
+    </w:p>
+    <w:p>
+      <w:pPr>
+        <w:pStyle w:val="Ttulo2"/>
+        <w:spacing w:before="0" w:after="120"/>
+      </w:pPr>
     </w:p>
     <w:tbl>
       <w:tblPr>
@@ -2335,6 +4405,954 @@
       <w:r>
         <w:t>Processos identificados</w:t>
       </w:r>
+      <w:r>
+        <w:rPr>
+          <w:noProof/>
+        </w:rPr>
+        <mc:AlternateContent>
+          <mc:Choice Requires="wps">
+            <w:drawing>
+              <wp:anchor distT="0" distB="0" distL="114300" distR="114300" simplePos="0" relativeHeight="251708416" behindDoc="0" locked="0" layoutInCell="1" allowOverlap="1" wp14:anchorId="6AF69CF5" wp14:editId="7254E9F6">
+                <wp:simplePos x="0" y="0"/>
+                <wp:positionH relativeFrom="column">
+                  <wp:posOffset>12369800</wp:posOffset>
+                </wp:positionH>
+                <wp:positionV relativeFrom="paragraph">
+                  <wp:posOffset>370840</wp:posOffset>
+                </wp:positionV>
+                <wp:extent cx="1714500" cy="762000"/>
+                <wp:effectExtent l="0" t="0" r="19050" b="19050"/>
+                <wp:wrapNone/>
+                <wp:docPr id="1937262424" name="Retângulo: Cantos Arredondados 49"/>
+                <wp:cNvGraphicFramePr/>
+                <a:graphic xmlns:a="http://schemas.openxmlformats.org/drawingml/2006/main">
+                  <a:graphicData uri="http://schemas.microsoft.com/office/word/2010/wordprocessingShape">
+                    <wps:wsp>
+                      <wps:cNvSpPr/>
+                      <wps:spPr>
+                        <a:xfrm>
+                          <a:off x="0" y="0"/>
+                          <a:ext cx="1714500" cy="762000"/>
+                        </a:xfrm>
+                        <a:prstGeom prst="roundRect">
+                          <a:avLst/>
+                        </a:prstGeom>
+                        <a:solidFill>
+                          <a:srgbClr val="DBFFE8"/>
+                        </a:solidFill>
+                        <a:ln w="12700">
+                          <a:solidFill>
+                            <a:srgbClr val="53DA3D"/>
+                          </a:solidFill>
+                        </a:ln>
+                      </wps:spPr>
+                      <wps:style>
+                        <a:lnRef idx="2">
+                          <a:schemeClr val="accent1">
+                            <a:shade val="15000"/>
+                          </a:schemeClr>
+                        </a:lnRef>
+                        <a:fillRef idx="1">
+                          <a:schemeClr val="accent1"/>
+                        </a:fillRef>
+                        <a:effectRef idx="0">
+                          <a:schemeClr val="accent1"/>
+                        </a:effectRef>
+                        <a:fontRef idx="minor">
+                          <a:schemeClr val="lt1"/>
+                        </a:fontRef>
+                      </wps:style>
+                      <wps:txbx>
+                        <w:txbxContent>
+                          <w:p>
+                            <w:pPr>
+                              <w:jc w:val="center"/>
+                              <w:rPr>
+                                <w:b/>
+                                <w:sz w:val="14"/>
+                              </w:rPr>
+                            </w:pPr>
+                            <w:r>
+                              <w:rPr>
+                                <w:b/>
+                                <w:sz w:val="14"/>
+                              </w:rPr>
+                              <w:t>{process_shape_6_title}</w:t>
+                            </w:r>
+                          </w:p>
+                          <w:p>
+                            <w:pPr>
+                              <w:jc w:val="center"/>
+                              <w:rPr>
+                                <w:sz w:val="14"/>
+                              </w:rPr>
+                            </w:pPr>
+                            <w:r>
+                              <w:rPr>
+                                <w:sz w:val="14"/>
+                              </w:rPr>
+                              <w:t>{process_shape_6_body}</w:t>
+                            </w:r>
+                          </w:p>
+                        </w:txbxContent>
+                      </wps:txbx>
+                      <wps:bodyPr rot="0" spcFirstLastPara="0" vertOverflow="overflow" horzOverflow="overflow" vert="horz" wrap="square" lIns="50800" tIns="38100" rIns="50800" bIns="38100" numCol="1" spcCol="0" rtlCol="0" fromWordArt="0" anchor="ctr" anchorCtr="0" forceAA="0" compatLnSpc="1">
+                        <a:prstTxWarp prst="textNoShape">
+                          <a:avLst/>
+                        </a:prstTxWarp>
+                        <a:noAutofit/>
+                      </wps:bodyPr>
+                    </wps:wsp>
+                  </a:graphicData>
+                </a:graphic>
+              </wp:anchor>
+            </w:drawing>
+          </mc:Choice>
+          <mc:Fallback>
+            <w:pict>
+              <v:roundrect w14:anchorId="6AF69CF5" id="Retângulo: Cantos Arredondados 49" o:spid="_x0000_s1034" style="position:absolute;margin-left:974pt;margin-top:29.2pt;width:135pt;height:60pt;z-index:251708416;visibility:visible;mso-wrap-style:square;mso-wrap-distance-left:9pt;mso-wrap-distance-top:0;mso-wrap-distance-right:9pt;mso-wrap-distance-bottom:0;mso-position-horizontal:absolute;mso-position-horizontal-relative:text;mso-position-vertical:absolute;mso-position-vertical-relative:text;v-text-anchor:middle" arcsize="10923f" o:gfxdata="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" fillcolor="#dbffe8" strokecolor="#53da3d" strokeweight="1pt">
+                <v:stroke joinstyle="miter"/>
+                <v:textbox inset="4pt,3pt,4pt,3pt">
+                  <w:txbxContent>
+                    <w:p>
+                      <w:pPr>
+                        <w:jc w:val="center"/>
+                        <w:rPr>
+                          <w:b/>
+                          <w:sz w:val="14"/>
+                        </w:rPr>
+                      </w:pPr>
+                      <w:r>
+                        <w:rPr>
+                          <w:b/>
+                          <w:sz w:val="14"/>
+                        </w:rPr>
+                        <w:t>{process_shape_6_title}</w:t>
+                      </w:r>
+                    </w:p>
+                    <w:p>
+                      <w:pPr>
+                        <w:jc w:val="center"/>
+                        <w:rPr>
+                          <w:sz w:val="14"/>
+                        </w:rPr>
+                      </w:pPr>
+                      <w:r>
+                        <w:rPr>
+                          <w:sz w:val="14"/>
+                        </w:rPr>
+                        <w:t>{process_shape_6_body}</w:t>
+                      </w:r>
+                    </w:p>
+                  </w:txbxContent>
+                </v:textbox>
+              </v:roundrect>
+            </w:pict>
+          </mc:Fallback>
+        </mc:AlternateContent>
+      </w:r>
+      <w:r>
+        <w:rPr>
+          <w:noProof/>
+        </w:rPr>
+        <mc:AlternateContent>
+          <mc:Choice Requires="wps">
+            <w:drawing>
+              <wp:anchor distT="0" distB="0" distL="114300" distR="114300" simplePos="0" relativeHeight="251706368" behindDoc="0" locked="0" layoutInCell="1" allowOverlap="1" wp14:anchorId="1F685356" wp14:editId="098E3869">
+                <wp:simplePos x="0" y="0"/>
+                <wp:positionH relativeFrom="column">
+                  <wp:posOffset>9956800</wp:posOffset>
+                </wp:positionH>
+                <wp:positionV relativeFrom="paragraph">
+                  <wp:posOffset>370840</wp:posOffset>
+                </wp:positionV>
+                <wp:extent cx="1714500" cy="762000"/>
+                <wp:effectExtent l="0" t="0" r="19050" b="19050"/>
+                <wp:wrapNone/>
+                <wp:docPr id="668368515" name="Retângulo: Cantos Arredondados 47"/>
+                <wp:cNvGraphicFramePr/>
+                <a:graphic xmlns:a="http://schemas.openxmlformats.org/drawingml/2006/main">
+                  <a:graphicData uri="http://schemas.microsoft.com/office/word/2010/wordprocessingShape">
+                    <wps:wsp>
+                      <wps:cNvSpPr/>
+                      <wps:spPr>
+                        <a:xfrm>
+                          <a:off x="0" y="0"/>
+                          <a:ext cx="1714500" cy="762000"/>
+                        </a:xfrm>
+                        <a:prstGeom prst="roundRect">
+                          <a:avLst/>
+                        </a:prstGeom>
+                        <a:solidFill>
+                          <a:srgbClr val="DBFFE8"/>
+                        </a:solidFill>
+                        <a:ln w="12700">
+                          <a:solidFill>
+                            <a:srgbClr val="53DA3D"/>
+                          </a:solidFill>
+                        </a:ln>
+                      </wps:spPr>
+                      <wps:style>
+                        <a:lnRef idx="2">
+                          <a:schemeClr val="accent1">
+                            <a:shade val="15000"/>
+                          </a:schemeClr>
+                        </a:lnRef>
+                        <a:fillRef idx="1">
+                          <a:schemeClr val="accent1"/>
+                        </a:fillRef>
+                        <a:effectRef idx="0">
+                          <a:schemeClr val="accent1"/>
+                        </a:effectRef>
+                        <a:fontRef idx="minor">
+                          <a:schemeClr val="lt1"/>
+                        </a:fontRef>
+                      </wps:style>
+                      <wps:txbx>
+                        <w:txbxContent>
+                          <w:p>
+                            <w:pPr>
+                              <w:jc w:val="center"/>
+                              <w:rPr>
+                                <w:b/>
+                                <w:sz w:val="14"/>
+                              </w:rPr>
+                            </w:pPr>
+                            <w:r>
+                              <w:rPr>
+                                <w:b/>
+                                <w:sz w:val="14"/>
+                              </w:rPr>
+                              <w:t>{process_shape_5_title}</w:t>
+                            </w:r>
+                          </w:p>
+                          <w:p>
+                            <w:pPr>
+                              <w:jc w:val="center"/>
+                              <w:rPr>
+                                <w:sz w:val="14"/>
+                              </w:rPr>
+                            </w:pPr>
+                            <w:r>
+                              <w:rPr>
+                                <w:sz w:val="14"/>
+                              </w:rPr>
+                              <w:t>{process_shape_5_body}</w:t>
+                            </w:r>
+                          </w:p>
+                        </w:txbxContent>
+                      </wps:txbx>
+                      <wps:bodyPr rot="0" spcFirstLastPara="0" vertOverflow="overflow" horzOverflow="overflow" vert="horz" wrap="square" lIns="50800" tIns="38100" rIns="50800" bIns="38100" numCol="1" spcCol="0" rtlCol="0" fromWordArt="0" anchor="ctr" anchorCtr="0" forceAA="0" compatLnSpc="1">
+                        <a:prstTxWarp prst="textNoShape">
+                          <a:avLst/>
+                        </a:prstTxWarp>
+                        <a:noAutofit/>
+                      </wps:bodyPr>
+                    </wps:wsp>
+                  </a:graphicData>
+                </a:graphic>
+              </wp:anchor>
+            </w:drawing>
+          </mc:Choice>
+          <mc:Fallback>
+            <w:pict>
+              <v:roundrect w14:anchorId="1F685356" id="Retângulo: Cantos Arredondados 47" o:spid="_x0000_s1035" style="position:absolute;margin-left:784pt;margin-top:29.2pt;width:135pt;height:60pt;z-index:251706368;visibility:visible;mso-wrap-style:square;mso-wrap-distance-left:9pt;mso-wrap-distance-top:0;mso-wrap-distance-right:9pt;mso-wrap-distance-bottom:0;mso-position-horizontal:absolute;mso-position-horizontal-relative:text;mso-position-vertical:absolute;mso-position-vertical-relative:text;v-text-anchor:middle" arcsize="10923f" o:gfxdata="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" fillcolor="#dbffe8" strokecolor="#53da3d" strokeweight="1pt">
+                <v:stroke joinstyle="miter"/>
+                <v:textbox inset="4pt,3pt,4pt,3pt">
+                  <w:txbxContent>
+                    <w:p>
+                      <w:pPr>
+                        <w:jc w:val="center"/>
+                        <w:rPr>
+                          <w:b/>
+                          <w:sz w:val="14"/>
+                        </w:rPr>
+                      </w:pPr>
+                      <w:r>
+                        <w:rPr>
+                          <w:b/>
+                          <w:sz w:val="14"/>
+                        </w:rPr>
+                        <w:t>{process_shape_5_title}</w:t>
+                      </w:r>
+                    </w:p>
+                    <w:p>
+                      <w:pPr>
+                        <w:jc w:val="center"/>
+                        <w:rPr>
+                          <w:sz w:val="14"/>
+                        </w:rPr>
+                      </w:pPr>
+                      <w:r>
+                        <w:rPr>
+                          <w:sz w:val="14"/>
+                        </w:rPr>
+                        <w:t>{process_shape_5_body}</w:t>
+                      </w:r>
+                    </w:p>
+                  </w:txbxContent>
+                </v:textbox>
+              </v:roundrect>
+            </w:pict>
+          </mc:Fallback>
+        </mc:AlternateContent>
+      </w:r>
+      <w:r>
+        <w:rPr>
+          <w:noProof/>
+        </w:rPr>
+        <mc:AlternateContent>
+          <mc:Choice Requires="wps">
+            <w:drawing>
+              <wp:anchor distT="0" distB="0" distL="114300" distR="114300" simplePos="0" relativeHeight="251704320" behindDoc="0" locked="0" layoutInCell="1" allowOverlap="1" wp14:anchorId="13218964" wp14:editId="7ED2E247">
+                <wp:simplePos x="0" y="0"/>
+                <wp:positionH relativeFrom="column">
+                  <wp:posOffset>7543800</wp:posOffset>
+                </wp:positionH>
+                <wp:positionV relativeFrom="paragraph">
+                  <wp:posOffset>370840</wp:posOffset>
+                </wp:positionV>
+                <wp:extent cx="1714500" cy="762000"/>
+                <wp:effectExtent l="0" t="0" r="19050" b="19050"/>
+                <wp:wrapNone/>
+                <wp:docPr id="1169046080" name="Retângulo: Cantos Arredondados 45"/>
+                <wp:cNvGraphicFramePr/>
+                <a:graphic xmlns:a="http://schemas.openxmlformats.org/drawingml/2006/main">
+                  <a:graphicData uri="http://schemas.microsoft.com/office/word/2010/wordprocessingShape">
+                    <wps:wsp>
+                      <wps:cNvSpPr/>
+                      <wps:spPr>
+                        <a:xfrm>
+                          <a:off x="0" y="0"/>
+                          <a:ext cx="1714500" cy="762000"/>
+                        </a:xfrm>
+                        <a:prstGeom prst="roundRect">
+                          <a:avLst/>
+                        </a:prstGeom>
+                        <a:solidFill>
+                          <a:srgbClr val="DBFFE8"/>
+                        </a:solidFill>
+                        <a:ln w="12700">
+                          <a:solidFill>
+                            <a:srgbClr val="53DA3D"/>
+                          </a:solidFill>
+                        </a:ln>
+                      </wps:spPr>
+                      <wps:style>
+                        <a:lnRef idx="2">
+                          <a:schemeClr val="accent1">
+                            <a:shade val="15000"/>
+                          </a:schemeClr>
+                        </a:lnRef>
+                        <a:fillRef idx="1">
+                          <a:schemeClr val="accent1"/>
+                        </a:fillRef>
+                        <a:effectRef idx="0">
+                          <a:schemeClr val="accent1"/>
+                        </a:effectRef>
+                        <a:fontRef idx="minor">
+                          <a:schemeClr val="lt1"/>
+                        </a:fontRef>
+                      </wps:style>
+                      <wps:txbx>
+                        <w:txbxContent>
+                          <w:p>
+                            <w:pPr>
+                              <w:jc w:val="center"/>
+                              <w:rPr>
+                                <w:b/>
+                                <w:sz w:val="14"/>
+                              </w:rPr>
+                            </w:pPr>
+                            <w:r>
+                              <w:rPr>
+                                <w:b/>
+                                <w:sz w:val="14"/>
+                              </w:rPr>
+                              <w:t>{process_shape_4_title}</w:t>
+                            </w:r>
+                          </w:p>
+                          <w:p>
+                            <w:pPr>
+                              <w:jc w:val="center"/>
+                              <w:rPr>
+                                <w:sz w:val="14"/>
+                              </w:rPr>
+                            </w:pPr>
+                            <w:r>
+                              <w:rPr>
+                                <w:sz w:val="14"/>
+                              </w:rPr>
+                              <w:t>{process_shape_4_body}</w:t>
+                            </w:r>
+                          </w:p>
+                        </w:txbxContent>
+                      </wps:txbx>
+                      <wps:bodyPr rot="0" spcFirstLastPara="0" vertOverflow="overflow" horzOverflow="overflow" vert="horz" wrap="square" lIns="50800" tIns="38100" rIns="50800" bIns="38100" numCol="1" spcCol="0" rtlCol="0" fromWordArt="0" anchor="ctr" anchorCtr="0" forceAA="0" compatLnSpc="1">
+                        <a:prstTxWarp prst="textNoShape">
+                          <a:avLst/>
+                        </a:prstTxWarp>
+                        <a:noAutofit/>
+                      </wps:bodyPr>
+                    </wps:wsp>
+                  </a:graphicData>
+                </a:graphic>
+              </wp:anchor>
+            </w:drawing>
+          </mc:Choice>
+          <mc:Fallback>
+            <w:pict>
+              <v:roundrect w14:anchorId="13218964" id="Retângulo: Cantos Arredondados 45" o:spid="_x0000_s1036" style="position:absolute;margin-left:594pt;margin-top:29.2pt;width:135pt;height:60pt;z-index:251704320;visibility:visible;mso-wrap-style:square;mso-wrap-distance-left:9pt;mso-wrap-distance-top:0;mso-wrap-distance-right:9pt;mso-wrap-distance-bottom:0;mso-position-horizontal:absolute;mso-position-horizontal-relative:text;mso-position-vertical:absolute;mso-position-vertical-relative:text;v-text-anchor:middle" arcsize="10923f" o:gfxdata="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" fillcolor="#dbffe8" strokecolor="#53da3d" strokeweight="1pt">
+                <v:stroke joinstyle="miter"/>
+                <v:textbox inset="4pt,3pt,4pt,3pt">
+                  <w:txbxContent>
+                    <w:p>
+                      <w:pPr>
+                        <w:jc w:val="center"/>
+                        <w:rPr>
+                          <w:b/>
+                          <w:sz w:val="14"/>
+                        </w:rPr>
+                      </w:pPr>
+                      <w:r>
+                        <w:rPr>
+                          <w:b/>
+                          <w:sz w:val="14"/>
+                        </w:rPr>
+                        <w:t>{process_shape_4_title}</w:t>
+                      </w:r>
+                    </w:p>
+                    <w:p>
+                      <w:pPr>
+                        <w:jc w:val="center"/>
+                        <w:rPr>
+                          <w:sz w:val="14"/>
+                        </w:rPr>
+                      </w:pPr>
+                      <w:r>
+                        <w:rPr>
+                          <w:sz w:val="14"/>
+                        </w:rPr>
+                        <w:t>{process_shape_4_body}</w:t>
+                      </w:r>
+                    </w:p>
+                  </w:txbxContent>
+                </v:textbox>
+              </v:roundrect>
+            </w:pict>
+          </mc:Fallback>
+        </mc:AlternateContent>
+      </w:r>
+      <w:r>
+        <w:rPr>
+          <w:noProof/>
+        </w:rPr>
+        <mc:AlternateContent>
+          <mc:Choice Requires="wps">
+            <w:drawing>
+              <wp:anchor distT="0" distB="0" distL="114300" distR="114300" simplePos="0" relativeHeight="251702272" behindDoc="0" locked="0" layoutInCell="1" allowOverlap="1" wp14:anchorId="3E8B22F5" wp14:editId="213F19B9">
+                <wp:simplePos x="0" y="0"/>
+                <wp:positionH relativeFrom="column">
+                  <wp:posOffset>5130800</wp:posOffset>
+                </wp:positionH>
+                <wp:positionV relativeFrom="paragraph">
+                  <wp:posOffset>370840</wp:posOffset>
+                </wp:positionV>
+                <wp:extent cx="1714500" cy="762000"/>
+                <wp:effectExtent l="0" t="0" r="19050" b="19050"/>
+                <wp:wrapNone/>
+                <wp:docPr id="1676559587" name="Retângulo: Cantos Arredondados 43"/>
+                <wp:cNvGraphicFramePr/>
+                <a:graphic xmlns:a="http://schemas.openxmlformats.org/drawingml/2006/main">
+                  <a:graphicData uri="http://schemas.microsoft.com/office/word/2010/wordprocessingShape">
+                    <wps:wsp>
+                      <wps:cNvSpPr/>
+                      <wps:spPr>
+                        <a:xfrm>
+                          <a:off x="0" y="0"/>
+                          <a:ext cx="1714500" cy="762000"/>
+                        </a:xfrm>
+                        <a:prstGeom prst="roundRect">
+                          <a:avLst/>
+                        </a:prstGeom>
+                        <a:solidFill>
+                          <a:srgbClr val="DBFFE8"/>
+                        </a:solidFill>
+                        <a:ln w="12700">
+                          <a:solidFill>
+                            <a:srgbClr val="53DA3D"/>
+                          </a:solidFill>
+                        </a:ln>
+                      </wps:spPr>
+                      <wps:style>
+                        <a:lnRef idx="2">
+                          <a:schemeClr val="accent1">
+                            <a:shade val="15000"/>
+                          </a:schemeClr>
+                        </a:lnRef>
+                        <a:fillRef idx="1">
+                          <a:schemeClr val="accent1"/>
+                        </a:fillRef>
+                        <a:effectRef idx="0">
+                          <a:schemeClr val="accent1"/>
+                        </a:effectRef>
+                        <a:fontRef idx="minor">
+                          <a:schemeClr val="lt1"/>
+                        </a:fontRef>
+                      </wps:style>
+                      <wps:txbx>
+                        <w:txbxContent>
+                          <w:p>
+                            <w:pPr>
+                              <w:jc w:val="center"/>
+                              <w:rPr>
+                                <w:b/>
+                                <w:sz w:val="14"/>
+                              </w:rPr>
+                            </w:pPr>
+                            <w:r>
+                              <w:rPr>
+                                <w:b/>
+                                <w:sz w:val="14"/>
+                              </w:rPr>
+                              <w:t>{process_shape_3_title}</w:t>
+                            </w:r>
+                          </w:p>
+                          <w:p>
+                            <w:pPr>
+                              <w:jc w:val="center"/>
+                              <w:rPr>
+                                <w:sz w:val="14"/>
+                              </w:rPr>
+                            </w:pPr>
+                            <w:r>
+                              <w:rPr>
+                                <w:sz w:val="14"/>
+                              </w:rPr>
+                              <w:t>{process_shape_3_body}</w:t>
+                            </w:r>
+                          </w:p>
+                        </w:txbxContent>
+                      </wps:txbx>
+                      <wps:bodyPr rot="0" spcFirstLastPara="0" vertOverflow="overflow" horzOverflow="overflow" vert="horz" wrap="square" lIns="50800" tIns="38100" rIns="50800" bIns="38100" numCol="1" spcCol="0" rtlCol="0" fromWordArt="0" anchor="ctr" anchorCtr="0" forceAA="0" compatLnSpc="1">
+                        <a:prstTxWarp prst="textNoShape">
+                          <a:avLst/>
+                        </a:prstTxWarp>
+                        <a:noAutofit/>
+                      </wps:bodyPr>
+                    </wps:wsp>
+                  </a:graphicData>
+                </a:graphic>
+              </wp:anchor>
+            </w:drawing>
+          </mc:Choice>
+          <mc:Fallback>
+            <w:pict>
+              <v:roundrect w14:anchorId="3E8B22F5" id="Retângulo: Cantos Arredondados 43" o:spid="_x0000_s1037" style="position:absolute;margin-left:404pt;margin-top:29.2pt;width:135pt;height:60pt;z-index:251702272;visibility:visible;mso-wrap-style:square;mso-wrap-distance-left:9pt;mso-wrap-distance-top:0;mso-wrap-distance-right:9pt;mso-wrap-distance-bottom:0;mso-position-horizontal:absolute;mso-position-horizontal-relative:text;mso-position-vertical:absolute;mso-position-vertical-relative:text;v-text-anchor:middle" arcsize="10923f" o:gfxdata="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" fillcolor="#dbffe8" strokecolor="#53da3d" strokeweight="1pt">
+                <v:stroke joinstyle="miter"/>
+                <v:textbox inset="4pt,3pt,4pt,3pt">
+                  <w:txbxContent>
+                    <w:p>
+                      <w:pPr>
+                        <w:jc w:val="center"/>
+                        <w:rPr>
+                          <w:b/>
+                          <w:sz w:val="14"/>
+                        </w:rPr>
+                      </w:pPr>
+                      <w:r>
+                        <w:rPr>
+                          <w:b/>
+                          <w:sz w:val="14"/>
+                        </w:rPr>
+                        <w:t>{process_shape_3_title}</w:t>
+                      </w:r>
+                    </w:p>
+                    <w:p>
+                      <w:pPr>
+                        <w:jc w:val="center"/>
+                        <w:rPr>
+                          <w:sz w:val="14"/>
+                        </w:rPr>
+                      </w:pPr>
+                      <w:r>
+                        <w:rPr>
+                          <w:sz w:val="14"/>
+                        </w:rPr>
+                        <w:t>{process_shape_3_body}</w:t>
+                      </w:r>
+                    </w:p>
+                  </w:txbxContent>
+                </v:textbox>
+              </v:roundrect>
+            </w:pict>
+          </mc:Fallback>
+        </mc:AlternateContent>
+      </w:r>
+      <w:r>
+        <w:rPr>
+          <w:noProof/>
+        </w:rPr>
+        <mc:AlternateContent>
+          <mc:Choice Requires="wps">
+            <w:drawing>
+              <wp:anchor distT="0" distB="0" distL="114300" distR="114300" simplePos="0" relativeHeight="251700224" behindDoc="0" locked="0" layoutInCell="1" allowOverlap="1" wp14:anchorId="52E760F4" wp14:editId="585EA3DD">
+                <wp:simplePos x="0" y="0"/>
+                <wp:positionH relativeFrom="column">
+                  <wp:posOffset>2717800</wp:posOffset>
+                </wp:positionH>
+                <wp:positionV relativeFrom="paragraph">
+                  <wp:posOffset>370840</wp:posOffset>
+                </wp:positionV>
+                <wp:extent cx="1714500" cy="762000"/>
+                <wp:effectExtent l="0" t="0" r="19050" b="19050"/>
+                <wp:wrapNone/>
+                <wp:docPr id="1162831683" name="Retângulo: Cantos Arredondados 41"/>
+                <wp:cNvGraphicFramePr/>
+                <a:graphic xmlns:a="http://schemas.openxmlformats.org/drawingml/2006/main">
+                  <a:graphicData uri="http://schemas.microsoft.com/office/word/2010/wordprocessingShape">
+                    <wps:wsp>
+                      <wps:cNvSpPr/>
+                      <wps:spPr>
+                        <a:xfrm>
+                          <a:off x="0" y="0"/>
+                          <a:ext cx="1714500" cy="762000"/>
+                        </a:xfrm>
+                        <a:prstGeom prst="roundRect">
+                          <a:avLst/>
+                        </a:prstGeom>
+                        <a:solidFill>
+                          <a:srgbClr val="DBFFE8"/>
+                        </a:solidFill>
+                        <a:ln w="12700">
+                          <a:solidFill>
+                            <a:srgbClr val="53DA3D"/>
+                          </a:solidFill>
+                        </a:ln>
+                      </wps:spPr>
+                      <wps:style>
+                        <a:lnRef idx="2">
+                          <a:schemeClr val="accent1">
+                            <a:shade val="15000"/>
+                          </a:schemeClr>
+                        </a:lnRef>
+                        <a:fillRef idx="1">
+                          <a:schemeClr val="accent1"/>
+                        </a:fillRef>
+                        <a:effectRef idx="0">
+                          <a:schemeClr val="accent1"/>
+                        </a:effectRef>
+                        <a:fontRef idx="minor">
+                          <a:schemeClr val="lt1"/>
+                        </a:fontRef>
+                      </wps:style>
+                      <wps:txbx>
+                        <w:txbxContent>
+                          <w:p>
+                            <w:pPr>
+                              <w:jc w:val="center"/>
+                              <w:rPr>
+                                <w:b/>
+                                <w:sz w:val="14"/>
+                              </w:rPr>
+                            </w:pPr>
+                            <w:r>
+                              <w:rPr>
+                                <w:b/>
+                                <w:sz w:val="14"/>
+                              </w:rPr>
+                              <w:t>{process_shape_2_title}</w:t>
+                            </w:r>
+                          </w:p>
+                          <w:p>
+                            <w:pPr>
+                              <w:jc w:val="center"/>
+                              <w:rPr>
+                                <w:sz w:val="14"/>
+                              </w:rPr>
+                            </w:pPr>
+                            <w:r>
+                              <w:rPr>
+                                <w:sz w:val="14"/>
+                              </w:rPr>
+                              <w:t>{process_shape_2_body}</w:t>
+                            </w:r>
+                          </w:p>
+                        </w:txbxContent>
+                      </wps:txbx>
+                      <wps:bodyPr rot="0" spcFirstLastPara="0" vertOverflow="overflow" horzOverflow="overflow" vert="horz" wrap="square" lIns="50800" tIns="38100" rIns="50800" bIns="38100" numCol="1" spcCol="0" rtlCol="0" fromWordArt="0" anchor="ctr" anchorCtr="0" forceAA="0" compatLnSpc="1">
+                        <a:prstTxWarp prst="textNoShape">
+                          <a:avLst/>
+                        </a:prstTxWarp>
+                        <a:noAutofit/>
+                      </wps:bodyPr>
+                    </wps:wsp>
+                  </a:graphicData>
+                </a:graphic>
+              </wp:anchor>
+            </w:drawing>
+          </mc:Choice>
+          <mc:Fallback>
+            <w:pict>
+              <v:roundrect w14:anchorId="52E760F4" id="Retângulo: Cantos Arredondados 41" o:spid="_x0000_s1038" style="position:absolute;margin-left:214pt;margin-top:29.2pt;width:135pt;height:60pt;z-index:251700224;visibility:visible;mso-wrap-style:square;mso-wrap-distance-left:9pt;mso-wrap-distance-top:0;mso-wrap-distance-right:9pt;mso-wrap-distance-bottom:0;mso-position-horizontal:absolute;mso-position-horizontal-relative:text;mso-position-vertical:absolute;mso-position-vertical-relative:text;v-text-anchor:middle" arcsize="10923f" o:gfxdata="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" fillcolor="#dbffe8" strokecolor="#53da3d" strokeweight="1pt">
+                <v:stroke joinstyle="miter"/>
+                <v:textbox inset="4pt,3pt,4pt,3pt">
+                  <w:txbxContent>
+                    <w:p>
+                      <w:pPr>
+                        <w:jc w:val="center"/>
+                        <w:rPr>
+                          <w:b/>
+                          <w:sz w:val="14"/>
+                        </w:rPr>
+                      </w:pPr>
+                      <w:r>
+                        <w:rPr>
+                          <w:b/>
+                          <w:sz w:val="14"/>
+                        </w:rPr>
+                        <w:t>{process_shape_2_title}</w:t>
+                      </w:r>
+                    </w:p>
+                    <w:p>
+                      <w:pPr>
+                        <w:jc w:val="center"/>
+                        <w:rPr>
+                          <w:sz w:val="14"/>
+                        </w:rPr>
+                      </w:pPr>
+                      <w:r>
+                        <w:rPr>
+                          <w:sz w:val="14"/>
+                        </w:rPr>
+                        <w:t>{process_shape_2_body}</w:t>
+                      </w:r>
+                    </w:p>
+                  </w:txbxContent>
+                </v:textbox>
+              </v:roundrect>
+            </w:pict>
+          </mc:Fallback>
+        </mc:AlternateContent>
+      </w:r>
+      <w:r>
+        <w:rPr>
+          <w:noProof/>
+        </w:rPr>
+        <mc:AlternateContent>
+          <mc:Choice Requires="wps">
+            <w:drawing>
+              <wp:anchor distT="0" distB="0" distL="114300" distR="114300" simplePos="0" relativeHeight="251698176" behindDoc="0" locked="0" layoutInCell="1" allowOverlap="1" wp14:anchorId="032C48ED" wp14:editId="1FAE323C">
+                <wp:simplePos x="0" y="0"/>
+                <wp:positionH relativeFrom="column">
+                  <wp:posOffset>304800</wp:posOffset>
+                </wp:positionH>
+                <wp:positionV relativeFrom="paragraph">
+                  <wp:posOffset>370840</wp:posOffset>
+                </wp:positionV>
+                <wp:extent cx="1714500" cy="762000"/>
+                <wp:effectExtent l="0" t="0" r="19050" b="19050"/>
+                <wp:wrapNone/>
+                <wp:docPr id="293274911" name="Retângulo: Cantos Arredondados 39"/>
+                <wp:cNvGraphicFramePr/>
+                <a:graphic xmlns:a="http://schemas.openxmlformats.org/drawingml/2006/main">
+                  <a:graphicData uri="http://schemas.microsoft.com/office/word/2010/wordprocessingShape">
+                    <wps:wsp>
+                      <wps:cNvSpPr/>
+                      <wps:spPr>
+                        <a:xfrm>
+                          <a:off x="0" y="0"/>
+                          <a:ext cx="1714500" cy="762000"/>
+                        </a:xfrm>
+                        <a:prstGeom prst="roundRect">
+                          <a:avLst/>
+                        </a:prstGeom>
+                        <a:solidFill>
+                          <a:srgbClr val="DBFFE8"/>
+                        </a:solidFill>
+                        <a:ln w="12700">
+                          <a:solidFill>
+                            <a:srgbClr val="53DA3D"/>
+                          </a:solidFill>
+                        </a:ln>
+                      </wps:spPr>
+                      <wps:style>
+                        <a:lnRef idx="2">
+                          <a:schemeClr val="accent1">
+                            <a:shade val="15000"/>
+                          </a:schemeClr>
+                        </a:lnRef>
+                        <a:fillRef idx="1">
+                          <a:schemeClr val="accent1"/>
+                        </a:fillRef>
+                        <a:effectRef idx="0">
+                          <a:schemeClr val="accent1"/>
+                        </a:effectRef>
+                        <a:fontRef idx="minor">
+                          <a:schemeClr val="lt1"/>
+                        </a:fontRef>
+                      </wps:style>
+                      <wps:txbx>
+                        <w:txbxContent>
+                          <w:p>
+                            <w:pPr>
+                              <w:jc w:val="center"/>
+                              <w:rPr>
+                                <w:b/>
+                                <w:sz w:val="14"/>
+                              </w:rPr>
+                            </w:pPr>
+                            <w:r>
+                              <w:rPr>
+                                <w:b/>
+                                <w:sz w:val="14"/>
+                              </w:rPr>
+                              <w:t>{process_shape_1_title}</w:t>
+                            </w:r>
+                          </w:p>
+                          <w:p>
+                            <w:pPr>
+                              <w:jc w:val="center"/>
+                              <w:rPr>
+                                <w:sz w:val="14"/>
+                              </w:rPr>
+                            </w:pPr>
+                            <w:r>
+                              <w:rPr>
+                                <w:sz w:val="14"/>
+                              </w:rPr>
+                              <w:t>{process_shape_1_body}</w:t>
+                            </w:r>
+                          </w:p>
+                        </w:txbxContent>
+                      </wps:txbx>
+                      <wps:bodyPr rot="0" spcFirstLastPara="0" vertOverflow="overflow" horzOverflow="overflow" vert="horz" wrap="square" lIns="50800" tIns="38100" rIns="50800" bIns="38100" numCol="1" spcCol="0" rtlCol="0" fromWordArt="0" anchor="ctr" anchorCtr="0" forceAA="0" compatLnSpc="1">
+                        <a:prstTxWarp prst="textNoShape">
+                          <a:avLst/>
+                        </a:prstTxWarp>
+                        <a:noAutofit/>
+                      </wps:bodyPr>
+                    </wps:wsp>
+                  </a:graphicData>
+                </a:graphic>
+              </wp:anchor>
+            </w:drawing>
+          </mc:Choice>
+          <mc:Fallback>
+            <w:pict>
+              <v:roundrect w14:anchorId="032C48ED" id="Retângulo: Cantos Arredondados 39" o:spid="_x0000_s1039" style="position:absolute;margin-left:24pt;margin-top:29.2pt;width:135pt;height:60pt;z-index:251698176;visibility:visible;mso-wrap-style:square;mso-wrap-distance-left:9pt;mso-wrap-distance-top:0;mso-wrap-distance-right:9pt;mso-wrap-distance-bottom:0;mso-position-horizontal:absolute;mso-position-horizontal-relative:text;mso-position-vertical:absolute;mso-position-vertical-relative:text;v-text-anchor:middle" arcsize="10923f" o:gfxdata="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" fillcolor="#dbffe8" strokecolor="#53da3d" strokeweight="1pt">
+                <v:stroke joinstyle="miter"/>
+                <v:textbox inset="4pt,3pt,4pt,3pt">
+                  <w:txbxContent>
+                    <w:p>
+                      <w:pPr>
+                        <w:jc w:val="center"/>
+                        <w:rPr>
+                          <w:b/>
+                          <w:sz w:val="14"/>
+                        </w:rPr>
+                      </w:pPr>
+                      <w:r>
+                        <w:rPr>
+                          <w:b/>
+                          <w:sz w:val="14"/>
+                        </w:rPr>
+                        <w:t>{process_shape_1_title}</w:t>
+                      </w:r>
+                    </w:p>
+                    <w:p>
+                      <w:pPr>
+                        <w:jc w:val="center"/>
+                        <w:rPr>
+                          <w:sz w:val="14"/>
+                        </w:rPr>
+                      </w:pPr>
+                      <w:r>
+                        <w:rPr>
+                          <w:sz w:val="14"/>
+                        </w:rPr>
+                        <w:t>{process_shape_1_body}</w:t>
+                      </w:r>
+                    </w:p>
+                  </w:txbxContent>
+                </v:textbox>
+              </v:roundrect>
+            </w:pict>
+          </mc:Fallback>
+        </mc:AlternateContent>
+      </w:r>
+    </w:p>
+    <w:p>
+      <w:pPr>
+        <w:pStyle w:val="Ttulo2"/>
+        <w:spacing w:before="220" w:after="120"/>
+      </w:pPr>
+    </w:p>
+    <w:p>
+      <w:pPr>
+        <w:pStyle w:val="Ttulo2"/>
+        <w:spacing w:before="220" w:after="120"/>
+      </w:pPr>
+    </w:p>
+    <w:p>
+      <w:pPr>
+        <w:pStyle w:val="Ttulo2"/>
+        <w:spacing w:before="220" w:after="120"/>
+      </w:pPr>
+    </w:p>
+    <w:p>
+      <w:pPr>
+        <w:pStyle w:val="Ttulo2"/>
+        <w:spacing w:before="220" w:after="120"/>
+      </w:pPr>
+    </w:p>
+    <w:p>
+      <w:pPr>
+        <w:pStyle w:val="Ttulo2"/>
+        <w:spacing w:before="220" w:after="120"/>
+      </w:pPr>
+    </w:p>
+    <w:p>
+      <w:pPr>
+        <w:pStyle w:val="Ttulo2"/>
+        <w:spacing w:before="220" w:after="120"/>
+      </w:pPr>
+    </w:p>
+    <w:p>
+      <w:pPr>
+        <w:pStyle w:val="Ttulo2"/>
+        <w:spacing w:before="220" w:after="120"/>
+      </w:pPr>
+    </w:p>
+    <w:p>
+      <w:pPr>
+        <w:pStyle w:val="Ttulo2"/>
+        <w:spacing w:before="220" w:after="120"/>
+      </w:pPr>
+    </w:p>
+    <w:p>
+      <w:pPr>
+        <w:pStyle w:val="Ttulo2"/>
+        <w:spacing w:before="220" w:after="120"/>
+      </w:pPr>
+    </w:p>
+    <w:p>
+      <w:pPr>
+        <w:pStyle w:val="Ttulo2"/>
+        <w:spacing w:before="220" w:after="120"/>
+      </w:pPr>
+    </w:p>
+    <w:p>
+      <w:pPr>
+        <w:pStyle w:val="Ttulo2"/>
+        <w:spacing w:before="220" w:after="120"/>
+      </w:pPr>
+    </w:p>
+    <w:p>
+      <w:pPr>
+        <w:pStyle w:val="Ttulo2"/>
+        <w:spacing w:before="220" w:after="120"/>
+      </w:pPr>
     </w:p>
     <w:tbl>
       <w:tblPr>
@@ -2829,7 +5847,6 @@
                 <w:bCs/>
                 <w:color w:val="FFFFFF"/>
               </w:rPr>
-              <w:lastRenderedPageBreak/>
               <w:t>03</w:t>
             </w:r>
           </w:p>

</xml_diff>

<commit_message>
Add native Word gap risk and roadmap visuals
</commit_message>
<xml_diff>
--- a/backend/templates/assessment-operational-template.docx
+++ b/backend/templates/assessment-operational-template.docx
@@ -47,6 +47,972 @@
               <w:spacing w:after="0"/>
               <w:jc w:val="center"/>
             </w:pPr>
+            <w:r>
+              <w:rPr>
+                <w:b/>
+                <w:bCs/>
+                <w:noProof/>
+                <w:color w:val="FFFFFF"/>
+                <w:sz w:val="34"/>
+                <w:szCs w:val="34"/>
+              </w:rPr>
+              <mc:AlternateContent>
+                <mc:Choice Requires="wps">
+                  <w:drawing>
+                    <wp:anchor distT="0" distB="0" distL="114300" distR="114300" simplePos="0" relativeHeight="251738112" behindDoc="0" locked="0" layoutInCell="1" allowOverlap="1" wp14:anchorId="4B421A83" wp14:editId="6C754063">
+                      <wp:simplePos x="0" y="0"/>
+                      <wp:positionH relativeFrom="column">
+                        <wp:posOffset>6026785</wp:posOffset>
+                      </wp:positionH>
+                      <wp:positionV relativeFrom="paragraph">
+                        <wp:posOffset>2997200</wp:posOffset>
+                      </wp:positionV>
+                      <wp:extent cx="190500" cy="0"/>
+                      <wp:effectExtent l="0" t="76200" r="19050" b="114300"/>
+                      <wp:wrapNone/>
+                      <wp:docPr id="428861026" name="roadmap_map_arrow_4"/>
+                      <wp:cNvGraphicFramePr/>
+                      <a:graphic xmlns:a="http://schemas.openxmlformats.org/drawingml/2006/main">
+                        <a:graphicData uri="http://schemas.microsoft.com/office/word/2010/wordprocessingShape">
+                          <wps:wsp>
+                            <wps:cNvCnPr/>
+                            <wps:spPr>
+                              <a:xfrm>
+                                <a:off x="0" y="0"/>
+                                <a:ext cx="190500" cy="0"/>
+                              </a:xfrm>
+                              <a:prstGeom prst="straightConnector1">
+                                <a:avLst/>
+                              </a:prstGeom>
+                              <a:ln w="16510">
+                                <a:solidFill>
+                                  <a:srgbClr val="334155"/>
+                                </a:solidFill>
+                                <a:tailEnd type="arrow"/>
+                              </a:ln>
+                            </wps:spPr>
+                            <wps:style>
+                              <a:lnRef idx="2">
+                                <a:schemeClr val="accent1"/>
+                              </a:lnRef>
+                              <a:fillRef idx="0">
+                                <a:schemeClr val="accent1"/>
+                              </a:fillRef>
+                              <a:effectRef idx="1">
+                                <a:schemeClr val="accent1"/>
+                              </a:effectRef>
+                              <a:fontRef idx="minor">
+                                <a:schemeClr val="tx1"/>
+                              </a:fontRef>
+                            </wps:style>
+                            <wps:bodyPr/>
+                          </wps:wsp>
+                        </a:graphicData>
+                      </a:graphic>
+                    </wp:anchor>
+                  </w:drawing>
+                </mc:Choice>
+                <mc:Fallback>
+                  <w:pict>
+                    <v:shapetype w14:anchorId="3A0C5B74" id="_x0000_t32" coordsize="21600,21600" o:spt="32" o:oned="t" path="m,l21600,21600e" filled="f">
+                      <v:path arrowok="t" fillok="f" o:connecttype="none"/>
+                      <o:lock v:ext="edit" shapetype="t"/>
+                    </v:shapetype>
+                    <v:shape id="roadmap_map_arrow_4" o:spid="_x0000_s1026" type="#_x0000_t32" style="position:absolute;margin-left:474.55pt;margin-top:236pt;width:15pt;height:0;z-index:251738112;visibility:visible;mso-wrap-style:square;mso-wrap-distance-left:9pt;mso-wrap-distance-top:0;mso-wrap-distance-right:9pt;mso-wrap-distance-bottom:0;mso-position-horizontal:absolute;mso-position-horizontal-relative:text;mso-position-vertical:absolute;mso-position-vertical-relative:text" o:gfxdata="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" strokecolor="#334155" strokeweight="1.3pt">
+                      <v:stroke endarrow="open" joinstyle="miter"/>
+                    </v:shape>
+                  </w:pict>
+                </mc:Fallback>
+              </mc:AlternateContent>
+            </w:r>
+            <w:r>
+              <w:rPr>
+                <w:b/>
+                <w:bCs/>
+                <w:noProof/>
+                <w:color w:val="FFFFFF"/>
+                <w:sz w:val="34"/>
+                <w:szCs w:val="34"/>
+              </w:rPr>
+              <mc:AlternateContent>
+                <mc:Choice Requires="wps">
+                  <w:drawing>
+                    <wp:anchor distT="0" distB="0" distL="114300" distR="114300" simplePos="0" relativeHeight="251737088" behindDoc="0" locked="0" layoutInCell="1" allowOverlap="1" wp14:anchorId="769EA1BB" wp14:editId="1D4D0CF1">
+                      <wp:simplePos x="0" y="0"/>
+                      <wp:positionH relativeFrom="column">
+                        <wp:posOffset>4566285</wp:posOffset>
+                      </wp:positionH>
+                      <wp:positionV relativeFrom="paragraph">
+                        <wp:posOffset>2997200</wp:posOffset>
+                      </wp:positionV>
+                      <wp:extent cx="190500" cy="0"/>
+                      <wp:effectExtent l="0" t="76200" r="19050" b="114300"/>
+                      <wp:wrapNone/>
+                      <wp:docPr id="722313279" name="roadmap_map_arrow_3"/>
+                      <wp:cNvGraphicFramePr/>
+                      <a:graphic xmlns:a="http://schemas.openxmlformats.org/drawingml/2006/main">
+                        <a:graphicData uri="http://schemas.microsoft.com/office/word/2010/wordprocessingShape">
+                          <wps:wsp>
+                            <wps:cNvCnPr/>
+                            <wps:spPr>
+                              <a:xfrm>
+                                <a:off x="0" y="0"/>
+                                <a:ext cx="190500" cy="0"/>
+                              </a:xfrm>
+                              <a:prstGeom prst="straightConnector1">
+                                <a:avLst/>
+                              </a:prstGeom>
+                              <a:ln w="16510">
+                                <a:solidFill>
+                                  <a:srgbClr val="334155"/>
+                                </a:solidFill>
+                                <a:tailEnd type="arrow"/>
+                              </a:ln>
+                            </wps:spPr>
+                            <wps:style>
+                              <a:lnRef idx="2">
+                                <a:schemeClr val="accent1"/>
+                              </a:lnRef>
+                              <a:fillRef idx="0">
+                                <a:schemeClr val="accent1"/>
+                              </a:fillRef>
+                              <a:effectRef idx="1">
+                                <a:schemeClr val="accent1"/>
+                              </a:effectRef>
+                              <a:fontRef idx="minor">
+                                <a:schemeClr val="tx1"/>
+                              </a:fontRef>
+                            </wps:style>
+                            <wps:bodyPr/>
+                          </wps:wsp>
+                        </a:graphicData>
+                      </a:graphic>
+                    </wp:anchor>
+                  </w:drawing>
+                </mc:Choice>
+                <mc:Fallback>
+                  <w:pict>
+                    <v:shape w14:anchorId="3DFC059E" id="roadmap_map_arrow_3" o:spid="_x0000_s1026" type="#_x0000_t32" style="position:absolute;margin-left:359.55pt;margin-top:236pt;width:15pt;height:0;z-index:251737088;visibility:visible;mso-wrap-style:square;mso-wrap-distance-left:9pt;mso-wrap-distance-top:0;mso-wrap-distance-right:9pt;mso-wrap-distance-bottom:0;mso-position-horizontal:absolute;mso-position-horizontal-relative:text;mso-position-vertical:absolute;mso-position-vertical-relative:text" o:gfxdata="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" strokecolor="#334155" strokeweight="1.3pt">
+                      <v:stroke endarrow="open" joinstyle="miter"/>
+                    </v:shape>
+                  </w:pict>
+                </mc:Fallback>
+              </mc:AlternateContent>
+            </w:r>
+            <w:r>
+              <w:rPr>
+                <w:b/>
+                <w:bCs/>
+                <w:noProof/>
+                <w:color w:val="FFFFFF"/>
+                <w:sz w:val="34"/>
+                <w:szCs w:val="34"/>
+              </w:rPr>
+              <mc:AlternateContent>
+                <mc:Choice Requires="wps">
+                  <w:drawing>
+                    <wp:anchor distT="0" distB="0" distL="114300" distR="114300" simplePos="0" relativeHeight="251736064" behindDoc="0" locked="0" layoutInCell="1" allowOverlap="1" wp14:anchorId="04A9127E" wp14:editId="725E6C9D">
+                      <wp:simplePos x="0" y="0"/>
+                      <wp:positionH relativeFrom="column">
+                        <wp:posOffset>3105785</wp:posOffset>
+                      </wp:positionH>
+                      <wp:positionV relativeFrom="paragraph">
+                        <wp:posOffset>2997200</wp:posOffset>
+                      </wp:positionV>
+                      <wp:extent cx="190500" cy="0"/>
+                      <wp:effectExtent l="0" t="76200" r="19050" b="114300"/>
+                      <wp:wrapNone/>
+                      <wp:docPr id="390497353" name="roadmap_map_arrow_2"/>
+                      <wp:cNvGraphicFramePr/>
+                      <a:graphic xmlns:a="http://schemas.openxmlformats.org/drawingml/2006/main">
+                        <a:graphicData uri="http://schemas.microsoft.com/office/word/2010/wordprocessingShape">
+                          <wps:wsp>
+                            <wps:cNvCnPr/>
+                            <wps:spPr>
+                              <a:xfrm>
+                                <a:off x="0" y="0"/>
+                                <a:ext cx="190500" cy="0"/>
+                              </a:xfrm>
+                              <a:prstGeom prst="straightConnector1">
+                                <a:avLst/>
+                              </a:prstGeom>
+                              <a:ln w="16510">
+                                <a:solidFill>
+                                  <a:srgbClr val="334155"/>
+                                </a:solidFill>
+                                <a:tailEnd type="arrow"/>
+                              </a:ln>
+                            </wps:spPr>
+                            <wps:style>
+                              <a:lnRef idx="2">
+                                <a:schemeClr val="accent1"/>
+                              </a:lnRef>
+                              <a:fillRef idx="0">
+                                <a:schemeClr val="accent1"/>
+                              </a:fillRef>
+                              <a:effectRef idx="1">
+                                <a:schemeClr val="accent1"/>
+                              </a:effectRef>
+                              <a:fontRef idx="minor">
+                                <a:schemeClr val="tx1"/>
+                              </a:fontRef>
+                            </wps:style>
+                            <wps:bodyPr/>
+                          </wps:wsp>
+                        </a:graphicData>
+                      </a:graphic>
+                    </wp:anchor>
+                  </w:drawing>
+                </mc:Choice>
+                <mc:Fallback>
+                  <w:pict>
+                    <v:shape w14:anchorId="23CD88CB" id="roadmap_map_arrow_2" o:spid="_x0000_s1026" type="#_x0000_t32" style="position:absolute;margin-left:244.55pt;margin-top:236pt;width:15pt;height:0;z-index:251736064;visibility:visible;mso-wrap-style:square;mso-wrap-distance-left:9pt;mso-wrap-distance-top:0;mso-wrap-distance-right:9pt;mso-wrap-distance-bottom:0;mso-position-horizontal:absolute;mso-position-horizontal-relative:text;mso-position-vertical:absolute;mso-position-vertical-relative:text" o:gfxdata="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" strokecolor="#334155" strokeweight="1.3pt">
+                      <v:stroke endarrow="open" joinstyle="miter"/>
+                    </v:shape>
+                  </w:pict>
+                </mc:Fallback>
+              </mc:AlternateContent>
+            </w:r>
+            <w:r>
+              <w:rPr>
+                <w:b/>
+                <w:bCs/>
+                <w:noProof/>
+                <w:color w:val="FFFFFF"/>
+                <w:sz w:val="34"/>
+                <w:szCs w:val="34"/>
+              </w:rPr>
+              <mc:AlternateContent>
+                <mc:Choice Requires="wps">
+                  <w:drawing>
+                    <wp:anchor distT="0" distB="0" distL="114300" distR="114300" simplePos="0" relativeHeight="251735040" behindDoc="0" locked="0" layoutInCell="1" allowOverlap="1" wp14:anchorId="15857FD0" wp14:editId="16E352AD">
+                      <wp:simplePos x="0" y="0"/>
+                      <wp:positionH relativeFrom="column">
+                        <wp:posOffset>1645285</wp:posOffset>
+                      </wp:positionH>
+                      <wp:positionV relativeFrom="paragraph">
+                        <wp:posOffset>2997200</wp:posOffset>
+                      </wp:positionV>
+                      <wp:extent cx="190500" cy="0"/>
+                      <wp:effectExtent l="0" t="76200" r="19050" b="114300"/>
+                      <wp:wrapNone/>
+                      <wp:docPr id="394380138" name="roadmap_map_arrow_1"/>
+                      <wp:cNvGraphicFramePr/>
+                      <a:graphic xmlns:a="http://schemas.openxmlformats.org/drawingml/2006/main">
+                        <a:graphicData uri="http://schemas.microsoft.com/office/word/2010/wordprocessingShape">
+                          <wps:wsp>
+                            <wps:cNvCnPr/>
+                            <wps:spPr>
+                              <a:xfrm>
+                                <a:off x="0" y="0"/>
+                                <a:ext cx="190500" cy="0"/>
+                              </a:xfrm>
+                              <a:prstGeom prst="straightConnector1">
+                                <a:avLst/>
+                              </a:prstGeom>
+                              <a:ln w="16510">
+                                <a:solidFill>
+                                  <a:srgbClr val="334155"/>
+                                </a:solidFill>
+                                <a:tailEnd type="arrow"/>
+                              </a:ln>
+                            </wps:spPr>
+                            <wps:style>
+                              <a:lnRef idx="2">
+                                <a:schemeClr val="accent1"/>
+                              </a:lnRef>
+                              <a:fillRef idx="0">
+                                <a:schemeClr val="accent1"/>
+                              </a:fillRef>
+                              <a:effectRef idx="1">
+                                <a:schemeClr val="accent1"/>
+                              </a:effectRef>
+                              <a:fontRef idx="minor">
+                                <a:schemeClr val="tx1"/>
+                              </a:fontRef>
+                            </wps:style>
+                            <wps:bodyPr/>
+                          </wps:wsp>
+                        </a:graphicData>
+                      </a:graphic>
+                    </wp:anchor>
+                  </w:drawing>
+                </mc:Choice>
+                <mc:Fallback>
+                  <w:pict>
+                    <v:shape w14:anchorId="62C0C36F" id="roadmap_map_arrow_1" o:spid="_x0000_s1026" type="#_x0000_t32" style="position:absolute;margin-left:129.55pt;margin-top:236pt;width:15pt;height:0;z-index:251735040;visibility:visible;mso-wrap-style:square;mso-wrap-distance-left:9pt;mso-wrap-distance-top:0;mso-wrap-distance-right:9pt;mso-wrap-distance-bottom:0;mso-position-horizontal:absolute;mso-position-horizontal-relative:text;mso-position-vertical:absolute;mso-position-vertical-relative:text" o:gfxdata="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" strokecolor="#334155" strokeweight="1.3pt">
+                      <v:stroke endarrow="open" joinstyle="miter"/>
+                    </v:shape>
+                  </w:pict>
+                </mc:Fallback>
+              </mc:AlternateContent>
+            </w:r>
+            <w:r>
+              <w:rPr>
+                <w:b/>
+                <w:bCs/>
+                <w:noProof/>
+                <w:color w:val="FFFFFF"/>
+                <w:sz w:val="34"/>
+                <w:szCs w:val="34"/>
+              </w:rPr>
+              <mc:AlternateContent>
+                <mc:Choice Requires="wps">
+                  <w:drawing>
+                    <wp:anchor distT="0" distB="0" distL="114300" distR="114300" simplePos="0" relativeHeight="251728896" behindDoc="0" locked="0" layoutInCell="1" allowOverlap="1" wp14:anchorId="37798CB2" wp14:editId="39D80E39">
+                      <wp:simplePos x="0" y="0"/>
+                      <wp:positionH relativeFrom="column">
+                        <wp:posOffset>4337685</wp:posOffset>
+                      </wp:positionH>
+                      <wp:positionV relativeFrom="paragraph">
+                        <wp:posOffset>5626100</wp:posOffset>
+                      </wp:positionV>
+                      <wp:extent cx="673100" cy="342900"/>
+                      <wp:effectExtent l="38100" t="0" r="31750" b="57150"/>
+                      <wp:wrapNone/>
+                      <wp:docPr id="203127538" name="risk_map_arrow_4"/>
+                      <wp:cNvGraphicFramePr/>
+                      <a:graphic xmlns:a="http://schemas.openxmlformats.org/drawingml/2006/main">
+                        <a:graphicData uri="http://schemas.microsoft.com/office/word/2010/wordprocessingShape">
+                          <wps:wsp>
+                            <wps:cNvCnPr/>
+                            <wps:spPr>
+                              <a:xfrm flipH="1">
+                                <a:off x="0" y="0"/>
+                                <a:ext cx="673100" cy="342900"/>
+                              </a:xfrm>
+                              <a:prstGeom prst="straightConnector1">
+                                <a:avLst/>
+                              </a:prstGeom>
+                              <a:ln w="16510">
+                                <a:solidFill>
+                                  <a:srgbClr val="DC2626"/>
+                                </a:solidFill>
+                                <a:tailEnd type="arrow"/>
+                              </a:ln>
+                            </wps:spPr>
+                            <wps:style>
+                              <a:lnRef idx="2">
+                                <a:schemeClr val="accent1"/>
+                              </a:lnRef>
+                              <a:fillRef idx="0">
+                                <a:schemeClr val="accent1"/>
+                              </a:fillRef>
+                              <a:effectRef idx="1">
+                                <a:schemeClr val="accent1"/>
+                              </a:effectRef>
+                              <a:fontRef idx="minor">
+                                <a:schemeClr val="tx1"/>
+                              </a:fontRef>
+                            </wps:style>
+                            <wps:bodyPr/>
+                          </wps:wsp>
+                        </a:graphicData>
+                      </a:graphic>
+                    </wp:anchor>
+                  </w:drawing>
+                </mc:Choice>
+                <mc:Fallback>
+                  <w:pict>
+                    <v:shape w14:anchorId="67098FEE" id="risk_map_arrow_4" o:spid="_x0000_s1026" type="#_x0000_t32" style="position:absolute;margin-left:341.55pt;margin-top:443pt;width:53pt;height:27pt;flip:x;z-index:251728896;visibility:visible;mso-wrap-style:square;mso-wrap-distance-left:9pt;mso-wrap-distance-top:0;mso-wrap-distance-right:9pt;mso-wrap-distance-bottom:0;mso-position-horizontal:absolute;mso-position-horizontal-relative:text;mso-position-vertical:absolute;mso-position-vertical-relative:text" o:gfxdata="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" strokecolor="#dc2626" strokeweight="1.3pt">
+                      <v:stroke endarrow="open" joinstyle="miter"/>
+                    </v:shape>
+                  </w:pict>
+                </mc:Fallback>
+              </mc:AlternateContent>
+            </w:r>
+            <w:r>
+              <w:rPr>
+                <w:b/>
+                <w:bCs/>
+                <w:noProof/>
+                <w:color w:val="FFFFFF"/>
+                <w:sz w:val="34"/>
+                <w:szCs w:val="34"/>
+              </w:rPr>
+              <mc:AlternateContent>
+                <mc:Choice Requires="wps">
+                  <w:drawing>
+                    <wp:anchor distT="0" distB="0" distL="114300" distR="114300" simplePos="0" relativeHeight="251727872" behindDoc="0" locked="0" layoutInCell="1" allowOverlap="1" wp14:anchorId="2E5076E4" wp14:editId="2A87ADE4">
+                      <wp:simplePos x="0" y="0"/>
+                      <wp:positionH relativeFrom="column">
+                        <wp:posOffset>2407285</wp:posOffset>
+                      </wp:positionH>
+                      <wp:positionV relativeFrom="paragraph">
+                        <wp:posOffset>5626100</wp:posOffset>
+                      </wp:positionV>
+                      <wp:extent cx="635000" cy="342900"/>
+                      <wp:effectExtent l="38100" t="0" r="31750" b="57150"/>
+                      <wp:wrapNone/>
+                      <wp:docPr id="451846492" name="risk_map_arrow_3"/>
+                      <wp:cNvGraphicFramePr/>
+                      <a:graphic xmlns:a="http://schemas.openxmlformats.org/drawingml/2006/main">
+                        <a:graphicData uri="http://schemas.microsoft.com/office/word/2010/wordprocessingShape">
+                          <wps:wsp>
+                            <wps:cNvCnPr/>
+                            <wps:spPr>
+                              <a:xfrm flipH="1">
+                                <a:off x="0" y="0"/>
+                                <a:ext cx="635000" cy="342900"/>
+                              </a:xfrm>
+                              <a:prstGeom prst="straightConnector1">
+                                <a:avLst/>
+                              </a:prstGeom>
+                              <a:ln w="16510">
+                                <a:solidFill>
+                                  <a:srgbClr val="DC2626"/>
+                                </a:solidFill>
+                                <a:tailEnd type="arrow"/>
+                              </a:ln>
+                            </wps:spPr>
+                            <wps:style>
+                              <a:lnRef idx="2">
+                                <a:schemeClr val="accent1"/>
+                              </a:lnRef>
+                              <a:fillRef idx="0">
+                                <a:schemeClr val="accent1"/>
+                              </a:fillRef>
+                              <a:effectRef idx="1">
+                                <a:schemeClr val="accent1"/>
+                              </a:effectRef>
+                              <a:fontRef idx="minor">
+                                <a:schemeClr val="tx1"/>
+                              </a:fontRef>
+                            </wps:style>
+                            <wps:bodyPr/>
+                          </wps:wsp>
+                        </a:graphicData>
+                      </a:graphic>
+                    </wp:anchor>
+                  </w:drawing>
+                </mc:Choice>
+                <mc:Fallback>
+                  <w:pict>
+                    <v:shape w14:anchorId="371151E2" id="risk_map_arrow_3" o:spid="_x0000_s1026" type="#_x0000_t32" style="position:absolute;margin-left:189.55pt;margin-top:443pt;width:50pt;height:27pt;flip:x;z-index:251727872;visibility:visible;mso-wrap-style:square;mso-wrap-distance-left:9pt;mso-wrap-distance-top:0;mso-wrap-distance-right:9pt;mso-wrap-distance-bottom:0;mso-position-horizontal:absolute;mso-position-horizontal-relative:text;mso-position-vertical:absolute;mso-position-vertical-relative:text" o:gfxdata="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" strokecolor="#dc2626" strokeweight="1.3pt">
+                      <v:stroke endarrow="open" joinstyle="miter"/>
+                    </v:shape>
+                  </w:pict>
+                </mc:Fallback>
+              </mc:AlternateContent>
+            </w:r>
+            <w:r>
+              <w:rPr>
+                <w:b/>
+                <w:bCs/>
+                <w:noProof/>
+                <w:color w:val="FFFFFF"/>
+                <w:sz w:val="34"/>
+                <w:szCs w:val="34"/>
+              </w:rPr>
+              <mc:AlternateContent>
+                <mc:Choice Requires="wps">
+                  <w:drawing>
+                    <wp:anchor distT="0" distB="0" distL="114300" distR="114300" simplePos="0" relativeHeight="251726848" behindDoc="0" locked="0" layoutInCell="1" allowOverlap="1" wp14:anchorId="6D59912F" wp14:editId="5483141B">
+                      <wp:simplePos x="0" y="0"/>
+                      <wp:positionH relativeFrom="column">
+                        <wp:posOffset>5010785</wp:posOffset>
+                      </wp:positionH>
+                      <wp:positionV relativeFrom="paragraph">
+                        <wp:posOffset>5194300</wp:posOffset>
+                      </wp:positionV>
+                      <wp:extent cx="635000" cy="0"/>
+                      <wp:effectExtent l="0" t="76200" r="12700" b="114300"/>
+                      <wp:wrapNone/>
+                      <wp:docPr id="220708263" name="risk_map_arrow_2"/>
+                      <wp:cNvGraphicFramePr/>
+                      <a:graphic xmlns:a="http://schemas.openxmlformats.org/drawingml/2006/main">
+                        <a:graphicData uri="http://schemas.microsoft.com/office/word/2010/wordprocessingShape">
+                          <wps:wsp>
+                            <wps:cNvCnPr/>
+                            <wps:spPr>
+                              <a:xfrm>
+                                <a:off x="0" y="0"/>
+                                <a:ext cx="635000" cy="0"/>
+                              </a:xfrm>
+                              <a:prstGeom prst="straightConnector1">
+                                <a:avLst/>
+                              </a:prstGeom>
+                              <a:ln w="16510">
+                                <a:solidFill>
+                                  <a:srgbClr val="DC2626"/>
+                                </a:solidFill>
+                                <a:tailEnd type="arrow"/>
+                              </a:ln>
+                            </wps:spPr>
+                            <wps:style>
+                              <a:lnRef idx="2">
+                                <a:schemeClr val="accent1"/>
+                              </a:lnRef>
+                              <a:fillRef idx="0">
+                                <a:schemeClr val="accent1"/>
+                              </a:fillRef>
+                              <a:effectRef idx="1">
+                                <a:schemeClr val="accent1"/>
+                              </a:effectRef>
+                              <a:fontRef idx="minor">
+                                <a:schemeClr val="tx1"/>
+                              </a:fontRef>
+                            </wps:style>
+                            <wps:bodyPr/>
+                          </wps:wsp>
+                        </a:graphicData>
+                      </a:graphic>
+                    </wp:anchor>
+                  </w:drawing>
+                </mc:Choice>
+                <mc:Fallback>
+                  <w:pict>
+                    <v:shape w14:anchorId="566A48D2" id="risk_map_arrow_2" o:spid="_x0000_s1026" type="#_x0000_t32" style="position:absolute;margin-left:394.55pt;margin-top:409pt;width:50pt;height:0;z-index:251726848;visibility:visible;mso-wrap-style:square;mso-wrap-distance-left:9pt;mso-wrap-distance-top:0;mso-wrap-distance-right:9pt;mso-wrap-distance-bottom:0;mso-position-horizontal:absolute;mso-position-horizontal-relative:text;mso-position-vertical:absolute;mso-position-vertical-relative:text" o:gfxdata="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" strokecolor="#dc2626" strokeweight="1.3pt">
+                      <v:stroke endarrow="open" joinstyle="miter"/>
+                    </v:shape>
+                  </w:pict>
+                </mc:Fallback>
+              </mc:AlternateContent>
+            </w:r>
+            <w:r>
+              <w:rPr>
+                <w:b/>
+                <w:bCs/>
+                <w:noProof/>
+                <w:color w:val="FFFFFF"/>
+                <w:sz w:val="34"/>
+                <w:szCs w:val="34"/>
+              </w:rPr>
+              <mc:AlternateContent>
+                <mc:Choice Requires="wps">
+                  <w:drawing>
+                    <wp:anchor distT="0" distB="0" distL="114300" distR="114300" simplePos="0" relativeHeight="251725824" behindDoc="0" locked="0" layoutInCell="1" allowOverlap="1" wp14:anchorId="174141FF" wp14:editId="064742E9">
+                      <wp:simplePos x="0" y="0"/>
+                      <wp:positionH relativeFrom="column">
+                        <wp:posOffset>2407285</wp:posOffset>
+                      </wp:positionH>
+                      <wp:positionV relativeFrom="paragraph">
+                        <wp:posOffset>5194300</wp:posOffset>
+                      </wp:positionV>
+                      <wp:extent cx="635000" cy="0"/>
+                      <wp:effectExtent l="0" t="76200" r="12700" b="114300"/>
+                      <wp:wrapNone/>
+                      <wp:docPr id="720348420" name="risk_map_arrow_1"/>
+                      <wp:cNvGraphicFramePr/>
+                      <a:graphic xmlns:a="http://schemas.openxmlformats.org/drawingml/2006/main">
+                        <a:graphicData uri="http://schemas.microsoft.com/office/word/2010/wordprocessingShape">
+                          <wps:wsp>
+                            <wps:cNvCnPr/>
+                            <wps:spPr>
+                              <a:xfrm>
+                                <a:off x="0" y="0"/>
+                                <a:ext cx="635000" cy="0"/>
+                              </a:xfrm>
+                              <a:prstGeom prst="straightConnector1">
+                                <a:avLst/>
+                              </a:prstGeom>
+                              <a:ln w="16510">
+                                <a:solidFill>
+                                  <a:srgbClr val="DC2626"/>
+                                </a:solidFill>
+                                <a:tailEnd type="arrow"/>
+                              </a:ln>
+                            </wps:spPr>
+                            <wps:style>
+                              <a:lnRef idx="2">
+                                <a:schemeClr val="accent1"/>
+                              </a:lnRef>
+                              <a:fillRef idx="0">
+                                <a:schemeClr val="accent1"/>
+                              </a:fillRef>
+                              <a:effectRef idx="1">
+                                <a:schemeClr val="accent1"/>
+                              </a:effectRef>
+                              <a:fontRef idx="minor">
+                                <a:schemeClr val="tx1"/>
+                              </a:fontRef>
+                            </wps:style>
+                            <wps:bodyPr/>
+                          </wps:wsp>
+                        </a:graphicData>
+                      </a:graphic>
+                    </wp:anchor>
+                  </w:drawing>
+                </mc:Choice>
+                <mc:Fallback>
+                  <w:pict>
+                    <v:shape w14:anchorId="5E49722A" id="risk_map_arrow_1" o:spid="_x0000_s1026" type="#_x0000_t32" style="position:absolute;margin-left:189.55pt;margin-top:409pt;width:50pt;height:0;z-index:251725824;visibility:visible;mso-wrap-style:square;mso-wrap-distance-left:9pt;mso-wrap-distance-top:0;mso-wrap-distance-right:9pt;mso-wrap-distance-bottom:0;mso-position-horizontal:absolute;mso-position-horizontal-relative:text;mso-position-vertical:absolute;mso-position-vertical-relative:text" o:gfxdata="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" strokecolor="#dc2626" strokeweight="1.3pt">
+                      <v:stroke endarrow="open" joinstyle="miter"/>
+                    </v:shape>
+                  </w:pict>
+                </mc:Fallback>
+              </mc:AlternateContent>
+            </w:r>
+            <w:r>
+              <w:rPr>
+                <w:b/>
+                <w:bCs/>
+                <w:noProof/>
+                <w:color w:val="FFFFFF"/>
+                <w:sz w:val="34"/>
+                <w:szCs w:val="34"/>
+              </w:rPr>
+              <mc:AlternateContent>
+                <mc:Choice Requires="wps">
+                  <w:drawing>
+                    <wp:anchor distT="0" distB="0" distL="114300" distR="114300" simplePos="0" relativeHeight="251719680" behindDoc="0" locked="0" layoutInCell="1" allowOverlap="1" wp14:anchorId="7A5C0158" wp14:editId="5CDC437C">
+                      <wp:simplePos x="0" y="0"/>
+                      <wp:positionH relativeFrom="column">
+                        <wp:posOffset>6026785</wp:posOffset>
+                      </wp:positionH>
+                      <wp:positionV relativeFrom="paragraph">
+                        <wp:posOffset>2743200</wp:posOffset>
+                      </wp:positionV>
+                      <wp:extent cx="0" cy="368300"/>
+                      <wp:effectExtent l="95250" t="0" r="95250" b="50800"/>
+                      <wp:wrapNone/>
+                      <wp:docPr id="766797638" name="gap_map_arrow_5"/>
+                      <wp:cNvGraphicFramePr/>
+                      <a:graphic xmlns:a="http://schemas.openxmlformats.org/drawingml/2006/main">
+                        <a:graphicData uri="http://schemas.microsoft.com/office/word/2010/wordprocessingShape">
+                          <wps:wsp>
+                            <wps:cNvCnPr/>
+                            <wps:spPr>
+                              <a:xfrm>
+                                <a:off x="0" y="0"/>
+                                <a:ext cx="0" cy="368300"/>
+                              </a:xfrm>
+                              <a:prstGeom prst="straightConnector1">
+                                <a:avLst/>
+                              </a:prstGeom>
+                              <a:ln w="16510">
+                                <a:solidFill>
+                                  <a:srgbClr val="DC2626"/>
+                                </a:solidFill>
+                                <a:tailEnd type="arrow"/>
+                              </a:ln>
+                            </wps:spPr>
+                            <wps:style>
+                              <a:lnRef idx="2">
+                                <a:schemeClr val="accent1"/>
+                              </a:lnRef>
+                              <a:fillRef idx="0">
+                                <a:schemeClr val="accent1"/>
+                              </a:fillRef>
+                              <a:effectRef idx="1">
+                                <a:schemeClr val="accent1"/>
+                              </a:effectRef>
+                              <a:fontRef idx="minor">
+                                <a:schemeClr val="tx1"/>
+                              </a:fontRef>
+                            </wps:style>
+                            <wps:bodyPr/>
+                          </wps:wsp>
+                        </a:graphicData>
+                      </a:graphic>
+                    </wp:anchor>
+                  </w:drawing>
+                </mc:Choice>
+                <mc:Fallback>
+                  <w:pict>
+                    <v:shape w14:anchorId="39A7982D" id="gap_map_arrow_5" o:spid="_x0000_s1026" type="#_x0000_t32" style="position:absolute;margin-left:474.55pt;margin-top:3in;width:0;height:29pt;z-index:251719680;visibility:visible;mso-wrap-style:square;mso-wrap-distance-left:9pt;mso-wrap-distance-top:0;mso-wrap-distance-right:9pt;mso-wrap-distance-bottom:0;mso-position-horizontal:absolute;mso-position-horizontal-relative:text;mso-position-vertical:absolute;mso-position-vertical-relative:text" o:gfxdata="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" strokecolor="#dc2626" strokeweight="1.3pt">
+                      <v:stroke endarrow="open" joinstyle="miter"/>
+                    </v:shape>
+                  </w:pict>
+                </mc:Fallback>
+              </mc:AlternateContent>
+            </w:r>
+            <w:r>
+              <w:rPr>
+                <w:b/>
+                <w:bCs/>
+                <w:noProof/>
+                <w:color w:val="FFFFFF"/>
+                <w:sz w:val="34"/>
+                <w:szCs w:val="34"/>
+              </w:rPr>
+              <mc:AlternateContent>
+                <mc:Choice Requires="wps">
+                  <w:drawing>
+                    <wp:anchor distT="0" distB="0" distL="114300" distR="114300" simplePos="0" relativeHeight="251718656" behindDoc="0" locked="0" layoutInCell="1" allowOverlap="1" wp14:anchorId="507AEAF7" wp14:editId="41307E45">
+                      <wp:simplePos x="0" y="0"/>
+                      <wp:positionH relativeFrom="column">
+                        <wp:posOffset>3677285</wp:posOffset>
+                      </wp:positionH>
+                      <wp:positionV relativeFrom="paragraph">
+                        <wp:posOffset>2743200</wp:posOffset>
+                      </wp:positionV>
+                      <wp:extent cx="0" cy="368300"/>
+                      <wp:effectExtent l="95250" t="0" r="95250" b="50800"/>
+                      <wp:wrapNone/>
+                      <wp:docPr id="1083795958" name="gap_map_arrow_4"/>
+                      <wp:cNvGraphicFramePr/>
+                      <a:graphic xmlns:a="http://schemas.openxmlformats.org/drawingml/2006/main">
+                        <a:graphicData uri="http://schemas.microsoft.com/office/word/2010/wordprocessingShape">
+                          <wps:wsp>
+                            <wps:cNvCnPr/>
+                            <wps:spPr>
+                              <a:xfrm>
+                                <a:off x="0" y="0"/>
+                                <a:ext cx="0" cy="368300"/>
+                              </a:xfrm>
+                              <a:prstGeom prst="straightConnector1">
+                                <a:avLst/>
+                              </a:prstGeom>
+                              <a:ln w="16510">
+                                <a:solidFill>
+                                  <a:srgbClr val="DC2626"/>
+                                </a:solidFill>
+                                <a:tailEnd type="arrow"/>
+                              </a:ln>
+                            </wps:spPr>
+                            <wps:style>
+                              <a:lnRef idx="2">
+                                <a:schemeClr val="accent1"/>
+                              </a:lnRef>
+                              <a:fillRef idx="0">
+                                <a:schemeClr val="accent1"/>
+                              </a:fillRef>
+                              <a:effectRef idx="1">
+                                <a:schemeClr val="accent1"/>
+                              </a:effectRef>
+                              <a:fontRef idx="minor">
+                                <a:schemeClr val="tx1"/>
+                              </a:fontRef>
+                            </wps:style>
+                            <wps:bodyPr/>
+                          </wps:wsp>
+                        </a:graphicData>
+                      </a:graphic>
+                    </wp:anchor>
+                  </w:drawing>
+                </mc:Choice>
+                <mc:Fallback>
+                  <w:pict>
+                    <v:shape w14:anchorId="3C93BDD4" id="gap_map_arrow_4" o:spid="_x0000_s1026" type="#_x0000_t32" style="position:absolute;margin-left:289.55pt;margin-top:3in;width:0;height:29pt;z-index:251718656;visibility:visible;mso-wrap-style:square;mso-wrap-distance-left:9pt;mso-wrap-distance-top:0;mso-wrap-distance-right:9pt;mso-wrap-distance-bottom:0;mso-position-horizontal:absolute;mso-position-horizontal-relative:text;mso-position-vertical:absolute;mso-position-vertical-relative:text" o:gfxdata="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" strokecolor="#dc2626" strokeweight="1.3pt">
+                      <v:stroke endarrow="open" joinstyle="miter"/>
+                    </v:shape>
+                  </w:pict>
+                </mc:Fallback>
+              </mc:AlternateContent>
+            </w:r>
+            <w:r>
+              <w:rPr>
+                <w:b/>
+                <w:bCs/>
+                <w:noProof/>
+                <w:color w:val="FFFFFF"/>
+                <w:sz w:val="34"/>
+                <w:szCs w:val="34"/>
+              </w:rPr>
+              <mc:AlternateContent>
+                <mc:Choice Requires="wps">
+                  <w:drawing>
+                    <wp:anchor distT="0" distB="0" distL="114300" distR="114300" simplePos="0" relativeHeight="251717632" behindDoc="0" locked="0" layoutInCell="1" allowOverlap="1" wp14:anchorId="73A65F6E" wp14:editId="51C02A63">
+                      <wp:simplePos x="0" y="0"/>
+                      <wp:positionH relativeFrom="column">
+                        <wp:posOffset>1327785</wp:posOffset>
+                      </wp:positionH>
+                      <wp:positionV relativeFrom="paragraph">
+                        <wp:posOffset>2743200</wp:posOffset>
+                      </wp:positionV>
+                      <wp:extent cx="0" cy="368300"/>
+                      <wp:effectExtent l="95250" t="0" r="95250" b="50800"/>
+                      <wp:wrapNone/>
+                      <wp:docPr id="2128903047" name="gap_map_arrow_3"/>
+                      <wp:cNvGraphicFramePr/>
+                      <a:graphic xmlns:a="http://schemas.openxmlformats.org/drawingml/2006/main">
+                        <a:graphicData uri="http://schemas.microsoft.com/office/word/2010/wordprocessingShape">
+                          <wps:wsp>
+                            <wps:cNvCnPr/>
+                            <wps:spPr>
+                              <a:xfrm>
+                                <a:off x="0" y="0"/>
+                                <a:ext cx="0" cy="368300"/>
+                              </a:xfrm>
+                              <a:prstGeom prst="straightConnector1">
+                                <a:avLst/>
+                              </a:prstGeom>
+                              <a:ln w="16510">
+                                <a:solidFill>
+                                  <a:srgbClr val="DC2626"/>
+                                </a:solidFill>
+                                <a:tailEnd type="arrow"/>
+                              </a:ln>
+                            </wps:spPr>
+                            <wps:style>
+                              <a:lnRef idx="2">
+                                <a:schemeClr val="accent1"/>
+                              </a:lnRef>
+                              <a:fillRef idx="0">
+                                <a:schemeClr val="accent1"/>
+                              </a:fillRef>
+                              <a:effectRef idx="1">
+                                <a:schemeClr val="accent1"/>
+                              </a:effectRef>
+                              <a:fontRef idx="minor">
+                                <a:schemeClr val="tx1"/>
+                              </a:fontRef>
+                            </wps:style>
+                            <wps:bodyPr/>
+                          </wps:wsp>
+                        </a:graphicData>
+                      </a:graphic>
+                    </wp:anchor>
+                  </w:drawing>
+                </mc:Choice>
+                <mc:Fallback>
+                  <w:pict>
+                    <v:shape w14:anchorId="1C585828" id="gap_map_arrow_3" o:spid="_x0000_s1026" type="#_x0000_t32" style="position:absolute;margin-left:104.55pt;margin-top:3in;width:0;height:29pt;z-index:251717632;visibility:visible;mso-wrap-style:square;mso-wrap-distance-left:9pt;mso-wrap-distance-top:0;mso-wrap-distance-right:9pt;mso-wrap-distance-bottom:0;mso-position-horizontal:absolute;mso-position-horizontal-relative:text;mso-position-vertical:absolute;mso-position-vertical-relative:text" o:gfxdata="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" strokecolor="#dc2626" strokeweight="1.3pt">
+                      <v:stroke endarrow="open" joinstyle="miter"/>
+                    </v:shape>
+                  </w:pict>
+                </mc:Fallback>
+              </mc:AlternateContent>
+            </w:r>
+            <w:r>
+              <w:rPr>
+                <w:b/>
+                <w:bCs/>
+                <w:noProof/>
+                <w:color w:val="FFFFFF"/>
+                <w:sz w:val="34"/>
+                <w:szCs w:val="34"/>
+              </w:rPr>
+              <mc:AlternateContent>
+                <mc:Choice Requires="wps">
+                  <w:drawing>
+                    <wp:anchor distT="0" distB="0" distL="114300" distR="114300" simplePos="0" relativeHeight="251716608" behindDoc="0" locked="0" layoutInCell="1" allowOverlap="1" wp14:anchorId="15615594" wp14:editId="453970AA">
+                      <wp:simplePos x="0" y="0"/>
+                      <wp:positionH relativeFrom="column">
+                        <wp:posOffset>4629785</wp:posOffset>
+                      </wp:positionH>
+                      <wp:positionV relativeFrom="paragraph">
+                        <wp:posOffset>2324100</wp:posOffset>
+                      </wp:positionV>
+                      <wp:extent cx="444500" cy="0"/>
+                      <wp:effectExtent l="0" t="76200" r="12700" b="114300"/>
+                      <wp:wrapNone/>
+                      <wp:docPr id="279692676" name="gap_map_arrow_2"/>
+                      <wp:cNvGraphicFramePr/>
+                      <a:graphic xmlns:a="http://schemas.openxmlformats.org/drawingml/2006/main">
+                        <a:graphicData uri="http://schemas.microsoft.com/office/word/2010/wordprocessingShape">
+                          <wps:wsp>
+                            <wps:cNvCnPr/>
+                            <wps:spPr>
+                              <a:xfrm>
+                                <a:off x="0" y="0"/>
+                                <a:ext cx="444500" cy="0"/>
+                              </a:xfrm>
+                              <a:prstGeom prst="straightConnector1">
+                                <a:avLst/>
+                              </a:prstGeom>
+                              <a:ln w="16510">
+                                <a:solidFill>
+                                  <a:srgbClr val="D97706"/>
+                                </a:solidFill>
+                                <a:tailEnd type="arrow"/>
+                              </a:ln>
+                            </wps:spPr>
+                            <wps:style>
+                              <a:lnRef idx="2">
+                                <a:schemeClr val="accent1"/>
+                              </a:lnRef>
+                              <a:fillRef idx="0">
+                                <a:schemeClr val="accent1"/>
+                              </a:fillRef>
+                              <a:effectRef idx="1">
+                                <a:schemeClr val="accent1"/>
+                              </a:effectRef>
+                              <a:fontRef idx="minor">
+                                <a:schemeClr val="tx1"/>
+                              </a:fontRef>
+                            </wps:style>
+                            <wps:bodyPr/>
+                          </wps:wsp>
+                        </a:graphicData>
+                      </a:graphic>
+                    </wp:anchor>
+                  </w:drawing>
+                </mc:Choice>
+                <mc:Fallback>
+                  <w:pict>
+                    <v:shape w14:anchorId="3331E9AC" id="gap_map_arrow_2" o:spid="_x0000_s1026" type="#_x0000_t32" style="position:absolute;margin-left:364.55pt;margin-top:183pt;width:35pt;height:0;z-index:251716608;visibility:visible;mso-wrap-style:square;mso-wrap-distance-left:9pt;mso-wrap-distance-top:0;mso-wrap-distance-right:9pt;mso-wrap-distance-bottom:0;mso-position-horizontal:absolute;mso-position-horizontal-relative:text;mso-position-vertical:absolute;mso-position-vertical-relative:text" o:gfxdata="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" strokecolor="#d97706" strokeweight="1.3pt">
+                      <v:stroke endarrow="open" joinstyle="miter"/>
+                    </v:shape>
+                  </w:pict>
+                </mc:Fallback>
+              </mc:AlternateContent>
+            </w:r>
+            <w:r>
+              <w:rPr>
+                <w:b/>
+                <w:bCs/>
+                <w:noProof/>
+                <w:color w:val="FFFFFF"/>
+                <w:sz w:val="34"/>
+                <w:szCs w:val="34"/>
+              </w:rPr>
+              <mc:AlternateContent>
+                <mc:Choice Requires="wps">
+                  <w:drawing>
+                    <wp:anchor distT="0" distB="0" distL="114300" distR="114300" simplePos="0" relativeHeight="251715584" behindDoc="0" locked="0" layoutInCell="1" allowOverlap="1" wp14:anchorId="53FF7DC1" wp14:editId="5C9DDF1A">
+                      <wp:simplePos x="0" y="0"/>
+                      <wp:positionH relativeFrom="column">
+                        <wp:posOffset>2280285</wp:posOffset>
+                      </wp:positionH>
+                      <wp:positionV relativeFrom="paragraph">
+                        <wp:posOffset>2324100</wp:posOffset>
+                      </wp:positionV>
+                      <wp:extent cx="444500" cy="0"/>
+                      <wp:effectExtent l="0" t="76200" r="12700" b="114300"/>
+                      <wp:wrapNone/>
+                      <wp:docPr id="1441967534" name="gap_map_arrow_1"/>
+                      <wp:cNvGraphicFramePr/>
+                      <a:graphic xmlns:a="http://schemas.openxmlformats.org/drawingml/2006/main">
+                        <a:graphicData uri="http://schemas.microsoft.com/office/word/2010/wordprocessingShape">
+                          <wps:wsp>
+                            <wps:cNvCnPr/>
+                            <wps:spPr>
+                              <a:xfrm>
+                                <a:off x="0" y="0"/>
+                                <a:ext cx="444500" cy="0"/>
+                              </a:xfrm>
+                              <a:prstGeom prst="straightConnector1">
+                                <a:avLst/>
+                              </a:prstGeom>
+                              <a:ln w="16510">
+                                <a:solidFill>
+                                  <a:srgbClr val="D97706"/>
+                                </a:solidFill>
+                                <a:tailEnd type="arrow"/>
+                              </a:ln>
+                            </wps:spPr>
+                            <wps:style>
+                              <a:lnRef idx="2">
+                                <a:schemeClr val="accent1"/>
+                              </a:lnRef>
+                              <a:fillRef idx="0">
+                                <a:schemeClr val="accent1"/>
+                              </a:fillRef>
+                              <a:effectRef idx="1">
+                                <a:schemeClr val="accent1"/>
+                              </a:effectRef>
+                              <a:fontRef idx="minor">
+                                <a:schemeClr val="tx1"/>
+                              </a:fontRef>
+                            </wps:style>
+                            <wps:bodyPr/>
+                          </wps:wsp>
+                        </a:graphicData>
+                      </a:graphic>
+                    </wp:anchor>
+                  </w:drawing>
+                </mc:Choice>
+                <mc:Fallback>
+                  <w:pict>
+                    <v:shape w14:anchorId="6051E82E" id="gap_map_arrow_1" o:spid="_x0000_s1026" type="#_x0000_t32" style="position:absolute;margin-left:179.55pt;margin-top:183pt;width:35pt;height:0;z-index:251715584;visibility:visible;mso-wrap-style:square;mso-wrap-distance-left:9pt;mso-wrap-distance-top:0;mso-wrap-distance-right:9pt;mso-wrap-distance-bottom:0;mso-position-horizontal:absolute;mso-position-horizontal-relative:text;mso-position-vertical:absolute;mso-position-vertical-relative:text" o:gfxdata="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" strokecolor="#d97706" strokeweight="1.3pt">
+                      <v:stroke endarrow="open" joinstyle="miter"/>
+                    </v:shape>
+                  </w:pict>
+                </mc:Fallback>
+              </mc:AlternateContent>
+            </w:r>
             <w:r>
               <w:rPr>
                 <w:b/>
@@ -5847,6 +6813,7 @@
                 <w:bCs/>
                 <w:color w:val="FFFFFF"/>
               </w:rPr>
+              <w:lastRenderedPageBreak/>
               <w:t>03</w:t>
             </w:r>
           </w:p>
@@ -5934,6 +6901,1050 @@
       </w:pPr>
       <w:r>
         <w:t>Mapa de gaps</w:t>
+      </w:r>
+    </w:p>
+    <w:p>
+      <w:pPr>
+        <w:pStyle w:val="Ttulo2"/>
+        <w:spacing w:before="0" w:after="120"/>
+      </w:pPr>
+    </w:p>
+    <w:p>
+      <w:pPr>
+        <w:pStyle w:val="Ttulo2"/>
+        <w:spacing w:before="0" w:after="120"/>
+      </w:pPr>
+    </w:p>
+    <w:p>
+      <w:pPr>
+        <w:pStyle w:val="Ttulo2"/>
+        <w:spacing w:before="0" w:after="120"/>
+      </w:pPr>
+    </w:p>
+    <w:p>
+      <w:pPr>
+        <w:pStyle w:val="Ttulo2"/>
+        <w:spacing w:before="0" w:after="120"/>
+      </w:pPr>
+    </w:p>
+    <w:p>
+      <w:pPr>
+        <w:pStyle w:val="Ttulo2"/>
+        <w:spacing w:before="0" w:after="120"/>
+      </w:pPr>
+    </w:p>
+    <w:p>
+      <w:pPr>
+        <w:pStyle w:val="Ttulo2"/>
+        <w:spacing w:before="0" w:after="120"/>
+      </w:pPr>
+    </w:p>
+    <w:p>
+      <w:pPr>
+        <w:pStyle w:val="Ttulo2"/>
+        <w:spacing w:before="0" w:after="120"/>
+      </w:pPr>
+    </w:p>
+    <w:p>
+      <w:pPr>
+        <w:pStyle w:val="Ttulo2"/>
+        <w:spacing w:before="0" w:after="120"/>
+      </w:pPr>
+    </w:p>
+    <w:p>
+      <w:pPr>
+        <w:pStyle w:val="Ttulo2"/>
+        <w:spacing w:before="0" w:after="120"/>
+      </w:pPr>
+    </w:p>
+    <w:p>
+      <w:pPr>
+        <w:pStyle w:val="Ttulo2"/>
+        <w:spacing w:before="0" w:after="120"/>
+      </w:pPr>
+    </w:p>
+    <w:p>
+      <w:pPr>
+        <w:pStyle w:val="Ttulo2"/>
+        <w:spacing w:before="0" w:after="120"/>
+      </w:pPr>
+    </w:p>
+    <w:p>
+      <w:pPr>
+        <w:pStyle w:val="Ttulo2"/>
+        <w:spacing w:before="0" w:after="120"/>
+      </w:pPr>
+      <w:r>
+        <w:rPr>
+          <w:noProof/>
+        </w:rPr>
+        <mc:AlternateContent>
+          <mc:Choice Requires="wps">
+            <w:drawing>
+              <wp:anchor distT="0" distB="0" distL="114300" distR="114300" simplePos="0" relativeHeight="251714560" behindDoc="0" locked="0" layoutInCell="1" allowOverlap="1" wp14:anchorId="4620713E" wp14:editId="5639BB4C">
+                <wp:simplePos x="0" y="0"/>
+                <wp:positionH relativeFrom="column">
+                  <wp:posOffset>4749800</wp:posOffset>
+                </wp:positionH>
+                <wp:positionV relativeFrom="paragraph">
+                  <wp:posOffset>-1306195</wp:posOffset>
+                </wp:positionV>
+                <wp:extent cx="1905000" cy="838200"/>
+                <wp:effectExtent l="0" t="0" r="19050" b="19050"/>
+                <wp:wrapNone/>
+                <wp:docPr id="1270503357" name="gap_map_box_6"/>
+                <wp:cNvGraphicFramePr/>
+                <a:graphic xmlns:a="http://schemas.openxmlformats.org/drawingml/2006/main">
+                  <a:graphicData uri="http://schemas.microsoft.com/office/word/2010/wordprocessingShape">
+                    <wps:wsp>
+                      <wps:cNvSpPr/>
+                      <wps:spPr>
+                        <a:xfrm>
+                          <a:off x="0" y="0"/>
+                          <a:ext cx="1905000" cy="838200"/>
+                        </a:xfrm>
+                        <a:prstGeom prst="roundRect">
+                          <a:avLst/>
+                        </a:prstGeom>
+                        <a:solidFill>
+                          <a:srgbClr val="FEF2F2"/>
+                        </a:solidFill>
+                        <a:ln w="17780">
+                          <a:solidFill>
+                            <a:srgbClr val="DC2626"/>
+                          </a:solidFill>
+                        </a:ln>
+                      </wps:spPr>
+                      <wps:style>
+                        <a:lnRef idx="2">
+                          <a:schemeClr val="accent1">
+                            <a:shade val="15000"/>
+                          </a:schemeClr>
+                        </a:lnRef>
+                        <a:fillRef idx="1">
+                          <a:schemeClr val="accent1"/>
+                        </a:fillRef>
+                        <a:effectRef idx="0">
+                          <a:schemeClr val="accent1"/>
+                        </a:effectRef>
+                        <a:fontRef idx="minor">
+                          <a:schemeClr val="lt1"/>
+                        </a:fontRef>
+                      </wps:style>
+                      <wps:txbx>
+                        <w:txbxContent>
+                          <w:p>
+                            <w:pPr>
+                              <w:jc w:val="center"/>
+                              <w:rPr>
+                                <w:rFonts w:ascii="Aptos" w:hAnsi="Aptos"/>
+                                <w:b/>
+                                <w:color w:val="1F2937"/>
+                                <w:sz w:val="18"/>
+                              </w:rPr>
+                            </w:pPr>
+                            <w:r>
+                              <w:rPr>
+                                <w:rFonts w:ascii="Aptos" w:hAnsi="Aptos"/>
+                                <w:b/>
+                                <w:color w:val="1F2937"/>
+                                <w:sz w:val="18"/>
+                              </w:rPr>
+                              <w:t>{gap_shape_6_title}</w:t>
+                            </w:r>
+                          </w:p>
+                          <w:p>
+                            <w:pPr>
+                              <w:jc w:val="center"/>
+                              <w:rPr>
+                                <w:rFonts w:ascii="Aptos" w:hAnsi="Aptos"/>
+                                <w:color w:val="1F2937"/>
+                                <w:sz w:val="16"/>
+                              </w:rPr>
+                            </w:pPr>
+                            <w:r>
+                              <w:rPr>
+                                <w:rFonts w:ascii="Aptos" w:hAnsi="Aptos"/>
+                                <w:color w:val="1F2937"/>
+                                <w:sz w:val="16"/>
+                              </w:rPr>
+                              <w:t>{gap_shape_6_body}</w:t>
+                            </w:r>
+                          </w:p>
+                        </w:txbxContent>
+                      </wps:txbx>
+                      <wps:bodyPr rot="0" spcFirstLastPara="0" vertOverflow="overflow" horzOverflow="overflow" vert="horz" wrap="square" lIns="88900" tIns="63500" rIns="88900" bIns="63500" numCol="1" spcCol="0" rtlCol="0" fromWordArt="0" anchor="ctr" anchorCtr="0" forceAA="0" compatLnSpc="1">
+                        <a:prstTxWarp prst="textNoShape">
+                          <a:avLst/>
+                        </a:prstTxWarp>
+                        <a:noAutofit/>
+                      </wps:bodyPr>
+                    </wps:wsp>
+                  </a:graphicData>
+                </a:graphic>
+              </wp:anchor>
+            </w:drawing>
+          </mc:Choice>
+          <mc:Fallback>
+            <w:pict>
+              <v:roundrect w14:anchorId="4620713E" id="gap_map_box_6" o:spid="_x0000_s1040" style="position:absolute;margin-left:374pt;margin-top:-102.85pt;width:150pt;height:66pt;z-index:251714560;visibility:visible;mso-wrap-style:square;mso-wrap-distance-left:9pt;mso-wrap-distance-top:0;mso-wrap-distance-right:9pt;mso-wrap-distance-bottom:0;mso-position-horizontal:absolute;mso-position-horizontal-relative:text;mso-position-vertical:absolute;mso-position-vertical-relative:text;v-text-anchor:middle" arcsize="10923f" o:gfxdata="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" fillcolor="#fef2f2" strokecolor="#dc2626" strokeweight="1.4pt">
+                <v:stroke joinstyle="miter"/>
+                <v:textbox inset="7pt,5pt,7pt,5pt">
+                  <w:txbxContent>
+                    <w:p>
+                      <w:pPr>
+                        <w:jc w:val="center"/>
+                        <w:rPr>
+                          <w:rFonts w:ascii="Aptos" w:hAnsi="Aptos"/>
+                          <w:b/>
+                          <w:color w:val="1F2937"/>
+                          <w:sz w:val="18"/>
+                        </w:rPr>
+                      </w:pPr>
+                      <w:r>
+                        <w:rPr>
+                          <w:rFonts w:ascii="Aptos" w:hAnsi="Aptos"/>
+                          <w:b/>
+                          <w:color w:val="1F2937"/>
+                          <w:sz w:val="18"/>
+                        </w:rPr>
+                        <w:t>{gap_shape_6_title}</w:t>
+                      </w:r>
+                    </w:p>
+                    <w:p>
+                      <w:pPr>
+                        <w:jc w:val="center"/>
+                        <w:rPr>
+                          <w:rFonts w:ascii="Aptos" w:hAnsi="Aptos"/>
+                          <w:color w:val="1F2937"/>
+                          <w:sz w:val="16"/>
+                        </w:rPr>
+                      </w:pPr>
+                      <w:r>
+                        <w:rPr>
+                          <w:rFonts w:ascii="Aptos" w:hAnsi="Aptos"/>
+                          <w:color w:val="1F2937"/>
+                          <w:sz w:val="16"/>
+                        </w:rPr>
+                        <w:t>{gap_shape_6_body}</w:t>
+                      </w:r>
+                    </w:p>
+                  </w:txbxContent>
+                </v:textbox>
+              </v:roundrect>
+            </w:pict>
+          </mc:Fallback>
+        </mc:AlternateContent>
+      </w:r>
+      <w:r>
+        <w:rPr>
+          <w:noProof/>
+        </w:rPr>
+        <mc:AlternateContent>
+          <mc:Choice Requires="wps">
+            <w:drawing>
+              <wp:anchor distT="0" distB="0" distL="114300" distR="114300" simplePos="0" relativeHeight="251713536" behindDoc="0" locked="0" layoutInCell="1" allowOverlap="1" wp14:anchorId="3421C2AA" wp14:editId="2F5D74F9">
+                <wp:simplePos x="0" y="0"/>
+                <wp:positionH relativeFrom="column">
+                  <wp:posOffset>2400300</wp:posOffset>
+                </wp:positionH>
+                <wp:positionV relativeFrom="paragraph">
+                  <wp:posOffset>-1306195</wp:posOffset>
+                </wp:positionV>
+                <wp:extent cx="1905000" cy="838200"/>
+                <wp:effectExtent l="0" t="0" r="19050" b="19050"/>
+                <wp:wrapNone/>
+                <wp:docPr id="405543313" name="gap_map_box_5"/>
+                <wp:cNvGraphicFramePr/>
+                <a:graphic xmlns:a="http://schemas.openxmlformats.org/drawingml/2006/main">
+                  <a:graphicData uri="http://schemas.microsoft.com/office/word/2010/wordprocessingShape">
+                    <wps:wsp>
+                      <wps:cNvSpPr/>
+                      <wps:spPr>
+                        <a:xfrm>
+                          <a:off x="0" y="0"/>
+                          <a:ext cx="1905000" cy="838200"/>
+                        </a:xfrm>
+                        <a:prstGeom prst="roundRect">
+                          <a:avLst/>
+                        </a:prstGeom>
+                        <a:solidFill>
+                          <a:srgbClr val="FEF2F2"/>
+                        </a:solidFill>
+                        <a:ln w="17780">
+                          <a:solidFill>
+                            <a:srgbClr val="DC2626"/>
+                          </a:solidFill>
+                        </a:ln>
+                      </wps:spPr>
+                      <wps:style>
+                        <a:lnRef idx="2">
+                          <a:schemeClr val="accent1">
+                            <a:shade val="15000"/>
+                          </a:schemeClr>
+                        </a:lnRef>
+                        <a:fillRef idx="1">
+                          <a:schemeClr val="accent1"/>
+                        </a:fillRef>
+                        <a:effectRef idx="0">
+                          <a:schemeClr val="accent1"/>
+                        </a:effectRef>
+                        <a:fontRef idx="minor">
+                          <a:schemeClr val="lt1"/>
+                        </a:fontRef>
+                      </wps:style>
+                      <wps:txbx>
+                        <w:txbxContent>
+                          <w:p>
+                            <w:pPr>
+                              <w:jc w:val="center"/>
+                              <w:rPr>
+                                <w:rFonts w:ascii="Aptos" w:hAnsi="Aptos"/>
+                                <w:b/>
+                                <w:color w:val="1F2937"/>
+                                <w:sz w:val="18"/>
+                              </w:rPr>
+                            </w:pPr>
+                            <w:r>
+                              <w:rPr>
+                                <w:rFonts w:ascii="Aptos" w:hAnsi="Aptos"/>
+                                <w:b/>
+                                <w:color w:val="1F2937"/>
+                                <w:sz w:val="18"/>
+                              </w:rPr>
+                              <w:t>{gap_shape_5_title}</w:t>
+                            </w:r>
+                          </w:p>
+                          <w:p>
+                            <w:pPr>
+                              <w:jc w:val="center"/>
+                              <w:rPr>
+                                <w:rFonts w:ascii="Aptos" w:hAnsi="Aptos"/>
+                                <w:color w:val="1F2937"/>
+                                <w:sz w:val="16"/>
+                              </w:rPr>
+                            </w:pPr>
+                            <w:r>
+                              <w:rPr>
+                                <w:rFonts w:ascii="Aptos" w:hAnsi="Aptos"/>
+                                <w:color w:val="1F2937"/>
+                                <w:sz w:val="16"/>
+                              </w:rPr>
+                              <w:t>{gap_shape_5_body}</w:t>
+                            </w:r>
+                          </w:p>
+                        </w:txbxContent>
+                      </wps:txbx>
+                      <wps:bodyPr rot="0" spcFirstLastPara="0" vertOverflow="overflow" horzOverflow="overflow" vert="horz" wrap="square" lIns="88900" tIns="63500" rIns="88900" bIns="63500" numCol="1" spcCol="0" rtlCol="0" fromWordArt="0" anchor="ctr" anchorCtr="0" forceAA="0" compatLnSpc="1">
+                        <a:prstTxWarp prst="textNoShape">
+                          <a:avLst/>
+                        </a:prstTxWarp>
+                        <a:noAutofit/>
+                      </wps:bodyPr>
+                    </wps:wsp>
+                  </a:graphicData>
+                </a:graphic>
+              </wp:anchor>
+            </w:drawing>
+          </mc:Choice>
+          <mc:Fallback>
+            <w:pict>
+              <v:roundrect w14:anchorId="3421C2AA" id="gap_map_box_5" o:spid="_x0000_s1041" style="position:absolute;margin-left:189pt;margin-top:-102.85pt;width:150pt;height:66pt;z-index:251713536;visibility:visible;mso-wrap-style:square;mso-wrap-distance-left:9pt;mso-wrap-distance-top:0;mso-wrap-distance-right:9pt;mso-wrap-distance-bottom:0;mso-position-horizontal:absolute;mso-position-horizontal-relative:text;mso-position-vertical:absolute;mso-position-vertical-relative:text;v-text-anchor:middle" arcsize="10923f" o:gfxdata="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" fillcolor="#fef2f2" strokecolor="#dc2626" strokeweight="1.4pt">
+                <v:stroke joinstyle="miter"/>
+                <v:textbox inset="7pt,5pt,7pt,5pt">
+                  <w:txbxContent>
+                    <w:p>
+                      <w:pPr>
+                        <w:jc w:val="center"/>
+                        <w:rPr>
+                          <w:rFonts w:ascii="Aptos" w:hAnsi="Aptos"/>
+                          <w:b/>
+                          <w:color w:val="1F2937"/>
+                          <w:sz w:val="18"/>
+                        </w:rPr>
+                      </w:pPr>
+                      <w:r>
+                        <w:rPr>
+                          <w:rFonts w:ascii="Aptos" w:hAnsi="Aptos"/>
+                          <w:b/>
+                          <w:color w:val="1F2937"/>
+                          <w:sz w:val="18"/>
+                        </w:rPr>
+                        <w:t>{gap_shape_5_title}</w:t>
+                      </w:r>
+                    </w:p>
+                    <w:p>
+                      <w:pPr>
+                        <w:jc w:val="center"/>
+                        <w:rPr>
+                          <w:rFonts w:ascii="Aptos" w:hAnsi="Aptos"/>
+                          <w:color w:val="1F2937"/>
+                          <w:sz w:val="16"/>
+                        </w:rPr>
+                      </w:pPr>
+                      <w:r>
+                        <w:rPr>
+                          <w:rFonts w:ascii="Aptos" w:hAnsi="Aptos"/>
+                          <w:color w:val="1F2937"/>
+                          <w:sz w:val="16"/>
+                        </w:rPr>
+                        <w:t>{gap_shape_5_body}</w:t>
+                      </w:r>
+                    </w:p>
+                  </w:txbxContent>
+                </v:textbox>
+              </v:roundrect>
+            </w:pict>
+          </mc:Fallback>
+        </mc:AlternateContent>
+      </w:r>
+      <w:r>
+        <w:rPr>
+          <w:noProof/>
+        </w:rPr>
+        <mc:AlternateContent>
+          <mc:Choice Requires="wps">
+            <w:drawing>
+              <wp:anchor distT="0" distB="0" distL="114300" distR="114300" simplePos="0" relativeHeight="251712512" behindDoc="0" locked="0" layoutInCell="1" allowOverlap="1" wp14:anchorId="6CF47701" wp14:editId="1FF99DB0">
+                <wp:simplePos x="0" y="0"/>
+                <wp:positionH relativeFrom="column">
+                  <wp:posOffset>50800</wp:posOffset>
+                </wp:positionH>
+                <wp:positionV relativeFrom="paragraph">
+                  <wp:posOffset>-1306195</wp:posOffset>
+                </wp:positionV>
+                <wp:extent cx="1905000" cy="838200"/>
+                <wp:effectExtent l="0" t="0" r="19050" b="19050"/>
+                <wp:wrapNone/>
+                <wp:docPr id="730638544" name="gap_map_box_4"/>
+                <wp:cNvGraphicFramePr/>
+                <a:graphic xmlns:a="http://schemas.openxmlformats.org/drawingml/2006/main">
+                  <a:graphicData uri="http://schemas.microsoft.com/office/word/2010/wordprocessingShape">
+                    <wps:wsp>
+                      <wps:cNvSpPr/>
+                      <wps:spPr>
+                        <a:xfrm>
+                          <a:off x="0" y="0"/>
+                          <a:ext cx="1905000" cy="838200"/>
+                        </a:xfrm>
+                        <a:prstGeom prst="roundRect">
+                          <a:avLst/>
+                        </a:prstGeom>
+                        <a:solidFill>
+                          <a:srgbClr val="FEF2F2"/>
+                        </a:solidFill>
+                        <a:ln w="17780">
+                          <a:solidFill>
+                            <a:srgbClr val="DC2626"/>
+                          </a:solidFill>
+                        </a:ln>
+                      </wps:spPr>
+                      <wps:style>
+                        <a:lnRef idx="2">
+                          <a:schemeClr val="accent1">
+                            <a:shade val="15000"/>
+                          </a:schemeClr>
+                        </a:lnRef>
+                        <a:fillRef idx="1">
+                          <a:schemeClr val="accent1"/>
+                        </a:fillRef>
+                        <a:effectRef idx="0">
+                          <a:schemeClr val="accent1"/>
+                        </a:effectRef>
+                        <a:fontRef idx="minor">
+                          <a:schemeClr val="lt1"/>
+                        </a:fontRef>
+                      </wps:style>
+                      <wps:txbx>
+                        <w:txbxContent>
+                          <w:p>
+                            <w:pPr>
+                              <w:jc w:val="center"/>
+                              <w:rPr>
+                                <w:rFonts w:ascii="Aptos" w:hAnsi="Aptos"/>
+                                <w:b/>
+                                <w:color w:val="1F2937"/>
+                                <w:sz w:val="18"/>
+                              </w:rPr>
+                            </w:pPr>
+                            <w:r>
+                              <w:rPr>
+                                <w:rFonts w:ascii="Aptos" w:hAnsi="Aptos"/>
+                                <w:b/>
+                                <w:color w:val="1F2937"/>
+                                <w:sz w:val="18"/>
+                              </w:rPr>
+                              <w:t>{gap_shape_4_title}</w:t>
+                            </w:r>
+                          </w:p>
+                          <w:p>
+                            <w:pPr>
+                              <w:jc w:val="center"/>
+                              <w:rPr>
+                                <w:rFonts w:ascii="Aptos" w:hAnsi="Aptos"/>
+                                <w:color w:val="1F2937"/>
+                                <w:sz w:val="16"/>
+                              </w:rPr>
+                            </w:pPr>
+                            <w:r>
+                              <w:rPr>
+                                <w:rFonts w:ascii="Aptos" w:hAnsi="Aptos"/>
+                                <w:color w:val="1F2937"/>
+                                <w:sz w:val="16"/>
+                              </w:rPr>
+                              <w:t>{gap_shape_4_body}</w:t>
+                            </w:r>
+                          </w:p>
+                        </w:txbxContent>
+                      </wps:txbx>
+                      <wps:bodyPr rot="0" spcFirstLastPara="0" vertOverflow="overflow" horzOverflow="overflow" vert="horz" wrap="square" lIns="88900" tIns="63500" rIns="88900" bIns="63500" numCol="1" spcCol="0" rtlCol="0" fromWordArt="0" anchor="ctr" anchorCtr="0" forceAA="0" compatLnSpc="1">
+                        <a:prstTxWarp prst="textNoShape">
+                          <a:avLst/>
+                        </a:prstTxWarp>
+                        <a:noAutofit/>
+                      </wps:bodyPr>
+                    </wps:wsp>
+                  </a:graphicData>
+                </a:graphic>
+              </wp:anchor>
+            </w:drawing>
+          </mc:Choice>
+          <mc:Fallback>
+            <w:pict>
+              <v:roundrect w14:anchorId="6CF47701" id="gap_map_box_4" o:spid="_x0000_s1042" style="position:absolute;margin-left:4pt;margin-top:-102.85pt;width:150pt;height:66pt;z-index:251712512;visibility:visible;mso-wrap-style:square;mso-wrap-distance-left:9pt;mso-wrap-distance-top:0;mso-wrap-distance-right:9pt;mso-wrap-distance-bottom:0;mso-position-horizontal:absolute;mso-position-horizontal-relative:text;mso-position-vertical:absolute;mso-position-vertical-relative:text;v-text-anchor:middle" arcsize="10923f" o:gfxdata="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" fillcolor="#fef2f2" strokecolor="#dc2626" strokeweight="1.4pt">
+                <v:stroke joinstyle="miter"/>
+                <v:textbox inset="7pt,5pt,7pt,5pt">
+                  <w:txbxContent>
+                    <w:p>
+                      <w:pPr>
+                        <w:jc w:val="center"/>
+                        <w:rPr>
+                          <w:rFonts w:ascii="Aptos" w:hAnsi="Aptos"/>
+                          <w:b/>
+                          <w:color w:val="1F2937"/>
+                          <w:sz w:val="18"/>
+                        </w:rPr>
+                      </w:pPr>
+                      <w:r>
+                        <w:rPr>
+                          <w:rFonts w:ascii="Aptos" w:hAnsi="Aptos"/>
+                          <w:b/>
+                          <w:color w:val="1F2937"/>
+                          <w:sz w:val="18"/>
+                        </w:rPr>
+                        <w:t>{gap_shape_4_title}</w:t>
+                      </w:r>
+                    </w:p>
+                    <w:p>
+                      <w:pPr>
+                        <w:jc w:val="center"/>
+                        <w:rPr>
+                          <w:rFonts w:ascii="Aptos" w:hAnsi="Aptos"/>
+                          <w:color w:val="1F2937"/>
+                          <w:sz w:val="16"/>
+                        </w:rPr>
+                      </w:pPr>
+                      <w:r>
+                        <w:rPr>
+                          <w:rFonts w:ascii="Aptos" w:hAnsi="Aptos"/>
+                          <w:color w:val="1F2937"/>
+                          <w:sz w:val="16"/>
+                        </w:rPr>
+                        <w:t>{gap_shape_4_body}</w:t>
+                      </w:r>
+                    </w:p>
+                  </w:txbxContent>
+                </v:textbox>
+              </v:roundrect>
+            </w:pict>
+          </mc:Fallback>
+        </mc:AlternateContent>
+      </w:r>
+      <w:r>
+        <w:rPr>
+          <w:noProof/>
+        </w:rPr>
+        <mc:AlternateContent>
+          <mc:Choice Requires="wps">
+            <w:drawing>
+              <wp:anchor distT="0" distB="0" distL="114300" distR="114300" simplePos="0" relativeHeight="251711488" behindDoc="0" locked="0" layoutInCell="1" allowOverlap="1" wp14:anchorId="6DB354CF" wp14:editId="20936864">
+                <wp:simplePos x="0" y="0"/>
+                <wp:positionH relativeFrom="column">
+                  <wp:posOffset>4749800</wp:posOffset>
+                </wp:positionH>
+                <wp:positionV relativeFrom="paragraph">
+                  <wp:posOffset>-2512695</wp:posOffset>
+                </wp:positionV>
+                <wp:extent cx="1905000" cy="838200"/>
+                <wp:effectExtent l="0" t="0" r="19050" b="19050"/>
+                <wp:wrapNone/>
+                <wp:docPr id="298406095" name="gap_map_box_3"/>
+                <wp:cNvGraphicFramePr/>
+                <a:graphic xmlns:a="http://schemas.openxmlformats.org/drawingml/2006/main">
+                  <a:graphicData uri="http://schemas.microsoft.com/office/word/2010/wordprocessingShape">
+                    <wps:wsp>
+                      <wps:cNvSpPr/>
+                      <wps:spPr>
+                        <a:xfrm>
+                          <a:off x="0" y="0"/>
+                          <a:ext cx="1905000" cy="838200"/>
+                        </a:xfrm>
+                        <a:prstGeom prst="roundRect">
+                          <a:avLst/>
+                        </a:prstGeom>
+                        <a:solidFill>
+                          <a:srgbClr val="FFF7ED"/>
+                        </a:solidFill>
+                        <a:ln w="17780">
+                          <a:solidFill>
+                            <a:srgbClr val="D97706"/>
+                          </a:solidFill>
+                        </a:ln>
+                      </wps:spPr>
+                      <wps:style>
+                        <a:lnRef idx="2">
+                          <a:schemeClr val="accent1">
+                            <a:shade val="15000"/>
+                          </a:schemeClr>
+                        </a:lnRef>
+                        <a:fillRef idx="1">
+                          <a:schemeClr val="accent1"/>
+                        </a:fillRef>
+                        <a:effectRef idx="0">
+                          <a:schemeClr val="accent1"/>
+                        </a:effectRef>
+                        <a:fontRef idx="minor">
+                          <a:schemeClr val="lt1"/>
+                        </a:fontRef>
+                      </wps:style>
+                      <wps:txbx>
+                        <w:txbxContent>
+                          <w:p>
+                            <w:pPr>
+                              <w:jc w:val="center"/>
+                              <w:rPr>
+                                <w:rFonts w:ascii="Aptos" w:hAnsi="Aptos"/>
+                                <w:b/>
+                                <w:color w:val="1F2937"/>
+                                <w:sz w:val="18"/>
+                              </w:rPr>
+                            </w:pPr>
+                            <w:r>
+                              <w:rPr>
+                                <w:rFonts w:ascii="Aptos" w:hAnsi="Aptos"/>
+                                <w:b/>
+                                <w:color w:val="1F2937"/>
+                                <w:sz w:val="18"/>
+                              </w:rPr>
+                              <w:t>{gap_shape_3_title}</w:t>
+                            </w:r>
+                          </w:p>
+                          <w:p>
+                            <w:pPr>
+                              <w:jc w:val="center"/>
+                              <w:rPr>
+                                <w:rFonts w:ascii="Aptos" w:hAnsi="Aptos"/>
+                                <w:color w:val="1F2937"/>
+                                <w:sz w:val="16"/>
+                              </w:rPr>
+                            </w:pPr>
+                            <w:r>
+                              <w:rPr>
+                                <w:rFonts w:ascii="Aptos" w:hAnsi="Aptos"/>
+                                <w:color w:val="1F2937"/>
+                                <w:sz w:val="16"/>
+                              </w:rPr>
+                              <w:t>{gap_shape_3_body}</w:t>
+                            </w:r>
+                          </w:p>
+                        </w:txbxContent>
+                      </wps:txbx>
+                      <wps:bodyPr rot="0" spcFirstLastPara="0" vertOverflow="overflow" horzOverflow="overflow" vert="horz" wrap="square" lIns="88900" tIns="63500" rIns="88900" bIns="63500" numCol="1" spcCol="0" rtlCol="0" fromWordArt="0" anchor="ctr" anchorCtr="0" forceAA="0" compatLnSpc="1">
+                        <a:prstTxWarp prst="textNoShape">
+                          <a:avLst/>
+                        </a:prstTxWarp>
+                        <a:noAutofit/>
+                      </wps:bodyPr>
+                    </wps:wsp>
+                  </a:graphicData>
+                </a:graphic>
+              </wp:anchor>
+            </w:drawing>
+          </mc:Choice>
+          <mc:Fallback>
+            <w:pict>
+              <v:roundrect w14:anchorId="6DB354CF" id="gap_map_box_3" o:spid="_x0000_s1043" style="position:absolute;margin-left:374pt;margin-top:-197.85pt;width:150pt;height:66pt;z-index:251711488;visibility:visible;mso-wrap-style:square;mso-wrap-distance-left:9pt;mso-wrap-distance-top:0;mso-wrap-distance-right:9pt;mso-wrap-distance-bottom:0;mso-position-horizontal:absolute;mso-position-horizontal-relative:text;mso-position-vertical:absolute;mso-position-vertical-relative:text;v-text-anchor:middle" arcsize="10923f" o:gfxdata="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" fillcolor="#fff7ed" strokecolor="#d97706" strokeweight="1.4pt">
+                <v:stroke joinstyle="miter"/>
+                <v:textbox inset="7pt,5pt,7pt,5pt">
+                  <w:txbxContent>
+                    <w:p>
+                      <w:pPr>
+                        <w:jc w:val="center"/>
+                        <w:rPr>
+                          <w:rFonts w:ascii="Aptos" w:hAnsi="Aptos"/>
+                          <w:b/>
+                          <w:color w:val="1F2937"/>
+                          <w:sz w:val="18"/>
+                        </w:rPr>
+                      </w:pPr>
+                      <w:r>
+                        <w:rPr>
+                          <w:rFonts w:ascii="Aptos" w:hAnsi="Aptos"/>
+                          <w:b/>
+                          <w:color w:val="1F2937"/>
+                          <w:sz w:val="18"/>
+                        </w:rPr>
+                        <w:t>{gap_shape_3_title}</w:t>
+                      </w:r>
+                    </w:p>
+                    <w:p>
+                      <w:pPr>
+                        <w:jc w:val="center"/>
+                        <w:rPr>
+                          <w:rFonts w:ascii="Aptos" w:hAnsi="Aptos"/>
+                          <w:color w:val="1F2937"/>
+                          <w:sz w:val="16"/>
+                        </w:rPr>
+                      </w:pPr>
+                      <w:r>
+                        <w:rPr>
+                          <w:rFonts w:ascii="Aptos" w:hAnsi="Aptos"/>
+                          <w:color w:val="1F2937"/>
+                          <w:sz w:val="16"/>
+                        </w:rPr>
+                        <w:t>{gap_shape_3_body}</w:t>
+                      </w:r>
+                    </w:p>
+                  </w:txbxContent>
+                </v:textbox>
+              </v:roundrect>
+            </w:pict>
+          </mc:Fallback>
+        </mc:AlternateContent>
+      </w:r>
+      <w:r>
+        <w:rPr>
+          <w:noProof/>
+        </w:rPr>
+        <mc:AlternateContent>
+          <mc:Choice Requires="wps">
+            <w:drawing>
+              <wp:anchor distT="0" distB="0" distL="114300" distR="114300" simplePos="0" relativeHeight="251710464" behindDoc="0" locked="0" layoutInCell="1" allowOverlap="1" wp14:anchorId="3FF80C4F" wp14:editId="5F6238C5">
+                <wp:simplePos x="0" y="0"/>
+                <wp:positionH relativeFrom="column">
+                  <wp:posOffset>2400300</wp:posOffset>
+                </wp:positionH>
+                <wp:positionV relativeFrom="paragraph">
+                  <wp:posOffset>-2512695</wp:posOffset>
+                </wp:positionV>
+                <wp:extent cx="1905000" cy="838200"/>
+                <wp:effectExtent l="0" t="0" r="19050" b="19050"/>
+                <wp:wrapNone/>
+                <wp:docPr id="127656070" name="gap_map_box_2"/>
+                <wp:cNvGraphicFramePr/>
+                <a:graphic xmlns:a="http://schemas.openxmlformats.org/drawingml/2006/main">
+                  <a:graphicData uri="http://schemas.microsoft.com/office/word/2010/wordprocessingShape">
+                    <wps:wsp>
+                      <wps:cNvSpPr/>
+                      <wps:spPr>
+                        <a:xfrm>
+                          <a:off x="0" y="0"/>
+                          <a:ext cx="1905000" cy="838200"/>
+                        </a:xfrm>
+                        <a:prstGeom prst="roundRect">
+                          <a:avLst/>
+                        </a:prstGeom>
+                        <a:solidFill>
+                          <a:srgbClr val="FFF7ED"/>
+                        </a:solidFill>
+                        <a:ln w="17780">
+                          <a:solidFill>
+                            <a:srgbClr val="D97706"/>
+                          </a:solidFill>
+                        </a:ln>
+                      </wps:spPr>
+                      <wps:style>
+                        <a:lnRef idx="2">
+                          <a:schemeClr val="accent1">
+                            <a:shade val="15000"/>
+                          </a:schemeClr>
+                        </a:lnRef>
+                        <a:fillRef idx="1">
+                          <a:schemeClr val="accent1"/>
+                        </a:fillRef>
+                        <a:effectRef idx="0">
+                          <a:schemeClr val="accent1"/>
+                        </a:effectRef>
+                        <a:fontRef idx="minor">
+                          <a:schemeClr val="lt1"/>
+                        </a:fontRef>
+                      </wps:style>
+                      <wps:txbx>
+                        <w:txbxContent>
+                          <w:p>
+                            <w:pPr>
+                              <w:jc w:val="center"/>
+                              <w:rPr>
+                                <w:rFonts w:ascii="Aptos" w:hAnsi="Aptos"/>
+                                <w:b/>
+                                <w:color w:val="1F2937"/>
+                                <w:sz w:val="18"/>
+                              </w:rPr>
+                            </w:pPr>
+                            <w:r>
+                              <w:rPr>
+                                <w:rFonts w:ascii="Aptos" w:hAnsi="Aptos"/>
+                                <w:b/>
+                                <w:color w:val="1F2937"/>
+                                <w:sz w:val="18"/>
+                              </w:rPr>
+                              <w:t>{gap_shape_2_title}</w:t>
+                            </w:r>
+                          </w:p>
+                          <w:p>
+                            <w:pPr>
+                              <w:jc w:val="center"/>
+                              <w:rPr>
+                                <w:rFonts w:ascii="Aptos" w:hAnsi="Aptos"/>
+                                <w:color w:val="1F2937"/>
+                                <w:sz w:val="16"/>
+                              </w:rPr>
+                            </w:pPr>
+                            <w:r>
+                              <w:rPr>
+                                <w:rFonts w:ascii="Aptos" w:hAnsi="Aptos"/>
+                                <w:color w:val="1F2937"/>
+                                <w:sz w:val="16"/>
+                              </w:rPr>
+                              <w:t>{gap_shape_2_body}</w:t>
+                            </w:r>
+                          </w:p>
+                        </w:txbxContent>
+                      </wps:txbx>
+                      <wps:bodyPr rot="0" spcFirstLastPara="0" vertOverflow="overflow" horzOverflow="overflow" vert="horz" wrap="square" lIns="88900" tIns="63500" rIns="88900" bIns="63500" numCol="1" spcCol="0" rtlCol="0" fromWordArt="0" anchor="ctr" anchorCtr="0" forceAA="0" compatLnSpc="1">
+                        <a:prstTxWarp prst="textNoShape">
+                          <a:avLst/>
+                        </a:prstTxWarp>
+                        <a:noAutofit/>
+                      </wps:bodyPr>
+                    </wps:wsp>
+                  </a:graphicData>
+                </a:graphic>
+              </wp:anchor>
+            </w:drawing>
+          </mc:Choice>
+          <mc:Fallback>
+            <w:pict>
+              <v:roundrect w14:anchorId="3FF80C4F" id="gap_map_box_2" o:spid="_x0000_s1044" style="position:absolute;margin-left:189pt;margin-top:-197.85pt;width:150pt;height:66pt;z-index:251710464;visibility:visible;mso-wrap-style:square;mso-wrap-distance-left:9pt;mso-wrap-distance-top:0;mso-wrap-distance-right:9pt;mso-wrap-distance-bottom:0;mso-position-horizontal:absolute;mso-position-horizontal-relative:text;mso-position-vertical:absolute;mso-position-vertical-relative:text;v-text-anchor:middle" arcsize="10923f" o:gfxdata="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" fillcolor="#fff7ed" strokecolor="#d97706" strokeweight="1.4pt">
+                <v:stroke joinstyle="miter"/>
+                <v:textbox inset="7pt,5pt,7pt,5pt">
+                  <w:txbxContent>
+                    <w:p>
+                      <w:pPr>
+                        <w:jc w:val="center"/>
+                        <w:rPr>
+                          <w:rFonts w:ascii="Aptos" w:hAnsi="Aptos"/>
+                          <w:b/>
+                          <w:color w:val="1F2937"/>
+                          <w:sz w:val="18"/>
+                        </w:rPr>
+                      </w:pPr>
+                      <w:r>
+                        <w:rPr>
+                          <w:rFonts w:ascii="Aptos" w:hAnsi="Aptos"/>
+                          <w:b/>
+                          <w:color w:val="1F2937"/>
+                          <w:sz w:val="18"/>
+                        </w:rPr>
+                        <w:t>{gap_shape_2_title}</w:t>
+                      </w:r>
+                    </w:p>
+                    <w:p>
+                      <w:pPr>
+                        <w:jc w:val="center"/>
+                        <w:rPr>
+                          <w:rFonts w:ascii="Aptos" w:hAnsi="Aptos"/>
+                          <w:color w:val="1F2937"/>
+                          <w:sz w:val="16"/>
+                        </w:rPr>
+                      </w:pPr>
+                      <w:r>
+                        <w:rPr>
+                          <w:rFonts w:ascii="Aptos" w:hAnsi="Aptos"/>
+                          <w:color w:val="1F2937"/>
+                          <w:sz w:val="16"/>
+                        </w:rPr>
+                        <w:t>{gap_shape_2_body}</w:t>
+                      </w:r>
+                    </w:p>
+                  </w:txbxContent>
+                </v:textbox>
+              </v:roundrect>
+            </w:pict>
+          </mc:Fallback>
+        </mc:AlternateContent>
+      </w:r>
+      <w:r>
+        <w:rPr>
+          <w:noProof/>
+        </w:rPr>
+        <mc:AlternateContent>
+          <mc:Choice Requires="wps">
+            <w:drawing>
+              <wp:anchor distT="0" distB="0" distL="114300" distR="114300" simplePos="0" relativeHeight="251709440" behindDoc="0" locked="0" layoutInCell="1" allowOverlap="1" wp14:anchorId="4C45A6F8" wp14:editId="1C916337">
+                <wp:simplePos x="0" y="0"/>
+                <wp:positionH relativeFrom="column">
+                  <wp:posOffset>50800</wp:posOffset>
+                </wp:positionH>
+                <wp:positionV relativeFrom="paragraph">
+                  <wp:posOffset>-2512695</wp:posOffset>
+                </wp:positionV>
+                <wp:extent cx="1905000" cy="838200"/>
+                <wp:effectExtent l="0" t="0" r="19050" b="19050"/>
+                <wp:wrapNone/>
+                <wp:docPr id="442210310" name="gap_map_box_1"/>
+                <wp:cNvGraphicFramePr/>
+                <a:graphic xmlns:a="http://schemas.openxmlformats.org/drawingml/2006/main">
+                  <a:graphicData uri="http://schemas.microsoft.com/office/word/2010/wordprocessingShape">
+                    <wps:wsp>
+                      <wps:cNvSpPr/>
+                      <wps:spPr>
+                        <a:xfrm>
+                          <a:off x="0" y="0"/>
+                          <a:ext cx="1905000" cy="838200"/>
+                        </a:xfrm>
+                        <a:prstGeom prst="roundRect">
+                          <a:avLst/>
+                        </a:prstGeom>
+                        <a:solidFill>
+                          <a:srgbClr val="FFF7ED"/>
+                        </a:solidFill>
+                        <a:ln w="17780">
+                          <a:solidFill>
+                            <a:srgbClr val="D97706"/>
+                          </a:solidFill>
+                        </a:ln>
+                      </wps:spPr>
+                      <wps:style>
+                        <a:lnRef idx="2">
+                          <a:schemeClr val="accent1">
+                            <a:shade val="15000"/>
+                          </a:schemeClr>
+                        </a:lnRef>
+                        <a:fillRef idx="1">
+                          <a:schemeClr val="accent1"/>
+                        </a:fillRef>
+                        <a:effectRef idx="0">
+                          <a:schemeClr val="accent1"/>
+                        </a:effectRef>
+                        <a:fontRef idx="minor">
+                          <a:schemeClr val="lt1"/>
+                        </a:fontRef>
+                      </wps:style>
+                      <wps:txbx>
+                        <w:txbxContent>
+                          <w:p>
+                            <w:pPr>
+                              <w:jc w:val="center"/>
+                              <w:rPr>
+                                <w:rFonts w:ascii="Aptos" w:hAnsi="Aptos"/>
+                                <w:b/>
+                                <w:color w:val="1F2937"/>
+                                <w:sz w:val="18"/>
+                              </w:rPr>
+                            </w:pPr>
+                            <w:r>
+                              <w:rPr>
+                                <w:rFonts w:ascii="Aptos" w:hAnsi="Aptos"/>
+                                <w:b/>
+                                <w:color w:val="1F2937"/>
+                                <w:sz w:val="18"/>
+                              </w:rPr>
+                              <w:t>{gap_shape_1_title}</w:t>
+                            </w:r>
+                          </w:p>
+                          <w:p>
+                            <w:pPr>
+                              <w:jc w:val="center"/>
+                              <w:rPr>
+                                <w:rFonts w:ascii="Aptos" w:hAnsi="Aptos"/>
+                                <w:color w:val="1F2937"/>
+                                <w:sz w:val="16"/>
+                              </w:rPr>
+                            </w:pPr>
+                            <w:r>
+                              <w:rPr>
+                                <w:rFonts w:ascii="Aptos" w:hAnsi="Aptos"/>
+                                <w:color w:val="1F2937"/>
+                                <w:sz w:val="16"/>
+                              </w:rPr>
+                              <w:t>{gap_shape_1_body}</w:t>
+                            </w:r>
+                          </w:p>
+                        </w:txbxContent>
+                      </wps:txbx>
+                      <wps:bodyPr rot="0" spcFirstLastPara="0" vertOverflow="overflow" horzOverflow="overflow" vert="horz" wrap="square" lIns="88900" tIns="63500" rIns="88900" bIns="63500" numCol="1" spcCol="0" rtlCol="0" fromWordArt="0" anchor="ctr" anchorCtr="0" forceAA="0" compatLnSpc="1">
+                        <a:prstTxWarp prst="textNoShape">
+                          <a:avLst/>
+                        </a:prstTxWarp>
+                        <a:noAutofit/>
+                      </wps:bodyPr>
+                    </wps:wsp>
+                  </a:graphicData>
+                </a:graphic>
+              </wp:anchor>
+            </w:drawing>
+          </mc:Choice>
+          <mc:Fallback>
+            <w:pict>
+              <v:roundrect w14:anchorId="4C45A6F8" id="gap_map_box_1" o:spid="_x0000_s1045" style="position:absolute;margin-left:4pt;margin-top:-197.85pt;width:150pt;height:66pt;z-index:251709440;visibility:visible;mso-wrap-style:square;mso-wrap-distance-left:9pt;mso-wrap-distance-top:0;mso-wrap-distance-right:9pt;mso-wrap-distance-bottom:0;mso-position-horizontal:absolute;mso-position-horizontal-relative:text;mso-position-vertical:absolute;mso-position-vertical-relative:text;v-text-anchor:middle" arcsize="10923f" o:gfxdata="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" fillcolor="#fff7ed" strokecolor="#d97706" strokeweight="1.4pt">
+                <v:stroke joinstyle="miter"/>
+                <v:textbox inset="7pt,5pt,7pt,5pt">
+                  <w:txbxContent>
+                    <w:p>
+                      <w:pPr>
+                        <w:jc w:val="center"/>
+                        <w:rPr>
+                          <w:rFonts w:ascii="Aptos" w:hAnsi="Aptos"/>
+                          <w:b/>
+                          <w:color w:val="1F2937"/>
+                          <w:sz w:val="18"/>
+                        </w:rPr>
+                      </w:pPr>
+                      <w:r>
+                        <w:rPr>
+                          <w:rFonts w:ascii="Aptos" w:hAnsi="Aptos"/>
+                          <w:b/>
+                          <w:color w:val="1F2937"/>
+                          <w:sz w:val="18"/>
+                        </w:rPr>
+                        <w:t>{gap_shape_1_title}</w:t>
+                      </w:r>
+                    </w:p>
+                    <w:p>
+                      <w:pPr>
+                        <w:jc w:val="center"/>
+                        <w:rPr>
+                          <w:rFonts w:ascii="Aptos" w:hAnsi="Aptos"/>
+                          <w:color w:val="1F2937"/>
+                          <w:sz w:val="16"/>
+                        </w:rPr>
+                      </w:pPr>
+                      <w:r>
+                        <w:rPr>
+                          <w:rFonts w:ascii="Aptos" w:hAnsi="Aptos"/>
+                          <w:color w:val="1F2937"/>
+                          <w:sz w:val="16"/>
+                        </w:rPr>
+                        <w:t>{gap_shape_1_body}</w:t>
+                      </w:r>
+                    </w:p>
+                  </w:txbxContent>
+                </v:textbox>
+              </v:roundrect>
+            </w:pict>
+          </mc:Fallback>
+        </mc:AlternateContent>
       </w:r>
     </w:p>
     <w:tbl>
@@ -6561,6 +8572,7 @@
                 <w:sz w:val="15"/>
                 <w:szCs w:val="15"/>
               </w:rPr>
+              <w:lastRenderedPageBreak/>
               <w:t>Categoria</w:t>
             </w:r>
           </w:p>
@@ -7210,6 +9222,876 @@
       </w:pPr>
       <w:r>
         <w:t>Riscos identificados</w:t>
+      </w:r>
+    </w:p>
+    <w:p>
+      <w:pPr>
+        <w:pStyle w:val="Ttulo2"/>
+        <w:spacing w:before="220" w:after="120"/>
+      </w:pPr>
+    </w:p>
+    <w:p>
+      <w:pPr>
+        <w:pStyle w:val="Ttulo2"/>
+        <w:spacing w:before="220" w:after="120"/>
+      </w:pPr>
+    </w:p>
+    <w:p>
+      <w:pPr>
+        <w:pStyle w:val="Ttulo2"/>
+        <w:spacing w:before="220" w:after="120"/>
+      </w:pPr>
+    </w:p>
+    <w:p>
+      <w:pPr>
+        <w:pStyle w:val="Ttulo2"/>
+        <w:spacing w:before="220" w:after="120"/>
+      </w:pPr>
+    </w:p>
+    <w:p>
+      <w:pPr>
+        <w:pStyle w:val="Ttulo2"/>
+        <w:spacing w:before="220" w:after="120"/>
+      </w:pPr>
+    </w:p>
+    <w:p>
+      <w:pPr>
+        <w:pStyle w:val="Ttulo2"/>
+        <w:spacing w:before="220" w:after="120"/>
+      </w:pPr>
+    </w:p>
+    <w:p>
+      <w:pPr>
+        <w:pStyle w:val="Ttulo2"/>
+        <w:spacing w:before="220" w:after="120"/>
+      </w:pPr>
+    </w:p>
+    <w:p>
+      <w:pPr>
+        <w:pStyle w:val="Ttulo2"/>
+        <w:spacing w:before="220" w:after="120"/>
+      </w:pPr>
+    </w:p>
+    <w:p>
+      <w:pPr>
+        <w:pStyle w:val="Ttulo2"/>
+        <w:spacing w:before="220" w:after="120"/>
+      </w:pPr>
+    </w:p>
+    <w:p>
+      <w:pPr>
+        <w:pStyle w:val="Ttulo2"/>
+        <w:spacing w:before="220" w:after="120"/>
+      </w:pPr>
+      <w:r>
+        <w:rPr>
+          <w:noProof/>
+        </w:rPr>
+        <mc:AlternateContent>
+          <mc:Choice Requires="wps">
+            <w:drawing>
+              <wp:anchor distT="0" distB="0" distL="114300" distR="114300" simplePos="0" relativeHeight="251724800" behindDoc="0" locked="0" layoutInCell="1" allowOverlap="1" wp14:anchorId="3A54AA77" wp14:editId="149C0244">
+                <wp:simplePos x="0" y="0"/>
+                <wp:positionH relativeFrom="column">
+                  <wp:posOffset>4013200</wp:posOffset>
+                </wp:positionH>
+                <wp:positionV relativeFrom="paragraph">
+                  <wp:posOffset>1252855</wp:posOffset>
+                </wp:positionV>
+                <wp:extent cx="1968500" cy="863600"/>
+                <wp:effectExtent l="0" t="0" r="12700" b="12700"/>
+                <wp:wrapNone/>
+                <wp:docPr id="637040628" name="risk_map_box_5"/>
+                <wp:cNvGraphicFramePr/>
+                <a:graphic xmlns:a="http://schemas.openxmlformats.org/drawingml/2006/main">
+                  <a:graphicData uri="http://schemas.microsoft.com/office/word/2010/wordprocessingShape">
+                    <wps:wsp>
+                      <wps:cNvSpPr/>
+                      <wps:spPr>
+                        <a:xfrm>
+                          <a:off x="0" y="0"/>
+                          <a:ext cx="1968500" cy="863600"/>
+                        </a:xfrm>
+                        <a:prstGeom prst="roundRect">
+                          <a:avLst/>
+                        </a:prstGeom>
+                        <a:solidFill>
+                          <a:srgbClr val="FEF2F2"/>
+                        </a:solidFill>
+                        <a:ln w="17780">
+                          <a:solidFill>
+                            <a:srgbClr val="DC2626"/>
+                          </a:solidFill>
+                        </a:ln>
+                      </wps:spPr>
+                      <wps:style>
+                        <a:lnRef idx="2">
+                          <a:schemeClr val="accent1">
+                            <a:shade val="15000"/>
+                          </a:schemeClr>
+                        </a:lnRef>
+                        <a:fillRef idx="1">
+                          <a:schemeClr val="accent1"/>
+                        </a:fillRef>
+                        <a:effectRef idx="0">
+                          <a:schemeClr val="accent1"/>
+                        </a:effectRef>
+                        <a:fontRef idx="minor">
+                          <a:schemeClr val="lt1"/>
+                        </a:fontRef>
+                      </wps:style>
+                      <wps:txbx>
+                        <w:txbxContent>
+                          <w:p>
+                            <w:pPr>
+                              <w:jc w:val="center"/>
+                              <w:rPr>
+                                <w:rFonts w:ascii="Aptos" w:hAnsi="Aptos"/>
+                                <w:b/>
+                                <w:color w:val="1F2937"/>
+                                <w:sz w:val="18"/>
+                              </w:rPr>
+                            </w:pPr>
+                            <w:r>
+                              <w:rPr>
+                                <w:rFonts w:ascii="Aptos" w:hAnsi="Aptos"/>
+                                <w:b/>
+                                <w:color w:val="1F2937"/>
+                                <w:sz w:val="18"/>
+                              </w:rPr>
+                              <w:t>{risk_shape_5_title}</w:t>
+                            </w:r>
+                          </w:p>
+                          <w:p>
+                            <w:pPr>
+                              <w:jc w:val="center"/>
+                              <w:rPr>
+                                <w:rFonts w:ascii="Aptos" w:hAnsi="Aptos"/>
+                                <w:color w:val="1F2937"/>
+                                <w:sz w:val="16"/>
+                              </w:rPr>
+                            </w:pPr>
+                            <w:r>
+                              <w:rPr>
+                                <w:rFonts w:ascii="Aptos" w:hAnsi="Aptos"/>
+                                <w:color w:val="1F2937"/>
+                                <w:sz w:val="16"/>
+                              </w:rPr>
+                              <w:t>{risk_shape_5_body}</w:t>
+                            </w:r>
+                          </w:p>
+                        </w:txbxContent>
+                      </wps:txbx>
+                      <wps:bodyPr rot="0" spcFirstLastPara="0" vertOverflow="overflow" horzOverflow="overflow" vert="horz" wrap="square" lIns="88900" tIns="63500" rIns="88900" bIns="63500" numCol="1" spcCol="0" rtlCol="0" fromWordArt="0" anchor="ctr" anchorCtr="0" forceAA="0" compatLnSpc="1">
+                        <a:prstTxWarp prst="textNoShape">
+                          <a:avLst/>
+                        </a:prstTxWarp>
+                        <a:noAutofit/>
+                      </wps:bodyPr>
+                    </wps:wsp>
+                  </a:graphicData>
+                </a:graphic>
+              </wp:anchor>
+            </w:drawing>
+          </mc:Choice>
+          <mc:Fallback>
+            <w:pict>
+              <v:roundrect w14:anchorId="3A54AA77" id="risk_map_box_5" o:spid="_x0000_s1046" style="position:absolute;margin-left:316pt;margin-top:98.65pt;width:155pt;height:68pt;z-index:251724800;visibility:visible;mso-wrap-style:square;mso-wrap-distance-left:9pt;mso-wrap-distance-top:0;mso-wrap-distance-right:9pt;mso-wrap-distance-bottom:0;mso-position-horizontal:absolute;mso-position-horizontal-relative:text;mso-position-vertical:absolute;mso-position-vertical-relative:text;v-text-anchor:middle" arcsize="10923f" o:gfxdata="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" fillcolor="#fef2f2" strokecolor="#dc2626" strokeweight="1.4pt">
+                <v:stroke joinstyle="miter"/>
+                <v:textbox inset="7pt,5pt,7pt,5pt">
+                  <w:txbxContent>
+                    <w:p>
+                      <w:pPr>
+                        <w:jc w:val="center"/>
+                        <w:rPr>
+                          <w:rFonts w:ascii="Aptos" w:hAnsi="Aptos"/>
+                          <w:b/>
+                          <w:color w:val="1F2937"/>
+                          <w:sz w:val="18"/>
+                        </w:rPr>
+                      </w:pPr>
+                      <w:r>
+                        <w:rPr>
+                          <w:rFonts w:ascii="Aptos" w:hAnsi="Aptos"/>
+                          <w:b/>
+                          <w:color w:val="1F2937"/>
+                          <w:sz w:val="18"/>
+                        </w:rPr>
+                        <w:t>{risk_shape_5_title}</w:t>
+                      </w:r>
+                    </w:p>
+                    <w:p>
+                      <w:pPr>
+                        <w:jc w:val="center"/>
+                        <w:rPr>
+                          <w:rFonts w:ascii="Aptos" w:hAnsi="Aptos"/>
+                          <w:color w:val="1F2937"/>
+                          <w:sz w:val="16"/>
+                        </w:rPr>
+                      </w:pPr>
+                      <w:r>
+                        <w:rPr>
+                          <w:rFonts w:ascii="Aptos" w:hAnsi="Aptos"/>
+                          <w:color w:val="1F2937"/>
+                          <w:sz w:val="16"/>
+                        </w:rPr>
+                        <w:t>{risk_shape_5_body}</w:t>
+                      </w:r>
+                    </w:p>
+                  </w:txbxContent>
+                </v:textbox>
+              </v:roundrect>
+            </w:pict>
+          </mc:Fallback>
+        </mc:AlternateContent>
+      </w:r>
+      <w:r>
+        <w:rPr>
+          <w:noProof/>
+        </w:rPr>
+        <mc:AlternateContent>
+          <mc:Choice Requires="wps">
+            <w:drawing>
+              <wp:anchor distT="0" distB="0" distL="114300" distR="114300" simplePos="0" relativeHeight="251723776" behindDoc="0" locked="0" layoutInCell="1" allowOverlap="1" wp14:anchorId="7A974F40" wp14:editId="0A30AE2B">
+                <wp:simplePos x="0" y="0"/>
+                <wp:positionH relativeFrom="column">
+                  <wp:posOffset>1409700</wp:posOffset>
+                </wp:positionH>
+                <wp:positionV relativeFrom="paragraph">
+                  <wp:posOffset>1252855</wp:posOffset>
+                </wp:positionV>
+                <wp:extent cx="1968500" cy="863600"/>
+                <wp:effectExtent l="0" t="0" r="12700" b="12700"/>
+                <wp:wrapNone/>
+                <wp:docPr id="200717047" name="risk_map_box_4"/>
+                <wp:cNvGraphicFramePr/>
+                <a:graphic xmlns:a="http://schemas.openxmlformats.org/drawingml/2006/main">
+                  <a:graphicData uri="http://schemas.microsoft.com/office/word/2010/wordprocessingShape">
+                    <wps:wsp>
+                      <wps:cNvSpPr/>
+                      <wps:spPr>
+                        <a:xfrm>
+                          <a:off x="0" y="0"/>
+                          <a:ext cx="1968500" cy="863600"/>
+                        </a:xfrm>
+                        <a:prstGeom prst="roundRect">
+                          <a:avLst/>
+                        </a:prstGeom>
+                        <a:solidFill>
+                          <a:srgbClr val="FEF2F2"/>
+                        </a:solidFill>
+                        <a:ln w="17780">
+                          <a:solidFill>
+                            <a:srgbClr val="DC2626"/>
+                          </a:solidFill>
+                        </a:ln>
+                      </wps:spPr>
+                      <wps:style>
+                        <a:lnRef idx="2">
+                          <a:schemeClr val="accent1">
+                            <a:shade val="15000"/>
+                          </a:schemeClr>
+                        </a:lnRef>
+                        <a:fillRef idx="1">
+                          <a:schemeClr val="accent1"/>
+                        </a:fillRef>
+                        <a:effectRef idx="0">
+                          <a:schemeClr val="accent1"/>
+                        </a:effectRef>
+                        <a:fontRef idx="minor">
+                          <a:schemeClr val="lt1"/>
+                        </a:fontRef>
+                      </wps:style>
+                      <wps:txbx>
+                        <w:txbxContent>
+                          <w:p>
+                            <w:pPr>
+                              <w:jc w:val="center"/>
+                              <w:rPr>
+                                <w:rFonts w:ascii="Aptos" w:hAnsi="Aptos"/>
+                                <w:b/>
+                                <w:color w:val="1F2937"/>
+                                <w:sz w:val="18"/>
+                              </w:rPr>
+                            </w:pPr>
+                            <w:r>
+                              <w:rPr>
+                                <w:rFonts w:ascii="Aptos" w:hAnsi="Aptos"/>
+                                <w:b/>
+                                <w:color w:val="1F2937"/>
+                                <w:sz w:val="18"/>
+                              </w:rPr>
+                              <w:t>{risk_shape_4_title}</w:t>
+                            </w:r>
+                          </w:p>
+                          <w:p>
+                            <w:pPr>
+                              <w:jc w:val="center"/>
+                              <w:rPr>
+                                <w:rFonts w:ascii="Aptos" w:hAnsi="Aptos"/>
+                                <w:color w:val="1F2937"/>
+                                <w:sz w:val="16"/>
+                              </w:rPr>
+                            </w:pPr>
+                            <w:r>
+                              <w:rPr>
+                                <w:rFonts w:ascii="Aptos" w:hAnsi="Aptos"/>
+                                <w:color w:val="1F2937"/>
+                                <w:sz w:val="16"/>
+                              </w:rPr>
+                              <w:t>{risk_shape_4_body}</w:t>
+                            </w:r>
+                          </w:p>
+                        </w:txbxContent>
+                      </wps:txbx>
+                      <wps:bodyPr rot="0" spcFirstLastPara="0" vertOverflow="overflow" horzOverflow="overflow" vert="horz" wrap="square" lIns="88900" tIns="63500" rIns="88900" bIns="63500" numCol="1" spcCol="0" rtlCol="0" fromWordArt="0" anchor="ctr" anchorCtr="0" forceAA="0" compatLnSpc="1">
+                        <a:prstTxWarp prst="textNoShape">
+                          <a:avLst/>
+                        </a:prstTxWarp>
+                        <a:noAutofit/>
+                      </wps:bodyPr>
+                    </wps:wsp>
+                  </a:graphicData>
+                </a:graphic>
+              </wp:anchor>
+            </w:drawing>
+          </mc:Choice>
+          <mc:Fallback>
+            <w:pict>
+              <v:roundrect w14:anchorId="7A974F40" id="risk_map_box_4" o:spid="_x0000_s1047" style="position:absolute;margin-left:111pt;margin-top:98.65pt;width:155pt;height:68pt;z-index:251723776;visibility:visible;mso-wrap-style:square;mso-wrap-distance-left:9pt;mso-wrap-distance-top:0;mso-wrap-distance-right:9pt;mso-wrap-distance-bottom:0;mso-position-horizontal:absolute;mso-position-horizontal-relative:text;mso-position-vertical:absolute;mso-position-vertical-relative:text;v-text-anchor:middle" arcsize="10923f" o:gfxdata="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" fillcolor="#fef2f2" strokecolor="#dc2626" strokeweight="1.4pt">
+                <v:stroke joinstyle="miter"/>
+                <v:textbox inset="7pt,5pt,7pt,5pt">
+                  <w:txbxContent>
+                    <w:p>
+                      <w:pPr>
+                        <w:jc w:val="center"/>
+                        <w:rPr>
+                          <w:rFonts w:ascii="Aptos" w:hAnsi="Aptos"/>
+                          <w:b/>
+                          <w:color w:val="1F2937"/>
+                          <w:sz w:val="18"/>
+                        </w:rPr>
+                      </w:pPr>
+                      <w:r>
+                        <w:rPr>
+                          <w:rFonts w:ascii="Aptos" w:hAnsi="Aptos"/>
+                          <w:b/>
+                          <w:color w:val="1F2937"/>
+                          <w:sz w:val="18"/>
+                        </w:rPr>
+                        <w:t>{risk_shape_4_title}</w:t>
+                      </w:r>
+                    </w:p>
+                    <w:p>
+                      <w:pPr>
+                        <w:jc w:val="center"/>
+                        <w:rPr>
+                          <w:rFonts w:ascii="Aptos" w:hAnsi="Aptos"/>
+                          <w:color w:val="1F2937"/>
+                          <w:sz w:val="16"/>
+                        </w:rPr>
+                      </w:pPr>
+                      <w:r>
+                        <w:rPr>
+                          <w:rFonts w:ascii="Aptos" w:hAnsi="Aptos"/>
+                          <w:color w:val="1F2937"/>
+                          <w:sz w:val="16"/>
+                        </w:rPr>
+                        <w:t>{risk_shape_4_body}</w:t>
+                      </w:r>
+                    </w:p>
+                  </w:txbxContent>
+                </v:textbox>
+              </v:roundrect>
+            </w:pict>
+          </mc:Fallback>
+        </mc:AlternateContent>
+      </w:r>
+      <w:r>
+        <w:rPr>
+          <w:noProof/>
+        </w:rPr>
+        <mc:AlternateContent>
+          <mc:Choice Requires="wps">
+            <w:drawing>
+              <wp:anchor distT="0" distB="0" distL="114300" distR="114300" simplePos="0" relativeHeight="251722752" behindDoc="0" locked="0" layoutInCell="1" allowOverlap="1" wp14:anchorId="1C3635D4" wp14:editId="5732B8C2">
+                <wp:simplePos x="0" y="0"/>
+                <wp:positionH relativeFrom="column">
+                  <wp:posOffset>5321300</wp:posOffset>
+                </wp:positionH>
+                <wp:positionV relativeFrom="paragraph">
+                  <wp:posOffset>46355</wp:posOffset>
+                </wp:positionV>
+                <wp:extent cx="1968500" cy="863600"/>
+                <wp:effectExtent l="0" t="0" r="12700" b="12700"/>
+                <wp:wrapNone/>
+                <wp:docPr id="2048368110" name="risk_map_box_3"/>
+                <wp:cNvGraphicFramePr/>
+                <a:graphic xmlns:a="http://schemas.openxmlformats.org/drawingml/2006/main">
+                  <a:graphicData uri="http://schemas.microsoft.com/office/word/2010/wordprocessingShape">
+                    <wps:wsp>
+                      <wps:cNvSpPr/>
+                      <wps:spPr>
+                        <a:xfrm>
+                          <a:off x="0" y="0"/>
+                          <a:ext cx="1968500" cy="863600"/>
+                        </a:xfrm>
+                        <a:prstGeom prst="roundRect">
+                          <a:avLst/>
+                        </a:prstGeom>
+                        <a:solidFill>
+                          <a:srgbClr val="FEF2F2"/>
+                        </a:solidFill>
+                        <a:ln w="17780">
+                          <a:solidFill>
+                            <a:srgbClr val="DC2626"/>
+                          </a:solidFill>
+                        </a:ln>
+                      </wps:spPr>
+                      <wps:style>
+                        <a:lnRef idx="2">
+                          <a:schemeClr val="accent1">
+                            <a:shade val="15000"/>
+                          </a:schemeClr>
+                        </a:lnRef>
+                        <a:fillRef idx="1">
+                          <a:schemeClr val="accent1"/>
+                        </a:fillRef>
+                        <a:effectRef idx="0">
+                          <a:schemeClr val="accent1"/>
+                        </a:effectRef>
+                        <a:fontRef idx="minor">
+                          <a:schemeClr val="lt1"/>
+                        </a:fontRef>
+                      </wps:style>
+                      <wps:txbx>
+                        <w:txbxContent>
+                          <w:p>
+                            <w:pPr>
+                              <w:jc w:val="center"/>
+                              <w:rPr>
+                                <w:rFonts w:ascii="Aptos" w:hAnsi="Aptos"/>
+                                <w:b/>
+                                <w:color w:val="1F2937"/>
+                                <w:sz w:val="18"/>
+                              </w:rPr>
+                            </w:pPr>
+                            <w:r>
+                              <w:rPr>
+                                <w:rFonts w:ascii="Aptos" w:hAnsi="Aptos"/>
+                                <w:b/>
+                                <w:color w:val="1F2937"/>
+                                <w:sz w:val="18"/>
+                              </w:rPr>
+                              <w:t>{risk_shape_3_title}</w:t>
+                            </w:r>
+                          </w:p>
+                          <w:p>
+                            <w:pPr>
+                              <w:jc w:val="center"/>
+                              <w:rPr>
+                                <w:rFonts w:ascii="Aptos" w:hAnsi="Aptos"/>
+                                <w:color w:val="1F2937"/>
+                                <w:sz w:val="16"/>
+                              </w:rPr>
+                            </w:pPr>
+                            <w:r>
+                              <w:rPr>
+                                <w:rFonts w:ascii="Aptos" w:hAnsi="Aptos"/>
+                                <w:color w:val="1F2937"/>
+                                <w:sz w:val="16"/>
+                              </w:rPr>
+                              <w:t>{risk_shape_3_body}</w:t>
+                            </w:r>
+                          </w:p>
+                        </w:txbxContent>
+                      </wps:txbx>
+                      <wps:bodyPr rot="0" spcFirstLastPara="0" vertOverflow="overflow" horzOverflow="overflow" vert="horz" wrap="square" lIns="88900" tIns="63500" rIns="88900" bIns="63500" numCol="1" spcCol="0" rtlCol="0" fromWordArt="0" anchor="ctr" anchorCtr="0" forceAA="0" compatLnSpc="1">
+                        <a:prstTxWarp prst="textNoShape">
+                          <a:avLst/>
+                        </a:prstTxWarp>
+                        <a:noAutofit/>
+                      </wps:bodyPr>
+                    </wps:wsp>
+                  </a:graphicData>
+                </a:graphic>
+              </wp:anchor>
+            </w:drawing>
+          </mc:Choice>
+          <mc:Fallback>
+            <w:pict>
+              <v:roundrect w14:anchorId="1C3635D4" id="risk_map_box_3" o:spid="_x0000_s1048" style="position:absolute;margin-left:419pt;margin-top:3.65pt;width:155pt;height:68pt;z-index:251722752;visibility:visible;mso-wrap-style:square;mso-wrap-distance-left:9pt;mso-wrap-distance-top:0;mso-wrap-distance-right:9pt;mso-wrap-distance-bottom:0;mso-position-horizontal:absolute;mso-position-horizontal-relative:text;mso-position-vertical:absolute;mso-position-vertical-relative:text;v-text-anchor:middle" arcsize="10923f" o:gfxdata="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" fillcolor="#fef2f2" strokecolor="#dc2626" strokeweight="1.4pt">
+                <v:stroke joinstyle="miter"/>
+                <v:textbox inset="7pt,5pt,7pt,5pt">
+                  <w:txbxContent>
+                    <w:p>
+                      <w:pPr>
+                        <w:jc w:val="center"/>
+                        <w:rPr>
+                          <w:rFonts w:ascii="Aptos" w:hAnsi="Aptos"/>
+                          <w:b/>
+                          <w:color w:val="1F2937"/>
+                          <w:sz w:val="18"/>
+                        </w:rPr>
+                      </w:pPr>
+                      <w:r>
+                        <w:rPr>
+                          <w:rFonts w:ascii="Aptos" w:hAnsi="Aptos"/>
+                          <w:b/>
+                          <w:color w:val="1F2937"/>
+                          <w:sz w:val="18"/>
+                        </w:rPr>
+                        <w:t>{risk_shape_3_title}</w:t>
+                      </w:r>
+                    </w:p>
+                    <w:p>
+                      <w:pPr>
+                        <w:jc w:val="center"/>
+                        <w:rPr>
+                          <w:rFonts w:ascii="Aptos" w:hAnsi="Aptos"/>
+                          <w:color w:val="1F2937"/>
+                          <w:sz w:val="16"/>
+                        </w:rPr>
+                      </w:pPr>
+                      <w:r>
+                        <w:rPr>
+                          <w:rFonts w:ascii="Aptos" w:hAnsi="Aptos"/>
+                          <w:color w:val="1F2937"/>
+                          <w:sz w:val="16"/>
+                        </w:rPr>
+                        <w:t>{risk_shape_3_body}</w:t>
+                      </w:r>
+                    </w:p>
+                  </w:txbxContent>
+                </v:textbox>
+              </v:roundrect>
+            </w:pict>
+          </mc:Fallback>
+        </mc:AlternateContent>
+      </w:r>
+      <w:r>
+        <w:rPr>
+          <w:noProof/>
+        </w:rPr>
+        <mc:AlternateContent>
+          <mc:Choice Requires="wps">
+            <w:drawing>
+              <wp:anchor distT="0" distB="0" distL="114300" distR="114300" simplePos="0" relativeHeight="251721728" behindDoc="0" locked="0" layoutInCell="1" allowOverlap="1" wp14:anchorId="44F5B2C7" wp14:editId="631E8BC8">
+                <wp:simplePos x="0" y="0"/>
+                <wp:positionH relativeFrom="column">
+                  <wp:posOffset>2717800</wp:posOffset>
+                </wp:positionH>
+                <wp:positionV relativeFrom="paragraph">
+                  <wp:posOffset>46355</wp:posOffset>
+                </wp:positionV>
+                <wp:extent cx="1968500" cy="863600"/>
+                <wp:effectExtent l="0" t="0" r="12700" b="12700"/>
+                <wp:wrapNone/>
+                <wp:docPr id="985322589" name="risk_map_box_2"/>
+                <wp:cNvGraphicFramePr/>
+                <a:graphic xmlns:a="http://schemas.openxmlformats.org/drawingml/2006/main">
+                  <a:graphicData uri="http://schemas.microsoft.com/office/word/2010/wordprocessingShape">
+                    <wps:wsp>
+                      <wps:cNvSpPr/>
+                      <wps:spPr>
+                        <a:xfrm>
+                          <a:off x="0" y="0"/>
+                          <a:ext cx="1968500" cy="863600"/>
+                        </a:xfrm>
+                        <a:prstGeom prst="roundRect">
+                          <a:avLst/>
+                        </a:prstGeom>
+                        <a:solidFill>
+                          <a:srgbClr val="FEF2F2"/>
+                        </a:solidFill>
+                        <a:ln w="17780">
+                          <a:solidFill>
+                            <a:srgbClr val="DC2626"/>
+                          </a:solidFill>
+                        </a:ln>
+                      </wps:spPr>
+                      <wps:style>
+                        <a:lnRef idx="2">
+                          <a:schemeClr val="accent1">
+                            <a:shade val="15000"/>
+                          </a:schemeClr>
+                        </a:lnRef>
+                        <a:fillRef idx="1">
+                          <a:schemeClr val="accent1"/>
+                        </a:fillRef>
+                        <a:effectRef idx="0">
+                          <a:schemeClr val="accent1"/>
+                        </a:effectRef>
+                        <a:fontRef idx="minor">
+                          <a:schemeClr val="lt1"/>
+                        </a:fontRef>
+                      </wps:style>
+                      <wps:txbx>
+                        <w:txbxContent>
+                          <w:p>
+                            <w:pPr>
+                              <w:jc w:val="center"/>
+                              <w:rPr>
+                                <w:rFonts w:ascii="Aptos" w:hAnsi="Aptos"/>
+                                <w:b/>
+                                <w:color w:val="1F2937"/>
+                                <w:sz w:val="18"/>
+                              </w:rPr>
+                            </w:pPr>
+                            <w:r>
+                              <w:rPr>
+                                <w:rFonts w:ascii="Aptos" w:hAnsi="Aptos"/>
+                                <w:b/>
+                                <w:color w:val="1F2937"/>
+                                <w:sz w:val="18"/>
+                              </w:rPr>
+                              <w:t>{risk_shape_2_title}</w:t>
+                            </w:r>
+                          </w:p>
+                          <w:p>
+                            <w:pPr>
+                              <w:jc w:val="center"/>
+                              <w:rPr>
+                                <w:rFonts w:ascii="Aptos" w:hAnsi="Aptos"/>
+                                <w:color w:val="1F2937"/>
+                                <w:sz w:val="16"/>
+                              </w:rPr>
+                            </w:pPr>
+                            <w:r>
+                              <w:rPr>
+                                <w:rFonts w:ascii="Aptos" w:hAnsi="Aptos"/>
+                                <w:color w:val="1F2937"/>
+                                <w:sz w:val="16"/>
+                              </w:rPr>
+                              <w:t>{risk_shape_2_body}</w:t>
+                            </w:r>
+                          </w:p>
+                        </w:txbxContent>
+                      </wps:txbx>
+                      <wps:bodyPr rot="0" spcFirstLastPara="0" vertOverflow="overflow" horzOverflow="overflow" vert="horz" wrap="square" lIns="88900" tIns="63500" rIns="88900" bIns="63500" numCol="1" spcCol="0" rtlCol="0" fromWordArt="0" anchor="ctr" anchorCtr="0" forceAA="0" compatLnSpc="1">
+                        <a:prstTxWarp prst="textNoShape">
+                          <a:avLst/>
+                        </a:prstTxWarp>
+                        <a:noAutofit/>
+                      </wps:bodyPr>
+                    </wps:wsp>
+                  </a:graphicData>
+                </a:graphic>
+              </wp:anchor>
+            </w:drawing>
+          </mc:Choice>
+          <mc:Fallback>
+            <w:pict>
+              <v:roundrect w14:anchorId="44F5B2C7" id="risk_map_box_2" o:spid="_x0000_s1049" style="position:absolute;margin-left:214pt;margin-top:3.65pt;width:155pt;height:68pt;z-index:251721728;visibility:visible;mso-wrap-style:square;mso-wrap-distance-left:9pt;mso-wrap-distance-top:0;mso-wrap-distance-right:9pt;mso-wrap-distance-bottom:0;mso-position-horizontal:absolute;mso-position-horizontal-relative:text;mso-position-vertical:absolute;mso-position-vertical-relative:text;v-text-anchor:middle" arcsize="10923f" o:gfxdata="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" fillcolor="#fef2f2" strokecolor="#dc2626" strokeweight="1.4pt">
+                <v:stroke joinstyle="miter"/>
+                <v:textbox inset="7pt,5pt,7pt,5pt">
+                  <w:txbxContent>
+                    <w:p>
+                      <w:pPr>
+                        <w:jc w:val="center"/>
+                        <w:rPr>
+                          <w:rFonts w:ascii="Aptos" w:hAnsi="Aptos"/>
+                          <w:b/>
+                          <w:color w:val="1F2937"/>
+                          <w:sz w:val="18"/>
+                        </w:rPr>
+                      </w:pPr>
+                      <w:r>
+                        <w:rPr>
+                          <w:rFonts w:ascii="Aptos" w:hAnsi="Aptos"/>
+                          <w:b/>
+                          <w:color w:val="1F2937"/>
+                          <w:sz w:val="18"/>
+                        </w:rPr>
+                        <w:t>{risk_shape_2_title}</w:t>
+                      </w:r>
+                    </w:p>
+                    <w:p>
+                      <w:pPr>
+                        <w:jc w:val="center"/>
+                        <w:rPr>
+                          <w:rFonts w:ascii="Aptos" w:hAnsi="Aptos"/>
+                          <w:color w:val="1F2937"/>
+                          <w:sz w:val="16"/>
+                        </w:rPr>
+                      </w:pPr>
+                      <w:r>
+                        <w:rPr>
+                          <w:rFonts w:ascii="Aptos" w:hAnsi="Aptos"/>
+                          <w:color w:val="1F2937"/>
+                          <w:sz w:val="16"/>
+                        </w:rPr>
+                        <w:t>{risk_shape_2_body}</w:t>
+                      </w:r>
+                    </w:p>
+                  </w:txbxContent>
+                </v:textbox>
+              </v:roundrect>
+            </w:pict>
+          </mc:Fallback>
+        </mc:AlternateContent>
+      </w:r>
+      <w:r>
+        <w:rPr>
+          <w:noProof/>
+        </w:rPr>
+        <mc:AlternateContent>
+          <mc:Choice Requires="wps">
+            <w:drawing>
+              <wp:anchor distT="0" distB="0" distL="114300" distR="114300" simplePos="0" relativeHeight="251720704" behindDoc="0" locked="0" layoutInCell="1" allowOverlap="1" wp14:anchorId="259294C8" wp14:editId="7ED3C70F">
+                <wp:simplePos x="0" y="0"/>
+                <wp:positionH relativeFrom="column">
+                  <wp:posOffset>114300</wp:posOffset>
+                </wp:positionH>
+                <wp:positionV relativeFrom="paragraph">
+                  <wp:posOffset>46355</wp:posOffset>
+                </wp:positionV>
+                <wp:extent cx="1968500" cy="863600"/>
+                <wp:effectExtent l="0" t="0" r="12700" b="12700"/>
+                <wp:wrapNone/>
+                <wp:docPr id="1279934026" name="risk_map_box_1"/>
+                <wp:cNvGraphicFramePr/>
+                <a:graphic xmlns:a="http://schemas.openxmlformats.org/drawingml/2006/main">
+                  <a:graphicData uri="http://schemas.microsoft.com/office/word/2010/wordprocessingShape">
+                    <wps:wsp>
+                      <wps:cNvSpPr/>
+                      <wps:spPr>
+                        <a:xfrm>
+                          <a:off x="0" y="0"/>
+                          <a:ext cx="1968500" cy="863600"/>
+                        </a:xfrm>
+                        <a:prstGeom prst="roundRect">
+                          <a:avLst/>
+                        </a:prstGeom>
+                        <a:solidFill>
+                          <a:srgbClr val="FEF2F2"/>
+                        </a:solidFill>
+                        <a:ln w="17780">
+                          <a:solidFill>
+                            <a:srgbClr val="DC2626"/>
+                          </a:solidFill>
+                        </a:ln>
+                      </wps:spPr>
+                      <wps:style>
+                        <a:lnRef idx="2">
+                          <a:schemeClr val="accent1">
+                            <a:shade val="15000"/>
+                          </a:schemeClr>
+                        </a:lnRef>
+                        <a:fillRef idx="1">
+                          <a:schemeClr val="accent1"/>
+                        </a:fillRef>
+                        <a:effectRef idx="0">
+                          <a:schemeClr val="accent1"/>
+                        </a:effectRef>
+                        <a:fontRef idx="minor">
+                          <a:schemeClr val="lt1"/>
+                        </a:fontRef>
+                      </wps:style>
+                      <wps:txbx>
+                        <w:txbxContent>
+                          <w:p>
+                            <w:pPr>
+                              <w:jc w:val="center"/>
+                              <w:rPr>
+                                <w:rFonts w:ascii="Aptos" w:hAnsi="Aptos"/>
+                                <w:b/>
+                                <w:color w:val="1F2937"/>
+                                <w:sz w:val="18"/>
+                              </w:rPr>
+                            </w:pPr>
+                            <w:r>
+                              <w:rPr>
+                                <w:rFonts w:ascii="Aptos" w:hAnsi="Aptos"/>
+                                <w:b/>
+                                <w:color w:val="1F2937"/>
+                                <w:sz w:val="18"/>
+                              </w:rPr>
+                              <w:t>{risk_shape_1_title}</w:t>
+                            </w:r>
+                          </w:p>
+                          <w:p>
+                            <w:pPr>
+                              <w:jc w:val="center"/>
+                              <w:rPr>
+                                <w:rFonts w:ascii="Aptos" w:hAnsi="Aptos"/>
+                                <w:color w:val="1F2937"/>
+                                <w:sz w:val="16"/>
+                              </w:rPr>
+                            </w:pPr>
+                            <w:r>
+                              <w:rPr>
+                                <w:rFonts w:ascii="Aptos" w:hAnsi="Aptos"/>
+                                <w:color w:val="1F2937"/>
+                                <w:sz w:val="16"/>
+                              </w:rPr>
+                              <w:t>{risk_shape_1_body}</w:t>
+                            </w:r>
+                          </w:p>
+                        </w:txbxContent>
+                      </wps:txbx>
+                      <wps:bodyPr rot="0" spcFirstLastPara="0" vertOverflow="overflow" horzOverflow="overflow" vert="horz" wrap="square" lIns="88900" tIns="63500" rIns="88900" bIns="63500" numCol="1" spcCol="0" rtlCol="0" fromWordArt="0" anchor="ctr" anchorCtr="0" forceAA="0" compatLnSpc="1">
+                        <a:prstTxWarp prst="textNoShape">
+                          <a:avLst/>
+                        </a:prstTxWarp>
+                        <a:noAutofit/>
+                      </wps:bodyPr>
+                    </wps:wsp>
+                  </a:graphicData>
+                </a:graphic>
+              </wp:anchor>
+            </w:drawing>
+          </mc:Choice>
+          <mc:Fallback>
+            <w:pict>
+              <v:roundrect w14:anchorId="259294C8" id="risk_map_box_1" o:spid="_x0000_s1050" style="position:absolute;margin-left:9pt;margin-top:3.65pt;width:155pt;height:68pt;z-index:251720704;visibility:visible;mso-wrap-style:square;mso-wrap-distance-left:9pt;mso-wrap-distance-top:0;mso-wrap-distance-right:9pt;mso-wrap-distance-bottom:0;mso-position-horizontal:absolute;mso-position-horizontal-relative:text;mso-position-vertical:absolute;mso-position-vertical-relative:text;v-text-anchor:middle" arcsize="10923f" o:gfxdata="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" fillcolor="#fef2f2" strokecolor="#dc2626" strokeweight="1.4pt">
+                <v:stroke joinstyle="miter"/>
+                <v:textbox inset="7pt,5pt,7pt,5pt">
+                  <w:txbxContent>
+                    <w:p>
+                      <w:pPr>
+                        <w:jc w:val="center"/>
+                        <w:rPr>
+                          <w:rFonts w:ascii="Aptos" w:hAnsi="Aptos"/>
+                          <w:b/>
+                          <w:color w:val="1F2937"/>
+                          <w:sz w:val="18"/>
+                        </w:rPr>
+                      </w:pPr>
+                      <w:r>
+                        <w:rPr>
+                          <w:rFonts w:ascii="Aptos" w:hAnsi="Aptos"/>
+                          <w:b/>
+                          <w:color w:val="1F2937"/>
+                          <w:sz w:val="18"/>
+                        </w:rPr>
+                        <w:t>{risk_shape_1_title}</w:t>
+                      </w:r>
+                    </w:p>
+                    <w:p>
+                      <w:pPr>
+                        <w:jc w:val="center"/>
+                        <w:rPr>
+                          <w:rFonts w:ascii="Aptos" w:hAnsi="Aptos"/>
+                          <w:color w:val="1F2937"/>
+                          <w:sz w:val="16"/>
+                        </w:rPr>
+                      </w:pPr>
+                      <w:r>
+                        <w:rPr>
+                          <w:rFonts w:ascii="Aptos" w:hAnsi="Aptos"/>
+                          <w:color w:val="1F2937"/>
+                          <w:sz w:val="16"/>
+                        </w:rPr>
+                        <w:t>{risk_shape_1_body}</w:t>
+                      </w:r>
+                    </w:p>
+                  </w:txbxContent>
+                </v:textbox>
+              </v:roundrect>
+            </w:pict>
+          </mc:Fallback>
+        </mc:AlternateContent>
       </w:r>
     </w:p>
     <w:tbl>
@@ -10867,8 +13749,6 @@
           <w:p>
             <w:pPr>
               <w:spacing w:after="0"/>
-            </w:pPr>
-            <w:r>
               <w:rPr>
                 <w:b/>
                 <w:bCs/>
@@ -10876,7 +13756,939 @@
                 <w:sz w:val="22"/>
                 <w:szCs w:val="22"/>
               </w:rPr>
+            </w:pPr>
+            <w:r>
+              <w:rPr>
+                <w:b/>
+                <w:bCs/>
+                <w:color w:val="1E3A8A"/>
+                <w:sz w:val="22"/>
+                <w:szCs w:val="22"/>
+              </w:rPr>
               <w:t>Recomendacoes e roadmap</w:t>
+            </w:r>
+          </w:p>
+          <w:p>
+            <w:pPr>
+              <w:spacing w:after="0"/>
+              <w:rPr>
+                <w:b/>
+                <w:bCs/>
+                <w:color w:val="1E3A8A"/>
+                <w:sz w:val="22"/>
+                <w:szCs w:val="22"/>
+              </w:rPr>
+            </w:pPr>
+          </w:p>
+          <w:p>
+            <w:pPr>
+              <w:spacing w:after="0"/>
+              <w:rPr>
+                <w:b/>
+                <w:bCs/>
+                <w:color w:val="1E3A8A"/>
+                <w:sz w:val="22"/>
+                <w:szCs w:val="22"/>
+              </w:rPr>
+            </w:pPr>
+          </w:p>
+          <w:p>
+            <w:pPr>
+              <w:spacing w:after="0"/>
+              <w:rPr>
+                <w:b/>
+                <w:bCs/>
+                <w:color w:val="1E3A8A"/>
+                <w:sz w:val="22"/>
+                <w:szCs w:val="22"/>
+              </w:rPr>
+            </w:pPr>
+          </w:p>
+          <w:p>
+            <w:pPr>
+              <w:spacing w:after="0"/>
+              <w:rPr>
+                <w:b/>
+                <w:bCs/>
+                <w:color w:val="1E3A8A"/>
+                <w:sz w:val="22"/>
+                <w:szCs w:val="22"/>
+              </w:rPr>
+            </w:pPr>
+          </w:p>
+          <w:p>
+            <w:pPr>
+              <w:spacing w:after="0"/>
+              <w:rPr>
+                <w:b/>
+                <w:bCs/>
+                <w:color w:val="1E3A8A"/>
+                <w:sz w:val="22"/>
+                <w:szCs w:val="22"/>
+              </w:rPr>
+            </w:pPr>
+          </w:p>
+          <w:p>
+            <w:pPr>
+              <w:spacing w:after="0"/>
+              <w:rPr>
+                <w:b/>
+                <w:bCs/>
+                <w:color w:val="1E3A8A"/>
+                <w:sz w:val="22"/>
+                <w:szCs w:val="22"/>
+              </w:rPr>
+            </w:pPr>
+          </w:p>
+          <w:p>
+            <w:pPr>
+              <w:spacing w:after="0"/>
+              <w:rPr>
+                <w:b/>
+                <w:bCs/>
+                <w:color w:val="1E3A8A"/>
+                <w:sz w:val="22"/>
+                <w:szCs w:val="22"/>
+              </w:rPr>
+            </w:pPr>
+          </w:p>
+          <w:p>
+            <w:pPr>
+              <w:spacing w:after="0"/>
+              <w:rPr>
+                <w:b/>
+                <w:bCs/>
+                <w:color w:val="1E3A8A"/>
+                <w:sz w:val="22"/>
+                <w:szCs w:val="22"/>
+              </w:rPr>
+            </w:pPr>
+          </w:p>
+          <w:p>
+            <w:pPr>
+              <w:spacing w:after="0"/>
+              <w:rPr>
+                <w:b/>
+                <w:bCs/>
+                <w:color w:val="1E3A8A"/>
+                <w:sz w:val="22"/>
+                <w:szCs w:val="22"/>
+              </w:rPr>
+            </w:pPr>
+          </w:p>
+          <w:p>
+            <w:pPr>
+              <w:spacing w:after="0"/>
+            </w:pPr>
+            <w:r>
+              <w:rPr>
+                <w:noProof/>
+              </w:rPr>
+              <mc:AlternateContent>
+                <mc:Choice Requires="wps">
+                  <w:drawing>
+                    <wp:anchor distT="0" distB="0" distL="114300" distR="114300" simplePos="0" relativeHeight="251734016" behindDoc="0" locked="0" layoutInCell="1" allowOverlap="1" wp14:anchorId="020AEC83" wp14:editId="50B942F6">
+                      <wp:simplePos x="0" y="0"/>
+                      <wp:positionH relativeFrom="column">
+                        <wp:posOffset>6217285</wp:posOffset>
+                      </wp:positionH>
+                      <wp:positionV relativeFrom="paragraph">
+                        <wp:posOffset>565785</wp:posOffset>
+                      </wp:positionV>
+                      <wp:extent cx="1270000" cy="1168400"/>
+                      <wp:effectExtent l="0" t="0" r="25400" b="12700"/>
+                      <wp:wrapNone/>
+                      <wp:docPr id="2056036199" name="roadmap_map_box_5"/>
+                      <wp:cNvGraphicFramePr/>
+                      <a:graphic xmlns:a="http://schemas.openxmlformats.org/drawingml/2006/main">
+                        <a:graphicData uri="http://schemas.microsoft.com/office/word/2010/wordprocessingShape">
+                          <wps:wsp>
+                            <wps:cNvSpPr/>
+                            <wps:spPr>
+                              <a:xfrm>
+                                <a:off x="0" y="0"/>
+                                <a:ext cx="1270000" cy="1168400"/>
+                              </a:xfrm>
+                              <a:prstGeom prst="roundRect">
+                                <a:avLst/>
+                              </a:prstGeom>
+                              <a:solidFill>
+                                <a:srgbClr val="F0FDF4"/>
+                              </a:solidFill>
+                              <a:ln w="17780">
+                                <a:solidFill>
+                                  <a:srgbClr val="16A34A"/>
+                                </a:solidFill>
+                              </a:ln>
+                            </wps:spPr>
+                            <wps:style>
+                              <a:lnRef idx="2">
+                                <a:schemeClr val="accent1">
+                                  <a:shade val="15000"/>
+                                </a:schemeClr>
+                              </a:lnRef>
+                              <a:fillRef idx="1">
+                                <a:schemeClr val="accent1"/>
+                              </a:fillRef>
+                              <a:effectRef idx="0">
+                                <a:schemeClr val="accent1"/>
+                              </a:effectRef>
+                              <a:fontRef idx="minor">
+                                <a:schemeClr val="lt1"/>
+                              </a:fontRef>
+                            </wps:style>
+                            <wps:txbx>
+                              <w:txbxContent>
+                                <w:p>
+                                  <w:pPr>
+                                    <w:jc w:val="center"/>
+                                    <w:rPr>
+                                      <w:rFonts w:ascii="Aptos" w:hAnsi="Aptos"/>
+                                      <w:b/>
+                                      <w:color w:val="1F2937"/>
+                                      <w:sz w:val="18"/>
+                                    </w:rPr>
+                                  </w:pPr>
+                                  <w:r>
+                                    <w:rPr>
+                                      <w:rFonts w:ascii="Aptos" w:hAnsi="Aptos"/>
+                                      <w:b/>
+                                      <w:color w:val="1F2937"/>
+                                      <w:sz w:val="18"/>
+                                    </w:rPr>
+                                    <w:t>{roadmap_shape_5_title}</w:t>
+                                  </w:r>
+                                </w:p>
+                                <w:p>
+                                  <w:pPr>
+                                    <w:jc w:val="center"/>
+                                    <w:rPr>
+                                      <w:rFonts w:ascii="Aptos" w:hAnsi="Aptos"/>
+                                      <w:color w:val="1F2937"/>
+                                      <w:sz w:val="16"/>
+                                    </w:rPr>
+                                  </w:pPr>
+                                  <w:r>
+                                    <w:rPr>
+                                      <w:rFonts w:ascii="Aptos" w:hAnsi="Aptos"/>
+                                      <w:color w:val="1F2937"/>
+                                      <w:sz w:val="16"/>
+                                    </w:rPr>
+                                    <w:t>{roadmap_shape_5_body}</w:t>
+                                  </w:r>
+                                </w:p>
+                              </w:txbxContent>
+                            </wps:txbx>
+                            <wps:bodyPr rot="0" spcFirstLastPara="0" vertOverflow="overflow" horzOverflow="overflow" vert="horz" wrap="square" lIns="88900" tIns="63500" rIns="88900" bIns="63500" numCol="1" spcCol="0" rtlCol="0" fromWordArt="0" anchor="ctr" anchorCtr="0" forceAA="0" compatLnSpc="1">
+                              <a:prstTxWarp prst="textNoShape">
+                                <a:avLst/>
+                              </a:prstTxWarp>
+                              <a:noAutofit/>
+                            </wps:bodyPr>
+                          </wps:wsp>
+                        </a:graphicData>
+                      </a:graphic>
+                    </wp:anchor>
+                  </w:drawing>
+                </mc:Choice>
+                <mc:Fallback>
+                  <w:pict>
+                    <v:roundrect w14:anchorId="020AEC83" id="roadmap_map_box_5" o:spid="_x0000_s1065" style="position:absolute;margin-left:489.55pt;margin-top:44.55pt;width:100pt;height:92pt;z-index:251734016;visibility:visible;mso-wrap-style:square;mso-wrap-distance-left:9pt;mso-wrap-distance-top:0;mso-wrap-distance-right:9pt;mso-wrap-distance-bottom:0;mso-position-horizontal:absolute;mso-position-horizontal-relative:text;mso-position-vertical:absolute;mso-position-vertical-relative:text;v-text-anchor:middle" arcsize="10923f" o:gfxdata="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" fillcolor="#f0fdf4" strokecolor="#16a34a" strokeweight="1.4pt">
+                      <v:stroke joinstyle="miter"/>
+                      <v:textbox inset="7pt,5pt,7pt,5pt">
+                        <w:txbxContent>
+                          <w:p>
+                            <w:pPr>
+                              <w:jc w:val="center"/>
+                              <w:rPr>
+                                <w:rFonts w:ascii="Aptos" w:hAnsi="Aptos"/>
+                                <w:b/>
+                                <w:color w:val="1F2937"/>
+                                <w:sz w:val="18"/>
+                              </w:rPr>
+                            </w:pPr>
+                            <w:r>
+                              <w:rPr>
+                                <w:rFonts w:ascii="Aptos" w:hAnsi="Aptos"/>
+                                <w:b/>
+                                <w:color w:val="1F2937"/>
+                                <w:sz w:val="18"/>
+                              </w:rPr>
+                              <w:t>{roadmap_shape_5_title}</w:t>
+                            </w:r>
+                          </w:p>
+                          <w:p>
+                            <w:pPr>
+                              <w:jc w:val="center"/>
+                              <w:rPr>
+                                <w:rFonts w:ascii="Aptos" w:hAnsi="Aptos"/>
+                                <w:color w:val="1F2937"/>
+                                <w:sz w:val="16"/>
+                              </w:rPr>
+                            </w:pPr>
+                            <w:r>
+                              <w:rPr>
+                                <w:rFonts w:ascii="Aptos" w:hAnsi="Aptos"/>
+                                <w:color w:val="1F2937"/>
+                                <w:sz w:val="16"/>
+                              </w:rPr>
+                              <w:t>{roadmap_shape_5_body}</w:t>
+                            </w:r>
+                          </w:p>
+                        </w:txbxContent>
+                      </v:textbox>
+                    </v:roundrect>
+                  </w:pict>
+                </mc:Fallback>
+              </mc:AlternateContent>
+            </w:r>
+            <w:r>
+              <w:rPr>
+                <w:noProof/>
+              </w:rPr>
+              <mc:AlternateContent>
+                <mc:Choice Requires="wps">
+                  <w:drawing>
+                    <wp:anchor distT="0" distB="0" distL="114300" distR="114300" simplePos="0" relativeHeight="251732992" behindDoc="0" locked="0" layoutInCell="1" allowOverlap="1" wp14:anchorId="32493762" wp14:editId="43E5F4D9">
+                      <wp:simplePos x="0" y="0"/>
+                      <wp:positionH relativeFrom="column">
+                        <wp:posOffset>4756785</wp:posOffset>
+                      </wp:positionH>
+                      <wp:positionV relativeFrom="paragraph">
+                        <wp:posOffset>565785</wp:posOffset>
+                      </wp:positionV>
+                      <wp:extent cx="1270000" cy="1168400"/>
+                      <wp:effectExtent l="0" t="0" r="25400" b="12700"/>
+                      <wp:wrapNone/>
+                      <wp:docPr id="170618146" name="roadmap_map_box_4"/>
+                      <wp:cNvGraphicFramePr/>
+                      <a:graphic xmlns:a="http://schemas.openxmlformats.org/drawingml/2006/main">
+                        <a:graphicData uri="http://schemas.microsoft.com/office/word/2010/wordprocessingShape">
+                          <wps:wsp>
+                            <wps:cNvSpPr/>
+                            <wps:spPr>
+                              <a:xfrm>
+                                <a:off x="0" y="0"/>
+                                <a:ext cx="1270000" cy="1168400"/>
+                              </a:xfrm>
+                              <a:prstGeom prst="roundRect">
+                                <a:avLst/>
+                              </a:prstGeom>
+                              <a:solidFill>
+                                <a:srgbClr val="F0FDF4"/>
+                              </a:solidFill>
+                              <a:ln w="17780">
+                                <a:solidFill>
+                                  <a:srgbClr val="16A34A"/>
+                                </a:solidFill>
+                              </a:ln>
+                            </wps:spPr>
+                            <wps:style>
+                              <a:lnRef idx="2">
+                                <a:schemeClr val="accent1">
+                                  <a:shade val="15000"/>
+                                </a:schemeClr>
+                              </a:lnRef>
+                              <a:fillRef idx="1">
+                                <a:schemeClr val="accent1"/>
+                              </a:fillRef>
+                              <a:effectRef idx="0">
+                                <a:schemeClr val="accent1"/>
+                              </a:effectRef>
+                              <a:fontRef idx="minor">
+                                <a:schemeClr val="lt1"/>
+                              </a:fontRef>
+                            </wps:style>
+                            <wps:txbx>
+                              <w:txbxContent>
+                                <w:p>
+                                  <w:pPr>
+                                    <w:jc w:val="center"/>
+                                    <w:rPr>
+                                      <w:rFonts w:ascii="Aptos" w:hAnsi="Aptos"/>
+                                      <w:b/>
+                                      <w:color w:val="1F2937"/>
+                                      <w:sz w:val="18"/>
+                                    </w:rPr>
+                                  </w:pPr>
+                                  <w:r>
+                                    <w:rPr>
+                                      <w:rFonts w:ascii="Aptos" w:hAnsi="Aptos"/>
+                                      <w:b/>
+                                      <w:color w:val="1F2937"/>
+                                      <w:sz w:val="18"/>
+                                    </w:rPr>
+                                    <w:t>{roadmap_shape_4_title}</w:t>
+                                  </w:r>
+                                </w:p>
+                                <w:p>
+                                  <w:pPr>
+                                    <w:jc w:val="center"/>
+                                    <w:rPr>
+                                      <w:rFonts w:ascii="Aptos" w:hAnsi="Aptos"/>
+                                      <w:color w:val="1F2937"/>
+                                      <w:sz w:val="16"/>
+                                    </w:rPr>
+                                  </w:pPr>
+                                  <w:r>
+                                    <w:rPr>
+                                      <w:rFonts w:ascii="Aptos" w:hAnsi="Aptos"/>
+                                      <w:color w:val="1F2937"/>
+                                      <w:sz w:val="16"/>
+                                    </w:rPr>
+                                    <w:t>{roadmap_shape_4_body}</w:t>
+                                  </w:r>
+                                </w:p>
+                              </w:txbxContent>
+                            </wps:txbx>
+                            <wps:bodyPr rot="0" spcFirstLastPara="0" vertOverflow="overflow" horzOverflow="overflow" vert="horz" wrap="square" lIns="88900" tIns="63500" rIns="88900" bIns="63500" numCol="1" spcCol="0" rtlCol="0" fromWordArt="0" anchor="ctr" anchorCtr="0" forceAA="0" compatLnSpc="1">
+                              <a:prstTxWarp prst="textNoShape">
+                                <a:avLst/>
+                              </a:prstTxWarp>
+                              <a:noAutofit/>
+                            </wps:bodyPr>
+                          </wps:wsp>
+                        </a:graphicData>
+                      </a:graphic>
+                    </wp:anchor>
+                  </w:drawing>
+                </mc:Choice>
+                <mc:Fallback>
+                  <w:pict>
+                    <v:roundrect w14:anchorId="32493762" id="roadmap_map_box_4" o:spid="_x0000_s1066" style="position:absolute;margin-left:374.55pt;margin-top:44.55pt;width:100pt;height:92pt;z-index:251732992;visibility:visible;mso-wrap-style:square;mso-wrap-distance-left:9pt;mso-wrap-distance-top:0;mso-wrap-distance-right:9pt;mso-wrap-distance-bottom:0;mso-position-horizontal:absolute;mso-position-horizontal-relative:text;mso-position-vertical:absolute;mso-position-vertical-relative:text;v-text-anchor:middle" arcsize="10923f" o:gfxdata="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" fillcolor="#f0fdf4" strokecolor="#16a34a" strokeweight="1.4pt">
+                      <v:stroke joinstyle="miter"/>
+                      <v:textbox inset="7pt,5pt,7pt,5pt">
+                        <w:txbxContent>
+                          <w:p>
+                            <w:pPr>
+                              <w:jc w:val="center"/>
+                              <w:rPr>
+                                <w:rFonts w:ascii="Aptos" w:hAnsi="Aptos"/>
+                                <w:b/>
+                                <w:color w:val="1F2937"/>
+                                <w:sz w:val="18"/>
+                              </w:rPr>
+                            </w:pPr>
+                            <w:r>
+                              <w:rPr>
+                                <w:rFonts w:ascii="Aptos" w:hAnsi="Aptos"/>
+                                <w:b/>
+                                <w:color w:val="1F2937"/>
+                                <w:sz w:val="18"/>
+                              </w:rPr>
+                              <w:t>{roadmap_shape_4_title}</w:t>
+                            </w:r>
+                          </w:p>
+                          <w:p>
+                            <w:pPr>
+                              <w:jc w:val="center"/>
+                              <w:rPr>
+                                <w:rFonts w:ascii="Aptos" w:hAnsi="Aptos"/>
+                                <w:color w:val="1F2937"/>
+                                <w:sz w:val="16"/>
+                              </w:rPr>
+                            </w:pPr>
+                            <w:r>
+                              <w:rPr>
+                                <w:rFonts w:ascii="Aptos" w:hAnsi="Aptos"/>
+                                <w:color w:val="1F2937"/>
+                                <w:sz w:val="16"/>
+                              </w:rPr>
+                              <w:t>{roadmap_shape_4_body}</w:t>
+                            </w:r>
+                          </w:p>
+                        </w:txbxContent>
+                      </v:textbox>
+                    </v:roundrect>
+                  </w:pict>
+                </mc:Fallback>
+              </mc:AlternateContent>
+            </w:r>
+            <w:r>
+              <w:rPr>
+                <w:noProof/>
+              </w:rPr>
+              <mc:AlternateContent>
+                <mc:Choice Requires="wps">
+                  <w:drawing>
+                    <wp:anchor distT="0" distB="0" distL="114300" distR="114300" simplePos="0" relativeHeight="251731968" behindDoc="0" locked="0" layoutInCell="1" allowOverlap="1" wp14:anchorId="42F7FC14" wp14:editId="2F8B5847">
+                      <wp:simplePos x="0" y="0"/>
+                      <wp:positionH relativeFrom="column">
+                        <wp:posOffset>3296285</wp:posOffset>
+                      </wp:positionH>
+                      <wp:positionV relativeFrom="paragraph">
+                        <wp:posOffset>565785</wp:posOffset>
+                      </wp:positionV>
+                      <wp:extent cx="1270000" cy="1168400"/>
+                      <wp:effectExtent l="0" t="0" r="25400" b="12700"/>
+                      <wp:wrapNone/>
+                      <wp:docPr id="1537187479" name="roadmap_map_box_3"/>
+                      <wp:cNvGraphicFramePr/>
+                      <a:graphic xmlns:a="http://schemas.openxmlformats.org/drawingml/2006/main">
+                        <a:graphicData uri="http://schemas.microsoft.com/office/word/2010/wordprocessingShape">
+                          <wps:wsp>
+                            <wps:cNvSpPr/>
+                            <wps:spPr>
+                              <a:xfrm>
+                                <a:off x="0" y="0"/>
+                                <a:ext cx="1270000" cy="1168400"/>
+                              </a:xfrm>
+                              <a:prstGeom prst="roundRect">
+                                <a:avLst/>
+                              </a:prstGeom>
+                              <a:solidFill>
+                                <a:srgbClr val="F0FDF4"/>
+                              </a:solidFill>
+                              <a:ln w="17780">
+                                <a:solidFill>
+                                  <a:srgbClr val="16A34A"/>
+                                </a:solidFill>
+                              </a:ln>
+                            </wps:spPr>
+                            <wps:style>
+                              <a:lnRef idx="2">
+                                <a:schemeClr val="accent1">
+                                  <a:shade val="15000"/>
+                                </a:schemeClr>
+                              </a:lnRef>
+                              <a:fillRef idx="1">
+                                <a:schemeClr val="accent1"/>
+                              </a:fillRef>
+                              <a:effectRef idx="0">
+                                <a:schemeClr val="accent1"/>
+                              </a:effectRef>
+                              <a:fontRef idx="minor">
+                                <a:schemeClr val="lt1"/>
+                              </a:fontRef>
+                            </wps:style>
+                            <wps:txbx>
+                              <w:txbxContent>
+                                <w:p>
+                                  <w:pPr>
+                                    <w:jc w:val="center"/>
+                                    <w:rPr>
+                                      <w:rFonts w:ascii="Aptos" w:hAnsi="Aptos"/>
+                                      <w:b/>
+                                      <w:color w:val="1F2937"/>
+                                      <w:sz w:val="18"/>
+                                    </w:rPr>
+                                  </w:pPr>
+                                  <w:r>
+                                    <w:rPr>
+                                      <w:rFonts w:ascii="Aptos" w:hAnsi="Aptos"/>
+                                      <w:b/>
+                                      <w:color w:val="1F2937"/>
+                                      <w:sz w:val="18"/>
+                                    </w:rPr>
+                                    <w:t>{roadmap_shape_3_title}</w:t>
+                                  </w:r>
+                                </w:p>
+                                <w:p>
+                                  <w:pPr>
+                                    <w:jc w:val="center"/>
+                                    <w:rPr>
+                                      <w:rFonts w:ascii="Aptos" w:hAnsi="Aptos"/>
+                                      <w:color w:val="1F2937"/>
+                                      <w:sz w:val="16"/>
+                                    </w:rPr>
+                                  </w:pPr>
+                                  <w:r>
+                                    <w:rPr>
+                                      <w:rFonts w:ascii="Aptos" w:hAnsi="Aptos"/>
+                                      <w:color w:val="1F2937"/>
+                                      <w:sz w:val="16"/>
+                                    </w:rPr>
+                                    <w:t>{roadmap_shape_3_body}</w:t>
+                                  </w:r>
+                                </w:p>
+                              </w:txbxContent>
+                            </wps:txbx>
+                            <wps:bodyPr rot="0" spcFirstLastPara="0" vertOverflow="overflow" horzOverflow="overflow" vert="horz" wrap="square" lIns="88900" tIns="63500" rIns="88900" bIns="63500" numCol="1" spcCol="0" rtlCol="0" fromWordArt="0" anchor="ctr" anchorCtr="0" forceAA="0" compatLnSpc="1">
+                              <a:prstTxWarp prst="textNoShape">
+                                <a:avLst/>
+                              </a:prstTxWarp>
+                              <a:noAutofit/>
+                            </wps:bodyPr>
+                          </wps:wsp>
+                        </a:graphicData>
+                      </a:graphic>
+                    </wp:anchor>
+                  </w:drawing>
+                </mc:Choice>
+                <mc:Fallback>
+                  <w:pict>
+                    <v:roundrect w14:anchorId="42F7FC14" id="roadmap_map_box_3" o:spid="_x0000_s1067" style="position:absolute;margin-left:259.55pt;margin-top:44.55pt;width:100pt;height:92pt;z-index:251731968;visibility:visible;mso-wrap-style:square;mso-wrap-distance-left:9pt;mso-wrap-distance-top:0;mso-wrap-distance-right:9pt;mso-wrap-distance-bottom:0;mso-position-horizontal:absolute;mso-position-horizontal-relative:text;mso-position-vertical:absolute;mso-position-vertical-relative:text;v-text-anchor:middle" arcsize="10923f" o:gfxdata="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" fillcolor="#f0fdf4" strokecolor="#16a34a" strokeweight="1.4pt">
+                      <v:stroke joinstyle="miter"/>
+                      <v:textbox inset="7pt,5pt,7pt,5pt">
+                        <w:txbxContent>
+                          <w:p>
+                            <w:pPr>
+                              <w:jc w:val="center"/>
+                              <w:rPr>
+                                <w:rFonts w:ascii="Aptos" w:hAnsi="Aptos"/>
+                                <w:b/>
+                                <w:color w:val="1F2937"/>
+                                <w:sz w:val="18"/>
+                              </w:rPr>
+                            </w:pPr>
+                            <w:r>
+                              <w:rPr>
+                                <w:rFonts w:ascii="Aptos" w:hAnsi="Aptos"/>
+                                <w:b/>
+                                <w:color w:val="1F2937"/>
+                                <w:sz w:val="18"/>
+                              </w:rPr>
+                              <w:t>{roadmap_shape_3_title}</w:t>
+                            </w:r>
+                          </w:p>
+                          <w:p>
+                            <w:pPr>
+                              <w:jc w:val="center"/>
+                              <w:rPr>
+                                <w:rFonts w:ascii="Aptos" w:hAnsi="Aptos"/>
+                                <w:color w:val="1F2937"/>
+                                <w:sz w:val="16"/>
+                              </w:rPr>
+                            </w:pPr>
+                            <w:r>
+                              <w:rPr>
+                                <w:rFonts w:ascii="Aptos" w:hAnsi="Aptos"/>
+                                <w:color w:val="1F2937"/>
+                                <w:sz w:val="16"/>
+                              </w:rPr>
+                              <w:t>{roadmap_shape_3_body}</w:t>
+                            </w:r>
+                          </w:p>
+                        </w:txbxContent>
+                      </v:textbox>
+                    </v:roundrect>
+                  </w:pict>
+                </mc:Fallback>
+              </mc:AlternateContent>
+            </w:r>
+            <w:r>
+              <w:rPr>
+                <w:noProof/>
+              </w:rPr>
+              <mc:AlternateContent>
+                <mc:Choice Requires="wps">
+                  <w:drawing>
+                    <wp:anchor distT="0" distB="0" distL="114300" distR="114300" simplePos="0" relativeHeight="251730944" behindDoc="0" locked="0" layoutInCell="1" allowOverlap="1" wp14:anchorId="00DB0AC9" wp14:editId="007F70B2">
+                      <wp:simplePos x="0" y="0"/>
+                      <wp:positionH relativeFrom="column">
+                        <wp:posOffset>1835785</wp:posOffset>
+                      </wp:positionH>
+                      <wp:positionV relativeFrom="paragraph">
+                        <wp:posOffset>565785</wp:posOffset>
+                      </wp:positionV>
+                      <wp:extent cx="1270000" cy="1168400"/>
+                      <wp:effectExtent l="0" t="0" r="25400" b="12700"/>
+                      <wp:wrapNone/>
+                      <wp:docPr id="1109469746" name="roadmap_map_box_2"/>
+                      <wp:cNvGraphicFramePr/>
+                      <a:graphic xmlns:a="http://schemas.openxmlformats.org/drawingml/2006/main">
+                        <a:graphicData uri="http://schemas.microsoft.com/office/word/2010/wordprocessingShape">
+                          <wps:wsp>
+                            <wps:cNvSpPr/>
+                            <wps:spPr>
+                              <a:xfrm>
+                                <a:off x="0" y="0"/>
+                                <a:ext cx="1270000" cy="1168400"/>
+                              </a:xfrm>
+                              <a:prstGeom prst="roundRect">
+                                <a:avLst/>
+                              </a:prstGeom>
+                              <a:solidFill>
+                                <a:srgbClr val="F0FDF4"/>
+                              </a:solidFill>
+                              <a:ln w="17780">
+                                <a:solidFill>
+                                  <a:srgbClr val="16A34A"/>
+                                </a:solidFill>
+                              </a:ln>
+                            </wps:spPr>
+                            <wps:style>
+                              <a:lnRef idx="2">
+                                <a:schemeClr val="accent1">
+                                  <a:shade val="15000"/>
+                                </a:schemeClr>
+                              </a:lnRef>
+                              <a:fillRef idx="1">
+                                <a:schemeClr val="accent1"/>
+                              </a:fillRef>
+                              <a:effectRef idx="0">
+                                <a:schemeClr val="accent1"/>
+                              </a:effectRef>
+                              <a:fontRef idx="minor">
+                                <a:schemeClr val="lt1"/>
+                              </a:fontRef>
+                            </wps:style>
+                            <wps:txbx>
+                              <w:txbxContent>
+                                <w:p>
+                                  <w:pPr>
+                                    <w:jc w:val="center"/>
+                                    <w:rPr>
+                                      <w:rFonts w:ascii="Aptos" w:hAnsi="Aptos"/>
+                                      <w:b/>
+                                      <w:color w:val="1F2937"/>
+                                      <w:sz w:val="18"/>
+                                    </w:rPr>
+                                  </w:pPr>
+                                  <w:r>
+                                    <w:rPr>
+                                      <w:rFonts w:ascii="Aptos" w:hAnsi="Aptos"/>
+                                      <w:b/>
+                                      <w:color w:val="1F2937"/>
+                                      <w:sz w:val="18"/>
+                                    </w:rPr>
+                                    <w:t>{roadmap_shape_2_title}</w:t>
+                                  </w:r>
+                                </w:p>
+                                <w:p>
+                                  <w:pPr>
+                                    <w:jc w:val="center"/>
+                                    <w:rPr>
+                                      <w:rFonts w:ascii="Aptos" w:hAnsi="Aptos"/>
+                                      <w:color w:val="1F2937"/>
+                                      <w:sz w:val="16"/>
+                                    </w:rPr>
+                                  </w:pPr>
+                                  <w:r>
+                                    <w:rPr>
+                                      <w:rFonts w:ascii="Aptos" w:hAnsi="Aptos"/>
+                                      <w:color w:val="1F2937"/>
+                                      <w:sz w:val="16"/>
+                                    </w:rPr>
+                                    <w:t>{roadmap_shape_2_body}</w:t>
+                                  </w:r>
+                                </w:p>
+                              </w:txbxContent>
+                            </wps:txbx>
+                            <wps:bodyPr rot="0" spcFirstLastPara="0" vertOverflow="overflow" horzOverflow="overflow" vert="horz" wrap="square" lIns="88900" tIns="63500" rIns="88900" bIns="63500" numCol="1" spcCol="0" rtlCol="0" fromWordArt="0" anchor="ctr" anchorCtr="0" forceAA="0" compatLnSpc="1">
+                              <a:prstTxWarp prst="textNoShape">
+                                <a:avLst/>
+                              </a:prstTxWarp>
+                              <a:noAutofit/>
+                            </wps:bodyPr>
+                          </wps:wsp>
+                        </a:graphicData>
+                      </a:graphic>
+                    </wp:anchor>
+                  </w:drawing>
+                </mc:Choice>
+                <mc:Fallback>
+                  <w:pict>
+                    <v:roundrect w14:anchorId="00DB0AC9" id="roadmap_map_box_2" o:spid="_x0000_s1068" style="position:absolute;margin-left:144.55pt;margin-top:44.55pt;width:100pt;height:92pt;z-index:251730944;visibility:visible;mso-wrap-style:square;mso-wrap-distance-left:9pt;mso-wrap-distance-top:0;mso-wrap-distance-right:9pt;mso-wrap-distance-bottom:0;mso-position-horizontal:absolute;mso-position-horizontal-relative:text;mso-position-vertical:absolute;mso-position-vertical-relative:text;v-text-anchor:middle" arcsize="10923f" o:gfxdata="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" fillcolor="#f0fdf4" strokecolor="#16a34a" strokeweight="1.4pt">
+                      <v:stroke joinstyle="miter"/>
+                      <v:textbox inset="7pt,5pt,7pt,5pt">
+                        <w:txbxContent>
+                          <w:p>
+                            <w:pPr>
+                              <w:jc w:val="center"/>
+                              <w:rPr>
+                                <w:rFonts w:ascii="Aptos" w:hAnsi="Aptos"/>
+                                <w:b/>
+                                <w:color w:val="1F2937"/>
+                                <w:sz w:val="18"/>
+                              </w:rPr>
+                            </w:pPr>
+                            <w:r>
+                              <w:rPr>
+                                <w:rFonts w:ascii="Aptos" w:hAnsi="Aptos"/>
+                                <w:b/>
+                                <w:color w:val="1F2937"/>
+                                <w:sz w:val="18"/>
+                              </w:rPr>
+                              <w:t>{roadmap_shape_2_title}</w:t>
+                            </w:r>
+                          </w:p>
+                          <w:p>
+                            <w:pPr>
+                              <w:jc w:val="center"/>
+                              <w:rPr>
+                                <w:rFonts w:ascii="Aptos" w:hAnsi="Aptos"/>
+                                <w:color w:val="1F2937"/>
+                                <w:sz w:val="16"/>
+                              </w:rPr>
+                            </w:pPr>
+                            <w:r>
+                              <w:rPr>
+                                <w:rFonts w:ascii="Aptos" w:hAnsi="Aptos"/>
+                                <w:color w:val="1F2937"/>
+                                <w:sz w:val="16"/>
+                              </w:rPr>
+                              <w:t>{roadmap_shape_2_body}</w:t>
+                            </w:r>
+                          </w:p>
+                        </w:txbxContent>
+                      </v:textbox>
+                    </v:roundrect>
+                  </w:pict>
+                </mc:Fallback>
+              </mc:AlternateContent>
+            </w:r>
+            <w:r>
+              <w:rPr>
+                <w:noProof/>
+              </w:rPr>
+              <mc:AlternateContent>
+                <mc:Choice Requires="wps">
+                  <w:drawing>
+                    <wp:anchor distT="0" distB="0" distL="114300" distR="114300" simplePos="0" relativeHeight="251729920" behindDoc="0" locked="0" layoutInCell="1" allowOverlap="1" wp14:anchorId="349F86A8" wp14:editId="2F7EC8BA">
+                      <wp:simplePos x="0" y="0"/>
+                      <wp:positionH relativeFrom="column">
+                        <wp:posOffset>375285</wp:posOffset>
+                      </wp:positionH>
+                      <wp:positionV relativeFrom="paragraph">
+                        <wp:posOffset>565785</wp:posOffset>
+                      </wp:positionV>
+                      <wp:extent cx="1270000" cy="1168400"/>
+                      <wp:effectExtent l="0" t="0" r="25400" b="12700"/>
+                      <wp:wrapNone/>
+                      <wp:docPr id="23696023" name="roadmap_map_box_1"/>
+                      <wp:cNvGraphicFramePr/>
+                      <a:graphic xmlns:a="http://schemas.openxmlformats.org/drawingml/2006/main">
+                        <a:graphicData uri="http://schemas.microsoft.com/office/word/2010/wordprocessingShape">
+                          <wps:wsp>
+                            <wps:cNvSpPr/>
+                            <wps:spPr>
+                              <a:xfrm>
+                                <a:off x="0" y="0"/>
+                                <a:ext cx="1270000" cy="1168400"/>
+                              </a:xfrm>
+                              <a:prstGeom prst="roundRect">
+                                <a:avLst/>
+                              </a:prstGeom>
+                              <a:solidFill>
+                                <a:srgbClr val="F0FDF4"/>
+                              </a:solidFill>
+                              <a:ln w="17780">
+                                <a:solidFill>
+                                  <a:srgbClr val="16A34A"/>
+                                </a:solidFill>
+                              </a:ln>
+                            </wps:spPr>
+                            <wps:style>
+                              <a:lnRef idx="2">
+                                <a:schemeClr val="accent1">
+                                  <a:shade val="15000"/>
+                                </a:schemeClr>
+                              </a:lnRef>
+                              <a:fillRef idx="1">
+                                <a:schemeClr val="accent1"/>
+                              </a:fillRef>
+                              <a:effectRef idx="0">
+                                <a:schemeClr val="accent1"/>
+                              </a:effectRef>
+                              <a:fontRef idx="minor">
+                                <a:schemeClr val="lt1"/>
+                              </a:fontRef>
+                            </wps:style>
+                            <wps:txbx>
+                              <w:txbxContent>
+                                <w:p>
+                                  <w:pPr>
+                                    <w:jc w:val="center"/>
+                                    <w:rPr>
+                                      <w:rFonts w:ascii="Aptos" w:hAnsi="Aptos"/>
+                                      <w:b/>
+                                      <w:color w:val="1F2937"/>
+                                      <w:sz w:val="18"/>
+                                    </w:rPr>
+                                  </w:pPr>
+                                  <w:r>
+                                    <w:rPr>
+                                      <w:rFonts w:ascii="Aptos" w:hAnsi="Aptos"/>
+                                      <w:b/>
+                                      <w:color w:val="1F2937"/>
+                                      <w:sz w:val="18"/>
+                                    </w:rPr>
+                                    <w:t>{roadmap_shape_1_title}</w:t>
+                                  </w:r>
+                                </w:p>
+                                <w:p>
+                                  <w:pPr>
+                                    <w:jc w:val="center"/>
+                                    <w:rPr>
+                                      <w:rFonts w:ascii="Aptos" w:hAnsi="Aptos"/>
+                                      <w:color w:val="1F2937"/>
+                                      <w:sz w:val="16"/>
+                                    </w:rPr>
+                                  </w:pPr>
+                                  <w:r>
+                                    <w:rPr>
+                                      <w:rFonts w:ascii="Aptos" w:hAnsi="Aptos"/>
+                                      <w:color w:val="1F2937"/>
+                                      <w:sz w:val="16"/>
+                                    </w:rPr>
+                                    <w:t>{roadmap_shape_1_body}</w:t>
+                                  </w:r>
+                                </w:p>
+                              </w:txbxContent>
+                            </wps:txbx>
+                            <wps:bodyPr rot="0" spcFirstLastPara="0" vertOverflow="overflow" horzOverflow="overflow" vert="horz" wrap="square" lIns="88900" tIns="63500" rIns="88900" bIns="63500" numCol="1" spcCol="0" rtlCol="0" fromWordArt="0" anchor="ctr" anchorCtr="0" forceAA="0" compatLnSpc="1">
+                              <a:prstTxWarp prst="textNoShape">
+                                <a:avLst/>
+                              </a:prstTxWarp>
+                              <a:noAutofit/>
+                            </wps:bodyPr>
+                          </wps:wsp>
+                        </a:graphicData>
+                      </a:graphic>
+                    </wp:anchor>
+                  </w:drawing>
+                </mc:Choice>
+                <mc:Fallback>
+                  <w:pict>
+                    <v:roundrect w14:anchorId="349F86A8" id="roadmap_map_box_1" o:spid="_x0000_s1069" style="position:absolute;margin-left:29.55pt;margin-top:44.55pt;width:100pt;height:92pt;z-index:251729920;visibility:visible;mso-wrap-style:square;mso-wrap-distance-left:9pt;mso-wrap-distance-top:0;mso-wrap-distance-right:9pt;mso-wrap-distance-bottom:0;mso-position-horizontal:absolute;mso-position-horizontal-relative:text;mso-position-vertical:absolute;mso-position-vertical-relative:text;v-text-anchor:middle" arcsize="10923f" o:gfxdata="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" fillcolor="#f0fdf4" strokecolor="#16a34a" strokeweight="1.4pt">
+                      <v:stroke joinstyle="miter"/>
+                      <v:textbox inset="7pt,5pt,7pt,5pt">
+                        <w:txbxContent>
+                          <w:p>
+                            <w:pPr>
+                              <w:jc w:val="center"/>
+                              <w:rPr>
+                                <w:rFonts w:ascii="Aptos" w:hAnsi="Aptos"/>
+                                <w:b/>
+                                <w:color w:val="1F2937"/>
+                                <w:sz w:val="18"/>
+                              </w:rPr>
+                            </w:pPr>
+                            <w:r>
+                              <w:rPr>
+                                <w:rFonts w:ascii="Aptos" w:hAnsi="Aptos"/>
+                                <w:b/>
+                                <w:color w:val="1F2937"/>
+                                <w:sz w:val="18"/>
+                              </w:rPr>
+                              <w:t>{roadmap_shape_1_title}</w:t>
+                            </w:r>
+                          </w:p>
+                          <w:p>
+                            <w:pPr>
+                              <w:jc w:val="center"/>
+                              <w:rPr>
+                                <w:rFonts w:ascii="Aptos" w:hAnsi="Aptos"/>
+                                <w:color w:val="1F2937"/>
+                                <w:sz w:val="16"/>
+                              </w:rPr>
+                            </w:pPr>
+                            <w:r>
+                              <w:rPr>
+                                <w:rFonts w:ascii="Aptos" w:hAnsi="Aptos"/>
+                                <w:color w:val="1F2937"/>
+                                <w:sz w:val="16"/>
+                              </w:rPr>
+                              <w:t>{roadmap_shape_1_body}</w:t>
+                            </w:r>
+                          </w:p>
+                        </w:txbxContent>
+                      </v:textbox>
+                    </v:roundrect>
+                  </w:pict>
+                </mc:Fallback>
+              </mc:AlternateContent>
             </w:r>
           </w:p>
         </w:tc>

</xml_diff>

<commit_message>
Add native Word flow detail visual
</commit_message>
<xml_diff>
--- a/backend/templates/assessment-operational-template.docx
+++ b/backend/templates/assessment-operational-template.docx
@@ -47,6 +47,528 @@
               <w:spacing w:after="0"/>
               <w:jc w:val="center"/>
             </w:pPr>
+            <w:r>
+              <w:rPr>
+                <w:b/>
+                <w:bCs/>
+                <w:noProof/>
+                <w:color w:val="FFFFFF"/>
+                <w:sz w:val="34"/>
+                <w:szCs w:val="34"/>
+              </w:rPr>
+              <mc:AlternateContent>
+                <mc:Choice Requires="wps">
+                  <w:drawing>
+                    <wp:anchor distT="0" distB="0" distL="114300" distR="114300" simplePos="0" relativeHeight="251753472" behindDoc="0" locked="0" layoutInCell="1" allowOverlap="1" wp14:anchorId="11333892" wp14:editId="1E044CE1">
+                      <wp:simplePos x="0" y="0"/>
+                      <wp:positionH relativeFrom="column">
+                        <wp:posOffset>5556885</wp:posOffset>
+                      </wp:positionH>
+                      <wp:positionV relativeFrom="paragraph">
+                        <wp:posOffset>8356600</wp:posOffset>
+                      </wp:positionV>
+                      <wp:extent cx="342900" cy="0"/>
+                      <wp:effectExtent l="0" t="76200" r="19050" b="114300"/>
+                      <wp:wrapNone/>
+                      <wp:docPr id="2009233793" name="flow_detail_arrow_7"/>
+                      <wp:cNvGraphicFramePr/>
+                      <a:graphic xmlns:a="http://schemas.openxmlformats.org/drawingml/2006/main">
+                        <a:graphicData uri="http://schemas.microsoft.com/office/word/2010/wordprocessingShape">
+                          <wps:wsp>
+                            <wps:cNvCnPr/>
+                            <wps:spPr>
+                              <a:xfrm>
+                                <a:off x="0" y="0"/>
+                                <a:ext cx="342900" cy="0"/>
+                              </a:xfrm>
+                              <a:prstGeom prst="straightConnector1">
+                                <a:avLst/>
+                              </a:prstGeom>
+                              <a:ln w="15240">
+                                <a:solidFill>
+                                  <a:srgbClr val="D97706"/>
+                                </a:solidFill>
+                                <a:tailEnd type="arrow"/>
+                              </a:ln>
+                            </wps:spPr>
+                            <wps:style>
+                              <a:lnRef idx="2">
+                                <a:schemeClr val="accent1"/>
+                              </a:lnRef>
+                              <a:fillRef idx="0">
+                                <a:schemeClr val="accent1"/>
+                              </a:fillRef>
+                              <a:effectRef idx="1">
+                                <a:schemeClr val="accent1"/>
+                              </a:effectRef>
+                              <a:fontRef idx="minor">
+                                <a:schemeClr val="tx1"/>
+                              </a:fontRef>
+                            </wps:style>
+                            <wps:bodyPr/>
+                          </wps:wsp>
+                        </a:graphicData>
+                      </a:graphic>
+                    </wp:anchor>
+                  </w:drawing>
+                </mc:Choice>
+                <mc:Fallback>
+                  <w:pict>
+                    <v:shapetype w14:anchorId="53283697" id="_x0000_t32" coordsize="21600,21600" o:spt="32" o:oned="t" path="m,l21600,21600e" filled="f">
+                      <v:path arrowok="t" fillok="f" o:connecttype="none"/>
+                      <o:lock v:ext="edit" shapetype="t"/>
+                    </v:shapetype>
+                    <v:shape id="flow_detail_arrow_7" o:spid="_x0000_s1026" type="#_x0000_t32" style="position:absolute;margin-left:437.55pt;margin-top:658pt;width:27pt;height:0;z-index:251753472;visibility:visible;mso-wrap-style:square;mso-wrap-distance-left:9pt;mso-wrap-distance-top:0;mso-wrap-distance-right:9pt;mso-wrap-distance-bottom:0;mso-position-horizontal:absolute;mso-position-horizontal-relative:text;mso-position-vertical:absolute;mso-position-vertical-relative:text" o:gfxdata="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" strokecolor="#d97706" strokeweight="1.2pt">
+                      <v:stroke endarrow="open" joinstyle="miter"/>
+                    </v:shape>
+                  </w:pict>
+                </mc:Fallback>
+              </mc:AlternateContent>
+            </w:r>
+            <w:r>
+              <w:rPr>
+                <w:b/>
+                <w:bCs/>
+                <w:noProof/>
+                <w:color w:val="FFFFFF"/>
+                <w:sz w:val="34"/>
+                <w:szCs w:val="34"/>
+              </w:rPr>
+              <mc:AlternateContent>
+                <mc:Choice Requires="wps">
+                  <w:drawing>
+                    <wp:anchor distT="0" distB="0" distL="114300" distR="114300" simplePos="0" relativeHeight="251752448" behindDoc="0" locked="0" layoutInCell="1" allowOverlap="1" wp14:anchorId="7F6388A2" wp14:editId="401AF2D9">
+                      <wp:simplePos x="0" y="0"/>
+                      <wp:positionH relativeFrom="column">
+                        <wp:posOffset>3715385</wp:posOffset>
+                      </wp:positionH>
+                      <wp:positionV relativeFrom="paragraph">
+                        <wp:posOffset>8356600</wp:posOffset>
+                      </wp:positionV>
+                      <wp:extent cx="342900" cy="0"/>
+                      <wp:effectExtent l="0" t="76200" r="19050" b="114300"/>
+                      <wp:wrapNone/>
+                      <wp:docPr id="648561602" name="flow_detail_arrow_6"/>
+                      <wp:cNvGraphicFramePr/>
+                      <a:graphic xmlns:a="http://schemas.openxmlformats.org/drawingml/2006/main">
+                        <a:graphicData uri="http://schemas.microsoft.com/office/word/2010/wordprocessingShape">
+                          <wps:wsp>
+                            <wps:cNvCnPr/>
+                            <wps:spPr>
+                              <a:xfrm>
+                                <a:off x="0" y="0"/>
+                                <a:ext cx="342900" cy="0"/>
+                              </a:xfrm>
+                              <a:prstGeom prst="straightConnector1">
+                                <a:avLst/>
+                              </a:prstGeom>
+                              <a:ln w="15240">
+                                <a:solidFill>
+                                  <a:srgbClr val="D97706"/>
+                                </a:solidFill>
+                                <a:tailEnd type="arrow"/>
+                              </a:ln>
+                            </wps:spPr>
+                            <wps:style>
+                              <a:lnRef idx="2">
+                                <a:schemeClr val="accent1"/>
+                              </a:lnRef>
+                              <a:fillRef idx="0">
+                                <a:schemeClr val="accent1"/>
+                              </a:fillRef>
+                              <a:effectRef idx="1">
+                                <a:schemeClr val="accent1"/>
+                              </a:effectRef>
+                              <a:fontRef idx="minor">
+                                <a:schemeClr val="tx1"/>
+                              </a:fontRef>
+                            </wps:style>
+                            <wps:bodyPr/>
+                          </wps:wsp>
+                        </a:graphicData>
+                      </a:graphic>
+                    </wp:anchor>
+                  </w:drawing>
+                </mc:Choice>
+                <mc:Fallback>
+                  <w:pict>
+                    <v:shape w14:anchorId="668A7678" id="flow_detail_arrow_6" o:spid="_x0000_s1026" type="#_x0000_t32" style="position:absolute;margin-left:292.55pt;margin-top:658pt;width:27pt;height:0;z-index:251752448;visibility:visible;mso-wrap-style:square;mso-wrap-distance-left:9pt;mso-wrap-distance-top:0;mso-wrap-distance-right:9pt;mso-wrap-distance-bottom:0;mso-position-horizontal:absolute;mso-position-horizontal-relative:text;mso-position-vertical:absolute;mso-position-vertical-relative:text" o:gfxdata="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" strokecolor="#d97706" strokeweight="1.2pt">
+                      <v:stroke endarrow="open" joinstyle="miter"/>
+                    </v:shape>
+                  </w:pict>
+                </mc:Fallback>
+              </mc:AlternateContent>
+            </w:r>
+            <w:r>
+              <w:rPr>
+                <w:b/>
+                <w:bCs/>
+                <w:noProof/>
+                <w:color w:val="FFFFFF"/>
+                <w:sz w:val="34"/>
+                <w:szCs w:val="34"/>
+              </w:rPr>
+              <mc:AlternateContent>
+                <mc:Choice Requires="wps">
+                  <w:drawing>
+                    <wp:anchor distT="0" distB="0" distL="114300" distR="114300" simplePos="0" relativeHeight="251751424" behindDoc="0" locked="0" layoutInCell="1" allowOverlap="1" wp14:anchorId="3481AEB8" wp14:editId="33F0591E">
+                      <wp:simplePos x="0" y="0"/>
+                      <wp:positionH relativeFrom="column">
+                        <wp:posOffset>1873885</wp:posOffset>
+                      </wp:positionH>
+                      <wp:positionV relativeFrom="paragraph">
+                        <wp:posOffset>8356600</wp:posOffset>
+                      </wp:positionV>
+                      <wp:extent cx="342900" cy="0"/>
+                      <wp:effectExtent l="0" t="76200" r="19050" b="114300"/>
+                      <wp:wrapNone/>
+                      <wp:docPr id="384219325" name="flow_detail_arrow_5"/>
+                      <wp:cNvGraphicFramePr/>
+                      <a:graphic xmlns:a="http://schemas.openxmlformats.org/drawingml/2006/main">
+                        <a:graphicData uri="http://schemas.microsoft.com/office/word/2010/wordprocessingShape">
+                          <wps:wsp>
+                            <wps:cNvCnPr/>
+                            <wps:spPr>
+                              <a:xfrm>
+                                <a:off x="0" y="0"/>
+                                <a:ext cx="342900" cy="0"/>
+                              </a:xfrm>
+                              <a:prstGeom prst="straightConnector1">
+                                <a:avLst/>
+                              </a:prstGeom>
+                              <a:ln w="15240">
+                                <a:solidFill>
+                                  <a:srgbClr val="D97706"/>
+                                </a:solidFill>
+                                <a:tailEnd type="arrow"/>
+                              </a:ln>
+                            </wps:spPr>
+                            <wps:style>
+                              <a:lnRef idx="2">
+                                <a:schemeClr val="accent1"/>
+                              </a:lnRef>
+                              <a:fillRef idx="0">
+                                <a:schemeClr val="accent1"/>
+                              </a:fillRef>
+                              <a:effectRef idx="1">
+                                <a:schemeClr val="accent1"/>
+                              </a:effectRef>
+                              <a:fontRef idx="minor">
+                                <a:schemeClr val="tx1"/>
+                              </a:fontRef>
+                            </wps:style>
+                            <wps:bodyPr/>
+                          </wps:wsp>
+                        </a:graphicData>
+                      </a:graphic>
+                    </wp:anchor>
+                  </w:drawing>
+                </mc:Choice>
+                <mc:Fallback>
+                  <w:pict>
+                    <v:shape w14:anchorId="2F4C7B3C" id="flow_detail_arrow_5" o:spid="_x0000_s1026" type="#_x0000_t32" style="position:absolute;margin-left:147.55pt;margin-top:658pt;width:27pt;height:0;z-index:251751424;visibility:visible;mso-wrap-style:square;mso-wrap-distance-left:9pt;mso-wrap-distance-top:0;mso-wrap-distance-right:9pt;mso-wrap-distance-bottom:0;mso-position-horizontal:absolute;mso-position-horizontal-relative:text;mso-position-vertical:absolute;mso-position-vertical-relative:text" o:gfxdata="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" strokecolor="#d97706" strokeweight="1.2pt">
+                      <v:stroke endarrow="open" joinstyle="miter"/>
+                    </v:shape>
+                  </w:pict>
+                </mc:Fallback>
+              </mc:AlternateContent>
+            </w:r>
+            <w:r>
+              <w:rPr>
+                <w:b/>
+                <w:bCs/>
+                <w:noProof/>
+                <w:color w:val="FFFFFF"/>
+                <w:sz w:val="34"/>
+                <w:szCs w:val="34"/>
+              </w:rPr>
+              <mc:AlternateContent>
+                <mc:Choice Requires="wps">
+                  <w:drawing>
+                    <wp:anchor distT="0" distB="0" distL="114300" distR="114300" simplePos="0" relativeHeight="251750400" behindDoc="0" locked="0" layoutInCell="1" allowOverlap="1" wp14:anchorId="70C165F2" wp14:editId="006BBBD9">
+                      <wp:simplePos x="0" y="0"/>
+                      <wp:positionH relativeFrom="column">
+                        <wp:posOffset>1124585</wp:posOffset>
+                      </wp:positionH>
+                      <wp:positionV relativeFrom="paragraph">
+                        <wp:posOffset>7569200</wp:posOffset>
+                      </wp:positionV>
+                      <wp:extent cx="5524500" cy="304800"/>
+                      <wp:effectExtent l="38100" t="0" r="19050" b="95250"/>
+                      <wp:wrapNone/>
+                      <wp:docPr id="236423360" name="flow_detail_arrow_4"/>
+                      <wp:cNvGraphicFramePr/>
+                      <a:graphic xmlns:a="http://schemas.openxmlformats.org/drawingml/2006/main">
+                        <a:graphicData uri="http://schemas.microsoft.com/office/word/2010/wordprocessingShape">
+                          <wps:wsp>
+                            <wps:cNvCnPr/>
+                            <wps:spPr>
+                              <a:xfrm flipH="1">
+                                <a:off x="0" y="0"/>
+                                <a:ext cx="5524500" cy="304800"/>
+                              </a:xfrm>
+                              <a:prstGeom prst="straightConnector1">
+                                <a:avLst/>
+                              </a:prstGeom>
+                              <a:ln w="15240">
+                                <a:solidFill>
+                                  <a:srgbClr val="D97706"/>
+                                </a:solidFill>
+                                <a:tailEnd type="arrow"/>
+                              </a:ln>
+                            </wps:spPr>
+                            <wps:style>
+                              <a:lnRef idx="2">
+                                <a:schemeClr val="accent1"/>
+                              </a:lnRef>
+                              <a:fillRef idx="0">
+                                <a:schemeClr val="accent1"/>
+                              </a:fillRef>
+                              <a:effectRef idx="1">
+                                <a:schemeClr val="accent1"/>
+                              </a:effectRef>
+                              <a:fontRef idx="minor">
+                                <a:schemeClr val="tx1"/>
+                              </a:fontRef>
+                            </wps:style>
+                            <wps:bodyPr/>
+                          </wps:wsp>
+                        </a:graphicData>
+                      </a:graphic>
+                    </wp:anchor>
+                  </w:drawing>
+                </mc:Choice>
+                <mc:Fallback>
+                  <w:pict>
+                    <v:shape w14:anchorId="2F429C9F" id="flow_detail_arrow_4" o:spid="_x0000_s1026" type="#_x0000_t32" style="position:absolute;margin-left:88.55pt;margin-top:596pt;width:435pt;height:24pt;flip:x;z-index:251750400;visibility:visible;mso-wrap-style:square;mso-wrap-distance-left:9pt;mso-wrap-distance-top:0;mso-wrap-distance-right:9pt;mso-wrap-distance-bottom:0;mso-position-horizontal:absolute;mso-position-horizontal-relative:text;mso-position-vertical:absolute;mso-position-vertical-relative:text" o:gfxdata="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" strokecolor="#d97706" strokeweight="1.2pt">
+                      <v:stroke endarrow="open" joinstyle="miter"/>
+                    </v:shape>
+                  </w:pict>
+                </mc:Fallback>
+              </mc:AlternateContent>
+            </w:r>
+            <w:r>
+              <w:rPr>
+                <w:b/>
+                <w:bCs/>
+                <w:noProof/>
+                <w:color w:val="FFFFFF"/>
+                <w:sz w:val="34"/>
+                <w:szCs w:val="34"/>
+              </w:rPr>
+              <mc:AlternateContent>
+                <mc:Choice Requires="wps">
+                  <w:drawing>
+                    <wp:anchor distT="0" distB="0" distL="114300" distR="114300" simplePos="0" relativeHeight="251749376" behindDoc="0" locked="0" layoutInCell="1" allowOverlap="1" wp14:anchorId="4C435658" wp14:editId="75B6CD54">
+                      <wp:simplePos x="0" y="0"/>
+                      <wp:positionH relativeFrom="column">
+                        <wp:posOffset>5556885</wp:posOffset>
+                      </wp:positionH>
+                      <wp:positionV relativeFrom="paragraph">
+                        <wp:posOffset>7086600</wp:posOffset>
+                      </wp:positionV>
+                      <wp:extent cx="342900" cy="0"/>
+                      <wp:effectExtent l="0" t="76200" r="19050" b="114300"/>
+                      <wp:wrapNone/>
+                      <wp:docPr id="692429297" name="flow_detail_arrow_3"/>
+                      <wp:cNvGraphicFramePr/>
+                      <a:graphic xmlns:a="http://schemas.openxmlformats.org/drawingml/2006/main">
+                        <a:graphicData uri="http://schemas.microsoft.com/office/word/2010/wordprocessingShape">
+                          <wps:wsp>
+                            <wps:cNvCnPr/>
+                            <wps:spPr>
+                              <a:xfrm>
+                                <a:off x="0" y="0"/>
+                                <a:ext cx="342900" cy="0"/>
+                              </a:xfrm>
+                              <a:prstGeom prst="straightConnector1">
+                                <a:avLst/>
+                              </a:prstGeom>
+                              <a:ln w="15240">
+                                <a:solidFill>
+                                  <a:srgbClr val="1F63A0"/>
+                                </a:solidFill>
+                                <a:tailEnd type="arrow"/>
+                              </a:ln>
+                            </wps:spPr>
+                            <wps:style>
+                              <a:lnRef idx="2">
+                                <a:schemeClr val="accent1"/>
+                              </a:lnRef>
+                              <a:fillRef idx="0">
+                                <a:schemeClr val="accent1"/>
+                              </a:fillRef>
+                              <a:effectRef idx="1">
+                                <a:schemeClr val="accent1"/>
+                              </a:effectRef>
+                              <a:fontRef idx="minor">
+                                <a:schemeClr val="tx1"/>
+                              </a:fontRef>
+                            </wps:style>
+                            <wps:bodyPr/>
+                          </wps:wsp>
+                        </a:graphicData>
+                      </a:graphic>
+                    </wp:anchor>
+                  </w:drawing>
+                </mc:Choice>
+                <mc:Fallback>
+                  <w:pict>
+                    <v:shape w14:anchorId="6EA27E9D" id="flow_detail_arrow_3" o:spid="_x0000_s1026" type="#_x0000_t32" style="position:absolute;margin-left:437.55pt;margin-top:558pt;width:27pt;height:0;z-index:251749376;visibility:visible;mso-wrap-style:square;mso-wrap-distance-left:9pt;mso-wrap-distance-top:0;mso-wrap-distance-right:9pt;mso-wrap-distance-bottom:0;mso-position-horizontal:absolute;mso-position-horizontal-relative:text;mso-position-vertical:absolute;mso-position-vertical-relative:text" o:gfxdata="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" strokecolor="#1f63a0" strokeweight="1.2pt">
+                      <v:stroke endarrow="open" joinstyle="miter"/>
+                    </v:shape>
+                  </w:pict>
+                </mc:Fallback>
+              </mc:AlternateContent>
+            </w:r>
+            <w:r>
+              <w:rPr>
+                <w:b/>
+                <w:bCs/>
+                <w:noProof/>
+                <w:color w:val="FFFFFF"/>
+                <w:sz w:val="34"/>
+                <w:szCs w:val="34"/>
+              </w:rPr>
+              <mc:AlternateContent>
+                <mc:Choice Requires="wps">
+                  <w:drawing>
+                    <wp:anchor distT="0" distB="0" distL="114300" distR="114300" simplePos="0" relativeHeight="251748352" behindDoc="0" locked="0" layoutInCell="1" allowOverlap="1" wp14:anchorId="4A52BC7D" wp14:editId="0A60CC06">
+                      <wp:simplePos x="0" y="0"/>
+                      <wp:positionH relativeFrom="column">
+                        <wp:posOffset>3715385</wp:posOffset>
+                      </wp:positionH>
+                      <wp:positionV relativeFrom="paragraph">
+                        <wp:posOffset>7086600</wp:posOffset>
+                      </wp:positionV>
+                      <wp:extent cx="342900" cy="0"/>
+                      <wp:effectExtent l="0" t="76200" r="19050" b="114300"/>
+                      <wp:wrapNone/>
+                      <wp:docPr id="1233397633" name="flow_detail_arrow_2"/>
+                      <wp:cNvGraphicFramePr/>
+                      <a:graphic xmlns:a="http://schemas.openxmlformats.org/drawingml/2006/main">
+                        <a:graphicData uri="http://schemas.microsoft.com/office/word/2010/wordprocessingShape">
+                          <wps:wsp>
+                            <wps:cNvCnPr/>
+                            <wps:spPr>
+                              <a:xfrm>
+                                <a:off x="0" y="0"/>
+                                <a:ext cx="342900" cy="0"/>
+                              </a:xfrm>
+                              <a:prstGeom prst="straightConnector1">
+                                <a:avLst/>
+                              </a:prstGeom>
+                              <a:ln w="15240">
+                                <a:solidFill>
+                                  <a:srgbClr val="1F63A0"/>
+                                </a:solidFill>
+                                <a:tailEnd type="arrow"/>
+                              </a:ln>
+                            </wps:spPr>
+                            <wps:style>
+                              <a:lnRef idx="2">
+                                <a:schemeClr val="accent1"/>
+                              </a:lnRef>
+                              <a:fillRef idx="0">
+                                <a:schemeClr val="accent1"/>
+                              </a:fillRef>
+                              <a:effectRef idx="1">
+                                <a:schemeClr val="accent1"/>
+                              </a:effectRef>
+                              <a:fontRef idx="minor">
+                                <a:schemeClr val="tx1"/>
+                              </a:fontRef>
+                            </wps:style>
+                            <wps:bodyPr/>
+                          </wps:wsp>
+                        </a:graphicData>
+                      </a:graphic>
+                    </wp:anchor>
+                  </w:drawing>
+                </mc:Choice>
+                <mc:Fallback>
+                  <w:pict>
+                    <v:shape w14:anchorId="720903E7" id="flow_detail_arrow_2" o:spid="_x0000_s1026" type="#_x0000_t32" style="position:absolute;margin-left:292.55pt;margin-top:558pt;width:27pt;height:0;z-index:251748352;visibility:visible;mso-wrap-style:square;mso-wrap-distance-left:9pt;mso-wrap-distance-top:0;mso-wrap-distance-right:9pt;mso-wrap-distance-bottom:0;mso-position-horizontal:absolute;mso-position-horizontal-relative:text;mso-position-vertical:absolute;mso-position-vertical-relative:text" o:gfxdata="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" strokecolor="#1f63a0" strokeweight="1.2pt">
+                      <v:stroke endarrow="open" joinstyle="miter"/>
+                    </v:shape>
+                  </w:pict>
+                </mc:Fallback>
+              </mc:AlternateContent>
+            </w:r>
+            <w:r>
+              <w:rPr>
+                <w:b/>
+                <w:bCs/>
+                <w:noProof/>
+                <w:color w:val="FFFFFF"/>
+                <w:sz w:val="34"/>
+                <w:szCs w:val="34"/>
+              </w:rPr>
+              <mc:AlternateContent>
+                <mc:Choice Requires="wps">
+                  <w:drawing>
+                    <wp:anchor distT="0" distB="0" distL="114300" distR="114300" simplePos="0" relativeHeight="251747328" behindDoc="0" locked="0" layoutInCell="1" allowOverlap="1" wp14:anchorId="4520EBAA" wp14:editId="01216584">
+                      <wp:simplePos x="0" y="0"/>
+                      <wp:positionH relativeFrom="column">
+                        <wp:posOffset>1873885</wp:posOffset>
+                      </wp:positionH>
+                      <wp:positionV relativeFrom="paragraph">
+                        <wp:posOffset>7086600</wp:posOffset>
+                      </wp:positionV>
+                      <wp:extent cx="342900" cy="0"/>
+                      <wp:effectExtent l="0" t="76200" r="19050" b="114300"/>
+                      <wp:wrapNone/>
+                      <wp:docPr id="441134639" name="flow_detail_arrow_1"/>
+                      <wp:cNvGraphicFramePr/>
+                      <a:graphic xmlns:a="http://schemas.openxmlformats.org/drawingml/2006/main">
+                        <a:graphicData uri="http://schemas.microsoft.com/office/word/2010/wordprocessingShape">
+                          <wps:wsp>
+                            <wps:cNvCnPr/>
+                            <wps:spPr>
+                              <a:xfrm>
+                                <a:off x="0" y="0"/>
+                                <a:ext cx="342900" cy="0"/>
+                              </a:xfrm>
+                              <a:prstGeom prst="straightConnector1">
+                                <a:avLst/>
+                              </a:prstGeom>
+                              <a:ln w="15240">
+                                <a:solidFill>
+                                  <a:srgbClr val="1F63A0"/>
+                                </a:solidFill>
+                                <a:tailEnd type="arrow"/>
+                              </a:ln>
+                            </wps:spPr>
+                            <wps:style>
+                              <a:lnRef idx="2">
+                                <a:schemeClr val="accent1"/>
+                              </a:lnRef>
+                              <a:fillRef idx="0">
+                                <a:schemeClr val="accent1"/>
+                              </a:fillRef>
+                              <a:effectRef idx="1">
+                                <a:schemeClr val="accent1"/>
+                              </a:effectRef>
+                              <a:fontRef idx="minor">
+                                <a:schemeClr val="tx1"/>
+                              </a:fontRef>
+                            </wps:style>
+                            <wps:bodyPr/>
+                          </wps:wsp>
+                        </a:graphicData>
+                      </a:graphic>
+                    </wp:anchor>
+                  </w:drawing>
+                </mc:Choice>
+                <mc:Fallback>
+                  <w:pict>
+                    <v:shape w14:anchorId="1E628A2B" id="flow_detail_arrow_1" o:spid="_x0000_s1026" type="#_x0000_t32" style="position:absolute;margin-left:147.55pt;margin-top:558pt;width:27pt;height:0;z-index:251747328;visibility:visible;mso-wrap-style:square;mso-wrap-distance-left:9pt;mso-wrap-distance-top:0;mso-wrap-distance-right:9pt;mso-wrap-distance-bottom:0;mso-position-horizontal:absolute;mso-position-horizontal-relative:text;mso-position-vertical:absolute;mso-position-vertical-relative:text" o:gfxdata="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" strokecolor="#1f63a0" strokeweight="1.2pt">
+                      <v:stroke endarrow="open" joinstyle="miter"/>
+                    </v:shape>
+                  </w:pict>
+                </mc:Fallback>
+              </mc:AlternateContent>
+            </w:r>
             <w:r>
               <w:rPr>
                 <w:b/>
@@ -12956,6 +13478,1386 @@
       </w:pPr>
       <w:r>
         <w:t>Detalhamento do fluxo</w:t>
+      </w:r>
+    </w:p>
+    <w:p>
+      <w:pPr>
+        <w:pStyle w:val="Ttulo2"/>
+        <w:spacing w:before="220" w:after="120"/>
+      </w:pPr>
+    </w:p>
+    <w:p>
+      <w:pPr>
+        <w:pStyle w:val="Ttulo2"/>
+        <w:spacing w:before="220" w:after="120"/>
+      </w:pPr>
+    </w:p>
+    <w:p>
+      <w:pPr>
+        <w:pStyle w:val="Ttulo2"/>
+        <w:spacing w:before="220" w:after="120"/>
+      </w:pPr>
+    </w:p>
+    <w:p>
+      <w:pPr>
+        <w:pStyle w:val="Ttulo2"/>
+        <w:spacing w:before="220" w:after="120"/>
+      </w:pPr>
+    </w:p>
+    <w:p>
+      <w:pPr>
+        <w:pStyle w:val="Ttulo2"/>
+        <w:spacing w:before="220" w:after="120"/>
+      </w:pPr>
+    </w:p>
+    <w:p>
+      <w:pPr>
+        <w:pStyle w:val="Ttulo2"/>
+        <w:spacing w:before="220" w:after="120"/>
+      </w:pPr>
+    </w:p>
+    <w:p>
+      <w:pPr>
+        <w:pStyle w:val="Ttulo2"/>
+        <w:spacing w:before="220" w:after="120"/>
+      </w:pPr>
+    </w:p>
+    <w:p>
+      <w:pPr>
+        <w:pStyle w:val="Ttulo2"/>
+        <w:spacing w:before="220" w:after="120"/>
+      </w:pPr>
+    </w:p>
+    <w:p>
+      <w:pPr>
+        <w:pStyle w:val="Ttulo2"/>
+        <w:spacing w:before="220" w:after="120"/>
+      </w:pPr>
+    </w:p>
+    <w:p>
+      <w:pPr>
+        <w:pStyle w:val="Ttulo2"/>
+        <w:spacing w:before="220" w:after="120"/>
+      </w:pPr>
+    </w:p>
+    <w:p>
+      <w:pPr>
+        <w:pStyle w:val="Ttulo2"/>
+        <w:spacing w:before="220" w:after="120"/>
+      </w:pPr>
+    </w:p>
+    <w:p>
+      <w:pPr>
+        <w:pStyle w:val="Ttulo2"/>
+        <w:spacing w:before="220" w:after="120"/>
+      </w:pPr>
+    </w:p>
+    <w:p>
+      <w:pPr>
+        <w:pStyle w:val="Ttulo2"/>
+        <w:spacing w:before="220" w:after="120"/>
+      </w:pPr>
+    </w:p>
+    <w:p>
+      <w:pPr>
+        <w:pStyle w:val="Ttulo2"/>
+        <w:spacing w:before="220" w:after="120"/>
+      </w:pPr>
+      <w:r>
+        <w:rPr>
+          <w:noProof/>
+        </w:rPr>
+        <mc:AlternateContent>
+          <mc:Choice Requires="wps">
+            <w:drawing>
+              <wp:anchor distT="0" distB="0" distL="114300" distR="114300" simplePos="0" relativeHeight="251746304" behindDoc="0" locked="0" layoutInCell="1" allowOverlap="1" wp14:anchorId="596C097A" wp14:editId="4293F763">
+                <wp:simplePos x="0" y="0"/>
+                <wp:positionH relativeFrom="column">
+                  <wp:posOffset>5575300</wp:posOffset>
+                </wp:positionH>
+                <wp:positionV relativeFrom="paragraph">
+                  <wp:posOffset>6481445</wp:posOffset>
+                </wp:positionV>
+                <wp:extent cx="1498600" cy="965200"/>
+                <wp:effectExtent l="0" t="0" r="25400" b="25400"/>
+                <wp:wrapNone/>
+                <wp:docPr id="2063523414" name="flow_detail_box_8"/>
+                <wp:cNvGraphicFramePr/>
+                <a:graphic xmlns:a="http://schemas.openxmlformats.org/drawingml/2006/main">
+                  <a:graphicData uri="http://schemas.microsoft.com/office/word/2010/wordprocessingShape">
+                    <wps:wsp>
+                      <wps:cNvSpPr/>
+                      <wps:spPr>
+                        <a:xfrm>
+                          <a:off x="0" y="0"/>
+                          <a:ext cx="1498600" cy="965200"/>
+                        </a:xfrm>
+                        <a:prstGeom prst="roundRect">
+                          <a:avLst/>
+                        </a:prstGeom>
+                        <a:solidFill>
+                          <a:srgbClr val="FFFBEB"/>
+                        </a:solidFill>
+                        <a:ln w="15240">
+                          <a:solidFill>
+                            <a:srgbClr val="D97706"/>
+                          </a:solidFill>
+                        </a:ln>
+                      </wps:spPr>
+                      <wps:style>
+                        <a:lnRef idx="2">
+                          <a:schemeClr val="accent1">
+                            <a:shade val="15000"/>
+                          </a:schemeClr>
+                        </a:lnRef>
+                        <a:fillRef idx="1">
+                          <a:schemeClr val="accent1"/>
+                        </a:fillRef>
+                        <a:effectRef idx="0">
+                          <a:schemeClr val="accent1"/>
+                        </a:effectRef>
+                        <a:fontRef idx="minor">
+                          <a:schemeClr val="lt1"/>
+                        </a:fontRef>
+                      </wps:style>
+                      <wps:txbx>
+                        <w:txbxContent>
+                          <w:p>
+                            <w:pPr>
+                              <w:jc w:val="center"/>
+                              <w:rPr>
+                                <w:rFonts w:ascii="Aptos" w:hAnsi="Aptos"/>
+                                <w:b/>
+                                <w:color w:val="1F2937"/>
+                                <w:sz w:val="17"/>
+                              </w:rPr>
+                            </w:pPr>
+                            <w:r>
+                              <w:rPr>
+                                <w:rFonts w:ascii="Aptos" w:hAnsi="Aptos"/>
+                                <w:b/>
+                                <w:color w:val="1F2937"/>
+                                <w:sz w:val="17"/>
+                              </w:rPr>
+                              <w:t>{flow_detail_shape_8_title}</w:t>
+                            </w:r>
+                          </w:p>
+                          <w:p>
+                            <w:pPr>
+                              <w:jc w:val="center"/>
+                              <w:rPr>
+                                <w:rFonts w:ascii="Aptos" w:hAnsi="Aptos"/>
+                                <w:color w:val="1F2937"/>
+                                <w:sz w:val="15"/>
+                              </w:rPr>
+                            </w:pPr>
+                            <w:r>
+                              <w:rPr>
+                                <w:rFonts w:ascii="Aptos" w:hAnsi="Aptos"/>
+                                <w:color w:val="1F2937"/>
+                                <w:sz w:val="15"/>
+                              </w:rPr>
+                              <w:t>{flow_detail_shape_8_body}</w:t>
+                            </w:r>
+                          </w:p>
+                        </w:txbxContent>
+                      </wps:txbx>
+                      <wps:bodyPr rot="0" spcFirstLastPara="0" vertOverflow="overflow" horzOverflow="overflow" vert="horz" wrap="square" lIns="76200" tIns="63500" rIns="76200" bIns="63500" numCol="1" spcCol="0" rtlCol="0" fromWordArt="0" anchor="ctr" anchorCtr="0" forceAA="0" compatLnSpc="1">
+                        <a:prstTxWarp prst="textNoShape">
+                          <a:avLst/>
+                        </a:prstTxWarp>
+                        <a:noAutofit/>
+                      </wps:bodyPr>
+                    </wps:wsp>
+                  </a:graphicData>
+                </a:graphic>
+              </wp:anchor>
+            </w:drawing>
+          </mc:Choice>
+          <mc:Fallback>
+            <w:pict>
+              <v:roundrect w14:anchorId="596C097A" id="flow_detail_box_8" o:spid="_x0000_s1065" style="position:absolute;margin-left:439pt;margin-top:510.35pt;width:118pt;height:76pt;z-index:251746304;visibility:visible;mso-wrap-style:square;mso-wrap-distance-left:9pt;mso-wrap-distance-top:0;mso-wrap-distance-right:9pt;mso-wrap-distance-bottom:0;mso-position-horizontal:absolute;mso-position-horizontal-relative:text;mso-position-vertical:absolute;mso-position-vertical-relative:text;v-text-anchor:middle" arcsize="10923f" o:gfxdata="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" fillcolor="#fffbeb" strokecolor="#d97706" strokeweight="1.2pt">
+                <v:stroke joinstyle="miter"/>
+                <v:textbox inset="6pt,5pt,6pt,5pt">
+                  <w:txbxContent>
+                    <w:p>
+                      <w:pPr>
+                        <w:jc w:val="center"/>
+                        <w:rPr>
+                          <w:rFonts w:ascii="Aptos" w:hAnsi="Aptos"/>
+                          <w:b/>
+                          <w:color w:val="1F2937"/>
+                          <w:sz w:val="17"/>
+                        </w:rPr>
+                      </w:pPr>
+                      <w:r>
+                        <w:rPr>
+                          <w:rFonts w:ascii="Aptos" w:hAnsi="Aptos"/>
+                          <w:b/>
+                          <w:color w:val="1F2937"/>
+                          <w:sz w:val="17"/>
+                        </w:rPr>
+                        <w:t>{flow_detail_shape_8_title}</w:t>
+                      </w:r>
+                    </w:p>
+                    <w:p>
+                      <w:pPr>
+                        <w:jc w:val="center"/>
+                        <w:rPr>
+                          <w:rFonts w:ascii="Aptos" w:hAnsi="Aptos"/>
+                          <w:color w:val="1F2937"/>
+                          <w:sz w:val="15"/>
+                        </w:rPr>
+                      </w:pPr>
+                      <w:r>
+                        <w:rPr>
+                          <w:rFonts w:ascii="Aptos" w:hAnsi="Aptos"/>
+                          <w:color w:val="1F2937"/>
+                          <w:sz w:val="15"/>
+                        </w:rPr>
+                        <w:t>{flow_detail_shape_8_body}</w:t>
+                      </w:r>
+                    </w:p>
+                  </w:txbxContent>
+                </v:textbox>
+              </v:roundrect>
+            </w:pict>
+          </mc:Fallback>
+        </mc:AlternateContent>
+      </w:r>
+      <w:r>
+        <w:rPr>
+          <w:noProof/>
+        </w:rPr>
+        <mc:AlternateContent>
+          <mc:Choice Requires="wps">
+            <w:drawing>
+              <wp:anchor distT="0" distB="0" distL="114300" distR="114300" simplePos="0" relativeHeight="251745280" behindDoc="0" locked="0" layoutInCell="1" allowOverlap="1" wp14:anchorId="6FF0CA27" wp14:editId="5D7D122D">
+                <wp:simplePos x="0" y="0"/>
+                <wp:positionH relativeFrom="column">
+                  <wp:posOffset>3733800</wp:posOffset>
+                </wp:positionH>
+                <wp:positionV relativeFrom="paragraph">
+                  <wp:posOffset>6481445</wp:posOffset>
+                </wp:positionV>
+                <wp:extent cx="1498600" cy="965200"/>
+                <wp:effectExtent l="0" t="0" r="25400" b="25400"/>
+                <wp:wrapNone/>
+                <wp:docPr id="1418196830" name="flow_detail_box_7"/>
+                <wp:cNvGraphicFramePr/>
+                <a:graphic xmlns:a="http://schemas.openxmlformats.org/drawingml/2006/main">
+                  <a:graphicData uri="http://schemas.microsoft.com/office/word/2010/wordprocessingShape">
+                    <wps:wsp>
+                      <wps:cNvSpPr/>
+                      <wps:spPr>
+                        <a:xfrm>
+                          <a:off x="0" y="0"/>
+                          <a:ext cx="1498600" cy="965200"/>
+                        </a:xfrm>
+                        <a:prstGeom prst="roundRect">
+                          <a:avLst/>
+                        </a:prstGeom>
+                        <a:solidFill>
+                          <a:srgbClr val="FFFBEB"/>
+                        </a:solidFill>
+                        <a:ln w="15240">
+                          <a:solidFill>
+                            <a:srgbClr val="D97706"/>
+                          </a:solidFill>
+                        </a:ln>
+                      </wps:spPr>
+                      <wps:style>
+                        <a:lnRef idx="2">
+                          <a:schemeClr val="accent1">
+                            <a:shade val="15000"/>
+                          </a:schemeClr>
+                        </a:lnRef>
+                        <a:fillRef idx="1">
+                          <a:schemeClr val="accent1"/>
+                        </a:fillRef>
+                        <a:effectRef idx="0">
+                          <a:schemeClr val="accent1"/>
+                        </a:effectRef>
+                        <a:fontRef idx="minor">
+                          <a:schemeClr val="lt1"/>
+                        </a:fontRef>
+                      </wps:style>
+                      <wps:txbx>
+                        <w:txbxContent>
+                          <w:p>
+                            <w:pPr>
+                              <w:jc w:val="center"/>
+                              <w:rPr>
+                                <w:rFonts w:ascii="Aptos" w:hAnsi="Aptos"/>
+                                <w:b/>
+                                <w:color w:val="1F2937"/>
+                                <w:sz w:val="17"/>
+                              </w:rPr>
+                            </w:pPr>
+                            <w:r>
+                              <w:rPr>
+                                <w:rFonts w:ascii="Aptos" w:hAnsi="Aptos"/>
+                                <w:b/>
+                                <w:color w:val="1F2937"/>
+                                <w:sz w:val="17"/>
+                              </w:rPr>
+                              <w:t>{flow_detail_shape_7_title}</w:t>
+                            </w:r>
+                          </w:p>
+                          <w:p>
+                            <w:pPr>
+                              <w:jc w:val="center"/>
+                              <w:rPr>
+                                <w:rFonts w:ascii="Aptos" w:hAnsi="Aptos"/>
+                                <w:color w:val="1F2937"/>
+                                <w:sz w:val="15"/>
+                              </w:rPr>
+                            </w:pPr>
+                            <w:r>
+                              <w:rPr>
+                                <w:rFonts w:ascii="Aptos" w:hAnsi="Aptos"/>
+                                <w:color w:val="1F2937"/>
+                                <w:sz w:val="15"/>
+                              </w:rPr>
+                              <w:t>{flow_detail_shape_7_body}</w:t>
+                            </w:r>
+                          </w:p>
+                        </w:txbxContent>
+                      </wps:txbx>
+                      <wps:bodyPr rot="0" spcFirstLastPara="0" vertOverflow="overflow" horzOverflow="overflow" vert="horz" wrap="square" lIns="76200" tIns="63500" rIns="76200" bIns="63500" numCol="1" spcCol="0" rtlCol="0" fromWordArt="0" anchor="ctr" anchorCtr="0" forceAA="0" compatLnSpc="1">
+                        <a:prstTxWarp prst="textNoShape">
+                          <a:avLst/>
+                        </a:prstTxWarp>
+                        <a:noAutofit/>
+                      </wps:bodyPr>
+                    </wps:wsp>
+                  </a:graphicData>
+                </a:graphic>
+              </wp:anchor>
+            </w:drawing>
+          </mc:Choice>
+          <mc:Fallback>
+            <w:pict>
+              <v:roundrect w14:anchorId="6FF0CA27" id="flow_detail_box_7" o:spid="_x0000_s1066" style="position:absolute;margin-left:294pt;margin-top:510.35pt;width:118pt;height:76pt;z-index:251745280;visibility:visible;mso-wrap-style:square;mso-wrap-distance-left:9pt;mso-wrap-distance-top:0;mso-wrap-distance-right:9pt;mso-wrap-distance-bottom:0;mso-position-horizontal:absolute;mso-position-horizontal-relative:text;mso-position-vertical:absolute;mso-position-vertical-relative:text;v-text-anchor:middle" arcsize="10923f" o:gfxdata="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" fillcolor="#fffbeb" strokecolor="#d97706" strokeweight="1.2pt">
+                <v:stroke joinstyle="miter"/>
+                <v:textbox inset="6pt,5pt,6pt,5pt">
+                  <w:txbxContent>
+                    <w:p>
+                      <w:pPr>
+                        <w:jc w:val="center"/>
+                        <w:rPr>
+                          <w:rFonts w:ascii="Aptos" w:hAnsi="Aptos"/>
+                          <w:b/>
+                          <w:color w:val="1F2937"/>
+                          <w:sz w:val="17"/>
+                        </w:rPr>
+                      </w:pPr>
+                      <w:r>
+                        <w:rPr>
+                          <w:rFonts w:ascii="Aptos" w:hAnsi="Aptos"/>
+                          <w:b/>
+                          <w:color w:val="1F2937"/>
+                          <w:sz w:val="17"/>
+                        </w:rPr>
+                        <w:t>{flow_detail_shape_7_title}</w:t>
+                      </w:r>
+                    </w:p>
+                    <w:p>
+                      <w:pPr>
+                        <w:jc w:val="center"/>
+                        <w:rPr>
+                          <w:rFonts w:ascii="Aptos" w:hAnsi="Aptos"/>
+                          <w:color w:val="1F2937"/>
+                          <w:sz w:val="15"/>
+                        </w:rPr>
+                      </w:pPr>
+                      <w:r>
+                        <w:rPr>
+                          <w:rFonts w:ascii="Aptos" w:hAnsi="Aptos"/>
+                          <w:color w:val="1F2937"/>
+                          <w:sz w:val="15"/>
+                        </w:rPr>
+                        <w:t>{flow_detail_shape_7_body}</w:t>
+                      </w:r>
+                    </w:p>
+                  </w:txbxContent>
+                </v:textbox>
+              </v:roundrect>
+            </w:pict>
+          </mc:Fallback>
+        </mc:AlternateContent>
+      </w:r>
+      <w:r>
+        <w:rPr>
+          <w:noProof/>
+        </w:rPr>
+        <mc:AlternateContent>
+          <mc:Choice Requires="wps">
+            <w:drawing>
+              <wp:anchor distT="0" distB="0" distL="114300" distR="114300" simplePos="0" relativeHeight="251744256" behindDoc="0" locked="0" layoutInCell="1" allowOverlap="1" wp14:anchorId="3A41B9B0" wp14:editId="2CA118EC">
+                <wp:simplePos x="0" y="0"/>
+                <wp:positionH relativeFrom="column">
+                  <wp:posOffset>1892300</wp:posOffset>
+                </wp:positionH>
+                <wp:positionV relativeFrom="paragraph">
+                  <wp:posOffset>6481445</wp:posOffset>
+                </wp:positionV>
+                <wp:extent cx="1498600" cy="965200"/>
+                <wp:effectExtent l="0" t="0" r="25400" b="25400"/>
+                <wp:wrapNone/>
+                <wp:docPr id="1150091481" name="flow_detail_box_6"/>
+                <wp:cNvGraphicFramePr/>
+                <a:graphic xmlns:a="http://schemas.openxmlformats.org/drawingml/2006/main">
+                  <a:graphicData uri="http://schemas.microsoft.com/office/word/2010/wordprocessingShape">
+                    <wps:wsp>
+                      <wps:cNvSpPr/>
+                      <wps:spPr>
+                        <a:xfrm>
+                          <a:off x="0" y="0"/>
+                          <a:ext cx="1498600" cy="965200"/>
+                        </a:xfrm>
+                        <a:prstGeom prst="roundRect">
+                          <a:avLst/>
+                        </a:prstGeom>
+                        <a:solidFill>
+                          <a:srgbClr val="FFFBEB"/>
+                        </a:solidFill>
+                        <a:ln w="15240">
+                          <a:solidFill>
+                            <a:srgbClr val="D97706"/>
+                          </a:solidFill>
+                        </a:ln>
+                      </wps:spPr>
+                      <wps:style>
+                        <a:lnRef idx="2">
+                          <a:schemeClr val="accent1">
+                            <a:shade val="15000"/>
+                          </a:schemeClr>
+                        </a:lnRef>
+                        <a:fillRef idx="1">
+                          <a:schemeClr val="accent1"/>
+                        </a:fillRef>
+                        <a:effectRef idx="0">
+                          <a:schemeClr val="accent1"/>
+                        </a:effectRef>
+                        <a:fontRef idx="minor">
+                          <a:schemeClr val="lt1"/>
+                        </a:fontRef>
+                      </wps:style>
+                      <wps:txbx>
+                        <w:txbxContent>
+                          <w:p>
+                            <w:pPr>
+                              <w:jc w:val="center"/>
+                              <w:rPr>
+                                <w:rFonts w:ascii="Aptos" w:hAnsi="Aptos"/>
+                                <w:b/>
+                                <w:color w:val="1F2937"/>
+                                <w:sz w:val="17"/>
+                              </w:rPr>
+                            </w:pPr>
+                            <w:r>
+                              <w:rPr>
+                                <w:rFonts w:ascii="Aptos" w:hAnsi="Aptos"/>
+                                <w:b/>
+                                <w:color w:val="1F2937"/>
+                                <w:sz w:val="17"/>
+                              </w:rPr>
+                              <w:t>{flow_detail_shape_6_title}</w:t>
+                            </w:r>
+                          </w:p>
+                          <w:p>
+                            <w:pPr>
+                              <w:jc w:val="center"/>
+                              <w:rPr>
+                                <w:rFonts w:ascii="Aptos" w:hAnsi="Aptos"/>
+                                <w:color w:val="1F2937"/>
+                                <w:sz w:val="15"/>
+                              </w:rPr>
+                            </w:pPr>
+                            <w:r>
+                              <w:rPr>
+                                <w:rFonts w:ascii="Aptos" w:hAnsi="Aptos"/>
+                                <w:color w:val="1F2937"/>
+                                <w:sz w:val="15"/>
+                              </w:rPr>
+                              <w:t>{flow_detail_shape_6_body}</w:t>
+                            </w:r>
+                          </w:p>
+                        </w:txbxContent>
+                      </wps:txbx>
+                      <wps:bodyPr rot="0" spcFirstLastPara="0" vertOverflow="overflow" horzOverflow="overflow" vert="horz" wrap="square" lIns="76200" tIns="63500" rIns="76200" bIns="63500" numCol="1" spcCol="0" rtlCol="0" fromWordArt="0" anchor="ctr" anchorCtr="0" forceAA="0" compatLnSpc="1">
+                        <a:prstTxWarp prst="textNoShape">
+                          <a:avLst/>
+                        </a:prstTxWarp>
+                        <a:noAutofit/>
+                      </wps:bodyPr>
+                    </wps:wsp>
+                  </a:graphicData>
+                </a:graphic>
+              </wp:anchor>
+            </w:drawing>
+          </mc:Choice>
+          <mc:Fallback>
+            <w:pict>
+              <v:roundrect w14:anchorId="3A41B9B0" id="flow_detail_box_6" o:spid="_x0000_s1067" style="position:absolute;margin-left:149pt;margin-top:510.35pt;width:118pt;height:76pt;z-index:251744256;visibility:visible;mso-wrap-style:square;mso-wrap-distance-left:9pt;mso-wrap-distance-top:0;mso-wrap-distance-right:9pt;mso-wrap-distance-bottom:0;mso-position-horizontal:absolute;mso-position-horizontal-relative:text;mso-position-vertical:absolute;mso-position-vertical-relative:text;v-text-anchor:middle" arcsize="10923f" o:gfxdata="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" fillcolor="#fffbeb" strokecolor="#d97706" strokeweight="1.2pt">
+                <v:stroke joinstyle="miter"/>
+                <v:textbox inset="6pt,5pt,6pt,5pt">
+                  <w:txbxContent>
+                    <w:p>
+                      <w:pPr>
+                        <w:jc w:val="center"/>
+                        <w:rPr>
+                          <w:rFonts w:ascii="Aptos" w:hAnsi="Aptos"/>
+                          <w:b/>
+                          <w:color w:val="1F2937"/>
+                          <w:sz w:val="17"/>
+                        </w:rPr>
+                      </w:pPr>
+                      <w:r>
+                        <w:rPr>
+                          <w:rFonts w:ascii="Aptos" w:hAnsi="Aptos"/>
+                          <w:b/>
+                          <w:color w:val="1F2937"/>
+                          <w:sz w:val="17"/>
+                        </w:rPr>
+                        <w:t>{flow_detail_shape_6_title}</w:t>
+                      </w:r>
+                    </w:p>
+                    <w:p>
+                      <w:pPr>
+                        <w:jc w:val="center"/>
+                        <w:rPr>
+                          <w:rFonts w:ascii="Aptos" w:hAnsi="Aptos"/>
+                          <w:color w:val="1F2937"/>
+                          <w:sz w:val="15"/>
+                        </w:rPr>
+                      </w:pPr>
+                      <w:r>
+                        <w:rPr>
+                          <w:rFonts w:ascii="Aptos" w:hAnsi="Aptos"/>
+                          <w:color w:val="1F2937"/>
+                          <w:sz w:val="15"/>
+                        </w:rPr>
+                        <w:t>{flow_detail_shape_6_body}</w:t>
+                      </w:r>
+                    </w:p>
+                  </w:txbxContent>
+                </v:textbox>
+              </v:roundrect>
+            </w:pict>
+          </mc:Fallback>
+        </mc:AlternateContent>
+      </w:r>
+      <w:r>
+        <w:rPr>
+          <w:noProof/>
+        </w:rPr>
+        <mc:AlternateContent>
+          <mc:Choice Requires="wps">
+            <w:drawing>
+              <wp:anchor distT="0" distB="0" distL="114300" distR="114300" simplePos="0" relativeHeight="251743232" behindDoc="0" locked="0" layoutInCell="1" allowOverlap="1" wp14:anchorId="6652BE28" wp14:editId="67CE9439">
+                <wp:simplePos x="0" y="0"/>
+                <wp:positionH relativeFrom="column">
+                  <wp:posOffset>50800</wp:posOffset>
+                </wp:positionH>
+                <wp:positionV relativeFrom="paragraph">
+                  <wp:posOffset>6481445</wp:posOffset>
+                </wp:positionV>
+                <wp:extent cx="1498600" cy="965200"/>
+                <wp:effectExtent l="0" t="0" r="25400" b="25400"/>
+                <wp:wrapNone/>
+                <wp:docPr id="1960903393" name="flow_detail_box_5"/>
+                <wp:cNvGraphicFramePr/>
+                <a:graphic xmlns:a="http://schemas.openxmlformats.org/drawingml/2006/main">
+                  <a:graphicData uri="http://schemas.microsoft.com/office/word/2010/wordprocessingShape">
+                    <wps:wsp>
+                      <wps:cNvSpPr/>
+                      <wps:spPr>
+                        <a:xfrm>
+                          <a:off x="0" y="0"/>
+                          <a:ext cx="1498600" cy="965200"/>
+                        </a:xfrm>
+                        <a:prstGeom prst="roundRect">
+                          <a:avLst/>
+                        </a:prstGeom>
+                        <a:solidFill>
+                          <a:srgbClr val="FFFBEB"/>
+                        </a:solidFill>
+                        <a:ln w="15240">
+                          <a:solidFill>
+                            <a:srgbClr val="D97706"/>
+                          </a:solidFill>
+                        </a:ln>
+                      </wps:spPr>
+                      <wps:style>
+                        <a:lnRef idx="2">
+                          <a:schemeClr val="accent1">
+                            <a:shade val="15000"/>
+                          </a:schemeClr>
+                        </a:lnRef>
+                        <a:fillRef idx="1">
+                          <a:schemeClr val="accent1"/>
+                        </a:fillRef>
+                        <a:effectRef idx="0">
+                          <a:schemeClr val="accent1"/>
+                        </a:effectRef>
+                        <a:fontRef idx="minor">
+                          <a:schemeClr val="lt1"/>
+                        </a:fontRef>
+                      </wps:style>
+                      <wps:txbx>
+                        <w:txbxContent>
+                          <w:p>
+                            <w:pPr>
+                              <w:jc w:val="center"/>
+                              <w:rPr>
+                                <w:rFonts w:ascii="Aptos" w:hAnsi="Aptos"/>
+                                <w:b/>
+                                <w:color w:val="1F2937"/>
+                                <w:sz w:val="17"/>
+                              </w:rPr>
+                            </w:pPr>
+                            <w:r>
+                              <w:rPr>
+                                <w:rFonts w:ascii="Aptos" w:hAnsi="Aptos"/>
+                                <w:b/>
+                                <w:color w:val="1F2937"/>
+                                <w:sz w:val="17"/>
+                              </w:rPr>
+                              <w:t>{flow_detail_shape_5_title}</w:t>
+                            </w:r>
+                          </w:p>
+                          <w:p>
+                            <w:pPr>
+                              <w:jc w:val="center"/>
+                              <w:rPr>
+                                <w:rFonts w:ascii="Aptos" w:hAnsi="Aptos"/>
+                                <w:color w:val="1F2937"/>
+                                <w:sz w:val="15"/>
+                              </w:rPr>
+                            </w:pPr>
+                            <w:r>
+                              <w:rPr>
+                                <w:rFonts w:ascii="Aptos" w:hAnsi="Aptos"/>
+                                <w:color w:val="1F2937"/>
+                                <w:sz w:val="15"/>
+                              </w:rPr>
+                              <w:t>{flow_detail_shape_5_body}</w:t>
+                            </w:r>
+                          </w:p>
+                        </w:txbxContent>
+                      </wps:txbx>
+                      <wps:bodyPr rot="0" spcFirstLastPara="0" vertOverflow="overflow" horzOverflow="overflow" vert="horz" wrap="square" lIns="76200" tIns="63500" rIns="76200" bIns="63500" numCol="1" spcCol="0" rtlCol="0" fromWordArt="0" anchor="ctr" anchorCtr="0" forceAA="0" compatLnSpc="1">
+                        <a:prstTxWarp prst="textNoShape">
+                          <a:avLst/>
+                        </a:prstTxWarp>
+                        <a:noAutofit/>
+                      </wps:bodyPr>
+                    </wps:wsp>
+                  </a:graphicData>
+                </a:graphic>
+              </wp:anchor>
+            </w:drawing>
+          </mc:Choice>
+          <mc:Fallback>
+            <w:pict>
+              <v:roundrect w14:anchorId="6652BE28" id="flow_detail_box_5" o:spid="_x0000_s1068" style="position:absolute;margin-left:4pt;margin-top:510.35pt;width:118pt;height:76pt;z-index:251743232;visibility:visible;mso-wrap-style:square;mso-wrap-distance-left:9pt;mso-wrap-distance-top:0;mso-wrap-distance-right:9pt;mso-wrap-distance-bottom:0;mso-position-horizontal:absolute;mso-position-horizontal-relative:text;mso-position-vertical:absolute;mso-position-vertical-relative:text;v-text-anchor:middle" arcsize="10923f" o:gfxdata="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" fillcolor="#fffbeb" strokecolor="#d97706" strokeweight="1.2pt">
+                <v:stroke joinstyle="miter"/>
+                <v:textbox inset="6pt,5pt,6pt,5pt">
+                  <w:txbxContent>
+                    <w:p>
+                      <w:pPr>
+                        <w:jc w:val="center"/>
+                        <w:rPr>
+                          <w:rFonts w:ascii="Aptos" w:hAnsi="Aptos"/>
+                          <w:b/>
+                          <w:color w:val="1F2937"/>
+                          <w:sz w:val="17"/>
+                        </w:rPr>
+                      </w:pPr>
+                      <w:r>
+                        <w:rPr>
+                          <w:rFonts w:ascii="Aptos" w:hAnsi="Aptos"/>
+                          <w:b/>
+                          <w:color w:val="1F2937"/>
+                          <w:sz w:val="17"/>
+                        </w:rPr>
+                        <w:t>{flow_detail_shape_5_title}</w:t>
+                      </w:r>
+                    </w:p>
+                    <w:p>
+                      <w:pPr>
+                        <w:jc w:val="center"/>
+                        <w:rPr>
+                          <w:rFonts w:ascii="Aptos" w:hAnsi="Aptos"/>
+                          <w:color w:val="1F2937"/>
+                          <w:sz w:val="15"/>
+                        </w:rPr>
+                      </w:pPr>
+                      <w:r>
+                        <w:rPr>
+                          <w:rFonts w:ascii="Aptos" w:hAnsi="Aptos"/>
+                          <w:color w:val="1F2937"/>
+                          <w:sz w:val="15"/>
+                        </w:rPr>
+                        <w:t>{flow_detail_shape_5_body}</w:t>
+                      </w:r>
+                    </w:p>
+                  </w:txbxContent>
+                </v:textbox>
+              </v:roundrect>
+            </w:pict>
+          </mc:Fallback>
+        </mc:AlternateContent>
+      </w:r>
+      <w:r>
+        <w:rPr>
+          <w:noProof/>
+        </w:rPr>
+        <mc:AlternateContent>
+          <mc:Choice Requires="wps">
+            <w:drawing>
+              <wp:anchor distT="0" distB="0" distL="114300" distR="114300" simplePos="0" relativeHeight="251742208" behindDoc="0" locked="0" layoutInCell="1" allowOverlap="1" wp14:anchorId="5B8C8FED" wp14:editId="63E6B652">
+                <wp:simplePos x="0" y="0"/>
+                <wp:positionH relativeFrom="column">
+                  <wp:posOffset>5575300</wp:posOffset>
+                </wp:positionH>
+                <wp:positionV relativeFrom="paragraph">
+                  <wp:posOffset>5211445</wp:posOffset>
+                </wp:positionV>
+                <wp:extent cx="1498600" cy="965200"/>
+                <wp:effectExtent l="0" t="0" r="25400" b="25400"/>
+                <wp:wrapNone/>
+                <wp:docPr id="1978542810" name="flow_detail_box_4"/>
+                <wp:cNvGraphicFramePr/>
+                <a:graphic xmlns:a="http://schemas.openxmlformats.org/drawingml/2006/main">
+                  <a:graphicData uri="http://schemas.microsoft.com/office/word/2010/wordprocessingShape">
+                    <wps:wsp>
+                      <wps:cNvSpPr/>
+                      <wps:spPr>
+                        <a:xfrm>
+                          <a:off x="0" y="0"/>
+                          <a:ext cx="1498600" cy="965200"/>
+                        </a:xfrm>
+                        <a:prstGeom prst="roundRect">
+                          <a:avLst/>
+                        </a:prstGeom>
+                        <a:solidFill>
+                          <a:srgbClr val="EFF6FF"/>
+                        </a:solidFill>
+                        <a:ln w="15240">
+                          <a:solidFill>
+                            <a:srgbClr val="1F63A0"/>
+                          </a:solidFill>
+                        </a:ln>
+                      </wps:spPr>
+                      <wps:style>
+                        <a:lnRef idx="2">
+                          <a:schemeClr val="accent1">
+                            <a:shade val="15000"/>
+                          </a:schemeClr>
+                        </a:lnRef>
+                        <a:fillRef idx="1">
+                          <a:schemeClr val="accent1"/>
+                        </a:fillRef>
+                        <a:effectRef idx="0">
+                          <a:schemeClr val="accent1"/>
+                        </a:effectRef>
+                        <a:fontRef idx="minor">
+                          <a:schemeClr val="lt1"/>
+                        </a:fontRef>
+                      </wps:style>
+                      <wps:txbx>
+                        <w:txbxContent>
+                          <w:p>
+                            <w:pPr>
+                              <w:jc w:val="center"/>
+                              <w:rPr>
+                                <w:rFonts w:ascii="Aptos" w:hAnsi="Aptos"/>
+                                <w:b/>
+                                <w:color w:val="1F2937"/>
+                                <w:sz w:val="17"/>
+                              </w:rPr>
+                            </w:pPr>
+                            <w:r>
+                              <w:rPr>
+                                <w:rFonts w:ascii="Aptos" w:hAnsi="Aptos"/>
+                                <w:b/>
+                                <w:color w:val="1F2937"/>
+                                <w:sz w:val="17"/>
+                              </w:rPr>
+                              <w:t>{flow_detail_shape_4_title}</w:t>
+                            </w:r>
+                          </w:p>
+                          <w:p>
+                            <w:pPr>
+                              <w:jc w:val="center"/>
+                              <w:rPr>
+                                <w:rFonts w:ascii="Aptos" w:hAnsi="Aptos"/>
+                                <w:color w:val="1F2937"/>
+                                <w:sz w:val="15"/>
+                              </w:rPr>
+                            </w:pPr>
+                            <w:r>
+                              <w:rPr>
+                                <w:rFonts w:ascii="Aptos" w:hAnsi="Aptos"/>
+                                <w:color w:val="1F2937"/>
+                                <w:sz w:val="15"/>
+                              </w:rPr>
+                              <w:t>{flow_detail_shape_4_body}</w:t>
+                            </w:r>
+                          </w:p>
+                        </w:txbxContent>
+                      </wps:txbx>
+                      <wps:bodyPr rot="0" spcFirstLastPara="0" vertOverflow="overflow" horzOverflow="overflow" vert="horz" wrap="square" lIns="76200" tIns="63500" rIns="76200" bIns="63500" numCol="1" spcCol="0" rtlCol="0" fromWordArt="0" anchor="ctr" anchorCtr="0" forceAA="0" compatLnSpc="1">
+                        <a:prstTxWarp prst="textNoShape">
+                          <a:avLst/>
+                        </a:prstTxWarp>
+                        <a:noAutofit/>
+                      </wps:bodyPr>
+                    </wps:wsp>
+                  </a:graphicData>
+                </a:graphic>
+              </wp:anchor>
+            </w:drawing>
+          </mc:Choice>
+          <mc:Fallback>
+            <w:pict>
+              <v:roundrect w14:anchorId="5B8C8FED" id="flow_detail_box_4" o:spid="_x0000_s1069" style="position:absolute;margin-left:439pt;margin-top:410.35pt;width:118pt;height:76pt;z-index:251742208;visibility:visible;mso-wrap-style:square;mso-wrap-distance-left:9pt;mso-wrap-distance-top:0;mso-wrap-distance-right:9pt;mso-wrap-distance-bottom:0;mso-position-horizontal:absolute;mso-position-horizontal-relative:text;mso-position-vertical:absolute;mso-position-vertical-relative:text;v-text-anchor:middle" arcsize="10923f" o:gfxdata="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" fillcolor="#eff6ff" strokecolor="#1f63a0" strokeweight="1.2pt">
+                <v:stroke joinstyle="miter"/>
+                <v:textbox inset="6pt,5pt,6pt,5pt">
+                  <w:txbxContent>
+                    <w:p>
+                      <w:pPr>
+                        <w:jc w:val="center"/>
+                        <w:rPr>
+                          <w:rFonts w:ascii="Aptos" w:hAnsi="Aptos"/>
+                          <w:b/>
+                          <w:color w:val="1F2937"/>
+                          <w:sz w:val="17"/>
+                        </w:rPr>
+                      </w:pPr>
+                      <w:r>
+                        <w:rPr>
+                          <w:rFonts w:ascii="Aptos" w:hAnsi="Aptos"/>
+                          <w:b/>
+                          <w:color w:val="1F2937"/>
+                          <w:sz w:val="17"/>
+                        </w:rPr>
+                        <w:t>{flow_detail_shape_4_title}</w:t>
+                      </w:r>
+                    </w:p>
+                    <w:p>
+                      <w:pPr>
+                        <w:jc w:val="center"/>
+                        <w:rPr>
+                          <w:rFonts w:ascii="Aptos" w:hAnsi="Aptos"/>
+                          <w:color w:val="1F2937"/>
+                          <w:sz w:val="15"/>
+                        </w:rPr>
+                      </w:pPr>
+                      <w:r>
+                        <w:rPr>
+                          <w:rFonts w:ascii="Aptos" w:hAnsi="Aptos"/>
+                          <w:color w:val="1F2937"/>
+                          <w:sz w:val="15"/>
+                        </w:rPr>
+                        <w:t>{flow_detail_shape_4_body}</w:t>
+                      </w:r>
+                    </w:p>
+                  </w:txbxContent>
+                </v:textbox>
+              </v:roundrect>
+            </w:pict>
+          </mc:Fallback>
+        </mc:AlternateContent>
+      </w:r>
+      <w:r>
+        <w:rPr>
+          <w:noProof/>
+        </w:rPr>
+        <mc:AlternateContent>
+          <mc:Choice Requires="wps">
+            <w:drawing>
+              <wp:anchor distT="0" distB="0" distL="114300" distR="114300" simplePos="0" relativeHeight="251741184" behindDoc="0" locked="0" layoutInCell="1" allowOverlap="1" wp14:anchorId="3C7CEBB8" wp14:editId="264AD1FA">
+                <wp:simplePos x="0" y="0"/>
+                <wp:positionH relativeFrom="column">
+                  <wp:posOffset>3733800</wp:posOffset>
+                </wp:positionH>
+                <wp:positionV relativeFrom="paragraph">
+                  <wp:posOffset>5211445</wp:posOffset>
+                </wp:positionV>
+                <wp:extent cx="1498600" cy="965200"/>
+                <wp:effectExtent l="0" t="0" r="25400" b="25400"/>
+                <wp:wrapNone/>
+                <wp:docPr id="1232331213" name="flow_detail_box_3"/>
+                <wp:cNvGraphicFramePr/>
+                <a:graphic xmlns:a="http://schemas.openxmlformats.org/drawingml/2006/main">
+                  <a:graphicData uri="http://schemas.microsoft.com/office/word/2010/wordprocessingShape">
+                    <wps:wsp>
+                      <wps:cNvSpPr/>
+                      <wps:spPr>
+                        <a:xfrm>
+                          <a:off x="0" y="0"/>
+                          <a:ext cx="1498600" cy="965200"/>
+                        </a:xfrm>
+                        <a:prstGeom prst="roundRect">
+                          <a:avLst/>
+                        </a:prstGeom>
+                        <a:solidFill>
+                          <a:srgbClr val="EFF6FF"/>
+                        </a:solidFill>
+                        <a:ln w="15240">
+                          <a:solidFill>
+                            <a:srgbClr val="1F63A0"/>
+                          </a:solidFill>
+                        </a:ln>
+                      </wps:spPr>
+                      <wps:style>
+                        <a:lnRef idx="2">
+                          <a:schemeClr val="accent1">
+                            <a:shade val="15000"/>
+                          </a:schemeClr>
+                        </a:lnRef>
+                        <a:fillRef idx="1">
+                          <a:schemeClr val="accent1"/>
+                        </a:fillRef>
+                        <a:effectRef idx="0">
+                          <a:schemeClr val="accent1"/>
+                        </a:effectRef>
+                        <a:fontRef idx="minor">
+                          <a:schemeClr val="lt1"/>
+                        </a:fontRef>
+                      </wps:style>
+                      <wps:txbx>
+                        <w:txbxContent>
+                          <w:p>
+                            <w:pPr>
+                              <w:jc w:val="center"/>
+                              <w:rPr>
+                                <w:rFonts w:ascii="Aptos" w:hAnsi="Aptos"/>
+                                <w:b/>
+                                <w:color w:val="1F2937"/>
+                                <w:sz w:val="17"/>
+                              </w:rPr>
+                            </w:pPr>
+                            <w:r>
+                              <w:rPr>
+                                <w:rFonts w:ascii="Aptos" w:hAnsi="Aptos"/>
+                                <w:b/>
+                                <w:color w:val="1F2937"/>
+                                <w:sz w:val="17"/>
+                              </w:rPr>
+                              <w:t>{flow_detail_shape_3_title}</w:t>
+                            </w:r>
+                          </w:p>
+                          <w:p>
+                            <w:pPr>
+                              <w:jc w:val="center"/>
+                              <w:rPr>
+                                <w:rFonts w:ascii="Aptos" w:hAnsi="Aptos"/>
+                                <w:color w:val="1F2937"/>
+                                <w:sz w:val="15"/>
+                              </w:rPr>
+                            </w:pPr>
+                            <w:r>
+                              <w:rPr>
+                                <w:rFonts w:ascii="Aptos" w:hAnsi="Aptos"/>
+                                <w:color w:val="1F2937"/>
+                                <w:sz w:val="15"/>
+                              </w:rPr>
+                              <w:t>{flow_detail_shape_3_body}</w:t>
+                            </w:r>
+                          </w:p>
+                        </w:txbxContent>
+                      </wps:txbx>
+                      <wps:bodyPr rot="0" spcFirstLastPara="0" vertOverflow="overflow" horzOverflow="overflow" vert="horz" wrap="square" lIns="76200" tIns="63500" rIns="76200" bIns="63500" numCol="1" spcCol="0" rtlCol="0" fromWordArt="0" anchor="ctr" anchorCtr="0" forceAA="0" compatLnSpc="1">
+                        <a:prstTxWarp prst="textNoShape">
+                          <a:avLst/>
+                        </a:prstTxWarp>
+                        <a:noAutofit/>
+                      </wps:bodyPr>
+                    </wps:wsp>
+                  </a:graphicData>
+                </a:graphic>
+              </wp:anchor>
+            </w:drawing>
+          </mc:Choice>
+          <mc:Fallback>
+            <w:pict>
+              <v:roundrect w14:anchorId="3C7CEBB8" id="flow_detail_box_3" o:spid="_x0000_s1070" style="position:absolute;margin-left:294pt;margin-top:410.35pt;width:118pt;height:76pt;z-index:251741184;visibility:visible;mso-wrap-style:square;mso-wrap-distance-left:9pt;mso-wrap-distance-top:0;mso-wrap-distance-right:9pt;mso-wrap-distance-bottom:0;mso-position-horizontal:absolute;mso-position-horizontal-relative:text;mso-position-vertical:absolute;mso-position-vertical-relative:text;v-text-anchor:middle" arcsize="10923f" o:gfxdata="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" fillcolor="#eff6ff" strokecolor="#1f63a0" strokeweight="1.2pt">
+                <v:stroke joinstyle="miter"/>
+                <v:textbox inset="6pt,5pt,6pt,5pt">
+                  <w:txbxContent>
+                    <w:p>
+                      <w:pPr>
+                        <w:jc w:val="center"/>
+                        <w:rPr>
+                          <w:rFonts w:ascii="Aptos" w:hAnsi="Aptos"/>
+                          <w:b/>
+                          <w:color w:val="1F2937"/>
+                          <w:sz w:val="17"/>
+                        </w:rPr>
+                      </w:pPr>
+                      <w:r>
+                        <w:rPr>
+                          <w:rFonts w:ascii="Aptos" w:hAnsi="Aptos"/>
+                          <w:b/>
+                          <w:color w:val="1F2937"/>
+                          <w:sz w:val="17"/>
+                        </w:rPr>
+                        <w:t>{flow_detail_shape_3_title}</w:t>
+                      </w:r>
+                    </w:p>
+                    <w:p>
+                      <w:pPr>
+                        <w:jc w:val="center"/>
+                        <w:rPr>
+                          <w:rFonts w:ascii="Aptos" w:hAnsi="Aptos"/>
+                          <w:color w:val="1F2937"/>
+                          <w:sz w:val="15"/>
+                        </w:rPr>
+                      </w:pPr>
+                      <w:r>
+                        <w:rPr>
+                          <w:rFonts w:ascii="Aptos" w:hAnsi="Aptos"/>
+                          <w:color w:val="1F2937"/>
+                          <w:sz w:val="15"/>
+                        </w:rPr>
+                        <w:t>{flow_detail_shape_3_body}</w:t>
+                      </w:r>
+                    </w:p>
+                  </w:txbxContent>
+                </v:textbox>
+              </v:roundrect>
+            </w:pict>
+          </mc:Fallback>
+        </mc:AlternateContent>
+      </w:r>
+      <w:r>
+        <w:rPr>
+          <w:noProof/>
+        </w:rPr>
+        <mc:AlternateContent>
+          <mc:Choice Requires="wps">
+            <w:drawing>
+              <wp:anchor distT="0" distB="0" distL="114300" distR="114300" simplePos="0" relativeHeight="251740160" behindDoc="0" locked="0" layoutInCell="1" allowOverlap="1" wp14:anchorId="78537069" wp14:editId="5E06CC51">
+                <wp:simplePos x="0" y="0"/>
+                <wp:positionH relativeFrom="column">
+                  <wp:posOffset>1892300</wp:posOffset>
+                </wp:positionH>
+                <wp:positionV relativeFrom="paragraph">
+                  <wp:posOffset>5211445</wp:posOffset>
+                </wp:positionV>
+                <wp:extent cx="1498600" cy="965200"/>
+                <wp:effectExtent l="0" t="0" r="25400" b="25400"/>
+                <wp:wrapNone/>
+                <wp:docPr id="978275686" name="flow_detail_box_2"/>
+                <wp:cNvGraphicFramePr/>
+                <a:graphic xmlns:a="http://schemas.openxmlformats.org/drawingml/2006/main">
+                  <a:graphicData uri="http://schemas.microsoft.com/office/word/2010/wordprocessingShape">
+                    <wps:wsp>
+                      <wps:cNvSpPr/>
+                      <wps:spPr>
+                        <a:xfrm>
+                          <a:off x="0" y="0"/>
+                          <a:ext cx="1498600" cy="965200"/>
+                        </a:xfrm>
+                        <a:prstGeom prst="roundRect">
+                          <a:avLst/>
+                        </a:prstGeom>
+                        <a:solidFill>
+                          <a:srgbClr val="EFF6FF"/>
+                        </a:solidFill>
+                        <a:ln w="15240">
+                          <a:solidFill>
+                            <a:srgbClr val="1F63A0"/>
+                          </a:solidFill>
+                        </a:ln>
+                      </wps:spPr>
+                      <wps:style>
+                        <a:lnRef idx="2">
+                          <a:schemeClr val="accent1">
+                            <a:shade val="15000"/>
+                          </a:schemeClr>
+                        </a:lnRef>
+                        <a:fillRef idx="1">
+                          <a:schemeClr val="accent1"/>
+                        </a:fillRef>
+                        <a:effectRef idx="0">
+                          <a:schemeClr val="accent1"/>
+                        </a:effectRef>
+                        <a:fontRef idx="minor">
+                          <a:schemeClr val="lt1"/>
+                        </a:fontRef>
+                      </wps:style>
+                      <wps:txbx>
+                        <w:txbxContent>
+                          <w:p>
+                            <w:pPr>
+                              <w:jc w:val="center"/>
+                              <w:rPr>
+                                <w:rFonts w:ascii="Aptos" w:hAnsi="Aptos"/>
+                                <w:b/>
+                                <w:color w:val="1F2937"/>
+                                <w:sz w:val="17"/>
+                              </w:rPr>
+                            </w:pPr>
+                            <w:r>
+                              <w:rPr>
+                                <w:rFonts w:ascii="Aptos" w:hAnsi="Aptos"/>
+                                <w:b/>
+                                <w:color w:val="1F2937"/>
+                                <w:sz w:val="17"/>
+                              </w:rPr>
+                              <w:t>{flow_detail_shape_2_title}</w:t>
+                            </w:r>
+                          </w:p>
+                          <w:p>
+                            <w:pPr>
+                              <w:jc w:val="center"/>
+                              <w:rPr>
+                                <w:rFonts w:ascii="Aptos" w:hAnsi="Aptos"/>
+                                <w:color w:val="1F2937"/>
+                                <w:sz w:val="15"/>
+                              </w:rPr>
+                            </w:pPr>
+                            <w:r>
+                              <w:rPr>
+                                <w:rFonts w:ascii="Aptos" w:hAnsi="Aptos"/>
+                                <w:color w:val="1F2937"/>
+                                <w:sz w:val="15"/>
+                              </w:rPr>
+                              <w:t>{flow_detail_shape_2_body}</w:t>
+                            </w:r>
+                          </w:p>
+                        </w:txbxContent>
+                      </wps:txbx>
+                      <wps:bodyPr rot="0" spcFirstLastPara="0" vertOverflow="overflow" horzOverflow="overflow" vert="horz" wrap="square" lIns="76200" tIns="63500" rIns="76200" bIns="63500" numCol="1" spcCol="0" rtlCol="0" fromWordArt="0" anchor="ctr" anchorCtr="0" forceAA="0" compatLnSpc="1">
+                        <a:prstTxWarp prst="textNoShape">
+                          <a:avLst/>
+                        </a:prstTxWarp>
+                        <a:noAutofit/>
+                      </wps:bodyPr>
+                    </wps:wsp>
+                  </a:graphicData>
+                </a:graphic>
+              </wp:anchor>
+            </w:drawing>
+          </mc:Choice>
+          <mc:Fallback>
+            <w:pict>
+              <v:roundrect w14:anchorId="78537069" id="flow_detail_box_2" o:spid="_x0000_s1071" style="position:absolute;margin-left:149pt;margin-top:410.35pt;width:118pt;height:76pt;z-index:251740160;visibility:visible;mso-wrap-style:square;mso-wrap-distance-left:9pt;mso-wrap-distance-top:0;mso-wrap-distance-right:9pt;mso-wrap-distance-bottom:0;mso-position-horizontal:absolute;mso-position-horizontal-relative:text;mso-position-vertical:absolute;mso-position-vertical-relative:text;v-text-anchor:middle" arcsize="10923f" o:gfxdata="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" fillcolor="#eff6ff" strokecolor="#1f63a0" strokeweight="1.2pt">
+                <v:stroke joinstyle="miter"/>
+                <v:textbox inset="6pt,5pt,6pt,5pt">
+                  <w:txbxContent>
+                    <w:p>
+                      <w:pPr>
+                        <w:jc w:val="center"/>
+                        <w:rPr>
+                          <w:rFonts w:ascii="Aptos" w:hAnsi="Aptos"/>
+                          <w:b/>
+                          <w:color w:val="1F2937"/>
+                          <w:sz w:val="17"/>
+                        </w:rPr>
+                      </w:pPr>
+                      <w:r>
+                        <w:rPr>
+                          <w:rFonts w:ascii="Aptos" w:hAnsi="Aptos"/>
+                          <w:b/>
+                          <w:color w:val="1F2937"/>
+                          <w:sz w:val="17"/>
+                        </w:rPr>
+                        <w:t>{flow_detail_shape_2_title}</w:t>
+                      </w:r>
+                    </w:p>
+                    <w:p>
+                      <w:pPr>
+                        <w:jc w:val="center"/>
+                        <w:rPr>
+                          <w:rFonts w:ascii="Aptos" w:hAnsi="Aptos"/>
+                          <w:color w:val="1F2937"/>
+                          <w:sz w:val="15"/>
+                        </w:rPr>
+                      </w:pPr>
+                      <w:r>
+                        <w:rPr>
+                          <w:rFonts w:ascii="Aptos" w:hAnsi="Aptos"/>
+                          <w:color w:val="1F2937"/>
+                          <w:sz w:val="15"/>
+                        </w:rPr>
+                        <w:t>{flow_detail_shape_2_body}</w:t>
+                      </w:r>
+                    </w:p>
+                  </w:txbxContent>
+                </v:textbox>
+              </v:roundrect>
+            </w:pict>
+          </mc:Fallback>
+        </mc:AlternateContent>
+      </w:r>
+      <w:r>
+        <w:rPr>
+          <w:noProof/>
+        </w:rPr>
+        <mc:AlternateContent>
+          <mc:Choice Requires="wps">
+            <w:drawing>
+              <wp:anchor distT="0" distB="0" distL="114300" distR="114300" simplePos="0" relativeHeight="251739136" behindDoc="0" locked="0" layoutInCell="1" allowOverlap="1" wp14:anchorId="3482E848" wp14:editId="229779A3">
+                <wp:simplePos x="0" y="0"/>
+                <wp:positionH relativeFrom="column">
+                  <wp:posOffset>50800</wp:posOffset>
+                </wp:positionH>
+                <wp:positionV relativeFrom="paragraph">
+                  <wp:posOffset>5211445</wp:posOffset>
+                </wp:positionV>
+                <wp:extent cx="1498600" cy="965200"/>
+                <wp:effectExtent l="0" t="0" r="25400" b="25400"/>
+                <wp:wrapNone/>
+                <wp:docPr id="284367200" name="flow_detail_box_1"/>
+                <wp:cNvGraphicFramePr/>
+                <a:graphic xmlns:a="http://schemas.openxmlformats.org/drawingml/2006/main">
+                  <a:graphicData uri="http://schemas.microsoft.com/office/word/2010/wordprocessingShape">
+                    <wps:wsp>
+                      <wps:cNvSpPr/>
+                      <wps:spPr>
+                        <a:xfrm>
+                          <a:off x="0" y="0"/>
+                          <a:ext cx="1498600" cy="965200"/>
+                        </a:xfrm>
+                        <a:prstGeom prst="roundRect">
+                          <a:avLst/>
+                        </a:prstGeom>
+                        <a:solidFill>
+                          <a:srgbClr val="EFF6FF"/>
+                        </a:solidFill>
+                        <a:ln w="15240">
+                          <a:solidFill>
+                            <a:srgbClr val="1F63A0"/>
+                          </a:solidFill>
+                        </a:ln>
+                      </wps:spPr>
+                      <wps:style>
+                        <a:lnRef idx="2">
+                          <a:schemeClr val="accent1">
+                            <a:shade val="15000"/>
+                          </a:schemeClr>
+                        </a:lnRef>
+                        <a:fillRef idx="1">
+                          <a:schemeClr val="accent1"/>
+                        </a:fillRef>
+                        <a:effectRef idx="0">
+                          <a:schemeClr val="accent1"/>
+                        </a:effectRef>
+                        <a:fontRef idx="minor">
+                          <a:schemeClr val="lt1"/>
+                        </a:fontRef>
+                      </wps:style>
+                      <wps:txbx>
+                        <w:txbxContent>
+                          <w:p>
+                            <w:pPr>
+                              <w:jc w:val="center"/>
+                              <w:rPr>
+                                <w:rFonts w:ascii="Aptos" w:hAnsi="Aptos"/>
+                                <w:b/>
+                                <w:color w:val="1F2937"/>
+                                <w:sz w:val="17"/>
+                              </w:rPr>
+                            </w:pPr>
+                            <w:r>
+                              <w:rPr>
+                                <w:rFonts w:ascii="Aptos" w:hAnsi="Aptos"/>
+                                <w:b/>
+                                <w:color w:val="1F2937"/>
+                                <w:sz w:val="17"/>
+                              </w:rPr>
+                              <w:t>{flow_detail_shape_1_title}</w:t>
+                            </w:r>
+                          </w:p>
+                          <w:p>
+                            <w:pPr>
+                              <w:jc w:val="center"/>
+                              <w:rPr>
+                                <w:rFonts w:ascii="Aptos" w:hAnsi="Aptos"/>
+                                <w:color w:val="1F2937"/>
+                                <w:sz w:val="15"/>
+                              </w:rPr>
+                            </w:pPr>
+                            <w:r>
+                              <w:rPr>
+                                <w:rFonts w:ascii="Aptos" w:hAnsi="Aptos"/>
+                                <w:color w:val="1F2937"/>
+                                <w:sz w:val="15"/>
+                              </w:rPr>
+                              <w:t>{flow_detail_shape_1_body}</w:t>
+                            </w:r>
+                          </w:p>
+                        </w:txbxContent>
+                      </wps:txbx>
+                      <wps:bodyPr rot="0" spcFirstLastPara="0" vertOverflow="overflow" horzOverflow="overflow" vert="horz" wrap="square" lIns="76200" tIns="63500" rIns="76200" bIns="63500" numCol="1" spcCol="0" rtlCol="0" fromWordArt="0" anchor="ctr" anchorCtr="0" forceAA="0" compatLnSpc="1">
+                        <a:prstTxWarp prst="textNoShape">
+                          <a:avLst/>
+                        </a:prstTxWarp>
+                        <a:noAutofit/>
+                      </wps:bodyPr>
+                    </wps:wsp>
+                  </a:graphicData>
+                </a:graphic>
+              </wp:anchor>
+            </w:drawing>
+          </mc:Choice>
+          <mc:Fallback>
+            <w:pict>
+              <v:roundrect w14:anchorId="3482E848" id="flow_detail_box_1" o:spid="_x0000_s1072" style="position:absolute;margin-left:4pt;margin-top:410.35pt;width:118pt;height:76pt;z-index:251739136;visibility:visible;mso-wrap-style:square;mso-wrap-distance-left:9pt;mso-wrap-distance-top:0;mso-wrap-distance-right:9pt;mso-wrap-distance-bottom:0;mso-position-horizontal:absolute;mso-position-horizontal-relative:text;mso-position-vertical:absolute;mso-position-vertical-relative:text;v-text-anchor:middle" arcsize="10923f" o:gfxdata="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" fillcolor="#eff6ff" strokecolor="#1f63a0" strokeweight="1.2pt">
+                <v:stroke joinstyle="miter"/>
+                <v:textbox inset="6pt,5pt,6pt,5pt">
+                  <w:txbxContent>
+                    <w:p>
+                      <w:pPr>
+                        <w:jc w:val="center"/>
+                        <w:rPr>
+                          <w:rFonts w:ascii="Aptos" w:hAnsi="Aptos"/>
+                          <w:b/>
+                          <w:color w:val="1F2937"/>
+                          <w:sz w:val="17"/>
+                        </w:rPr>
+                      </w:pPr>
+                      <w:r>
+                        <w:rPr>
+                          <w:rFonts w:ascii="Aptos" w:hAnsi="Aptos"/>
+                          <w:b/>
+                          <w:color w:val="1F2937"/>
+                          <w:sz w:val="17"/>
+                        </w:rPr>
+                        <w:t>{flow_detail_shape_1_title}</w:t>
+                      </w:r>
+                    </w:p>
+                    <w:p>
+                      <w:pPr>
+                        <w:jc w:val="center"/>
+                        <w:rPr>
+                          <w:rFonts w:ascii="Aptos" w:hAnsi="Aptos"/>
+                          <w:color w:val="1F2937"/>
+                          <w:sz w:val="15"/>
+                        </w:rPr>
+                      </w:pPr>
+                      <w:r>
+                        <w:rPr>
+                          <w:rFonts w:ascii="Aptos" w:hAnsi="Aptos"/>
+                          <w:color w:val="1F2937"/>
+                          <w:sz w:val="15"/>
+                        </w:rPr>
+                        <w:t>{flow_detail_shape_1_body}</w:t>
+                      </w:r>
+                    </w:p>
+                  </w:txbxContent>
+                </v:textbox>
+              </v:roundrect>
+            </w:pict>
+          </mc:Fallback>
+        </mc:AlternateContent>
       </w:r>
     </w:p>
     <w:tbl>

</xml_diff>